<commit_message>
docs: Atualizado o arquivo do Microsoft Word, contendo agora protótipo, MER, Diagrama de classes e modo de rodar o app
</commit_message>
<xml_diff>
--- a/SoulPass-Java-Documentacao.docx
+++ b/SoulPass-Java-Documentacao.docx
@@ -1,15 +1,19 @@
 
 <file path=word/document.xml><?xml version="1.0" encoding="utf-8"?>
-<w:document xmlns:wpc="http://schemas.microsoft.com/office/word/2010/wordprocessingCanvas" xmlns:cx="http://schemas.microsoft.com/office/drawing/2014/chartex" xmlns:cx1="http://schemas.microsoft.com/office/drawing/2015/9/8/chartex" xmlns:cx2="http://schemas.microsoft.com/office/drawing/2015/10/21/chartex" xmlns:cx3="http://schemas.microsoft.com/office/drawing/2016/5/9/chartex" xmlns:cx4="http://schemas.microsoft.com/office/drawing/2016/5/10/chartex" xmlns:cx5="http://schemas.microsoft.com/office/drawing/2016/5/11/chartex" xmlns:cx6="http://schemas.microsoft.com/office/drawing/2016/5/12/chartex" xmlns:cx7="http://schemas.microsoft.com/office/drawing/2016/5/13/chartex" xmlns:cx8="http://schemas.microsoft.com/office/drawing/2016/5/14/chartex" xmlns:mc="http://schemas.openxmlformats.org/markup-compatibility/2006" xmlns:aink="http://schemas.microsoft.com/office/drawing/2016/ink" xmlns:am3d="http://schemas.microsoft.com/office/drawing/2017/model3d" xmlns:o="urn:schemas-microsoft-com:office:office" xmlns:oel="http://schemas.microsoft.com/office/2019/extlst" xmlns:r="http://schemas.openxmlformats.org/officeDocument/2006/relationships" xmlns:m="http://schemas.openxmlformats.org/officeDocument/2006/math" xmlns:v="urn:schemas-microsoft-com:vml" xmlns:wp14="http://schemas.microsoft.com/office/word/2010/wordprocessingDrawing" xmlns:wp="http://schemas.openxmlformats.org/drawingml/2006/wordprocessingDrawing" xmlns:w10="urn:schemas-microsoft-com:office:word" xmlns:w="http://schemas.openxmlformats.org/wordprocessingml/2006/main" xmlns:w14="http://schemas.microsoft.com/office/word/2010/wordml" xmlns:w15="http://schemas.microsoft.com/office/word/2012/wordml" xmlns:w16cex="http://schemas.microsoft.com/office/word/2018/wordml/cex" xmlns:w16cid="http://schemas.microsoft.com/office/word/2016/wordml/cid" xmlns:w16="http://schemas.microsoft.com/office/word/2018/wordml" xmlns:w16du="http://schemas.microsoft.com/office/word/2023/wordml/word16du" xmlns:w16sdtdh="http://schemas.microsoft.com/office/word/2020/wordml/sdtdatahash" xmlns:w16se="http://schemas.microsoft.com/office/word/2015/wordml/symex" xmlns:wpg="http://schemas.microsoft.com/office/word/2010/wordprocessingGroup" xmlns:wpi="http://schemas.microsoft.com/office/word/2010/wordprocessingInk" xmlns:wne="http://schemas.microsoft.com/office/word/2006/wordml" xmlns:wps="http://schemas.microsoft.com/office/word/2010/wordprocessingShape" mc:Ignorable="w14 w15 w16se w16cid w16 w16cex w16sdtdh w16du wp14">
+<w:document xmlns:wpc="http://schemas.microsoft.com/office/word/2010/wordprocessingCanvas" xmlns:cx="http://schemas.microsoft.com/office/drawing/2014/chartex" xmlns:cx1="http://schemas.microsoft.com/office/drawing/2015/9/8/chartex" xmlns:cx2="http://schemas.microsoft.com/office/drawing/2015/10/21/chartex" xmlns:cx3="http://schemas.microsoft.com/office/drawing/2016/5/9/chartex" xmlns:cx4="http://schemas.microsoft.com/office/drawing/2016/5/10/chartex" xmlns:cx5="http://schemas.microsoft.com/office/drawing/2016/5/11/chartex" xmlns:cx6="http://schemas.microsoft.com/office/drawing/2016/5/12/chartex" xmlns:cx7="http://schemas.microsoft.com/office/drawing/2016/5/13/chartex" xmlns:cx8="http://schemas.microsoft.com/office/drawing/2016/5/14/chartex" xmlns:mc="http://schemas.openxmlformats.org/markup-compatibility/2006" xmlns:aink="http://schemas.microsoft.com/office/drawing/2016/ink" xmlns:am3d="http://schemas.microsoft.com/office/drawing/2017/model3d" xmlns:o="urn:schemas-microsoft-com:office:office" xmlns:oel="http://schemas.microsoft.com/office/2019/extlst" xmlns:r="http://schemas.openxmlformats.org/officeDocument/2006/relationships" xmlns:m="http://schemas.openxmlformats.org/officeDocument/2006/math" xmlns:v="urn:schemas-microsoft-com:vml" xmlns:wp14="http://schemas.microsoft.com/office/word/2010/wordprocessingDrawing" xmlns:wp="http://schemas.openxmlformats.org/drawingml/2006/wordprocessingDrawing" xmlns:w10="urn:schemas-microsoft-com:office:word" xmlns:w="http://schemas.openxmlformats.org/wordprocessingml/2006/main" xmlns:w14="http://schemas.microsoft.com/office/word/2010/wordml" xmlns:w15="http://schemas.microsoft.com/office/word/2012/wordml" xmlns:w16cex="http://schemas.microsoft.com/office/word/2018/wordml/cex" xmlns:w16cid="http://schemas.microsoft.com/office/word/2016/wordml/cid" xmlns:w16="http://schemas.microsoft.com/office/word/2018/wordml" xmlns:w16sdtdh="http://schemas.microsoft.com/office/word/2020/wordml/sdtdatahash" xmlns:w16se="http://schemas.microsoft.com/office/word/2015/wordml/symex" xmlns:wpg="http://schemas.microsoft.com/office/word/2010/wordprocessingGroup" xmlns:wpi="http://schemas.microsoft.com/office/word/2010/wordprocessingInk" xmlns:wne="http://schemas.microsoft.com/office/word/2006/wordml" xmlns:wps="http://schemas.microsoft.com/office/word/2010/wordprocessingShape" mc:Ignorable="w14 w15 w16se w16cid w16 w16cex w16sdtdh wp14">
   <w:body>
     <w:p>
       <w:pPr>
-        <w:pStyle w:val="Ttulo1"/>
+        <w:pStyle w:val="Heading1"/>
         <w:jc w:val="center"/>
       </w:pPr>
+      <w:bookmarkStart w:id="0" w:name="_Toc240009152"/>
+      <w:proofErr w:type="spellStart"/>
       <w:r>
         <w:t>SoulPass</w:t>
       </w:r>
+      <w:bookmarkEnd w:id="0"/>
+      <w:proofErr w:type="spellEnd"/>
     </w:p>
     <w:p>
       <w:pPr>
@@ -37,7 +41,7 @@
                     </pic:cNvPicPr>
                   </pic:nvPicPr>
                   <pic:blipFill>
-                    <a:blip r:embed="rId5">
+                    <a:blip r:embed="rId8">
                       <a:extLst>
                         <a:ext uri="{28A0092B-C50C-407E-A947-70E740481C1C}">
                           <a14:useLocalDpi xmlns:a14="http://schemas.microsoft.com/office/drawing/2010/main" val="0"/>
@@ -137,7 +141,15 @@
         <w:t xml:space="preserve">Renato Ruiz Ferreira </w:t>
       </w:r>
       <w:r>
-        <w:t xml:space="preserve">Fonseca Scolamieri </w:t>
+        <w:t xml:space="preserve">Fonseca </w:t>
+      </w:r>
+      <w:proofErr w:type="spellStart"/>
+      <w:r>
+        <w:t>Scolamieri</w:t>
+      </w:r>
+      <w:proofErr w:type="spellEnd"/>
+      <w:r>
+        <w:t xml:space="preserve"> </w:t>
       </w:r>
       <w:r>
         <w:t>–</w:t>
@@ -193,6 +205,7 @@
       <w:r>
         <w:t xml:space="preserve">Sistema </w:t>
       </w:r>
+      <w:proofErr w:type="spellStart"/>
       <w:r>
         <w:rPr>
           <w:i/>
@@ -200,6 +213,7 @@
         </w:rPr>
         <w:t>SoulPass</w:t>
       </w:r>
+      <w:proofErr w:type="spellEnd"/>
       <w:r>
         <w:t xml:space="preserve"> de </w:t>
       </w:r>
@@ -216,20 +230,847 @@
     <w:p/>
     <w:p>
       <w:pPr>
-        <w:pStyle w:val="Ttulo1"/>
-      </w:pPr>
+        <w:pStyle w:val="Heading1"/>
+      </w:pPr>
+      <w:bookmarkStart w:id="1" w:name="_Toc240009153"/>
       <w:r>
         <w:lastRenderedPageBreak/>
+        <w:t>Sumário</w:t>
+      </w:r>
+      <w:bookmarkEnd w:id="1"/>
+    </w:p>
+    <w:sdt>
+      <w:sdtPr>
+        <w:id w:val="-1601644247"/>
+        <w:docPartObj>
+          <w:docPartGallery w:val="Table of Contents"/>
+          <w:docPartUnique/>
+        </w:docPartObj>
+      </w:sdtPr>
+      <w:sdtEndPr>
+        <w:rPr>
+          <w:rFonts w:ascii="Arial" w:eastAsiaTheme="minorHAnsi" w:hAnsi="Arial" w:cs="Arial"/>
+          <w:b/>
+          <w:bCs/>
+          <w:noProof/>
+          <w:color w:val="auto"/>
+          <w:kern w:val="2"/>
+          <w:sz w:val="24"/>
+          <w:szCs w:val="24"/>
+          <w:lang w:val="pt-BR"/>
+          <w14:ligatures w14:val="standardContextual"/>
+        </w:rPr>
+      </w:sdtEndPr>
+      <w:sdtContent>
+        <w:p>
+          <w:pPr>
+            <w:pStyle w:val="TOCHeading"/>
+            <w:spacing w:line="360" w:lineRule="auto"/>
+            <w:rPr>
+              <w:rFonts w:ascii="Arial" w:hAnsi="Arial" w:cs="Arial"/>
+              <w:color w:val="000000" w:themeColor="text1"/>
+              <w:sz w:val="28"/>
+              <w:szCs w:val="28"/>
+            </w:rPr>
+          </w:pPr>
+          <w:r>
+            <w:rPr>
+              <w:rFonts w:ascii="Arial" w:hAnsi="Arial" w:cs="Arial"/>
+              <w:color w:val="000000" w:themeColor="text1"/>
+              <w:sz w:val="28"/>
+              <w:szCs w:val="28"/>
+            </w:rPr>
+            <w:t>Contents</w:t>
+          </w:r>
+        </w:p>
+        <w:p>
+          <w:pPr>
+            <w:pStyle w:val="TOC1"/>
+            <w:tabs>
+              <w:tab w:val="right" w:leader="dot" w:pos="8494"/>
+            </w:tabs>
+            <w:rPr>
+              <w:noProof/>
+            </w:rPr>
+          </w:pPr>
+          <w:r>
+            <w:fldChar w:fldCharType="begin"/>
+          </w:r>
+          <w:r>
+            <w:instrText xml:space="preserve"> TOC \o "1-3" \h \z \u </w:instrText>
+          </w:r>
+          <w:r>
+            <w:fldChar w:fldCharType="separate"/>
+          </w:r>
+          <w:hyperlink w:anchor="_Toc240009152" w:history="1">
+            <w:r>
+              <w:rPr>
+                <w:rStyle w:val="Hyperlink"/>
+                <w:noProof/>
+              </w:rPr>
+              <w:t>SoulPass</w:t>
+            </w:r>
+            <w:r>
+              <w:rPr>
+                <w:noProof/>
+                <w:webHidden/>
+              </w:rPr>
+              <w:tab/>
+            </w:r>
+            <w:r>
+              <w:rPr>
+                <w:noProof/>
+                <w:webHidden/>
+              </w:rPr>
+              <w:fldChar w:fldCharType="begin"/>
+            </w:r>
+            <w:r>
+              <w:rPr>
+                <w:noProof/>
+                <w:webHidden/>
+              </w:rPr>
+              <w:instrText xml:space="preserve"> PAGEREF _Toc240009152 \h </w:instrText>
+            </w:r>
+            <w:r>
+              <w:rPr>
+                <w:noProof/>
+                <w:webHidden/>
+              </w:rPr>
+            </w:r>
+            <w:r>
+              <w:rPr>
+                <w:noProof/>
+                <w:webHidden/>
+              </w:rPr>
+              <w:fldChar w:fldCharType="separate"/>
+            </w:r>
+            <w:r>
+              <w:rPr>
+                <w:noProof/>
+                <w:webHidden/>
+              </w:rPr>
+              <w:t>1</w:t>
+            </w:r>
+            <w:r>
+              <w:rPr>
+                <w:noProof/>
+                <w:webHidden/>
+              </w:rPr>
+              <w:fldChar w:fldCharType="end"/>
+            </w:r>
+          </w:hyperlink>
+        </w:p>
+        <w:p>
+          <w:pPr>
+            <w:pStyle w:val="TOC1"/>
+            <w:tabs>
+              <w:tab w:val="right" w:leader="dot" w:pos="8494"/>
+            </w:tabs>
+            <w:rPr>
+              <w:noProof/>
+            </w:rPr>
+          </w:pPr>
+          <w:hyperlink w:anchor="_Toc240009153" w:history="1">
+            <w:r>
+              <w:rPr>
+                <w:rStyle w:val="Hyperlink"/>
+                <w:noProof/>
+              </w:rPr>
+              <w:t>Sumário</w:t>
+            </w:r>
+            <w:r>
+              <w:rPr>
+                <w:noProof/>
+                <w:webHidden/>
+              </w:rPr>
+              <w:tab/>
+            </w:r>
+            <w:r>
+              <w:rPr>
+                <w:noProof/>
+                <w:webHidden/>
+              </w:rPr>
+              <w:fldChar w:fldCharType="begin"/>
+            </w:r>
+            <w:r>
+              <w:rPr>
+                <w:noProof/>
+                <w:webHidden/>
+              </w:rPr>
+              <w:instrText xml:space="preserve"> PAGEREF _Toc240009153 \h </w:instrText>
+            </w:r>
+            <w:r>
+              <w:rPr>
+                <w:noProof/>
+                <w:webHidden/>
+              </w:rPr>
+            </w:r>
+            <w:r>
+              <w:rPr>
+                <w:noProof/>
+                <w:webHidden/>
+              </w:rPr>
+              <w:fldChar w:fldCharType="separate"/>
+            </w:r>
+            <w:r>
+              <w:rPr>
+                <w:noProof/>
+                <w:webHidden/>
+              </w:rPr>
+              <w:t>2</w:t>
+            </w:r>
+            <w:r>
+              <w:rPr>
+                <w:noProof/>
+                <w:webHidden/>
+              </w:rPr>
+              <w:fldChar w:fldCharType="end"/>
+            </w:r>
+          </w:hyperlink>
+        </w:p>
+        <w:p>
+          <w:pPr>
+            <w:pStyle w:val="TOC1"/>
+            <w:tabs>
+              <w:tab w:val="right" w:leader="dot" w:pos="8494"/>
+            </w:tabs>
+            <w:rPr>
+              <w:noProof/>
+            </w:rPr>
+          </w:pPr>
+          <w:hyperlink w:anchor="_Toc240009154" w:history="1">
+            <w:r>
+              <w:rPr>
+                <w:rStyle w:val="Hyperlink"/>
+                <w:noProof/>
+              </w:rPr>
+              <w:t>1. Objetivo e escopo do projeto</w:t>
+            </w:r>
+            <w:r>
+              <w:rPr>
+                <w:noProof/>
+                <w:webHidden/>
+              </w:rPr>
+              <w:tab/>
+            </w:r>
+            <w:r>
+              <w:rPr>
+                <w:noProof/>
+                <w:webHidden/>
+              </w:rPr>
+              <w:fldChar w:fldCharType="begin"/>
+            </w:r>
+            <w:r>
+              <w:rPr>
+                <w:noProof/>
+                <w:webHidden/>
+              </w:rPr>
+              <w:instrText xml:space="preserve"> PAGEREF _Toc240009154 \h </w:instrText>
+            </w:r>
+            <w:r>
+              <w:rPr>
+                <w:noProof/>
+                <w:webHidden/>
+              </w:rPr>
+            </w:r>
+            <w:r>
+              <w:rPr>
+                <w:noProof/>
+                <w:webHidden/>
+              </w:rPr>
+              <w:fldChar w:fldCharType="separate"/>
+            </w:r>
+            <w:r>
+              <w:rPr>
+                <w:noProof/>
+                <w:webHidden/>
+              </w:rPr>
+              <w:t>2</w:t>
+            </w:r>
+            <w:r>
+              <w:rPr>
+                <w:noProof/>
+                <w:webHidden/>
+              </w:rPr>
+              <w:fldChar w:fldCharType="end"/>
+            </w:r>
+          </w:hyperlink>
+        </w:p>
+        <w:p>
+          <w:pPr>
+            <w:pStyle w:val="TOC2"/>
+            <w:tabs>
+              <w:tab w:val="right" w:leader="dot" w:pos="8494"/>
+            </w:tabs>
+            <w:rPr>
+              <w:noProof/>
+            </w:rPr>
+          </w:pPr>
+          <w:hyperlink w:anchor="_Toc240009155" w:history="1">
+            <w:r>
+              <w:rPr>
+                <w:rStyle w:val="Hyperlink"/>
+                <w:noProof/>
+              </w:rPr>
+              <w:t>1.1. O objetivo da SoulPass e da Aplicação</w:t>
+            </w:r>
+            <w:r>
+              <w:rPr>
+                <w:noProof/>
+                <w:webHidden/>
+              </w:rPr>
+              <w:tab/>
+            </w:r>
+            <w:r>
+              <w:rPr>
+                <w:noProof/>
+                <w:webHidden/>
+              </w:rPr>
+              <w:fldChar w:fldCharType="begin"/>
+            </w:r>
+            <w:r>
+              <w:rPr>
+                <w:noProof/>
+                <w:webHidden/>
+              </w:rPr>
+              <w:instrText xml:space="preserve"> PAGEREF _Toc240009155 \h </w:instrText>
+            </w:r>
+            <w:r>
+              <w:rPr>
+                <w:noProof/>
+                <w:webHidden/>
+              </w:rPr>
+            </w:r>
+            <w:r>
+              <w:rPr>
+                <w:noProof/>
+                <w:webHidden/>
+              </w:rPr>
+              <w:fldChar w:fldCharType="separate"/>
+            </w:r>
+            <w:r>
+              <w:rPr>
+                <w:noProof/>
+                <w:webHidden/>
+              </w:rPr>
+              <w:t>2</w:t>
+            </w:r>
+            <w:r>
+              <w:rPr>
+                <w:noProof/>
+                <w:webHidden/>
+              </w:rPr>
+              <w:fldChar w:fldCharType="end"/>
+            </w:r>
+          </w:hyperlink>
+        </w:p>
+        <w:p>
+          <w:pPr>
+            <w:pStyle w:val="TOC2"/>
+            <w:tabs>
+              <w:tab w:val="right" w:leader="dot" w:pos="8494"/>
+            </w:tabs>
+            <w:rPr>
+              <w:noProof/>
+            </w:rPr>
+          </w:pPr>
+          <w:hyperlink w:anchor="_Toc240009156" w:history="1">
+            <w:r>
+              <w:rPr>
+                <w:rStyle w:val="Hyperlink"/>
+                <w:noProof/>
+              </w:rPr>
+              <w:t>1.2. O Escopo desse projeto</w:t>
+            </w:r>
+            <w:r>
+              <w:rPr>
+                <w:noProof/>
+                <w:webHidden/>
+              </w:rPr>
+              <w:tab/>
+            </w:r>
+            <w:r>
+              <w:rPr>
+                <w:noProof/>
+                <w:webHidden/>
+              </w:rPr>
+              <w:fldChar w:fldCharType="begin"/>
+            </w:r>
+            <w:r>
+              <w:rPr>
+                <w:noProof/>
+                <w:webHidden/>
+              </w:rPr>
+              <w:instrText xml:space="preserve"> PAGEREF _Toc240009156 \h </w:instrText>
+            </w:r>
+            <w:r>
+              <w:rPr>
+                <w:noProof/>
+                <w:webHidden/>
+              </w:rPr>
+            </w:r>
+            <w:r>
+              <w:rPr>
+                <w:noProof/>
+                <w:webHidden/>
+              </w:rPr>
+              <w:fldChar w:fldCharType="separate"/>
+            </w:r>
+            <w:r>
+              <w:rPr>
+                <w:noProof/>
+                <w:webHidden/>
+              </w:rPr>
+              <w:t>3</w:t>
+            </w:r>
+            <w:r>
+              <w:rPr>
+                <w:noProof/>
+                <w:webHidden/>
+              </w:rPr>
+              <w:fldChar w:fldCharType="end"/>
+            </w:r>
+          </w:hyperlink>
+        </w:p>
+        <w:p>
+          <w:pPr>
+            <w:pStyle w:val="TOC3"/>
+            <w:tabs>
+              <w:tab w:val="right" w:leader="dot" w:pos="8494"/>
+            </w:tabs>
+            <w:rPr>
+              <w:noProof/>
+            </w:rPr>
+          </w:pPr>
+          <w:hyperlink w:anchor="_Toc240009157" w:history="1">
+            <w:r>
+              <w:rPr>
+                <w:rStyle w:val="Hyperlink"/>
+                <w:noProof/>
+              </w:rPr>
+              <w:t>1.2.1. O que ele pode fazer:</w:t>
+            </w:r>
+            <w:r>
+              <w:rPr>
+                <w:noProof/>
+                <w:webHidden/>
+              </w:rPr>
+              <w:tab/>
+            </w:r>
+            <w:r>
+              <w:rPr>
+                <w:noProof/>
+                <w:webHidden/>
+              </w:rPr>
+              <w:fldChar w:fldCharType="begin"/>
+            </w:r>
+            <w:r>
+              <w:rPr>
+                <w:noProof/>
+                <w:webHidden/>
+              </w:rPr>
+              <w:instrText xml:space="preserve"> PAGEREF _Toc240009157 \h </w:instrText>
+            </w:r>
+            <w:r>
+              <w:rPr>
+                <w:noProof/>
+                <w:webHidden/>
+              </w:rPr>
+            </w:r>
+            <w:r>
+              <w:rPr>
+                <w:noProof/>
+                <w:webHidden/>
+              </w:rPr>
+              <w:fldChar w:fldCharType="separate"/>
+            </w:r>
+            <w:r>
+              <w:rPr>
+                <w:noProof/>
+                <w:webHidden/>
+              </w:rPr>
+              <w:t>3</w:t>
+            </w:r>
+            <w:r>
+              <w:rPr>
+                <w:noProof/>
+                <w:webHidden/>
+              </w:rPr>
+              <w:fldChar w:fldCharType="end"/>
+            </w:r>
+          </w:hyperlink>
+        </w:p>
+        <w:p>
+          <w:pPr>
+            <w:pStyle w:val="TOC3"/>
+            <w:tabs>
+              <w:tab w:val="right" w:leader="dot" w:pos="8494"/>
+            </w:tabs>
+            <w:rPr>
+              <w:noProof/>
+            </w:rPr>
+          </w:pPr>
+          <w:hyperlink w:anchor="_Toc240009158" w:history="1">
+            <w:r>
+              <w:rPr>
+                <w:rStyle w:val="Hyperlink"/>
+                <w:noProof/>
+              </w:rPr>
+              <w:t>1.2.2. O que ele (ainda) não pode fazer:</w:t>
+            </w:r>
+            <w:r>
+              <w:rPr>
+                <w:noProof/>
+                <w:webHidden/>
+              </w:rPr>
+              <w:tab/>
+            </w:r>
+            <w:r>
+              <w:rPr>
+                <w:noProof/>
+                <w:webHidden/>
+              </w:rPr>
+              <w:fldChar w:fldCharType="begin"/>
+            </w:r>
+            <w:r>
+              <w:rPr>
+                <w:noProof/>
+                <w:webHidden/>
+              </w:rPr>
+              <w:instrText xml:space="preserve"> PAGEREF _Toc240009158 \h </w:instrText>
+            </w:r>
+            <w:r>
+              <w:rPr>
+                <w:noProof/>
+                <w:webHidden/>
+              </w:rPr>
+            </w:r>
+            <w:r>
+              <w:rPr>
+                <w:noProof/>
+                <w:webHidden/>
+              </w:rPr>
+              <w:fldChar w:fldCharType="separate"/>
+            </w:r>
+            <w:r>
+              <w:rPr>
+                <w:noProof/>
+                <w:webHidden/>
+              </w:rPr>
+              <w:t>4</w:t>
+            </w:r>
+            <w:r>
+              <w:rPr>
+                <w:noProof/>
+                <w:webHidden/>
+              </w:rPr>
+              <w:fldChar w:fldCharType="end"/>
+            </w:r>
+          </w:hyperlink>
+        </w:p>
+        <w:p>
+          <w:pPr>
+            <w:pStyle w:val="TOC1"/>
+            <w:tabs>
+              <w:tab w:val="right" w:leader="dot" w:pos="8494"/>
+            </w:tabs>
+            <w:rPr>
+              <w:noProof/>
+            </w:rPr>
+          </w:pPr>
+          <w:hyperlink w:anchor="_Toc240009159" w:history="1">
+            <w:r>
+              <w:rPr>
+                <w:rStyle w:val="Hyperlink"/>
+                <w:noProof/>
+                <w:lang w:val="en-US"/>
+              </w:rPr>
+              <w:t>2. Protótipo</w:t>
+            </w:r>
+            <w:r>
+              <w:rPr>
+                <w:noProof/>
+                <w:webHidden/>
+              </w:rPr>
+              <w:tab/>
+            </w:r>
+            <w:r>
+              <w:rPr>
+                <w:noProof/>
+                <w:webHidden/>
+              </w:rPr>
+              <w:fldChar w:fldCharType="begin"/>
+            </w:r>
+            <w:r>
+              <w:rPr>
+                <w:noProof/>
+                <w:webHidden/>
+              </w:rPr>
+              <w:instrText xml:space="preserve"> PAGEREF _Toc240009159 \h </w:instrText>
+            </w:r>
+            <w:r>
+              <w:rPr>
+                <w:noProof/>
+                <w:webHidden/>
+              </w:rPr>
+            </w:r>
+            <w:r>
+              <w:rPr>
+                <w:noProof/>
+                <w:webHidden/>
+              </w:rPr>
+              <w:fldChar w:fldCharType="separate"/>
+            </w:r>
+            <w:r>
+              <w:rPr>
+                <w:noProof/>
+                <w:webHidden/>
+              </w:rPr>
+              <w:t>4</w:t>
+            </w:r>
+            <w:r>
+              <w:rPr>
+                <w:noProof/>
+                <w:webHidden/>
+              </w:rPr>
+              <w:fldChar w:fldCharType="end"/>
+            </w:r>
+          </w:hyperlink>
+        </w:p>
+        <w:p>
+          <w:pPr>
+            <w:pStyle w:val="TOC1"/>
+            <w:tabs>
+              <w:tab w:val="right" w:leader="dot" w:pos="8494"/>
+            </w:tabs>
+            <w:rPr>
+              <w:noProof/>
+            </w:rPr>
+          </w:pPr>
+          <w:hyperlink w:anchor="_Toc240009160" w:history="1">
+            <w:r>
+              <w:rPr>
+                <w:rStyle w:val="Hyperlink"/>
+                <w:noProof/>
+              </w:rPr>
+              <w:t>3. MER (Modelo de Entidade e Relacionamento)</w:t>
+            </w:r>
+            <w:r>
+              <w:rPr>
+                <w:noProof/>
+                <w:webHidden/>
+              </w:rPr>
+              <w:tab/>
+            </w:r>
+            <w:r>
+              <w:rPr>
+                <w:noProof/>
+                <w:webHidden/>
+              </w:rPr>
+              <w:fldChar w:fldCharType="begin"/>
+            </w:r>
+            <w:r>
+              <w:rPr>
+                <w:noProof/>
+                <w:webHidden/>
+              </w:rPr>
+              <w:instrText xml:space="preserve"> PAGEREF _Toc240009160 \h </w:instrText>
+            </w:r>
+            <w:r>
+              <w:rPr>
+                <w:noProof/>
+                <w:webHidden/>
+              </w:rPr>
+            </w:r>
+            <w:r>
+              <w:rPr>
+                <w:noProof/>
+                <w:webHidden/>
+              </w:rPr>
+              <w:fldChar w:fldCharType="separate"/>
+            </w:r>
+            <w:r>
+              <w:rPr>
+                <w:noProof/>
+                <w:webHidden/>
+              </w:rPr>
+              <w:t>4</w:t>
+            </w:r>
+            <w:r>
+              <w:rPr>
+                <w:noProof/>
+                <w:webHidden/>
+              </w:rPr>
+              <w:fldChar w:fldCharType="end"/>
+            </w:r>
+          </w:hyperlink>
+        </w:p>
+        <w:p>
+          <w:pPr>
+            <w:pStyle w:val="TOC1"/>
+            <w:tabs>
+              <w:tab w:val="right" w:leader="dot" w:pos="8494"/>
+            </w:tabs>
+            <w:rPr>
+              <w:noProof/>
+            </w:rPr>
+          </w:pPr>
+          <w:hyperlink w:anchor="_Toc240009161" w:history="1">
+            <w:r>
+              <w:rPr>
+                <w:rStyle w:val="Hyperlink"/>
+                <w:noProof/>
+              </w:rPr>
+              <w:t>4. Diagrama de Classes</w:t>
+            </w:r>
+            <w:r>
+              <w:rPr>
+                <w:noProof/>
+                <w:webHidden/>
+              </w:rPr>
+              <w:tab/>
+            </w:r>
+            <w:r>
+              <w:rPr>
+                <w:noProof/>
+                <w:webHidden/>
+              </w:rPr>
+              <w:fldChar w:fldCharType="begin"/>
+            </w:r>
+            <w:r>
+              <w:rPr>
+                <w:noProof/>
+                <w:webHidden/>
+              </w:rPr>
+              <w:instrText xml:space="preserve"> PAGEREF _Toc240009161 \h </w:instrText>
+            </w:r>
+            <w:r>
+              <w:rPr>
+                <w:noProof/>
+                <w:webHidden/>
+              </w:rPr>
+            </w:r>
+            <w:r>
+              <w:rPr>
+                <w:noProof/>
+                <w:webHidden/>
+              </w:rPr>
+              <w:fldChar w:fldCharType="separate"/>
+            </w:r>
+            <w:r>
+              <w:rPr>
+                <w:noProof/>
+                <w:webHidden/>
+              </w:rPr>
+              <w:t>5</w:t>
+            </w:r>
+            <w:r>
+              <w:rPr>
+                <w:noProof/>
+                <w:webHidden/>
+              </w:rPr>
+              <w:fldChar w:fldCharType="end"/>
+            </w:r>
+          </w:hyperlink>
+        </w:p>
+        <w:p>
+          <w:pPr>
+            <w:pStyle w:val="TOC1"/>
+            <w:tabs>
+              <w:tab w:val="right" w:leader="dot" w:pos="8494"/>
+            </w:tabs>
+            <w:rPr>
+              <w:noProof/>
+            </w:rPr>
+          </w:pPr>
+          <w:hyperlink w:anchor="_Toc240009162" w:history="1">
+            <w:r>
+              <w:rPr>
+                <w:rStyle w:val="Hyperlink"/>
+                <w:noProof/>
+              </w:rPr>
+              <w:t>5. Como rodar a aplicação?</w:t>
+            </w:r>
+            <w:r>
+              <w:rPr>
+                <w:noProof/>
+                <w:webHidden/>
+              </w:rPr>
+              <w:tab/>
+            </w:r>
+            <w:r>
+              <w:rPr>
+                <w:noProof/>
+                <w:webHidden/>
+              </w:rPr>
+              <w:fldChar w:fldCharType="begin"/>
+            </w:r>
+            <w:r>
+              <w:rPr>
+                <w:noProof/>
+                <w:webHidden/>
+              </w:rPr>
+              <w:instrText xml:space="preserve"> PAGEREF _Toc240009162 \h </w:instrText>
+            </w:r>
+            <w:r>
+              <w:rPr>
+                <w:noProof/>
+                <w:webHidden/>
+              </w:rPr>
+            </w:r>
+            <w:r>
+              <w:rPr>
+                <w:noProof/>
+                <w:webHidden/>
+              </w:rPr>
+              <w:fldChar w:fldCharType="separate"/>
+            </w:r>
+            <w:r>
+              <w:rPr>
+                <w:noProof/>
+                <w:webHidden/>
+              </w:rPr>
+              <w:t>5</w:t>
+            </w:r>
+            <w:r>
+              <w:rPr>
+                <w:noProof/>
+                <w:webHidden/>
+              </w:rPr>
+              <w:fldChar w:fldCharType="end"/>
+            </w:r>
+          </w:hyperlink>
+        </w:p>
+        <w:p>
+          <w:r>
+            <w:rPr>
+              <w:b/>
+              <w:bCs/>
+              <w:noProof/>
+            </w:rPr>
+            <w:fldChar w:fldCharType="end"/>
+          </w:r>
+        </w:p>
+      </w:sdtContent>
+    </w:sdt>
+    <w:p>
+      <w:pPr>
+        <w:pStyle w:val="Heading1"/>
+      </w:pPr>
+      <w:bookmarkStart w:id="2" w:name="_Toc240009154"/>
+      <w:r>
         <w:t xml:space="preserve">1. </w:t>
       </w:r>
       <w:r>
         <w:t>Objetivo e escopo do projeto</w:t>
       </w:r>
-    </w:p>
-    <w:p>
-      <w:pPr>
-        <w:pStyle w:val="Ttulo2"/>
-      </w:pPr>
+      <w:bookmarkEnd w:id="2"/>
+    </w:p>
+    <w:p>
+      <w:pPr>
+        <w:pStyle w:val="Heading2"/>
+      </w:pPr>
+      <w:bookmarkStart w:id="3" w:name="_Toc240009155"/>
       <w:r>
         <w:t>1.</w:t>
       </w:r>
@@ -240,8 +1081,17 @@
         <w:t xml:space="preserve">. </w:t>
       </w:r>
       <w:r>
-        <w:t>O objetivo da SoulPass e da Aplicação</w:t>
-      </w:r>
+        <w:t xml:space="preserve">O objetivo da </w:t>
+      </w:r>
+      <w:proofErr w:type="spellStart"/>
+      <w:r>
+        <w:t>SoulPass</w:t>
+      </w:r>
+      <w:proofErr w:type="spellEnd"/>
+      <w:r>
+        <w:t xml:space="preserve"> e da Aplicação</w:t>
+      </w:r>
+      <w:bookmarkEnd w:id="3"/>
     </w:p>
     <w:p>
       <w:pPr>
@@ -259,6 +1109,7 @@
         </w:rPr>
         <w:t xml:space="preserve">O </w:t>
       </w:r>
+      <w:proofErr w:type="spellStart"/>
       <w:r>
         <w:rPr>
           <w:b/>
@@ -268,6 +1119,7 @@
         </w:rPr>
         <w:t>SoulPass</w:t>
       </w:r>
+      <w:proofErr w:type="spellEnd"/>
       <w:r>
         <w:rPr>
           <w:b/>
@@ -275,6 +1127,7 @@
         </w:rPr>
         <w:t xml:space="preserve"> é uma solução inovadora desenvolvida em parceria com a </w:t>
       </w:r>
+      <w:proofErr w:type="spellStart"/>
       <w:r>
         <w:rPr>
           <w:b/>
@@ -284,6 +1137,7 @@
         </w:rPr>
         <w:t>SoulUp</w:t>
       </w:r>
+      <w:proofErr w:type="spellEnd"/>
       <w:r>
         <w:rPr>
           <w:b/>
@@ -291,6 +1145,7 @@
         </w:rPr>
         <w:t xml:space="preserve"> como parte do </w:t>
       </w:r>
+      <w:proofErr w:type="spellStart"/>
       <w:r>
         <w:rPr>
           <w:b/>
@@ -300,6 +1155,7 @@
         </w:rPr>
         <w:t>Challenge</w:t>
       </w:r>
+      <w:proofErr w:type="spellEnd"/>
       <w:r>
         <w:rPr>
           <w:b/>
@@ -341,6 +1197,7 @@
         </w:rPr>
         <w:t xml:space="preserve">Converta pontos acumulados na plataforma </w:t>
       </w:r>
+      <w:proofErr w:type="spellStart"/>
       <w:r>
         <w:rPr>
           <w:b/>
@@ -350,6 +1207,7 @@
         </w:rPr>
         <w:t>SoulUp</w:t>
       </w:r>
+      <w:proofErr w:type="spellEnd"/>
       <w:r>
         <w:rPr>
           <w:b/>
@@ -416,8 +1274,13 @@
         <w:t xml:space="preserve"> acumulam pontos </w:t>
       </w:r>
       <w:r>
-        <w:t>no aplicativo SoulUp</w:t>
-      </w:r>
+        <w:t xml:space="preserve">no aplicativo </w:t>
+      </w:r>
+      <w:proofErr w:type="spellStart"/>
+      <w:r>
+        <w:t>SoulUp</w:t>
+      </w:r>
+      <w:proofErr w:type="spellEnd"/>
       <w:r>
         <w:t xml:space="preserve"> </w:t>
       </w:r>
@@ -465,6 +1328,7 @@
     </w:p>
     <w:p>
       <w:r>
+        <w:lastRenderedPageBreak/>
         <w:tab/>
       </w:r>
       <w:r>
@@ -492,14 +1356,29 @@
         <w:rPr>
           <w:rFonts w:ascii="Segoe UI Emoji" w:hAnsi="Segoe UI Emoji" w:cs="Segoe UI Emoji"/>
         </w:rPr>
-        <w:t>➡️</w:t>
-      </w:r>
-      <w:r>
-        <w:rPr>
-          <w:b/>
-          <w:bCs/>
-        </w:rPr>
-        <w:t xml:space="preserve">Se desloque e ganhe muito mais pontos </w:t>
+        <w:t>➡</w:t>
+      </w:r>
+      <w:proofErr w:type="gramStart"/>
+      <w:r>
+        <w:rPr>
+          <w:rFonts w:ascii="Segoe UI Emoji" w:hAnsi="Segoe UI Emoji" w:cs="Segoe UI Emoji"/>
+        </w:rPr>
+        <w:t>️</w:t>
+      </w:r>
+      <w:r>
+        <w:rPr>
+          <w:b/>
+          <w:bCs/>
+        </w:rPr>
+        <w:t>Se</w:t>
+      </w:r>
+      <w:proofErr w:type="gramEnd"/>
+      <w:r>
+        <w:rPr>
+          <w:b/>
+          <w:bCs/>
+        </w:rPr>
+        <w:t xml:space="preserve"> desloque e ganhe muito mais pontos </w:t>
       </w:r>
       <w:r>
         <w:t>na plataforma.</w:t>
@@ -567,7 +1446,11 @@
         <w:t xml:space="preserve"> </w:t>
       </w:r>
       <w:r>
-        <w:t>tendo limite de 6km por dia</w:t>
+        <w:t xml:space="preserve">tendo limite de 6km por </w:t>
+      </w:r>
+      <w:proofErr w:type="gramStart"/>
+      <w:r>
+        <w:t>dia</w:t>
       </w:r>
       <w:r>
         <w:t xml:space="preserve">  </w:t>
@@ -578,6 +1461,7 @@
         </w:rPr>
         <w:t>—</w:t>
       </w:r>
+      <w:proofErr w:type="gramEnd"/>
       <w:r>
         <w:t xml:space="preserve"> </w:t>
       </w:r>
@@ -656,6 +1540,7 @@
       <w:r>
         <w:t xml:space="preserve"> de classes modelo, </w:t>
       </w:r>
+      <w:proofErr w:type="spellStart"/>
       <w:r>
         <w:rPr>
           <w:i/>
@@ -663,6 +1548,7 @@
         </w:rPr>
         <w:t>enums</w:t>
       </w:r>
+      <w:proofErr w:type="spellEnd"/>
       <w:r>
         <w:t xml:space="preserve">, </w:t>
       </w:r>
@@ -679,6 +1565,7 @@
       <w:r>
         <w:t xml:space="preserve"> </w:t>
       </w:r>
+      <w:proofErr w:type="spellStart"/>
       <w:r>
         <w:rPr>
           <w:i/>
@@ -686,6 +1573,7 @@
         </w:rPr>
         <w:t>daos</w:t>
       </w:r>
+      <w:proofErr w:type="spellEnd"/>
       <w:r>
         <w:t xml:space="preserve"> </w:t>
       </w:r>
@@ -700,6 +1588,10 @@
     <w:p>
       <w:pPr>
         <w:ind w:firstLine="708"/>
+        <w:rPr>
+          <w:b/>
+          <w:bCs/>
+        </w:rPr>
       </w:pPr>
       <w:r>
         <w:t xml:space="preserve">A equipe está em </w:t>
@@ -724,35 +1616,27 @@
     </w:p>
     <w:p>
       <w:pPr>
-        <w:pStyle w:val="Ttulo2"/>
-      </w:pPr>
-    </w:p>
-    <w:p>
-      <w:pPr>
-        <w:pStyle w:val="Ttulo2"/>
-      </w:pPr>
-    </w:p>
-    <w:p/>
-    <w:p>
-      <w:pPr>
-        <w:pStyle w:val="Ttulo2"/>
-      </w:pPr>
-      <w:r>
-        <w:lastRenderedPageBreak/>
+        <w:pStyle w:val="Heading2"/>
+      </w:pPr>
+      <w:bookmarkStart w:id="4" w:name="_Toc240009156"/>
+      <w:r>
         <w:t>1.2. O Escopo desse projeto</w:t>
       </w:r>
-    </w:p>
-    <w:p>
-      <w:pPr>
-        <w:pStyle w:val="Ttulo3"/>
-      </w:pPr>
+      <w:bookmarkEnd w:id="4"/>
+    </w:p>
+    <w:p>
+      <w:pPr>
+        <w:pStyle w:val="Heading3"/>
+      </w:pPr>
+      <w:bookmarkStart w:id="5" w:name="_Toc240009157"/>
       <w:r>
         <w:t>1.2.1. O que ele pode fazer:</w:t>
       </w:r>
-    </w:p>
-    <w:p>
-      <w:pPr>
-        <w:pStyle w:val="PargrafodaLista"/>
+      <w:bookmarkEnd w:id="5"/>
+    </w:p>
+    <w:p>
+      <w:pPr>
+        <w:pStyle w:val="ListParagraph"/>
         <w:numPr>
           <w:ilvl w:val="0"/>
           <w:numId w:val="5"/>
@@ -767,7 +1651,7 @@
     </w:p>
     <w:p>
       <w:pPr>
-        <w:pStyle w:val="PargrafodaLista"/>
+        <w:pStyle w:val="ListParagraph"/>
         <w:numPr>
           <w:ilvl w:val="0"/>
           <w:numId w:val="5"/>
@@ -789,7 +1673,7 @@
     </w:p>
     <w:p>
       <w:pPr>
-        <w:pStyle w:val="PargrafodaLista"/>
+        <w:pStyle w:val="ListParagraph"/>
         <w:numPr>
           <w:ilvl w:val="0"/>
           <w:numId w:val="5"/>
@@ -807,7 +1691,7 @@
     </w:p>
     <w:p>
       <w:pPr>
-        <w:pStyle w:val="PargrafodaLista"/>
+        <w:pStyle w:val="ListParagraph"/>
         <w:numPr>
           <w:ilvl w:val="0"/>
           <w:numId w:val="5"/>
@@ -825,7 +1709,7 @@
     </w:p>
     <w:p>
       <w:pPr>
-        <w:pStyle w:val="PargrafodaLista"/>
+        <w:pStyle w:val="ListParagraph"/>
         <w:numPr>
           <w:ilvl w:val="0"/>
           <w:numId w:val="5"/>
@@ -840,7 +1724,7 @@
     </w:p>
     <w:p>
       <w:pPr>
-        <w:pStyle w:val="PargrafodaLista"/>
+        <w:pStyle w:val="ListParagraph"/>
         <w:numPr>
           <w:ilvl w:val="0"/>
           <w:numId w:val="5"/>
@@ -855,7 +1739,7 @@
     </w:p>
     <w:p>
       <w:pPr>
-        <w:pStyle w:val="PargrafodaLista"/>
+        <w:pStyle w:val="ListParagraph"/>
         <w:numPr>
           <w:ilvl w:val="0"/>
           <w:numId w:val="5"/>
@@ -867,7 +1751,7 @@
     </w:p>
     <w:p>
       <w:pPr>
-        <w:pStyle w:val="PargrafodaLista"/>
+        <w:pStyle w:val="ListParagraph"/>
         <w:numPr>
           <w:ilvl w:val="0"/>
           <w:numId w:val="5"/>
@@ -879,7 +1763,7 @@
     </w:p>
     <w:p>
       <w:pPr>
-        <w:pStyle w:val="PargrafodaLista"/>
+        <w:pStyle w:val="ListParagraph"/>
         <w:numPr>
           <w:ilvl w:val="0"/>
           <w:numId w:val="5"/>
@@ -891,7 +1775,7 @@
     </w:p>
     <w:p>
       <w:pPr>
-        <w:pStyle w:val="PargrafodaLista"/>
+        <w:pStyle w:val="ListParagraph"/>
         <w:numPr>
           <w:ilvl w:val="0"/>
           <w:numId w:val="5"/>
@@ -915,7 +1799,7 @@
     </w:p>
     <w:p>
       <w:pPr>
-        <w:pStyle w:val="PargrafodaLista"/>
+        <w:pStyle w:val="ListParagraph"/>
         <w:numPr>
           <w:ilvl w:val="0"/>
           <w:numId w:val="5"/>
@@ -939,7 +1823,7 @@
     </w:p>
     <w:p>
       <w:pPr>
-        <w:pStyle w:val="PargrafodaLista"/>
+        <w:pStyle w:val="ListParagraph"/>
         <w:numPr>
           <w:ilvl w:val="0"/>
           <w:numId w:val="5"/>
@@ -958,7 +1842,7 @@
     </w:p>
     <w:p>
       <w:pPr>
-        <w:pStyle w:val="PargrafodaLista"/>
+        <w:pStyle w:val="ListParagraph"/>
         <w:numPr>
           <w:ilvl w:val="0"/>
           <w:numId w:val="5"/>
@@ -970,7 +1854,7 @@
     </w:p>
     <w:p>
       <w:pPr>
-        <w:pStyle w:val="PargrafodaLista"/>
+        <w:pStyle w:val="ListParagraph"/>
         <w:numPr>
           <w:ilvl w:val="0"/>
           <w:numId w:val="5"/>
@@ -989,7 +1873,7 @@
     </w:p>
     <w:p>
       <w:pPr>
-        <w:pStyle w:val="PargrafodaLista"/>
+        <w:pStyle w:val="ListParagraph"/>
         <w:numPr>
           <w:ilvl w:val="0"/>
           <w:numId w:val="5"/>
@@ -1001,7 +1885,7 @@
     </w:p>
     <w:p>
       <w:pPr>
-        <w:pStyle w:val="PargrafodaLista"/>
+        <w:pStyle w:val="ListParagraph"/>
         <w:numPr>
           <w:ilvl w:val="0"/>
           <w:numId w:val="5"/>
@@ -1016,19 +1900,20 @@
     </w:p>
     <w:p>
       <w:pPr>
-        <w:pStyle w:val="PargrafodaLista"/>
+        <w:pStyle w:val="ListParagraph"/>
         <w:numPr>
           <w:ilvl w:val="0"/>
           <w:numId w:val="5"/>
         </w:numPr>
       </w:pPr>
       <w:r>
+        <w:lastRenderedPageBreak/>
         <w:t>Ver histórico de pontos ganhos;</w:t>
       </w:r>
     </w:p>
     <w:p>
       <w:pPr>
-        <w:pStyle w:val="PargrafodaLista"/>
+        <w:pStyle w:val="ListParagraph"/>
         <w:numPr>
           <w:ilvl w:val="0"/>
           <w:numId w:val="5"/>
@@ -1043,7 +1928,7 @@
     </w:p>
     <w:p>
       <w:pPr>
-        <w:pStyle w:val="PargrafodaLista"/>
+        <w:pStyle w:val="ListParagraph"/>
         <w:numPr>
           <w:ilvl w:val="0"/>
           <w:numId w:val="5"/>
@@ -1055,25 +1940,17 @@
     </w:p>
     <w:p>
       <w:pPr>
-        <w:pStyle w:val="PargrafodaLista"/>
-      </w:pPr>
-    </w:p>
-    <w:p>
-      <w:pPr>
-        <w:pStyle w:val="PargrafodaLista"/>
-      </w:pPr>
-    </w:p>
-    <w:p>
-      <w:pPr>
-        <w:pStyle w:val="Ttulo3"/>
-      </w:pPr>
+        <w:pStyle w:val="Heading3"/>
+      </w:pPr>
+      <w:bookmarkStart w:id="6" w:name="_Toc240009158"/>
       <w:r>
         <w:t>1.2.2. O que ele (ainda) não pode fazer:</w:t>
       </w:r>
-    </w:p>
-    <w:p>
-      <w:pPr>
-        <w:pStyle w:val="PargrafodaLista"/>
+      <w:bookmarkEnd w:id="6"/>
+    </w:p>
+    <w:p>
+      <w:pPr>
+        <w:pStyle w:val="ListParagraph"/>
         <w:numPr>
           <w:ilvl w:val="0"/>
           <w:numId w:val="6"/>
@@ -1085,7 +1962,7 @@
     </w:p>
     <w:p>
       <w:pPr>
-        <w:pStyle w:val="PargrafodaLista"/>
+        <w:pStyle w:val="ListParagraph"/>
         <w:numPr>
           <w:ilvl w:val="0"/>
           <w:numId w:val="6"/>
@@ -1097,53 +1974,453 @@
       <w:r>
         <w:t xml:space="preserve"> o tipo de atividade e o quanto ela vale em pontos </w:t>
       </w:r>
+      <w:proofErr w:type="spellStart"/>
       <w:r>
         <w:rPr>
           <w:i/>
           <w:iCs/>
         </w:rPr>
-        <w:t>in-app;</w:t>
-      </w:r>
-    </w:p>
-    <w:p>
-      <w:pPr>
-        <w:pStyle w:val="PargrafodaLista"/>
+        <w:t>in-app</w:t>
+      </w:r>
+      <w:proofErr w:type="spellEnd"/>
+      <w:r>
+        <w:rPr>
+          <w:i/>
+          <w:iCs/>
+        </w:rPr>
+        <w:t>;</w:t>
+      </w:r>
+    </w:p>
+    <w:p>
+      <w:pPr>
+        <w:pStyle w:val="ListParagraph"/>
         <w:numPr>
           <w:ilvl w:val="0"/>
           <w:numId w:val="6"/>
         </w:numPr>
       </w:pPr>
       <w:r>
-        <w:t>Se conectar a rede de postagens para se ter comentários ou likes;</w:t>
-      </w:r>
-    </w:p>
-    <w:p/>
-    <w:p/>
-    <w:p>
-      <w:pPr>
-        <w:pStyle w:val="Ttulo1"/>
-      </w:pPr>
-      <w:r>
-        <w:t>2. Funcionalidades</w:t>
-      </w:r>
-    </w:p>
-    <w:p>
-      <w:pPr>
-        <w:pStyle w:val="Ttulo3"/>
-      </w:pPr>
+        <w:t xml:space="preserve">Se conectar </w:t>
+      </w:r>
+      <w:proofErr w:type="spellStart"/>
+      <w:r>
+        <w:t>a</w:t>
+      </w:r>
+      <w:proofErr w:type="spellEnd"/>
+      <w:r>
+        <w:t xml:space="preserve"> rede de postagens para se ter comentários ou likes;</w:t>
+      </w:r>
+    </w:p>
+    <w:p>
+      <w:pPr>
+        <w:pStyle w:val="Heading1"/>
+        <w:rPr>
+          <w:lang w:val="en-US"/>
+        </w:rPr>
+      </w:pPr>
+      <w:bookmarkStart w:id="7" w:name="_Toc240009159"/>
+      <w:r>
+        <w:rPr>
+          <w:lang w:val="en-US"/>
+        </w:rPr>
+        <w:t>2</w:t>
+      </w:r>
+      <w:r>
+        <w:rPr>
+          <w:lang w:val="en-US"/>
+        </w:rPr>
+        <w:t xml:space="preserve">. </w:t>
+      </w:r>
+      <w:proofErr w:type="spellStart"/>
+      <w:r>
+        <w:rPr>
+          <w:lang w:val="en-US"/>
+        </w:rPr>
+        <w:t>Protótipo</w:t>
+      </w:r>
+      <w:bookmarkEnd w:id="7"/>
+      <w:proofErr w:type="spellEnd"/>
+    </w:p>
+    <w:p>
+      <w:pPr>
+        <w:ind w:firstLine="708"/>
+      </w:pPr>
+      <w:r>
+        <w:t>Acesse o</w:t>
+      </w:r>
+      <w:r>
+        <w:t xml:space="preserve"> link a seguir:</w:t>
+      </w:r>
+    </w:p>
+    <w:p>
+      <w:pPr>
+        <w:ind w:firstLine="708"/>
+      </w:pPr>
+      <w:hyperlink r:id="rId9" w:history="1">
+        <w:r>
+          <w:rPr>
+            <w:rStyle w:val="Hyperlink"/>
+          </w:rPr>
+          <w:t>https://ww</w:t>
+        </w:r>
+        <w:r>
+          <w:rPr>
+            <w:rStyle w:val="Hyperlink"/>
+          </w:rPr>
+          <w:t>w</w:t>
+        </w:r>
+        <w:r>
+          <w:rPr>
+            <w:rStyle w:val="Hyperlink"/>
+          </w:rPr>
+          <w:t>.figma.com/site/0cQyRoIL1mQcZd8ziV5CTK/SoulPass</w:t>
+        </w:r>
+      </w:hyperlink>
+    </w:p>
+    <w:p>
+      <w:pPr>
+        <w:pStyle w:val="Heading1"/>
+      </w:pPr>
+      <w:bookmarkStart w:id="8" w:name="_Toc240009160"/>
+      <w:r>
+        <w:t>3. MER (Modelo de Entidade e Relacionamento)</w:t>
+      </w:r>
+      <w:bookmarkEnd w:id="8"/>
+    </w:p>
+    <w:p>
+      <w:pPr>
+        <w:rPr>
+          <w:lang w:val="en-US"/>
+        </w:rPr>
+      </w:pPr>
+      <w:r>
+        <w:rPr>
+          <w:lang w:val="en-US"/>
+        </w:rPr>
+        <w:drawing>
+          <wp:inline distT="0" distB="0" distL="0" distR="0" wp14:anchorId="7CDA4E5B" wp14:editId="41D7DE97">
+            <wp:extent cx="5400040" cy="4306570"/>
+            <wp:effectExtent l="0" t="0" r="0" b="0"/>
+            <wp:docPr id="5" name="Picture 5"/>
+            <wp:cNvGraphicFramePr>
+              <a:graphicFrameLocks xmlns:a="http://schemas.openxmlformats.org/drawingml/2006/main" noChangeAspect="1"/>
+            </wp:cNvGraphicFramePr>
+            <a:graphic xmlns:a="http://schemas.openxmlformats.org/drawingml/2006/main">
+              <a:graphicData uri="http://schemas.openxmlformats.org/drawingml/2006/picture">
+                <pic:pic xmlns:pic="http://schemas.openxmlformats.org/drawingml/2006/picture">
+                  <pic:nvPicPr>
+                    <pic:cNvPr id="0" name="Picture 14"/>
+                    <pic:cNvPicPr>
+                      <a:picLocks noChangeAspect="1" noChangeArrowheads="1"/>
+                    </pic:cNvPicPr>
+                  </pic:nvPicPr>
+                  <pic:blipFill>
+                    <a:blip r:embed="rId10">
+                      <a:extLst>
+                        <a:ext uri="{28A0092B-C50C-407E-A947-70E740481C1C}">
+                          <a14:useLocalDpi xmlns:a14="http://schemas.microsoft.com/office/drawing/2010/main" val="0"/>
+                        </a:ext>
+                      </a:extLst>
+                    </a:blip>
+                    <a:srcRect/>
+                    <a:stretch>
+                      <a:fillRect/>
+                    </a:stretch>
+                  </pic:blipFill>
+                  <pic:spPr bwMode="auto">
+                    <a:xfrm>
+                      <a:off x="0" y="0"/>
+                      <a:ext cx="5400040" cy="4306570"/>
+                    </a:xfrm>
+                    <a:prstGeom prst="rect">
+                      <a:avLst/>
+                    </a:prstGeom>
+                    <a:noFill/>
+                    <a:ln>
+                      <a:noFill/>
+                    </a:ln>
+                  </pic:spPr>
+                </pic:pic>
+              </a:graphicData>
+            </a:graphic>
+          </wp:inline>
+        </w:drawing>
+      </w:r>
+    </w:p>
+    <w:p>
+      <w:pPr>
+        <w:pStyle w:val="Heading1"/>
+      </w:pPr>
+      <w:bookmarkStart w:id="9" w:name="_Toc240009161"/>
+      <w:r>
+        <w:lastRenderedPageBreak/>
+        <w:t>4. Diagrama de Classes</w:t>
+      </w:r>
+      <w:bookmarkEnd w:id="9"/>
+    </w:p>
+    <w:p>
+      <w:r>
+        <w:rPr>
+          <w:noProof/>
+        </w:rPr>
+        <w:drawing>
+          <wp:inline distT="0" distB="0" distL="0" distR="0" wp14:anchorId="4B47EEA9" wp14:editId="6851C68B">
+            <wp:extent cx="5391150" cy="4248150"/>
+            <wp:effectExtent l="0" t="0" r="0" b="0"/>
+            <wp:docPr id="6" name="Picture 6"/>
+            <wp:cNvGraphicFramePr>
+              <a:graphicFrameLocks xmlns:a="http://schemas.openxmlformats.org/drawingml/2006/main" noChangeAspect="1"/>
+            </wp:cNvGraphicFramePr>
+            <a:graphic xmlns:a="http://schemas.openxmlformats.org/drawingml/2006/main">
+              <a:graphicData uri="http://schemas.openxmlformats.org/drawingml/2006/picture">
+                <pic:pic xmlns:pic="http://schemas.openxmlformats.org/drawingml/2006/picture">
+                  <pic:nvPicPr>
+                    <pic:cNvPr id="0" name="Picture 16"/>
+                    <pic:cNvPicPr>
+                      <a:picLocks noChangeAspect="1" noChangeArrowheads="1"/>
+                    </pic:cNvPicPr>
+                  </pic:nvPicPr>
+                  <pic:blipFill>
+                    <a:blip r:embed="rId11">
+                      <a:extLst>
+                        <a:ext uri="{28A0092B-C50C-407E-A947-70E740481C1C}">
+                          <a14:useLocalDpi xmlns:a14="http://schemas.microsoft.com/office/drawing/2010/main" val="0"/>
+                        </a:ext>
+                      </a:extLst>
+                    </a:blip>
+                    <a:srcRect/>
+                    <a:stretch>
+                      <a:fillRect/>
+                    </a:stretch>
+                  </pic:blipFill>
+                  <pic:spPr bwMode="auto">
+                    <a:xfrm>
+                      <a:off x="0" y="0"/>
+                      <a:ext cx="5391150" cy="4248150"/>
+                    </a:xfrm>
+                    <a:prstGeom prst="rect">
+                      <a:avLst/>
+                    </a:prstGeom>
+                    <a:noFill/>
+                    <a:ln>
+                      <a:noFill/>
+                    </a:ln>
+                  </pic:spPr>
+                </pic:pic>
+              </a:graphicData>
+            </a:graphic>
+          </wp:inline>
+        </w:drawing>
+      </w:r>
+    </w:p>
+    <w:p>
+      <w:pPr>
+        <w:pStyle w:val="Heading1"/>
+      </w:pPr>
+      <w:bookmarkStart w:id="10" w:name="_Toc240009162"/>
+      <w:r>
+        <w:t>5. Como rodar a aplicação?</w:t>
+      </w:r>
+      <w:bookmarkEnd w:id="10"/>
+    </w:p>
+    <w:p>
+      <w:r>
+        <w:tab/>
+        <w:t xml:space="preserve">O </w:t>
+      </w:r>
+      <w:r>
+        <w:rPr>
+          <w:i/>
+          <w:iCs/>
+        </w:rPr>
+        <w:t>app</w:t>
+      </w:r>
+      <w:r>
+        <w:t xml:space="preserve"> a seguir foi feito no </w:t>
+      </w:r>
+      <w:proofErr w:type="spellStart"/>
+      <w:r>
+        <w:rPr>
+          <w:b/>
+          <w:bCs/>
+        </w:rPr>
+        <w:t>JetBrains</w:t>
+      </w:r>
+      <w:proofErr w:type="spellEnd"/>
+      <w:r>
+        <w:rPr>
+          <w:b/>
+          <w:bCs/>
+        </w:rPr>
+        <w:t xml:space="preserve"> </w:t>
+      </w:r>
+      <w:proofErr w:type="spellStart"/>
+      <w:r>
+        <w:rPr>
+          <w:b/>
+          <w:bCs/>
+        </w:rPr>
+        <w:t>IntelliJ</w:t>
+      </w:r>
+      <w:proofErr w:type="spellEnd"/>
+      <w:r>
+        <w:t xml:space="preserve">, na </w:t>
+      </w:r>
+      <w:r>
+        <w:rPr>
+          <w:b/>
+          <w:bCs/>
+        </w:rPr>
+        <w:t>versão 25 do JDK.</w:t>
+      </w:r>
+      <w:r>
+        <w:t xml:space="preserve"> </w:t>
+      </w:r>
+      <w:r>
+        <w:t xml:space="preserve">Caso ainda esteja vendo esse arquivo pelo .zip, por favor, extraia o conteúdo da pasta comprimida para uma nova pasta. </w:t>
+      </w:r>
+      <w:r>
+        <w:t xml:space="preserve">Abra a pasta do projeto pelo </w:t>
+      </w:r>
+      <w:proofErr w:type="spellStart"/>
+      <w:r>
+        <w:t>IntelliJ</w:t>
+      </w:r>
+      <w:proofErr w:type="spellEnd"/>
+      <w:r>
+        <w:t xml:space="preserve"> e use a classe </w:t>
+      </w:r>
+      <w:r>
+        <w:rPr>
+          <w:i/>
+          <w:iCs/>
+        </w:rPr>
+        <w:t>App</w:t>
+      </w:r>
+      <w:r>
+        <w:t xml:space="preserve"> para rodar a aplicação</w:t>
+      </w:r>
+      <w:r>
+        <w:t>. Aproveite o sistema.</w:t>
+      </w:r>
     </w:p>
     <w:sectPr>
+      <w:headerReference w:type="default" r:id="rId12"/>
       <w:pgSz w:w="11906" w:h="16838"/>
       <w:pgMar w:top="1417" w:right="1701" w:bottom="1417" w:left="1701" w:header="708" w:footer="708" w:gutter="0"/>
       <w:cols w:space="708"/>
+      <w:titlePg/>
       <w:docGrid w:linePitch="360"/>
     </w:sectPr>
   </w:body>
 </w:document>
 </file>
 
+<file path=word/endnotes.xml><?xml version="1.0" encoding="utf-8"?>
+<w:endnotes xmlns:wpc="http://schemas.microsoft.com/office/word/2010/wordprocessingCanvas" xmlns:cx="http://schemas.microsoft.com/office/drawing/2014/chartex" xmlns:cx1="http://schemas.microsoft.com/office/drawing/2015/9/8/chartex" xmlns:cx2="http://schemas.microsoft.com/office/drawing/2015/10/21/chartex" xmlns:cx3="http://schemas.microsoft.com/office/drawing/2016/5/9/chartex" xmlns:cx4="http://schemas.microsoft.com/office/drawing/2016/5/10/chartex" xmlns:cx5="http://schemas.microsoft.com/office/drawing/2016/5/11/chartex" xmlns:cx6="http://schemas.microsoft.com/office/drawing/2016/5/12/chartex" xmlns:cx7="http://schemas.microsoft.com/office/drawing/2016/5/13/chartex" xmlns:cx8="http://schemas.microsoft.com/office/drawing/2016/5/14/chartex" xmlns:mc="http://schemas.openxmlformats.org/markup-compatibility/2006" xmlns:aink="http://schemas.microsoft.com/office/drawing/2016/ink" xmlns:am3d="http://schemas.microsoft.com/office/drawing/2017/model3d" xmlns:o="urn:schemas-microsoft-com:office:office" xmlns:oel="http://schemas.microsoft.com/office/2019/extlst" xmlns:r="http://schemas.openxmlformats.org/officeDocument/2006/relationships" xmlns:m="http://schemas.openxmlformats.org/officeDocument/2006/math" xmlns:v="urn:schemas-microsoft-com:vml" xmlns:wp14="http://schemas.microsoft.com/office/word/2010/wordprocessingDrawing" xmlns:wp="http://schemas.openxmlformats.org/drawingml/2006/wordprocessingDrawing" xmlns:w10="urn:schemas-microsoft-com:office:word" xmlns:w="http://schemas.openxmlformats.org/wordprocessingml/2006/main" xmlns:w14="http://schemas.microsoft.com/office/word/2010/wordml" xmlns:w15="http://schemas.microsoft.com/office/word/2012/wordml" xmlns:w16cex="http://schemas.microsoft.com/office/word/2018/wordml/cex" xmlns:w16cid="http://schemas.microsoft.com/office/word/2016/wordml/cid" xmlns:w16="http://schemas.microsoft.com/office/word/2018/wordml" xmlns:w16sdtdh="http://schemas.microsoft.com/office/word/2020/wordml/sdtdatahash" xmlns:w16se="http://schemas.microsoft.com/office/word/2015/wordml/symex" xmlns:wpg="http://schemas.microsoft.com/office/word/2010/wordprocessingGroup" xmlns:wpi="http://schemas.microsoft.com/office/word/2010/wordprocessingInk" xmlns:wne="http://schemas.microsoft.com/office/word/2006/wordml" xmlns:wps="http://schemas.microsoft.com/office/word/2010/wordprocessingShape" mc:Ignorable="w14 w15 w16se w16cid w16 w16cex w16sdtdh wp14">
+  <w:endnote w:type="separator" w:id="-1">
+    <w:p>
+      <w:pPr>
+        <w:spacing w:after="0" w:line="240" w:lineRule="auto"/>
+      </w:pPr>
+      <w:r>
+        <w:separator/>
+      </w:r>
+    </w:p>
+  </w:endnote>
+  <w:endnote w:type="continuationSeparator" w:id="0">
+    <w:p>
+      <w:pPr>
+        <w:spacing w:after="0" w:line="240" w:lineRule="auto"/>
+      </w:pPr>
+      <w:r>
+        <w:continuationSeparator/>
+      </w:r>
+    </w:p>
+  </w:endnote>
+</w:endnotes>
+</file>
+
+<file path=word/footnotes.xml><?xml version="1.0" encoding="utf-8"?>
+<w:footnotes xmlns:wpc="http://schemas.microsoft.com/office/word/2010/wordprocessingCanvas" xmlns:cx="http://schemas.microsoft.com/office/drawing/2014/chartex" xmlns:cx1="http://schemas.microsoft.com/office/drawing/2015/9/8/chartex" xmlns:cx2="http://schemas.microsoft.com/office/drawing/2015/10/21/chartex" xmlns:cx3="http://schemas.microsoft.com/office/drawing/2016/5/9/chartex" xmlns:cx4="http://schemas.microsoft.com/office/drawing/2016/5/10/chartex" xmlns:cx5="http://schemas.microsoft.com/office/drawing/2016/5/11/chartex" xmlns:cx6="http://schemas.microsoft.com/office/drawing/2016/5/12/chartex" xmlns:cx7="http://schemas.microsoft.com/office/drawing/2016/5/13/chartex" xmlns:cx8="http://schemas.microsoft.com/office/drawing/2016/5/14/chartex" xmlns:mc="http://schemas.openxmlformats.org/markup-compatibility/2006" xmlns:aink="http://schemas.microsoft.com/office/drawing/2016/ink" xmlns:am3d="http://schemas.microsoft.com/office/drawing/2017/model3d" xmlns:o="urn:schemas-microsoft-com:office:office" xmlns:oel="http://schemas.microsoft.com/office/2019/extlst" xmlns:r="http://schemas.openxmlformats.org/officeDocument/2006/relationships" xmlns:m="http://schemas.openxmlformats.org/officeDocument/2006/math" xmlns:v="urn:schemas-microsoft-com:vml" xmlns:wp14="http://schemas.microsoft.com/office/word/2010/wordprocessingDrawing" xmlns:wp="http://schemas.openxmlformats.org/drawingml/2006/wordprocessingDrawing" xmlns:w10="urn:schemas-microsoft-com:office:word" xmlns:w="http://schemas.openxmlformats.org/wordprocessingml/2006/main" xmlns:w14="http://schemas.microsoft.com/office/word/2010/wordml" xmlns:w15="http://schemas.microsoft.com/office/word/2012/wordml" xmlns:w16cex="http://schemas.microsoft.com/office/word/2018/wordml/cex" xmlns:w16cid="http://schemas.microsoft.com/office/word/2016/wordml/cid" xmlns:w16="http://schemas.microsoft.com/office/word/2018/wordml" xmlns:w16sdtdh="http://schemas.microsoft.com/office/word/2020/wordml/sdtdatahash" xmlns:w16se="http://schemas.microsoft.com/office/word/2015/wordml/symex" xmlns:wpg="http://schemas.microsoft.com/office/word/2010/wordprocessingGroup" xmlns:wpi="http://schemas.microsoft.com/office/word/2010/wordprocessingInk" xmlns:wne="http://schemas.microsoft.com/office/word/2006/wordml" xmlns:wps="http://schemas.microsoft.com/office/word/2010/wordprocessingShape" mc:Ignorable="w14 w15 w16se w16cid w16 w16cex w16sdtdh wp14">
+  <w:footnote w:type="separator" w:id="-1">
+    <w:p>
+      <w:pPr>
+        <w:spacing w:after="0" w:line="240" w:lineRule="auto"/>
+      </w:pPr>
+      <w:r>
+        <w:separator/>
+      </w:r>
+    </w:p>
+  </w:footnote>
+  <w:footnote w:type="continuationSeparator" w:id="0">
+    <w:p>
+      <w:pPr>
+        <w:spacing w:after="0" w:line="240" w:lineRule="auto"/>
+      </w:pPr>
+      <w:r>
+        <w:continuationSeparator/>
+      </w:r>
+    </w:p>
+  </w:footnote>
+</w:footnotes>
+</file>
+
+<file path=word/header1.xml><?xml version="1.0" encoding="utf-8"?>
+<w:hdr xmlns:wpc="http://schemas.microsoft.com/office/word/2010/wordprocessingCanvas" xmlns:cx="http://schemas.microsoft.com/office/drawing/2014/chartex" xmlns:cx1="http://schemas.microsoft.com/office/drawing/2015/9/8/chartex" xmlns:cx2="http://schemas.microsoft.com/office/drawing/2015/10/21/chartex" xmlns:cx3="http://schemas.microsoft.com/office/drawing/2016/5/9/chartex" xmlns:cx4="http://schemas.microsoft.com/office/drawing/2016/5/10/chartex" xmlns:cx5="http://schemas.microsoft.com/office/drawing/2016/5/11/chartex" xmlns:cx6="http://schemas.microsoft.com/office/drawing/2016/5/12/chartex" xmlns:cx7="http://schemas.microsoft.com/office/drawing/2016/5/13/chartex" xmlns:cx8="http://schemas.microsoft.com/office/drawing/2016/5/14/chartex" xmlns:mc="http://schemas.openxmlformats.org/markup-compatibility/2006" xmlns:aink="http://schemas.microsoft.com/office/drawing/2016/ink" xmlns:am3d="http://schemas.microsoft.com/office/drawing/2017/model3d" xmlns:o="urn:schemas-microsoft-com:office:office" xmlns:oel="http://schemas.microsoft.com/office/2019/extlst" xmlns:r="http://schemas.openxmlformats.org/officeDocument/2006/relationships" xmlns:m="http://schemas.openxmlformats.org/officeDocument/2006/math" xmlns:v="urn:schemas-microsoft-com:vml" xmlns:wp14="http://schemas.microsoft.com/office/word/2010/wordprocessingDrawing" xmlns:wp="http://schemas.openxmlformats.org/drawingml/2006/wordprocessingDrawing" xmlns:w10="urn:schemas-microsoft-com:office:word" xmlns:w="http://schemas.openxmlformats.org/wordprocessingml/2006/main" xmlns:w14="http://schemas.microsoft.com/office/word/2010/wordml" xmlns:w15="http://schemas.microsoft.com/office/word/2012/wordml" xmlns:w16cex="http://schemas.microsoft.com/office/word/2018/wordml/cex" xmlns:w16cid="http://schemas.microsoft.com/office/word/2016/wordml/cid" xmlns:w16="http://schemas.microsoft.com/office/word/2018/wordml" xmlns:w16sdtdh="http://schemas.microsoft.com/office/word/2020/wordml/sdtdatahash" xmlns:w16se="http://schemas.microsoft.com/office/word/2015/wordml/symex" xmlns:wpg="http://schemas.microsoft.com/office/word/2010/wordprocessingGroup" xmlns:wpi="http://schemas.microsoft.com/office/word/2010/wordprocessingInk" xmlns:wne="http://schemas.microsoft.com/office/word/2006/wordml" xmlns:wps="http://schemas.microsoft.com/office/word/2010/wordprocessingShape" mc:Ignorable="w14 w15 w16se w16cid w16 w16cex w16sdtdh wp14">
+  <w:sdt>
+    <w:sdtPr>
+      <w:id w:val="-1213418629"/>
+      <w:docPartObj>
+        <w:docPartGallery w:val="Page Numbers (Top of Page)"/>
+        <w:docPartUnique/>
+      </w:docPartObj>
+    </w:sdtPr>
+    <w:sdtEndPr>
+      <w:rPr>
+        <w:noProof/>
+      </w:rPr>
+    </w:sdtEndPr>
+    <w:sdtContent>
+      <w:p>
+        <w:pPr>
+          <w:pStyle w:val="Header"/>
+          <w:jc w:val="right"/>
+        </w:pPr>
+        <w:r>
+          <w:fldChar w:fldCharType="begin"/>
+        </w:r>
+        <w:r>
+          <w:instrText xml:space="preserve"> PAGE   \* MERGEFORMAT </w:instrText>
+        </w:r>
+        <w:r>
+          <w:fldChar w:fldCharType="separate"/>
+        </w:r>
+        <w:r>
+          <w:rPr>
+            <w:noProof/>
+          </w:rPr>
+          <w:t>2</w:t>
+        </w:r>
+        <w:r>
+          <w:rPr>
+            <w:noProof/>
+          </w:rPr>
+          <w:fldChar w:fldCharType="end"/>
+        </w:r>
+      </w:p>
+    </w:sdtContent>
+  </w:sdt>
+  <w:p>
+    <w:pPr>
+      <w:pStyle w:val="Header"/>
+    </w:pPr>
+  </w:p>
+</w:hdr>
+</file>
+
 <file path=word/numbering.xml><?xml version="1.0" encoding="utf-8"?>
-<w:numbering xmlns:wpc="http://schemas.microsoft.com/office/word/2010/wordprocessingCanvas" xmlns:cx="http://schemas.microsoft.com/office/drawing/2014/chartex" xmlns:cx1="http://schemas.microsoft.com/office/drawing/2015/9/8/chartex" xmlns:cx2="http://schemas.microsoft.com/office/drawing/2015/10/21/chartex" xmlns:cx3="http://schemas.microsoft.com/office/drawing/2016/5/9/chartex" xmlns:cx4="http://schemas.microsoft.com/office/drawing/2016/5/10/chartex" xmlns:cx5="http://schemas.microsoft.com/office/drawing/2016/5/11/chartex" xmlns:cx6="http://schemas.microsoft.com/office/drawing/2016/5/12/chartex" xmlns:cx7="http://schemas.microsoft.com/office/drawing/2016/5/13/chartex" xmlns:cx8="http://schemas.microsoft.com/office/drawing/2016/5/14/chartex" xmlns:mc="http://schemas.openxmlformats.org/markup-compatibility/2006" xmlns:aink="http://schemas.microsoft.com/office/drawing/2016/ink" xmlns:am3d="http://schemas.microsoft.com/office/drawing/2017/model3d" xmlns:o="urn:schemas-microsoft-com:office:office" xmlns:oel="http://schemas.microsoft.com/office/2019/extlst" xmlns:r="http://schemas.openxmlformats.org/officeDocument/2006/relationships" xmlns:m="http://schemas.openxmlformats.org/officeDocument/2006/math" xmlns:v="urn:schemas-microsoft-com:vml" xmlns:wp14="http://schemas.microsoft.com/office/word/2010/wordprocessingDrawing" xmlns:wp="http://schemas.openxmlformats.org/drawingml/2006/wordprocessingDrawing" xmlns:w10="urn:schemas-microsoft-com:office:word" xmlns:w="http://schemas.openxmlformats.org/wordprocessingml/2006/main" xmlns:w14="http://schemas.microsoft.com/office/word/2010/wordml" xmlns:w15="http://schemas.microsoft.com/office/word/2012/wordml" xmlns:w16cex="http://schemas.microsoft.com/office/word/2018/wordml/cex" xmlns:w16cid="http://schemas.microsoft.com/office/word/2016/wordml/cid" xmlns:w16="http://schemas.microsoft.com/office/word/2018/wordml" xmlns:w16du="http://schemas.microsoft.com/office/word/2023/wordml/word16du" xmlns:w16sdtdh="http://schemas.microsoft.com/office/word/2020/wordml/sdtdatahash" xmlns:w16se="http://schemas.microsoft.com/office/word/2015/wordml/symex" xmlns:wpg="http://schemas.microsoft.com/office/word/2010/wordprocessingGroup" xmlns:wpi="http://schemas.microsoft.com/office/word/2010/wordprocessingInk" xmlns:wne="http://schemas.microsoft.com/office/word/2006/wordml" xmlns:wps="http://schemas.microsoft.com/office/word/2010/wordprocessingShape" mc:Ignorable="w14 w15 w16se w16cid w16 w16cex w16sdtdh w16du wp14">
+<w:numbering xmlns:wpc="http://schemas.microsoft.com/office/word/2010/wordprocessingCanvas" xmlns:cx="http://schemas.microsoft.com/office/drawing/2014/chartex" xmlns:cx1="http://schemas.microsoft.com/office/drawing/2015/9/8/chartex" xmlns:cx2="http://schemas.microsoft.com/office/drawing/2015/10/21/chartex" xmlns:cx3="http://schemas.microsoft.com/office/drawing/2016/5/9/chartex" xmlns:cx4="http://schemas.microsoft.com/office/drawing/2016/5/10/chartex" xmlns:cx5="http://schemas.microsoft.com/office/drawing/2016/5/11/chartex" xmlns:cx6="http://schemas.microsoft.com/office/drawing/2016/5/12/chartex" xmlns:cx7="http://schemas.microsoft.com/office/drawing/2016/5/13/chartex" xmlns:cx8="http://schemas.microsoft.com/office/drawing/2016/5/14/chartex" xmlns:mc="http://schemas.openxmlformats.org/markup-compatibility/2006" xmlns:aink="http://schemas.microsoft.com/office/drawing/2016/ink" xmlns:am3d="http://schemas.microsoft.com/office/drawing/2017/model3d" xmlns:o="urn:schemas-microsoft-com:office:office" xmlns:oel="http://schemas.microsoft.com/office/2019/extlst" xmlns:r="http://schemas.openxmlformats.org/officeDocument/2006/relationships" xmlns:m="http://schemas.openxmlformats.org/officeDocument/2006/math" xmlns:v="urn:schemas-microsoft-com:vml" xmlns:wp14="http://schemas.microsoft.com/office/word/2010/wordprocessingDrawing" xmlns:wp="http://schemas.openxmlformats.org/drawingml/2006/wordprocessingDrawing" xmlns:w10="urn:schemas-microsoft-com:office:word" xmlns:w="http://schemas.openxmlformats.org/wordprocessingml/2006/main" xmlns:w14="http://schemas.microsoft.com/office/word/2010/wordml" xmlns:w15="http://schemas.microsoft.com/office/word/2012/wordml" xmlns:w16cex="http://schemas.microsoft.com/office/word/2018/wordml/cex" xmlns:w16cid="http://schemas.microsoft.com/office/word/2016/wordml/cid" xmlns:w16="http://schemas.microsoft.com/office/word/2018/wordml" xmlns:w16sdtdh="http://schemas.microsoft.com/office/word/2020/wordml/sdtdatahash" xmlns:w16se="http://schemas.microsoft.com/office/word/2015/wordml/symex" xmlns:wpg="http://schemas.microsoft.com/office/word/2010/wordprocessingGroup" xmlns:wpi="http://schemas.microsoft.com/office/word/2010/wordprocessingInk" xmlns:wne="http://schemas.microsoft.com/office/word/2006/wordml" xmlns:wps="http://schemas.microsoft.com/office/word/2010/wordprocessingShape" mc:Ignorable="w14 w15 w16se w16cid w16 w16cex w16sdtdh wp14">
   <w:abstractNum w:abstractNumId="0" w15:restartNumberingAfterBreak="0">
     <w:nsid w:val="17BD535A"/>
     <w:multiLevelType w:val="hybridMultilevel"/>
@@ -1748,7 +3025,7 @@
 </file>
 
 <file path=word/styles.xml><?xml version="1.0" encoding="utf-8"?>
-<w:styles xmlns:mc="http://schemas.openxmlformats.org/markup-compatibility/2006" xmlns:r="http://schemas.openxmlformats.org/officeDocument/2006/relationships" xmlns:w="http://schemas.openxmlformats.org/wordprocessingml/2006/main" xmlns:w14="http://schemas.microsoft.com/office/word/2010/wordml" xmlns:w15="http://schemas.microsoft.com/office/word/2012/wordml" xmlns:w16cex="http://schemas.microsoft.com/office/word/2018/wordml/cex" xmlns:w16cid="http://schemas.microsoft.com/office/word/2016/wordml/cid" xmlns:w16="http://schemas.microsoft.com/office/word/2018/wordml" xmlns:w16du="http://schemas.microsoft.com/office/word/2023/wordml/word16du" xmlns:w16sdtdh="http://schemas.microsoft.com/office/word/2020/wordml/sdtdatahash" xmlns:w16se="http://schemas.microsoft.com/office/word/2015/wordml/symex" mc:Ignorable="w14 w15 w16se w16cid w16 w16cex w16sdtdh w16du">
+<w:styles xmlns:mc="http://schemas.openxmlformats.org/markup-compatibility/2006" xmlns:r="http://schemas.openxmlformats.org/officeDocument/2006/relationships" xmlns:w="http://schemas.openxmlformats.org/wordprocessingml/2006/main" xmlns:w14="http://schemas.microsoft.com/office/word/2010/wordml" xmlns:w15="http://schemas.microsoft.com/office/word/2012/wordml" xmlns:w16cex="http://schemas.microsoft.com/office/word/2018/wordml/cex" xmlns:w16cid="http://schemas.microsoft.com/office/word/2016/wordml/cid" xmlns:w16="http://schemas.microsoft.com/office/word/2018/wordml" xmlns:w16sdtdh="http://schemas.microsoft.com/office/word/2020/wordml/sdtdatahash" xmlns:w16se="http://schemas.microsoft.com/office/word/2015/wordml/symex" mc:Ignorable="w14 w15 w16se w16cid w16 w16cex w16sdtdh">
   <w:docDefaults>
     <w:rPrDefault>
       <w:rPr>
@@ -2158,11 +3435,11 @@
       <w:szCs w:val="24"/>
     </w:rPr>
   </w:style>
-  <w:style w:type="paragraph" w:styleId="Ttulo1">
+  <w:style w:type="paragraph" w:styleId="Heading1">
     <w:name w:val="heading 1"/>
     <w:basedOn w:val="Normal"/>
     <w:next w:val="Normal"/>
-    <w:link w:val="Ttulo1Char"/>
+    <w:link w:val="Heading1Char"/>
     <w:uiPriority w:val="9"/>
     <w:qFormat/>
     <w:rsid w:val="00BD4496"/>
@@ -2174,11 +3451,11 @@
       <w:szCs w:val="28"/>
     </w:rPr>
   </w:style>
-  <w:style w:type="paragraph" w:styleId="Ttulo2">
+  <w:style w:type="paragraph" w:styleId="Heading2">
     <w:name w:val="heading 2"/>
-    <w:basedOn w:val="Ttulo1"/>
+    <w:basedOn w:val="Heading1"/>
     <w:next w:val="Normal"/>
-    <w:link w:val="Ttulo2Char"/>
+    <w:link w:val="Heading2Char"/>
     <w:uiPriority w:val="9"/>
     <w:unhideWhenUsed/>
     <w:qFormat/>
@@ -2187,11 +3464,11 @@
       <w:outlineLvl w:val="1"/>
     </w:pPr>
   </w:style>
-  <w:style w:type="paragraph" w:styleId="Ttulo3">
+  <w:style w:type="paragraph" w:styleId="Heading3">
     <w:name w:val="heading 3"/>
-    <w:basedOn w:val="Ttulo2"/>
+    <w:basedOn w:val="Heading2"/>
     <w:next w:val="Normal"/>
-    <w:link w:val="Ttulo3Char"/>
+    <w:link w:val="Heading3Char"/>
     <w:uiPriority w:val="9"/>
     <w:unhideWhenUsed/>
     <w:qFormat/>
@@ -2200,13 +3477,12 @@
       <w:outlineLvl w:val="2"/>
     </w:pPr>
   </w:style>
-  <w:style w:type="character" w:default="1" w:styleId="Fontepargpadro">
+  <w:style w:type="character" w:default="1" w:styleId="DefaultParagraphFont">
     <w:name w:val="Default Paragraph Font"/>
     <w:uiPriority w:val="1"/>
-    <w:semiHidden/>
     <w:unhideWhenUsed/>
   </w:style>
-  <w:style w:type="table" w:default="1" w:styleId="Tabelanormal">
+  <w:style w:type="table" w:default="1" w:styleId="TableNormal">
     <w:name w:val="Normal Table"/>
     <w:uiPriority w:val="99"/>
     <w:semiHidden/>
@@ -2221,16 +3497,16 @@
       </w:tblCellMar>
     </w:tblPr>
   </w:style>
-  <w:style w:type="numbering" w:default="1" w:styleId="Semlista">
+  <w:style w:type="numbering" w:default="1" w:styleId="NoList">
     <w:name w:val="No List"/>
     <w:uiPriority w:val="99"/>
     <w:semiHidden/>
     <w:unhideWhenUsed/>
   </w:style>
-  <w:style w:type="character" w:customStyle="1" w:styleId="Ttulo1Char">
-    <w:name w:val="Título 1 Char"/>
-    <w:basedOn w:val="Fontepargpadro"/>
-    <w:link w:val="Ttulo1"/>
+  <w:style w:type="character" w:customStyle="1" w:styleId="Heading1Char">
+    <w:name w:val="Heading 1 Char"/>
+    <w:basedOn w:val="DefaultParagraphFont"/>
+    <w:link w:val="Heading1"/>
     <w:uiPriority w:val="9"/>
     <w:rsid w:val="00BD4496"/>
     <w:rPr>
@@ -2239,10 +3515,10 @@
       <w:szCs w:val="28"/>
     </w:rPr>
   </w:style>
-  <w:style w:type="character" w:customStyle="1" w:styleId="Ttulo2Char">
-    <w:name w:val="Título 2 Char"/>
-    <w:basedOn w:val="Fontepargpadro"/>
-    <w:link w:val="Ttulo2"/>
+  <w:style w:type="character" w:customStyle="1" w:styleId="Heading2Char">
+    <w:name w:val="Heading 2 Char"/>
+    <w:basedOn w:val="DefaultParagraphFont"/>
+    <w:link w:val="Heading2"/>
     <w:uiPriority w:val="9"/>
     <w:rsid w:val="00BD4496"/>
     <w:rPr>
@@ -2251,10 +3527,10 @@
       <w:szCs w:val="28"/>
     </w:rPr>
   </w:style>
-  <w:style w:type="character" w:customStyle="1" w:styleId="Ttulo3Char">
-    <w:name w:val="Título 3 Char"/>
-    <w:basedOn w:val="Fontepargpadro"/>
-    <w:link w:val="Ttulo3"/>
+  <w:style w:type="character" w:customStyle="1" w:styleId="Heading3Char">
+    <w:name w:val="Heading 3 Char"/>
+    <w:basedOn w:val="DefaultParagraphFont"/>
+    <w:link w:val="Heading3"/>
     <w:uiPriority w:val="9"/>
     <w:rsid w:val="00BD4496"/>
     <w:rPr>
@@ -2280,7 +3556,7 @@
       <w14:ligatures w14:val="none"/>
     </w:rPr>
   </w:style>
-  <w:style w:type="paragraph" w:styleId="PargrafodaLista">
+  <w:style w:type="paragraph" w:styleId="ListParagraph">
     <w:name w:val="List Paragraph"/>
     <w:basedOn w:val="Normal"/>
     <w:uiPriority w:val="34"/>
@@ -2290,6 +3566,158 @@
       <w:ind w:left="720"/>
       <w:contextualSpacing/>
     </w:pPr>
+  </w:style>
+  <w:style w:type="character" w:styleId="Hyperlink">
+    <w:name w:val="Hyperlink"/>
+    <w:basedOn w:val="DefaultParagraphFont"/>
+    <w:uiPriority w:val="99"/>
+    <w:unhideWhenUsed/>
+    <w:rsid w:val="00B669D3"/>
+    <w:rPr>
+      <w:color w:val="0563C1" w:themeColor="hyperlink"/>
+      <w:u w:val="single"/>
+    </w:rPr>
+  </w:style>
+  <w:style w:type="character" w:styleId="UnresolvedMention">
+    <w:name w:val="Unresolved Mention"/>
+    <w:basedOn w:val="DefaultParagraphFont"/>
+    <w:uiPriority w:val="99"/>
+    <w:semiHidden/>
+    <w:unhideWhenUsed/>
+    <w:rsid w:val="00B669D3"/>
+    <w:rPr>
+      <w:color w:val="605E5C"/>
+      <w:shd w:val="clear" w:color="auto" w:fill="E1DFDD"/>
+    </w:rPr>
+  </w:style>
+  <w:style w:type="paragraph" w:styleId="Header">
+    <w:name w:val="header"/>
+    <w:basedOn w:val="Normal"/>
+    <w:link w:val="HeaderChar"/>
+    <w:uiPriority w:val="99"/>
+    <w:unhideWhenUsed/>
+    <w:rsid w:val="007832B1"/>
+    <w:pPr>
+      <w:tabs>
+        <w:tab w:val="center" w:pos="4680"/>
+        <w:tab w:val="right" w:pos="9360"/>
+      </w:tabs>
+      <w:spacing w:after="0" w:line="240" w:lineRule="auto"/>
+    </w:pPr>
+  </w:style>
+  <w:style w:type="character" w:customStyle="1" w:styleId="HeaderChar">
+    <w:name w:val="Header Char"/>
+    <w:basedOn w:val="DefaultParagraphFont"/>
+    <w:link w:val="Header"/>
+    <w:uiPriority w:val="99"/>
+    <w:rsid w:val="007832B1"/>
+    <w:rPr>
+      <w:rFonts w:ascii="Arial" w:hAnsi="Arial" w:cs="Arial"/>
+      <w:sz w:val="24"/>
+      <w:szCs w:val="24"/>
+    </w:rPr>
+  </w:style>
+  <w:style w:type="paragraph" w:styleId="Footer">
+    <w:name w:val="footer"/>
+    <w:basedOn w:val="Normal"/>
+    <w:link w:val="FooterChar"/>
+    <w:uiPriority w:val="99"/>
+    <w:unhideWhenUsed/>
+    <w:rsid w:val="007832B1"/>
+    <w:pPr>
+      <w:tabs>
+        <w:tab w:val="center" w:pos="4680"/>
+        <w:tab w:val="right" w:pos="9360"/>
+      </w:tabs>
+      <w:spacing w:after="0" w:line="240" w:lineRule="auto"/>
+    </w:pPr>
+  </w:style>
+  <w:style w:type="character" w:customStyle="1" w:styleId="FooterChar">
+    <w:name w:val="Footer Char"/>
+    <w:basedOn w:val="DefaultParagraphFont"/>
+    <w:link w:val="Footer"/>
+    <w:uiPriority w:val="99"/>
+    <w:rsid w:val="007832B1"/>
+    <w:rPr>
+      <w:rFonts w:ascii="Arial" w:hAnsi="Arial" w:cs="Arial"/>
+      <w:sz w:val="24"/>
+      <w:szCs w:val="24"/>
+    </w:rPr>
+  </w:style>
+  <w:style w:type="paragraph" w:styleId="TOCHeading">
+    <w:name w:val="TOC Heading"/>
+    <w:basedOn w:val="Heading1"/>
+    <w:next w:val="Normal"/>
+    <w:uiPriority w:val="39"/>
+    <w:unhideWhenUsed/>
+    <w:qFormat/>
+    <w:rsid w:val="007832B1"/>
+    <w:pPr>
+      <w:keepNext/>
+      <w:keepLines/>
+      <w:spacing w:before="240" w:after="0" w:line="259" w:lineRule="auto"/>
+      <w:jc w:val="left"/>
+      <w:outlineLvl w:val="9"/>
+    </w:pPr>
+    <w:rPr>
+      <w:rFonts w:asciiTheme="majorHAnsi" w:eastAsiaTheme="majorEastAsia" w:hAnsiTheme="majorHAnsi" w:cstheme="majorBidi"/>
+      <w:color w:val="2F5496" w:themeColor="accent1" w:themeShade="BF"/>
+      <w:kern w:val="0"/>
+      <w:sz w:val="32"/>
+      <w:szCs w:val="32"/>
+      <w:lang w:val="en-US"/>
+      <w14:ligatures w14:val="none"/>
+    </w:rPr>
+  </w:style>
+  <w:style w:type="paragraph" w:styleId="TOC1">
+    <w:name w:val="toc 1"/>
+    <w:basedOn w:val="Normal"/>
+    <w:next w:val="Normal"/>
+    <w:autoRedefine/>
+    <w:uiPriority w:val="39"/>
+    <w:unhideWhenUsed/>
+    <w:rsid w:val="007832B1"/>
+    <w:pPr>
+      <w:spacing w:after="100"/>
+    </w:pPr>
+  </w:style>
+  <w:style w:type="paragraph" w:styleId="TOC2">
+    <w:name w:val="toc 2"/>
+    <w:basedOn w:val="Normal"/>
+    <w:next w:val="Normal"/>
+    <w:autoRedefine/>
+    <w:uiPriority w:val="39"/>
+    <w:unhideWhenUsed/>
+    <w:rsid w:val="007832B1"/>
+    <w:pPr>
+      <w:spacing w:after="100"/>
+      <w:ind w:left="240"/>
+    </w:pPr>
+  </w:style>
+  <w:style w:type="paragraph" w:styleId="TOC3">
+    <w:name w:val="toc 3"/>
+    <w:basedOn w:val="Normal"/>
+    <w:next w:val="Normal"/>
+    <w:autoRedefine/>
+    <w:uiPriority w:val="39"/>
+    <w:unhideWhenUsed/>
+    <w:rsid w:val="007832B1"/>
+    <w:pPr>
+      <w:spacing w:after="100"/>
+      <w:ind w:left="480"/>
+    </w:pPr>
+  </w:style>
+  <w:style w:type="character" w:styleId="FollowedHyperlink">
+    <w:name w:val="FollowedHyperlink"/>
+    <w:basedOn w:val="DefaultParagraphFont"/>
+    <w:uiPriority w:val="99"/>
+    <w:semiHidden/>
+    <w:unhideWhenUsed/>
+    <w:rsid w:val="0076020D"/>
+    <w:rPr>
+      <w:color w:val="954F72" w:themeColor="followedHyperlink"/>
+      <w:u w:val="single"/>
+    </w:rPr>
   </w:style>
 </w:styles>
 </file>
@@ -2587,4 +4015,16 @@
     </a:ext>
   </a:extLst>
 </a:theme>
+</file>
+
+<file path=customXml/item1.xml><?xml version="1.0" encoding="utf-8"?>
+<b:Sources xmlns:b="http://schemas.openxmlformats.org/officeDocument/2006/bibliography" xmlns="http://schemas.openxmlformats.org/officeDocument/2006/bibliography" SelectedStyle="\APASixthEditionOfficeOnline.xsl" StyleName="APA" Version="6"/>
+</file>
+
+<file path=customXml/itemProps1.xml><?xml version="1.0" encoding="utf-8"?>
+<ds:datastoreItem xmlns:ds="http://schemas.openxmlformats.org/officeDocument/2006/customXml" ds:itemID="{48D9A97A-8EC6-417C-A015-EA0A5ABBEB23}">
+  <ds:schemaRefs>
+    <ds:schemaRef ds:uri="http://schemas.openxmlformats.org/officeDocument/2006/bibliography"/>
+  </ds:schemaRefs>
+</ds:datastoreItem>
 </file>
</xml_diff>

<commit_message>
docs: Atualizando a imagem do Diagrama de Classes no documento
</commit_message>
<xml_diff>
--- a/SoulPass-Java-Documentacao.docx
+++ b/SoulPass-Java-Documentacao.docx
@@ -1,19 +1,17 @@
 
 <file path=word/document.xml><?xml version="1.0" encoding="utf-8"?>
-<w:document xmlns:wpc="http://schemas.microsoft.com/office/word/2010/wordprocessingCanvas" xmlns:cx="http://schemas.microsoft.com/office/drawing/2014/chartex" xmlns:cx1="http://schemas.microsoft.com/office/drawing/2015/9/8/chartex" xmlns:cx2="http://schemas.microsoft.com/office/drawing/2015/10/21/chartex" xmlns:cx3="http://schemas.microsoft.com/office/drawing/2016/5/9/chartex" xmlns:cx4="http://schemas.microsoft.com/office/drawing/2016/5/10/chartex" xmlns:cx5="http://schemas.microsoft.com/office/drawing/2016/5/11/chartex" xmlns:cx6="http://schemas.microsoft.com/office/drawing/2016/5/12/chartex" xmlns:cx7="http://schemas.microsoft.com/office/drawing/2016/5/13/chartex" xmlns:cx8="http://schemas.microsoft.com/office/drawing/2016/5/14/chartex" xmlns:mc="http://schemas.openxmlformats.org/markup-compatibility/2006" xmlns:aink="http://schemas.microsoft.com/office/drawing/2016/ink" xmlns:am3d="http://schemas.microsoft.com/office/drawing/2017/model3d" xmlns:o="urn:schemas-microsoft-com:office:office" xmlns:oel="http://schemas.microsoft.com/office/2019/extlst" xmlns:r="http://schemas.openxmlformats.org/officeDocument/2006/relationships" xmlns:m="http://schemas.openxmlformats.org/officeDocument/2006/math" xmlns:v="urn:schemas-microsoft-com:vml" xmlns:wp14="http://schemas.microsoft.com/office/word/2010/wordprocessingDrawing" xmlns:wp="http://schemas.openxmlformats.org/drawingml/2006/wordprocessingDrawing" xmlns:w10="urn:schemas-microsoft-com:office:word" xmlns:w="http://schemas.openxmlformats.org/wordprocessingml/2006/main" xmlns:w14="http://schemas.microsoft.com/office/word/2010/wordml" xmlns:w15="http://schemas.microsoft.com/office/word/2012/wordml" xmlns:w16cex="http://schemas.microsoft.com/office/word/2018/wordml/cex" xmlns:w16cid="http://schemas.microsoft.com/office/word/2016/wordml/cid" xmlns:w16="http://schemas.microsoft.com/office/word/2018/wordml" xmlns:w16sdtdh="http://schemas.microsoft.com/office/word/2020/wordml/sdtdatahash" xmlns:w16se="http://schemas.microsoft.com/office/word/2015/wordml/symex" xmlns:wpg="http://schemas.microsoft.com/office/word/2010/wordprocessingGroup" xmlns:wpi="http://schemas.microsoft.com/office/word/2010/wordprocessingInk" xmlns:wne="http://schemas.microsoft.com/office/word/2006/wordml" xmlns:wps="http://schemas.microsoft.com/office/word/2010/wordprocessingShape" mc:Ignorable="w14 w15 w16se w16cid w16 w16cex w16sdtdh wp14">
+<w:document xmlns:wpc="http://schemas.microsoft.com/office/word/2010/wordprocessingCanvas" xmlns:cx="http://schemas.microsoft.com/office/drawing/2014/chartex" xmlns:cx1="http://schemas.microsoft.com/office/drawing/2015/9/8/chartex" xmlns:cx2="http://schemas.microsoft.com/office/drawing/2015/10/21/chartex" xmlns:cx3="http://schemas.microsoft.com/office/drawing/2016/5/9/chartex" xmlns:cx4="http://schemas.microsoft.com/office/drawing/2016/5/10/chartex" xmlns:cx5="http://schemas.microsoft.com/office/drawing/2016/5/11/chartex" xmlns:cx6="http://schemas.microsoft.com/office/drawing/2016/5/12/chartex" xmlns:cx7="http://schemas.microsoft.com/office/drawing/2016/5/13/chartex" xmlns:cx8="http://schemas.microsoft.com/office/drawing/2016/5/14/chartex" xmlns:mc="http://schemas.openxmlformats.org/markup-compatibility/2006" xmlns:aink="http://schemas.microsoft.com/office/drawing/2016/ink" xmlns:am3d="http://schemas.microsoft.com/office/drawing/2017/model3d" xmlns:o="urn:schemas-microsoft-com:office:office" xmlns:oel="http://schemas.microsoft.com/office/2019/extlst" xmlns:r="http://schemas.openxmlformats.org/officeDocument/2006/relationships" xmlns:m="http://schemas.openxmlformats.org/officeDocument/2006/math" xmlns:v="urn:schemas-microsoft-com:vml" xmlns:wp14="http://schemas.microsoft.com/office/word/2010/wordprocessingDrawing" xmlns:wp="http://schemas.openxmlformats.org/drawingml/2006/wordprocessingDrawing" xmlns:w10="urn:schemas-microsoft-com:office:word" xmlns:w="http://schemas.openxmlformats.org/wordprocessingml/2006/main" xmlns:w14="http://schemas.microsoft.com/office/word/2010/wordml" xmlns:w15="http://schemas.microsoft.com/office/word/2012/wordml" xmlns:w16cex="http://schemas.microsoft.com/office/word/2018/wordml/cex" xmlns:w16cid="http://schemas.microsoft.com/office/word/2016/wordml/cid" xmlns:w16="http://schemas.microsoft.com/office/word/2018/wordml" xmlns:w16du="http://schemas.microsoft.com/office/word/2023/wordml/word16du" xmlns:w16sdtdh="http://schemas.microsoft.com/office/word/2020/wordml/sdtdatahash" xmlns:w16se="http://schemas.microsoft.com/office/word/2015/wordml/symex" xmlns:wpg="http://schemas.microsoft.com/office/word/2010/wordprocessingGroup" xmlns:wpi="http://schemas.microsoft.com/office/word/2010/wordprocessingInk" xmlns:wne="http://schemas.microsoft.com/office/word/2006/wordml" xmlns:wps="http://schemas.microsoft.com/office/word/2010/wordprocessingShape" mc:Ignorable="w14 w15 w16se w16cid w16 w16cex w16sdtdh w16du wp14">
   <w:body>
     <w:p>
       <w:pPr>
-        <w:pStyle w:val="Heading1"/>
+        <w:pStyle w:val="Ttulo1"/>
         <w:jc w:val="center"/>
       </w:pPr>
       <w:bookmarkStart w:id="0" w:name="_Toc240009152"/>
-      <w:proofErr w:type="spellStart"/>
       <w:r>
         <w:t>SoulPass</w:t>
       </w:r>
       <w:bookmarkEnd w:id="0"/>
-      <w:proofErr w:type="spellEnd"/>
     </w:p>
     <w:p>
       <w:pPr>
@@ -141,15 +139,7 @@
         <w:t xml:space="preserve">Renato Ruiz Ferreira </w:t>
       </w:r>
       <w:r>
-        <w:t xml:space="preserve">Fonseca </w:t>
-      </w:r>
-      <w:proofErr w:type="spellStart"/>
-      <w:r>
-        <w:t>Scolamieri</w:t>
-      </w:r>
-      <w:proofErr w:type="spellEnd"/>
-      <w:r>
-        <w:t xml:space="preserve"> </w:t>
+        <w:t xml:space="preserve">Fonseca Scolamieri </w:t>
       </w:r>
       <w:r>
         <w:t>–</w:t>
@@ -205,7 +195,6 @@
       <w:r>
         <w:t xml:space="preserve">Sistema </w:t>
       </w:r>
-      <w:proofErr w:type="spellStart"/>
       <w:r>
         <w:rPr>
           <w:i/>
@@ -213,7 +202,6 @@
         </w:rPr>
         <w:t>SoulPass</w:t>
       </w:r>
-      <w:proofErr w:type="spellEnd"/>
       <w:r>
         <w:t xml:space="preserve"> de </w:t>
       </w:r>
@@ -230,7 +218,7 @@
     <w:p/>
     <w:p>
       <w:pPr>
-        <w:pStyle w:val="Heading1"/>
+        <w:pStyle w:val="Ttulo1"/>
       </w:pPr>
       <w:bookmarkStart w:id="1" w:name="_Toc240009153"/>
       <w:r>
@@ -241,6 +229,15 @@
     </w:p>
     <w:sdt>
       <w:sdtPr>
+        <w:rPr>
+          <w:rFonts w:ascii="Arial" w:eastAsiaTheme="minorHAnsi" w:hAnsi="Arial" w:cs="Arial"/>
+          <w:color w:val="auto"/>
+          <w:kern w:val="2"/>
+          <w:sz w:val="24"/>
+          <w:szCs w:val="24"/>
+          <w:lang w:val="pt-BR"/>
+          <w14:ligatures w14:val="standardContextual"/>
+        </w:rPr>
         <w:id w:val="-1601644247"/>
         <w:docPartObj>
           <w:docPartGallery w:val="Table of Contents"/>
@@ -249,22 +246,15 @@
       </w:sdtPr>
       <w:sdtEndPr>
         <w:rPr>
-          <w:rFonts w:ascii="Arial" w:eastAsiaTheme="minorHAnsi" w:hAnsi="Arial" w:cs="Arial"/>
           <w:b/>
           <w:bCs/>
           <w:noProof/>
-          <w:color w:val="auto"/>
-          <w:kern w:val="2"/>
-          <w:sz w:val="24"/>
-          <w:szCs w:val="24"/>
-          <w:lang w:val="pt-BR"/>
-          <w14:ligatures w14:val="standardContextual"/>
         </w:rPr>
       </w:sdtEndPr>
       <w:sdtContent>
         <w:p>
           <w:pPr>
-            <w:pStyle w:val="TOCHeading"/>
+            <w:pStyle w:val="CabealhodoSumrio"/>
             <w:spacing w:line="360" w:lineRule="auto"/>
             <w:rPr>
               <w:rFonts w:ascii="Arial" w:hAnsi="Arial" w:cs="Arial"/>
@@ -285,7 +275,7 @@
         </w:p>
         <w:p>
           <w:pPr>
-            <w:pStyle w:val="TOC1"/>
+            <w:pStyle w:val="Sumrio1"/>
             <w:tabs>
               <w:tab w:val="right" w:leader="dot" w:pos="8494"/>
             </w:tabs>
@@ -362,7 +352,7 @@
         </w:p>
         <w:p>
           <w:pPr>
-            <w:pStyle w:val="TOC1"/>
+            <w:pStyle w:val="Sumrio1"/>
             <w:tabs>
               <w:tab w:val="right" w:leader="dot" w:pos="8494"/>
             </w:tabs>
@@ -430,7 +420,7 @@
         </w:p>
         <w:p>
           <w:pPr>
-            <w:pStyle w:val="TOC1"/>
+            <w:pStyle w:val="Sumrio1"/>
             <w:tabs>
               <w:tab w:val="right" w:leader="dot" w:pos="8494"/>
             </w:tabs>
@@ -485,7 +475,7 @@
                 <w:noProof/>
                 <w:webHidden/>
               </w:rPr>
-              <w:t>2</w:t>
+              <w:t>3</w:t>
             </w:r>
             <w:r>
               <w:rPr>
@@ -498,7 +488,7 @@
         </w:p>
         <w:p>
           <w:pPr>
-            <w:pStyle w:val="TOC2"/>
+            <w:pStyle w:val="Sumrio2"/>
             <w:tabs>
               <w:tab w:val="right" w:leader="dot" w:pos="8494"/>
             </w:tabs>
@@ -553,7 +543,7 @@
                 <w:noProof/>
                 <w:webHidden/>
               </w:rPr>
-              <w:t>2</w:t>
+              <w:t>3</w:t>
             </w:r>
             <w:r>
               <w:rPr>
@@ -566,7 +556,7 @@
         </w:p>
         <w:p>
           <w:pPr>
-            <w:pStyle w:val="TOC2"/>
+            <w:pStyle w:val="Sumrio2"/>
             <w:tabs>
               <w:tab w:val="right" w:leader="dot" w:pos="8494"/>
             </w:tabs>
@@ -621,7 +611,7 @@
                 <w:noProof/>
                 <w:webHidden/>
               </w:rPr>
-              <w:t>3</w:t>
+              <w:t>4</w:t>
             </w:r>
             <w:r>
               <w:rPr>
@@ -634,7 +624,7 @@
         </w:p>
         <w:p>
           <w:pPr>
-            <w:pStyle w:val="TOC3"/>
+            <w:pStyle w:val="Sumrio3"/>
             <w:tabs>
               <w:tab w:val="right" w:leader="dot" w:pos="8494"/>
             </w:tabs>
@@ -689,7 +679,7 @@
                 <w:noProof/>
                 <w:webHidden/>
               </w:rPr>
-              <w:t>3</w:t>
+              <w:t>4</w:t>
             </w:r>
             <w:r>
               <w:rPr>
@@ -702,7 +692,7 @@
         </w:p>
         <w:p>
           <w:pPr>
-            <w:pStyle w:val="TOC3"/>
+            <w:pStyle w:val="Sumrio3"/>
             <w:tabs>
               <w:tab w:val="right" w:leader="dot" w:pos="8494"/>
             </w:tabs>
@@ -770,7 +760,7 @@
         </w:p>
         <w:p>
           <w:pPr>
-            <w:pStyle w:val="TOC1"/>
+            <w:pStyle w:val="Sumrio1"/>
             <w:tabs>
               <w:tab w:val="right" w:leader="dot" w:pos="8494"/>
             </w:tabs>
@@ -826,7 +816,7 @@
                 <w:noProof/>
                 <w:webHidden/>
               </w:rPr>
-              <w:t>4</w:t>
+              <w:t>5</w:t>
             </w:r>
             <w:r>
               <w:rPr>
@@ -839,7 +829,7 @@
         </w:p>
         <w:p>
           <w:pPr>
-            <w:pStyle w:val="TOC1"/>
+            <w:pStyle w:val="Sumrio1"/>
             <w:tabs>
               <w:tab w:val="right" w:leader="dot" w:pos="8494"/>
             </w:tabs>
@@ -894,7 +884,7 @@
                 <w:noProof/>
                 <w:webHidden/>
               </w:rPr>
-              <w:t>4</w:t>
+              <w:t>5</w:t>
             </w:r>
             <w:r>
               <w:rPr>
@@ -907,7 +897,7 @@
         </w:p>
         <w:p>
           <w:pPr>
-            <w:pStyle w:val="TOC1"/>
+            <w:pStyle w:val="Sumrio1"/>
             <w:tabs>
               <w:tab w:val="right" w:leader="dot" w:pos="8494"/>
             </w:tabs>
@@ -975,7 +965,7 @@
         </w:p>
         <w:p>
           <w:pPr>
-            <w:pStyle w:val="TOC1"/>
+            <w:pStyle w:val="Sumrio1"/>
             <w:tabs>
               <w:tab w:val="right" w:leader="dot" w:pos="8494"/>
             </w:tabs>
@@ -1030,7 +1020,7 @@
                 <w:noProof/>
                 <w:webHidden/>
               </w:rPr>
-              <w:t>5</w:t>
+              <w:t>6</w:t>
             </w:r>
             <w:r>
               <w:rPr>
@@ -1055,10 +1045,61 @@
     </w:sdt>
     <w:p>
       <w:pPr>
-        <w:pStyle w:val="Heading1"/>
+        <w:pStyle w:val="Ttulo1"/>
       </w:pPr>
       <w:bookmarkStart w:id="2" w:name="_Toc240009154"/>
-      <w:r>
+    </w:p>
+    <w:p>
+      <w:pPr>
+        <w:pStyle w:val="Ttulo1"/>
+      </w:pPr>
+    </w:p>
+    <w:p>
+      <w:pPr>
+        <w:pStyle w:val="Ttulo1"/>
+      </w:pPr>
+    </w:p>
+    <w:p>
+      <w:pPr>
+        <w:pStyle w:val="Ttulo1"/>
+      </w:pPr>
+    </w:p>
+    <w:p>
+      <w:pPr>
+        <w:pStyle w:val="Ttulo1"/>
+      </w:pPr>
+    </w:p>
+    <w:p>
+      <w:pPr>
+        <w:pStyle w:val="Ttulo1"/>
+      </w:pPr>
+    </w:p>
+    <w:p>
+      <w:pPr>
+        <w:pStyle w:val="Ttulo1"/>
+      </w:pPr>
+    </w:p>
+    <w:p>
+      <w:pPr>
+        <w:pStyle w:val="Ttulo1"/>
+      </w:pPr>
+    </w:p>
+    <w:p>
+      <w:pPr>
+        <w:pStyle w:val="Ttulo1"/>
+      </w:pPr>
+    </w:p>
+    <w:p>
+      <w:pPr>
+        <w:pStyle w:val="Ttulo1"/>
+      </w:pPr>
+    </w:p>
+    <w:p>
+      <w:pPr>
+        <w:pStyle w:val="Ttulo1"/>
+      </w:pPr>
+      <w:r>
+        <w:lastRenderedPageBreak/>
         <w:t xml:space="preserve">1. </w:t>
       </w:r>
       <w:r>
@@ -1068,7 +1109,7 @@
     </w:p>
     <w:p>
       <w:pPr>
-        <w:pStyle w:val="Heading2"/>
+        <w:pStyle w:val="Ttulo2"/>
       </w:pPr>
       <w:bookmarkStart w:id="3" w:name="_Toc240009155"/>
       <w:r>
@@ -1081,15 +1122,7 @@
         <w:t xml:space="preserve">. </w:t>
       </w:r>
       <w:r>
-        <w:t xml:space="preserve">O objetivo da </w:t>
-      </w:r>
-      <w:proofErr w:type="spellStart"/>
-      <w:r>
-        <w:t>SoulPass</w:t>
-      </w:r>
-      <w:proofErr w:type="spellEnd"/>
-      <w:r>
-        <w:t xml:space="preserve"> e da Aplicação</w:t>
+        <w:t>O objetivo da SoulPass e da Aplicação</w:t>
       </w:r>
       <w:bookmarkEnd w:id="3"/>
     </w:p>
@@ -1109,7 +1142,6 @@
         </w:rPr>
         <w:t xml:space="preserve">O </w:t>
       </w:r>
-      <w:proofErr w:type="spellStart"/>
       <w:r>
         <w:rPr>
           <w:b/>
@@ -1119,7 +1151,6 @@
         </w:rPr>
         <w:t>SoulPass</w:t>
       </w:r>
-      <w:proofErr w:type="spellEnd"/>
       <w:r>
         <w:rPr>
           <w:b/>
@@ -1127,7 +1158,6 @@
         </w:rPr>
         <w:t xml:space="preserve"> é uma solução inovadora desenvolvida em parceria com a </w:t>
       </w:r>
-      <w:proofErr w:type="spellStart"/>
       <w:r>
         <w:rPr>
           <w:b/>
@@ -1137,7 +1167,6 @@
         </w:rPr>
         <w:t>SoulUp</w:t>
       </w:r>
-      <w:proofErr w:type="spellEnd"/>
       <w:r>
         <w:rPr>
           <w:b/>
@@ -1145,7 +1174,6 @@
         </w:rPr>
         <w:t xml:space="preserve"> como parte do </w:t>
       </w:r>
-      <w:proofErr w:type="spellStart"/>
       <w:r>
         <w:rPr>
           <w:b/>
@@ -1155,7 +1183,6 @@
         </w:rPr>
         <w:t>Challenge</w:t>
       </w:r>
-      <w:proofErr w:type="spellEnd"/>
       <w:r>
         <w:rPr>
           <w:b/>
@@ -1197,7 +1224,6 @@
         </w:rPr>
         <w:t xml:space="preserve">Converta pontos acumulados na plataforma </w:t>
       </w:r>
-      <w:proofErr w:type="spellStart"/>
       <w:r>
         <w:rPr>
           <w:b/>
@@ -1207,7 +1233,6 @@
         </w:rPr>
         <w:t>SoulUp</w:t>
       </w:r>
-      <w:proofErr w:type="spellEnd"/>
       <w:r>
         <w:rPr>
           <w:b/>
@@ -1274,13 +1299,8 @@
         <w:t xml:space="preserve"> acumulam pontos </w:t>
       </w:r>
       <w:r>
-        <w:t xml:space="preserve">no aplicativo </w:t>
-      </w:r>
-      <w:proofErr w:type="spellStart"/>
-      <w:r>
-        <w:t>SoulUp</w:t>
-      </w:r>
-      <w:proofErr w:type="spellEnd"/>
+        <w:t>no aplicativo SoulUp</w:t>
+      </w:r>
       <w:r>
         <w:t xml:space="preserve"> </w:t>
       </w:r>
@@ -1328,7 +1348,6 @@
     </w:p>
     <w:p>
       <w:r>
-        <w:lastRenderedPageBreak/>
         <w:tab/>
       </w:r>
       <w:r>
@@ -1540,7 +1559,6 @@
       <w:r>
         <w:t xml:space="preserve"> de classes modelo, </w:t>
       </w:r>
-      <w:proofErr w:type="spellStart"/>
       <w:r>
         <w:rPr>
           <w:i/>
@@ -1548,7 +1566,6 @@
         </w:rPr>
         <w:t>enums</w:t>
       </w:r>
-      <w:proofErr w:type="spellEnd"/>
       <w:r>
         <w:t xml:space="preserve">, </w:t>
       </w:r>
@@ -1565,7 +1582,6 @@
       <w:r>
         <w:t xml:space="preserve"> </w:t>
       </w:r>
-      <w:proofErr w:type="spellStart"/>
       <w:r>
         <w:rPr>
           <w:i/>
@@ -1573,7 +1589,6 @@
         </w:rPr>
         <w:t>daos</w:t>
       </w:r>
-      <w:proofErr w:type="spellEnd"/>
       <w:r>
         <w:t xml:space="preserve"> </w:t>
       </w:r>
@@ -1616,17 +1631,33 @@
     </w:p>
     <w:p>
       <w:pPr>
-        <w:pStyle w:val="Heading2"/>
+        <w:pStyle w:val="Ttulo2"/>
       </w:pPr>
       <w:bookmarkStart w:id="4" w:name="_Toc240009156"/>
-      <w:r>
+    </w:p>
+    <w:p>
+      <w:pPr>
+        <w:pStyle w:val="Ttulo2"/>
+      </w:pPr>
+    </w:p>
+    <w:p>
+      <w:pPr>
+        <w:pStyle w:val="Ttulo2"/>
+      </w:pPr>
+    </w:p>
+    <w:p>
+      <w:pPr>
+        <w:pStyle w:val="Ttulo2"/>
+      </w:pPr>
+      <w:r>
+        <w:lastRenderedPageBreak/>
         <w:t>1.2. O Escopo desse projeto</w:t>
       </w:r>
       <w:bookmarkEnd w:id="4"/>
     </w:p>
     <w:p>
       <w:pPr>
-        <w:pStyle w:val="Heading3"/>
+        <w:pStyle w:val="Ttulo3"/>
       </w:pPr>
       <w:bookmarkStart w:id="5" w:name="_Toc240009157"/>
       <w:r>
@@ -1636,7 +1667,7 @@
     </w:p>
     <w:p>
       <w:pPr>
-        <w:pStyle w:val="ListParagraph"/>
+        <w:pStyle w:val="PargrafodaLista"/>
         <w:numPr>
           <w:ilvl w:val="0"/>
           <w:numId w:val="5"/>
@@ -1651,7 +1682,7 @@
     </w:p>
     <w:p>
       <w:pPr>
-        <w:pStyle w:val="ListParagraph"/>
+        <w:pStyle w:val="PargrafodaLista"/>
         <w:numPr>
           <w:ilvl w:val="0"/>
           <w:numId w:val="5"/>
@@ -1673,7 +1704,7 @@
     </w:p>
     <w:p>
       <w:pPr>
-        <w:pStyle w:val="ListParagraph"/>
+        <w:pStyle w:val="PargrafodaLista"/>
         <w:numPr>
           <w:ilvl w:val="0"/>
           <w:numId w:val="5"/>
@@ -1691,7 +1722,7 @@
     </w:p>
     <w:p>
       <w:pPr>
-        <w:pStyle w:val="ListParagraph"/>
+        <w:pStyle w:val="PargrafodaLista"/>
         <w:numPr>
           <w:ilvl w:val="0"/>
           <w:numId w:val="5"/>
@@ -1709,7 +1740,7 @@
     </w:p>
     <w:p>
       <w:pPr>
-        <w:pStyle w:val="ListParagraph"/>
+        <w:pStyle w:val="PargrafodaLista"/>
         <w:numPr>
           <w:ilvl w:val="0"/>
           <w:numId w:val="5"/>
@@ -1724,7 +1755,7 @@
     </w:p>
     <w:p>
       <w:pPr>
-        <w:pStyle w:val="ListParagraph"/>
+        <w:pStyle w:val="PargrafodaLista"/>
         <w:numPr>
           <w:ilvl w:val="0"/>
           <w:numId w:val="5"/>
@@ -1739,7 +1770,7 @@
     </w:p>
     <w:p>
       <w:pPr>
-        <w:pStyle w:val="ListParagraph"/>
+        <w:pStyle w:val="PargrafodaLista"/>
         <w:numPr>
           <w:ilvl w:val="0"/>
           <w:numId w:val="5"/>
@@ -1751,7 +1782,7 @@
     </w:p>
     <w:p>
       <w:pPr>
-        <w:pStyle w:val="ListParagraph"/>
+        <w:pStyle w:val="PargrafodaLista"/>
         <w:numPr>
           <w:ilvl w:val="0"/>
           <w:numId w:val="5"/>
@@ -1763,7 +1794,7 @@
     </w:p>
     <w:p>
       <w:pPr>
-        <w:pStyle w:val="ListParagraph"/>
+        <w:pStyle w:val="PargrafodaLista"/>
         <w:numPr>
           <w:ilvl w:val="0"/>
           <w:numId w:val="5"/>
@@ -1775,7 +1806,7 @@
     </w:p>
     <w:p>
       <w:pPr>
-        <w:pStyle w:val="ListParagraph"/>
+        <w:pStyle w:val="PargrafodaLista"/>
         <w:numPr>
           <w:ilvl w:val="0"/>
           <w:numId w:val="5"/>
@@ -1799,7 +1830,7 @@
     </w:p>
     <w:p>
       <w:pPr>
-        <w:pStyle w:val="ListParagraph"/>
+        <w:pStyle w:val="PargrafodaLista"/>
         <w:numPr>
           <w:ilvl w:val="0"/>
           <w:numId w:val="5"/>
@@ -1823,7 +1854,7 @@
     </w:p>
     <w:p>
       <w:pPr>
-        <w:pStyle w:val="ListParagraph"/>
+        <w:pStyle w:val="PargrafodaLista"/>
         <w:numPr>
           <w:ilvl w:val="0"/>
           <w:numId w:val="5"/>
@@ -1842,7 +1873,7 @@
     </w:p>
     <w:p>
       <w:pPr>
-        <w:pStyle w:val="ListParagraph"/>
+        <w:pStyle w:val="PargrafodaLista"/>
         <w:numPr>
           <w:ilvl w:val="0"/>
           <w:numId w:val="5"/>
@@ -1854,7 +1885,7 @@
     </w:p>
     <w:p>
       <w:pPr>
-        <w:pStyle w:val="ListParagraph"/>
+        <w:pStyle w:val="PargrafodaLista"/>
         <w:numPr>
           <w:ilvl w:val="0"/>
           <w:numId w:val="5"/>
@@ -1873,7 +1904,7 @@
     </w:p>
     <w:p>
       <w:pPr>
-        <w:pStyle w:val="ListParagraph"/>
+        <w:pStyle w:val="PargrafodaLista"/>
         <w:numPr>
           <w:ilvl w:val="0"/>
           <w:numId w:val="5"/>
@@ -1885,7 +1916,7 @@
     </w:p>
     <w:p>
       <w:pPr>
-        <w:pStyle w:val="ListParagraph"/>
+        <w:pStyle w:val="PargrafodaLista"/>
         <w:numPr>
           <w:ilvl w:val="0"/>
           <w:numId w:val="5"/>
@@ -1900,20 +1931,19 @@
     </w:p>
     <w:p>
       <w:pPr>
-        <w:pStyle w:val="ListParagraph"/>
+        <w:pStyle w:val="PargrafodaLista"/>
         <w:numPr>
           <w:ilvl w:val="0"/>
           <w:numId w:val="5"/>
         </w:numPr>
       </w:pPr>
       <w:r>
-        <w:lastRenderedPageBreak/>
         <w:t>Ver histórico de pontos ganhos;</w:t>
       </w:r>
     </w:p>
     <w:p>
       <w:pPr>
-        <w:pStyle w:val="ListParagraph"/>
+        <w:pStyle w:val="PargrafodaLista"/>
         <w:numPr>
           <w:ilvl w:val="0"/>
           <w:numId w:val="5"/>
@@ -1928,7 +1958,7 @@
     </w:p>
     <w:p>
       <w:pPr>
-        <w:pStyle w:val="ListParagraph"/>
+        <w:pStyle w:val="PargrafodaLista"/>
         <w:numPr>
           <w:ilvl w:val="0"/>
           <w:numId w:val="5"/>
@@ -1940,7 +1970,7 @@
     </w:p>
     <w:p>
       <w:pPr>
-        <w:pStyle w:val="Heading3"/>
+        <w:pStyle w:val="Ttulo3"/>
       </w:pPr>
       <w:bookmarkStart w:id="6" w:name="_Toc240009158"/>
       <w:r>
@@ -1950,7 +1980,7 @@
     </w:p>
     <w:p>
       <w:pPr>
-        <w:pStyle w:val="ListParagraph"/>
+        <w:pStyle w:val="PargrafodaLista"/>
         <w:numPr>
           <w:ilvl w:val="0"/>
           <w:numId w:val="6"/>
@@ -1962,7 +1992,7 @@
     </w:p>
     <w:p>
       <w:pPr>
-        <w:pStyle w:val="ListParagraph"/>
+        <w:pStyle w:val="PargrafodaLista"/>
         <w:numPr>
           <w:ilvl w:val="0"/>
           <w:numId w:val="6"/>
@@ -1974,72 +2004,64 @@
       <w:r>
         <w:t xml:space="preserve"> o tipo de atividade e o quanto ela vale em pontos </w:t>
       </w:r>
-      <w:proofErr w:type="spellStart"/>
       <w:r>
         <w:rPr>
           <w:i/>
           <w:iCs/>
         </w:rPr>
-        <w:t>in-app</w:t>
-      </w:r>
-      <w:proofErr w:type="spellEnd"/>
-      <w:r>
-        <w:rPr>
-          <w:i/>
-          <w:iCs/>
-        </w:rPr>
-        <w:t>;</w:t>
-      </w:r>
-    </w:p>
-    <w:p>
-      <w:pPr>
-        <w:pStyle w:val="ListParagraph"/>
+        <w:t>in-app;</w:t>
+      </w:r>
+    </w:p>
+    <w:p>
+      <w:pPr>
+        <w:pStyle w:val="PargrafodaLista"/>
         <w:numPr>
           <w:ilvl w:val="0"/>
           <w:numId w:val="6"/>
         </w:numPr>
       </w:pPr>
       <w:r>
-        <w:t xml:space="preserve">Se conectar </w:t>
-      </w:r>
-      <w:proofErr w:type="spellStart"/>
-      <w:r>
-        <w:t>a</w:t>
-      </w:r>
-      <w:proofErr w:type="spellEnd"/>
-      <w:r>
-        <w:t xml:space="preserve"> rede de postagens para se ter comentários ou likes;</w:t>
-      </w:r>
-    </w:p>
-    <w:p>
-      <w:pPr>
-        <w:pStyle w:val="Heading1"/>
+        <w:t>Se conectar a rede de postagens para se ter comentários ou likes;</w:t>
+      </w:r>
+    </w:p>
+    <w:p>
+      <w:pPr>
+        <w:pStyle w:val="Ttulo1"/>
         <w:rPr>
           <w:lang w:val="en-US"/>
         </w:rPr>
       </w:pPr>
       <w:bookmarkStart w:id="7" w:name="_Toc240009159"/>
-      <w:r>
+    </w:p>
+    <w:p>
+      <w:pPr>
+        <w:pStyle w:val="Ttulo1"/>
         <w:rPr>
           <w:lang w:val="en-US"/>
         </w:rPr>
+      </w:pPr>
+    </w:p>
+    <w:p>
+      <w:pPr>
+        <w:pStyle w:val="Ttulo1"/>
+        <w:rPr>
+          <w:lang w:val="en-US"/>
+        </w:rPr>
+      </w:pPr>
+      <w:r>
+        <w:rPr>
+          <w:lang w:val="en-US"/>
+        </w:rPr>
+        <w:lastRenderedPageBreak/>
         <w:t>2</w:t>
       </w:r>
       <w:r>
         <w:rPr>
           <w:lang w:val="en-US"/>
         </w:rPr>
-        <w:t xml:space="preserve">. </w:t>
-      </w:r>
-      <w:proofErr w:type="spellStart"/>
-      <w:r>
-        <w:rPr>
-          <w:lang w:val="en-US"/>
-        </w:rPr>
-        <w:t>Protótipo</w:t>
+        <w:t>. Protótipo</w:t>
       </w:r>
       <w:bookmarkEnd w:id="7"/>
-      <w:proofErr w:type="spellEnd"/>
     </w:p>
     <w:p>
       <w:pPr>
@@ -2061,27 +2083,15 @@
           <w:rPr>
             <w:rStyle w:val="Hyperlink"/>
           </w:rPr>
-          <w:t>https://ww</w:t>
-        </w:r>
-        <w:r>
-          <w:rPr>
-            <w:rStyle w:val="Hyperlink"/>
-          </w:rPr>
-          <w:t>w</w:t>
-        </w:r>
-        <w:r>
-          <w:rPr>
-            <w:rStyle w:val="Hyperlink"/>
-          </w:rPr>
-          <w:t>.figma.com/site/0cQyRoIL1mQcZd8ziV5CTK/SoulPass</w:t>
+          <w:t>https://www.figma.com/site/0cQyRoIL1mQcZd8ziV5CTK/SoulPass</w:t>
         </w:r>
       </w:hyperlink>
-    </w:p>
-    <w:p>
-      <w:pPr>
-        <w:pStyle w:val="Heading1"/>
-      </w:pPr>
       <w:bookmarkStart w:id="8" w:name="_Toc240009160"/>
+    </w:p>
+    <w:p>
+      <w:pPr>
+        <w:pStyle w:val="Ttulo1"/>
+      </w:pPr>
       <w:r>
         <w:t>3. MER (Modelo de Entidade e Relacionamento)</w:t>
       </w:r>
@@ -2089,17 +2099,19 @@
     </w:p>
     <w:p>
       <w:pPr>
+        <w:jc w:val="center"/>
         <w:rPr>
           <w:lang w:val="en-US"/>
         </w:rPr>
       </w:pPr>
       <w:r>
         <w:rPr>
+          <w:noProof/>
           <w:lang w:val="en-US"/>
         </w:rPr>
         <w:drawing>
-          <wp:inline distT="0" distB="0" distL="0" distR="0" wp14:anchorId="7CDA4E5B" wp14:editId="41D7DE97">
-            <wp:extent cx="5400040" cy="4306570"/>
+          <wp:inline distT="0" distB="0" distL="0" distR="0" wp14:anchorId="7CDA4E5B" wp14:editId="3531DE18">
+            <wp:extent cx="4333152" cy="3455719"/>
             <wp:effectExtent l="0" t="0" r="0" b="0"/>
             <wp:docPr id="5" name="Picture 5"/>
             <wp:cNvGraphicFramePr>
@@ -2130,7 +2142,7 @@
                   <pic:spPr bwMode="auto">
                     <a:xfrm>
                       <a:off x="0" y="0"/>
-                      <a:ext cx="5400040" cy="4306570"/>
+                      <a:ext cx="4341662" cy="3462506"/>
                     </a:xfrm>
                     <a:prstGeom prst="rect">
                       <a:avLst/>
@@ -2149,25 +2161,27 @@
     </w:p>
     <w:p>
       <w:pPr>
-        <w:pStyle w:val="Heading1"/>
+        <w:pStyle w:val="Ttulo1"/>
       </w:pPr>
       <w:bookmarkStart w:id="9" w:name="_Toc240009161"/>
       <w:r>
-        <w:lastRenderedPageBreak/>
         <w:t>4. Diagrama de Classes</w:t>
       </w:r>
       <w:bookmarkEnd w:id="9"/>
     </w:p>
     <w:p>
+      <w:pPr>
+        <w:jc w:val="center"/>
+      </w:pPr>
       <w:r>
         <w:rPr>
           <w:noProof/>
         </w:rPr>
         <w:drawing>
-          <wp:inline distT="0" distB="0" distL="0" distR="0" wp14:anchorId="4B47EEA9" wp14:editId="6851C68B">
-            <wp:extent cx="5391150" cy="4248150"/>
-            <wp:effectExtent l="0" t="0" r="0" b="0"/>
-            <wp:docPr id="6" name="Picture 6"/>
+          <wp:inline distT="0" distB="0" distL="0" distR="0" wp14:anchorId="21D948BA" wp14:editId="3401E349">
+            <wp:extent cx="4144903" cy="3220995"/>
+            <wp:effectExtent l="0" t="0" r="8255" b="0"/>
+            <wp:docPr id="1047754742" name="Imagem 2"/>
             <wp:cNvGraphicFramePr>
               <a:graphicFrameLocks xmlns:a="http://schemas.openxmlformats.org/drawingml/2006/main" noChangeAspect="1"/>
             </wp:cNvGraphicFramePr>
@@ -2175,7 +2189,7 @@
               <a:graphicData uri="http://schemas.openxmlformats.org/drawingml/2006/picture">
                 <pic:pic xmlns:pic="http://schemas.openxmlformats.org/drawingml/2006/picture">
                   <pic:nvPicPr>
-                    <pic:cNvPr id="0" name="Picture 16"/>
+                    <pic:cNvPr id="0" name="Picture 2"/>
                     <pic:cNvPicPr>
                       <a:picLocks noChangeAspect="1" noChangeArrowheads="1"/>
                     </pic:cNvPicPr>
@@ -2196,7 +2210,7 @@
                   <pic:spPr bwMode="auto">
                     <a:xfrm>
                       <a:off x="0" y="0"/>
-                      <a:ext cx="5391150" cy="4248150"/>
+                      <a:ext cx="4198556" cy="3262689"/>
                     </a:xfrm>
                     <a:prstGeom prst="rect">
                       <a:avLst/>
@@ -2215,10 +2229,11 @@
     </w:p>
     <w:p>
       <w:pPr>
-        <w:pStyle w:val="Heading1"/>
+        <w:pStyle w:val="Ttulo1"/>
       </w:pPr>
       <w:bookmarkStart w:id="10" w:name="_Toc240009162"/>
       <w:r>
+        <w:lastRenderedPageBreak/>
         <w:t>5. Como rodar a aplicação?</w:t>
       </w:r>
       <w:bookmarkEnd w:id="10"/>
@@ -2238,57 +2253,31 @@
       <w:r>
         <w:t xml:space="preserve"> a seguir foi feito no </w:t>
       </w:r>
-      <w:proofErr w:type="spellStart"/>
-      <w:r>
-        <w:rPr>
-          <w:b/>
-          <w:bCs/>
-        </w:rPr>
-        <w:t>JetBrains</w:t>
-      </w:r>
-      <w:proofErr w:type="spellEnd"/>
-      <w:r>
-        <w:rPr>
-          <w:b/>
-          <w:bCs/>
-        </w:rPr>
+      <w:r>
+        <w:rPr>
+          <w:b/>
+          <w:bCs/>
+        </w:rPr>
+        <w:t>JetBrains IntelliJ</w:t>
+      </w:r>
+      <w:r>
+        <w:t xml:space="preserve">, na </w:t>
+      </w:r>
+      <w:r>
+        <w:rPr>
+          <w:b/>
+          <w:bCs/>
+        </w:rPr>
+        <w:t>versão 25 do JDK.</w:t>
+      </w:r>
+      <w:r>
         <w:t xml:space="preserve"> </w:t>
       </w:r>
-      <w:proofErr w:type="spellStart"/>
-      <w:r>
-        <w:rPr>
-          <w:b/>
-          <w:bCs/>
-        </w:rPr>
-        <w:t>IntelliJ</w:t>
-      </w:r>
-      <w:proofErr w:type="spellEnd"/>
-      <w:r>
-        <w:t xml:space="preserve">, na </w:t>
-      </w:r>
-      <w:r>
-        <w:rPr>
-          <w:b/>
-          <w:bCs/>
-        </w:rPr>
-        <w:t>versão 25 do JDK.</w:t>
-      </w:r>
-      <w:r>
-        <w:t xml:space="preserve"> </w:t>
-      </w:r>
       <w:r>
         <w:t xml:space="preserve">Caso ainda esteja vendo esse arquivo pelo .zip, por favor, extraia o conteúdo da pasta comprimida para uma nova pasta. </w:t>
       </w:r>
       <w:r>
-        <w:t xml:space="preserve">Abra a pasta do projeto pelo </w:t>
-      </w:r>
-      <w:proofErr w:type="spellStart"/>
-      <w:r>
-        <w:t>IntelliJ</w:t>
-      </w:r>
-      <w:proofErr w:type="spellEnd"/>
-      <w:r>
-        <w:t xml:space="preserve"> e use a classe </w:t>
+        <w:t xml:space="preserve">Abra a pasta do projeto pelo IntelliJ e use a classe </w:t>
       </w:r>
       <w:r>
         <w:rPr>
@@ -2317,7 +2306,7 @@
 </file>
 
 <file path=word/endnotes.xml><?xml version="1.0" encoding="utf-8"?>
-<w:endnotes xmlns:wpc="http://schemas.microsoft.com/office/word/2010/wordprocessingCanvas" xmlns:cx="http://schemas.microsoft.com/office/drawing/2014/chartex" xmlns:cx1="http://schemas.microsoft.com/office/drawing/2015/9/8/chartex" xmlns:cx2="http://schemas.microsoft.com/office/drawing/2015/10/21/chartex" xmlns:cx3="http://schemas.microsoft.com/office/drawing/2016/5/9/chartex" xmlns:cx4="http://schemas.microsoft.com/office/drawing/2016/5/10/chartex" xmlns:cx5="http://schemas.microsoft.com/office/drawing/2016/5/11/chartex" xmlns:cx6="http://schemas.microsoft.com/office/drawing/2016/5/12/chartex" xmlns:cx7="http://schemas.microsoft.com/office/drawing/2016/5/13/chartex" xmlns:cx8="http://schemas.microsoft.com/office/drawing/2016/5/14/chartex" xmlns:mc="http://schemas.openxmlformats.org/markup-compatibility/2006" xmlns:aink="http://schemas.microsoft.com/office/drawing/2016/ink" xmlns:am3d="http://schemas.microsoft.com/office/drawing/2017/model3d" xmlns:o="urn:schemas-microsoft-com:office:office" xmlns:oel="http://schemas.microsoft.com/office/2019/extlst" xmlns:r="http://schemas.openxmlformats.org/officeDocument/2006/relationships" xmlns:m="http://schemas.openxmlformats.org/officeDocument/2006/math" xmlns:v="urn:schemas-microsoft-com:vml" xmlns:wp14="http://schemas.microsoft.com/office/word/2010/wordprocessingDrawing" xmlns:wp="http://schemas.openxmlformats.org/drawingml/2006/wordprocessingDrawing" xmlns:w10="urn:schemas-microsoft-com:office:word" xmlns:w="http://schemas.openxmlformats.org/wordprocessingml/2006/main" xmlns:w14="http://schemas.microsoft.com/office/word/2010/wordml" xmlns:w15="http://schemas.microsoft.com/office/word/2012/wordml" xmlns:w16cex="http://schemas.microsoft.com/office/word/2018/wordml/cex" xmlns:w16cid="http://schemas.microsoft.com/office/word/2016/wordml/cid" xmlns:w16="http://schemas.microsoft.com/office/word/2018/wordml" xmlns:w16sdtdh="http://schemas.microsoft.com/office/word/2020/wordml/sdtdatahash" xmlns:w16se="http://schemas.microsoft.com/office/word/2015/wordml/symex" xmlns:wpg="http://schemas.microsoft.com/office/word/2010/wordprocessingGroup" xmlns:wpi="http://schemas.microsoft.com/office/word/2010/wordprocessingInk" xmlns:wne="http://schemas.microsoft.com/office/word/2006/wordml" xmlns:wps="http://schemas.microsoft.com/office/word/2010/wordprocessingShape" mc:Ignorable="w14 w15 w16se w16cid w16 w16cex w16sdtdh wp14">
+<w:endnotes xmlns:wpc="http://schemas.microsoft.com/office/word/2010/wordprocessingCanvas" xmlns:cx="http://schemas.microsoft.com/office/drawing/2014/chartex" xmlns:cx1="http://schemas.microsoft.com/office/drawing/2015/9/8/chartex" xmlns:cx2="http://schemas.microsoft.com/office/drawing/2015/10/21/chartex" xmlns:cx3="http://schemas.microsoft.com/office/drawing/2016/5/9/chartex" xmlns:cx4="http://schemas.microsoft.com/office/drawing/2016/5/10/chartex" xmlns:cx5="http://schemas.microsoft.com/office/drawing/2016/5/11/chartex" xmlns:cx6="http://schemas.microsoft.com/office/drawing/2016/5/12/chartex" xmlns:cx7="http://schemas.microsoft.com/office/drawing/2016/5/13/chartex" xmlns:cx8="http://schemas.microsoft.com/office/drawing/2016/5/14/chartex" xmlns:mc="http://schemas.openxmlformats.org/markup-compatibility/2006" xmlns:aink="http://schemas.microsoft.com/office/drawing/2016/ink" xmlns:am3d="http://schemas.microsoft.com/office/drawing/2017/model3d" xmlns:o="urn:schemas-microsoft-com:office:office" xmlns:oel="http://schemas.microsoft.com/office/2019/extlst" xmlns:r="http://schemas.openxmlformats.org/officeDocument/2006/relationships" xmlns:m="http://schemas.openxmlformats.org/officeDocument/2006/math" xmlns:v="urn:schemas-microsoft-com:vml" xmlns:wp14="http://schemas.microsoft.com/office/word/2010/wordprocessingDrawing" xmlns:wp="http://schemas.openxmlformats.org/drawingml/2006/wordprocessingDrawing" xmlns:w10="urn:schemas-microsoft-com:office:word" xmlns:w="http://schemas.openxmlformats.org/wordprocessingml/2006/main" xmlns:w14="http://schemas.microsoft.com/office/word/2010/wordml" xmlns:w15="http://schemas.microsoft.com/office/word/2012/wordml" xmlns:w16cex="http://schemas.microsoft.com/office/word/2018/wordml/cex" xmlns:w16cid="http://schemas.microsoft.com/office/word/2016/wordml/cid" xmlns:w16="http://schemas.microsoft.com/office/word/2018/wordml" xmlns:w16du="http://schemas.microsoft.com/office/word/2023/wordml/word16du" xmlns:w16sdtdh="http://schemas.microsoft.com/office/word/2020/wordml/sdtdatahash" xmlns:w16se="http://schemas.microsoft.com/office/word/2015/wordml/symex" xmlns:wpg="http://schemas.microsoft.com/office/word/2010/wordprocessingGroup" xmlns:wpi="http://schemas.microsoft.com/office/word/2010/wordprocessingInk" xmlns:wne="http://schemas.microsoft.com/office/word/2006/wordml" xmlns:wps="http://schemas.microsoft.com/office/word/2010/wordprocessingShape" mc:Ignorable="w14 w15 w16se w16cid w16 w16cex w16sdtdh w16du wp14">
   <w:endnote w:type="separator" w:id="-1">
     <w:p>
       <w:pPr>
@@ -2342,7 +2331,7 @@
 </file>
 
 <file path=word/footnotes.xml><?xml version="1.0" encoding="utf-8"?>
-<w:footnotes xmlns:wpc="http://schemas.microsoft.com/office/word/2010/wordprocessingCanvas" xmlns:cx="http://schemas.microsoft.com/office/drawing/2014/chartex" xmlns:cx1="http://schemas.microsoft.com/office/drawing/2015/9/8/chartex" xmlns:cx2="http://schemas.microsoft.com/office/drawing/2015/10/21/chartex" xmlns:cx3="http://schemas.microsoft.com/office/drawing/2016/5/9/chartex" xmlns:cx4="http://schemas.microsoft.com/office/drawing/2016/5/10/chartex" xmlns:cx5="http://schemas.microsoft.com/office/drawing/2016/5/11/chartex" xmlns:cx6="http://schemas.microsoft.com/office/drawing/2016/5/12/chartex" xmlns:cx7="http://schemas.microsoft.com/office/drawing/2016/5/13/chartex" xmlns:cx8="http://schemas.microsoft.com/office/drawing/2016/5/14/chartex" xmlns:mc="http://schemas.openxmlformats.org/markup-compatibility/2006" xmlns:aink="http://schemas.microsoft.com/office/drawing/2016/ink" xmlns:am3d="http://schemas.microsoft.com/office/drawing/2017/model3d" xmlns:o="urn:schemas-microsoft-com:office:office" xmlns:oel="http://schemas.microsoft.com/office/2019/extlst" xmlns:r="http://schemas.openxmlformats.org/officeDocument/2006/relationships" xmlns:m="http://schemas.openxmlformats.org/officeDocument/2006/math" xmlns:v="urn:schemas-microsoft-com:vml" xmlns:wp14="http://schemas.microsoft.com/office/word/2010/wordprocessingDrawing" xmlns:wp="http://schemas.openxmlformats.org/drawingml/2006/wordprocessingDrawing" xmlns:w10="urn:schemas-microsoft-com:office:word" xmlns:w="http://schemas.openxmlformats.org/wordprocessingml/2006/main" xmlns:w14="http://schemas.microsoft.com/office/word/2010/wordml" xmlns:w15="http://schemas.microsoft.com/office/word/2012/wordml" xmlns:w16cex="http://schemas.microsoft.com/office/word/2018/wordml/cex" xmlns:w16cid="http://schemas.microsoft.com/office/word/2016/wordml/cid" xmlns:w16="http://schemas.microsoft.com/office/word/2018/wordml" xmlns:w16sdtdh="http://schemas.microsoft.com/office/word/2020/wordml/sdtdatahash" xmlns:w16se="http://schemas.microsoft.com/office/word/2015/wordml/symex" xmlns:wpg="http://schemas.microsoft.com/office/word/2010/wordprocessingGroup" xmlns:wpi="http://schemas.microsoft.com/office/word/2010/wordprocessingInk" xmlns:wne="http://schemas.microsoft.com/office/word/2006/wordml" xmlns:wps="http://schemas.microsoft.com/office/word/2010/wordprocessingShape" mc:Ignorable="w14 w15 w16se w16cid w16 w16cex w16sdtdh wp14">
+<w:footnotes xmlns:wpc="http://schemas.microsoft.com/office/word/2010/wordprocessingCanvas" xmlns:cx="http://schemas.microsoft.com/office/drawing/2014/chartex" xmlns:cx1="http://schemas.microsoft.com/office/drawing/2015/9/8/chartex" xmlns:cx2="http://schemas.microsoft.com/office/drawing/2015/10/21/chartex" xmlns:cx3="http://schemas.microsoft.com/office/drawing/2016/5/9/chartex" xmlns:cx4="http://schemas.microsoft.com/office/drawing/2016/5/10/chartex" xmlns:cx5="http://schemas.microsoft.com/office/drawing/2016/5/11/chartex" xmlns:cx6="http://schemas.microsoft.com/office/drawing/2016/5/12/chartex" xmlns:cx7="http://schemas.microsoft.com/office/drawing/2016/5/13/chartex" xmlns:cx8="http://schemas.microsoft.com/office/drawing/2016/5/14/chartex" xmlns:mc="http://schemas.openxmlformats.org/markup-compatibility/2006" xmlns:aink="http://schemas.microsoft.com/office/drawing/2016/ink" xmlns:am3d="http://schemas.microsoft.com/office/drawing/2017/model3d" xmlns:o="urn:schemas-microsoft-com:office:office" xmlns:oel="http://schemas.microsoft.com/office/2019/extlst" xmlns:r="http://schemas.openxmlformats.org/officeDocument/2006/relationships" xmlns:m="http://schemas.openxmlformats.org/officeDocument/2006/math" xmlns:v="urn:schemas-microsoft-com:vml" xmlns:wp14="http://schemas.microsoft.com/office/word/2010/wordprocessingDrawing" xmlns:wp="http://schemas.openxmlformats.org/drawingml/2006/wordprocessingDrawing" xmlns:w10="urn:schemas-microsoft-com:office:word" xmlns:w="http://schemas.openxmlformats.org/wordprocessingml/2006/main" xmlns:w14="http://schemas.microsoft.com/office/word/2010/wordml" xmlns:w15="http://schemas.microsoft.com/office/word/2012/wordml" xmlns:w16cex="http://schemas.microsoft.com/office/word/2018/wordml/cex" xmlns:w16cid="http://schemas.microsoft.com/office/word/2016/wordml/cid" xmlns:w16="http://schemas.microsoft.com/office/word/2018/wordml" xmlns:w16du="http://schemas.microsoft.com/office/word/2023/wordml/word16du" xmlns:w16sdtdh="http://schemas.microsoft.com/office/word/2020/wordml/sdtdatahash" xmlns:w16se="http://schemas.microsoft.com/office/word/2015/wordml/symex" xmlns:wpg="http://schemas.microsoft.com/office/word/2010/wordprocessingGroup" xmlns:wpi="http://schemas.microsoft.com/office/word/2010/wordprocessingInk" xmlns:wne="http://schemas.microsoft.com/office/word/2006/wordml" xmlns:wps="http://schemas.microsoft.com/office/word/2010/wordprocessingShape" mc:Ignorable="w14 w15 w16se w16cid w16 w16cex w16sdtdh w16du wp14">
   <w:footnote w:type="separator" w:id="-1">
     <w:p>
       <w:pPr>
@@ -2367,7 +2356,7 @@
 </file>
 
 <file path=word/header1.xml><?xml version="1.0" encoding="utf-8"?>
-<w:hdr xmlns:wpc="http://schemas.microsoft.com/office/word/2010/wordprocessingCanvas" xmlns:cx="http://schemas.microsoft.com/office/drawing/2014/chartex" xmlns:cx1="http://schemas.microsoft.com/office/drawing/2015/9/8/chartex" xmlns:cx2="http://schemas.microsoft.com/office/drawing/2015/10/21/chartex" xmlns:cx3="http://schemas.microsoft.com/office/drawing/2016/5/9/chartex" xmlns:cx4="http://schemas.microsoft.com/office/drawing/2016/5/10/chartex" xmlns:cx5="http://schemas.microsoft.com/office/drawing/2016/5/11/chartex" xmlns:cx6="http://schemas.microsoft.com/office/drawing/2016/5/12/chartex" xmlns:cx7="http://schemas.microsoft.com/office/drawing/2016/5/13/chartex" xmlns:cx8="http://schemas.microsoft.com/office/drawing/2016/5/14/chartex" xmlns:mc="http://schemas.openxmlformats.org/markup-compatibility/2006" xmlns:aink="http://schemas.microsoft.com/office/drawing/2016/ink" xmlns:am3d="http://schemas.microsoft.com/office/drawing/2017/model3d" xmlns:o="urn:schemas-microsoft-com:office:office" xmlns:oel="http://schemas.microsoft.com/office/2019/extlst" xmlns:r="http://schemas.openxmlformats.org/officeDocument/2006/relationships" xmlns:m="http://schemas.openxmlformats.org/officeDocument/2006/math" xmlns:v="urn:schemas-microsoft-com:vml" xmlns:wp14="http://schemas.microsoft.com/office/word/2010/wordprocessingDrawing" xmlns:wp="http://schemas.openxmlformats.org/drawingml/2006/wordprocessingDrawing" xmlns:w10="urn:schemas-microsoft-com:office:word" xmlns:w="http://schemas.openxmlformats.org/wordprocessingml/2006/main" xmlns:w14="http://schemas.microsoft.com/office/word/2010/wordml" xmlns:w15="http://schemas.microsoft.com/office/word/2012/wordml" xmlns:w16cex="http://schemas.microsoft.com/office/word/2018/wordml/cex" xmlns:w16cid="http://schemas.microsoft.com/office/word/2016/wordml/cid" xmlns:w16="http://schemas.microsoft.com/office/word/2018/wordml" xmlns:w16sdtdh="http://schemas.microsoft.com/office/word/2020/wordml/sdtdatahash" xmlns:w16se="http://schemas.microsoft.com/office/word/2015/wordml/symex" xmlns:wpg="http://schemas.microsoft.com/office/word/2010/wordprocessingGroup" xmlns:wpi="http://schemas.microsoft.com/office/word/2010/wordprocessingInk" xmlns:wne="http://schemas.microsoft.com/office/word/2006/wordml" xmlns:wps="http://schemas.microsoft.com/office/word/2010/wordprocessingShape" mc:Ignorable="w14 w15 w16se w16cid w16 w16cex w16sdtdh wp14">
+<w:hdr xmlns:wpc="http://schemas.microsoft.com/office/word/2010/wordprocessingCanvas" xmlns:cx="http://schemas.microsoft.com/office/drawing/2014/chartex" xmlns:cx1="http://schemas.microsoft.com/office/drawing/2015/9/8/chartex" xmlns:cx2="http://schemas.microsoft.com/office/drawing/2015/10/21/chartex" xmlns:cx3="http://schemas.microsoft.com/office/drawing/2016/5/9/chartex" xmlns:cx4="http://schemas.microsoft.com/office/drawing/2016/5/10/chartex" xmlns:cx5="http://schemas.microsoft.com/office/drawing/2016/5/11/chartex" xmlns:cx6="http://schemas.microsoft.com/office/drawing/2016/5/12/chartex" xmlns:cx7="http://schemas.microsoft.com/office/drawing/2016/5/13/chartex" xmlns:cx8="http://schemas.microsoft.com/office/drawing/2016/5/14/chartex" xmlns:mc="http://schemas.openxmlformats.org/markup-compatibility/2006" xmlns:aink="http://schemas.microsoft.com/office/drawing/2016/ink" xmlns:am3d="http://schemas.microsoft.com/office/drawing/2017/model3d" xmlns:o="urn:schemas-microsoft-com:office:office" xmlns:oel="http://schemas.microsoft.com/office/2019/extlst" xmlns:r="http://schemas.openxmlformats.org/officeDocument/2006/relationships" xmlns:m="http://schemas.openxmlformats.org/officeDocument/2006/math" xmlns:v="urn:schemas-microsoft-com:vml" xmlns:wp14="http://schemas.microsoft.com/office/word/2010/wordprocessingDrawing" xmlns:wp="http://schemas.openxmlformats.org/drawingml/2006/wordprocessingDrawing" xmlns:w10="urn:schemas-microsoft-com:office:word" xmlns:w="http://schemas.openxmlformats.org/wordprocessingml/2006/main" xmlns:w14="http://schemas.microsoft.com/office/word/2010/wordml" xmlns:w15="http://schemas.microsoft.com/office/word/2012/wordml" xmlns:w16cex="http://schemas.microsoft.com/office/word/2018/wordml/cex" xmlns:w16cid="http://schemas.microsoft.com/office/word/2016/wordml/cid" xmlns:w16="http://schemas.microsoft.com/office/word/2018/wordml" xmlns:w16du="http://schemas.microsoft.com/office/word/2023/wordml/word16du" xmlns:w16sdtdh="http://schemas.microsoft.com/office/word/2020/wordml/sdtdatahash" xmlns:w16se="http://schemas.microsoft.com/office/word/2015/wordml/symex" xmlns:wpg="http://schemas.microsoft.com/office/word/2010/wordprocessingGroup" xmlns:wpi="http://schemas.microsoft.com/office/word/2010/wordprocessingInk" xmlns:wne="http://schemas.microsoft.com/office/word/2006/wordml" xmlns:wps="http://schemas.microsoft.com/office/word/2010/wordprocessingShape" mc:Ignorable="w14 w15 w16se w16cid w16 w16cex w16sdtdh w16du wp14">
   <w:sdt>
     <w:sdtPr>
       <w:id w:val="-1213418629"/>
@@ -2384,7 +2373,7 @@
     <w:sdtContent>
       <w:p>
         <w:pPr>
-          <w:pStyle w:val="Header"/>
+          <w:pStyle w:val="Cabealho"/>
           <w:jc w:val="right"/>
         </w:pPr>
         <w:r>
@@ -2413,14 +2402,14 @@
   </w:sdt>
   <w:p>
     <w:pPr>
-      <w:pStyle w:val="Header"/>
+      <w:pStyle w:val="Cabealho"/>
     </w:pPr>
   </w:p>
 </w:hdr>
 </file>
 
 <file path=word/numbering.xml><?xml version="1.0" encoding="utf-8"?>
-<w:numbering xmlns:wpc="http://schemas.microsoft.com/office/word/2010/wordprocessingCanvas" xmlns:cx="http://schemas.microsoft.com/office/drawing/2014/chartex" xmlns:cx1="http://schemas.microsoft.com/office/drawing/2015/9/8/chartex" xmlns:cx2="http://schemas.microsoft.com/office/drawing/2015/10/21/chartex" xmlns:cx3="http://schemas.microsoft.com/office/drawing/2016/5/9/chartex" xmlns:cx4="http://schemas.microsoft.com/office/drawing/2016/5/10/chartex" xmlns:cx5="http://schemas.microsoft.com/office/drawing/2016/5/11/chartex" xmlns:cx6="http://schemas.microsoft.com/office/drawing/2016/5/12/chartex" xmlns:cx7="http://schemas.microsoft.com/office/drawing/2016/5/13/chartex" xmlns:cx8="http://schemas.microsoft.com/office/drawing/2016/5/14/chartex" xmlns:mc="http://schemas.openxmlformats.org/markup-compatibility/2006" xmlns:aink="http://schemas.microsoft.com/office/drawing/2016/ink" xmlns:am3d="http://schemas.microsoft.com/office/drawing/2017/model3d" xmlns:o="urn:schemas-microsoft-com:office:office" xmlns:oel="http://schemas.microsoft.com/office/2019/extlst" xmlns:r="http://schemas.openxmlformats.org/officeDocument/2006/relationships" xmlns:m="http://schemas.openxmlformats.org/officeDocument/2006/math" xmlns:v="urn:schemas-microsoft-com:vml" xmlns:wp14="http://schemas.microsoft.com/office/word/2010/wordprocessingDrawing" xmlns:wp="http://schemas.openxmlformats.org/drawingml/2006/wordprocessingDrawing" xmlns:w10="urn:schemas-microsoft-com:office:word" xmlns:w="http://schemas.openxmlformats.org/wordprocessingml/2006/main" xmlns:w14="http://schemas.microsoft.com/office/word/2010/wordml" xmlns:w15="http://schemas.microsoft.com/office/word/2012/wordml" xmlns:w16cex="http://schemas.microsoft.com/office/word/2018/wordml/cex" xmlns:w16cid="http://schemas.microsoft.com/office/word/2016/wordml/cid" xmlns:w16="http://schemas.microsoft.com/office/word/2018/wordml" xmlns:w16sdtdh="http://schemas.microsoft.com/office/word/2020/wordml/sdtdatahash" xmlns:w16se="http://schemas.microsoft.com/office/word/2015/wordml/symex" xmlns:wpg="http://schemas.microsoft.com/office/word/2010/wordprocessingGroup" xmlns:wpi="http://schemas.microsoft.com/office/word/2010/wordprocessingInk" xmlns:wne="http://schemas.microsoft.com/office/word/2006/wordml" xmlns:wps="http://schemas.microsoft.com/office/word/2010/wordprocessingShape" mc:Ignorable="w14 w15 w16se w16cid w16 w16cex w16sdtdh wp14">
+<w:numbering xmlns:wpc="http://schemas.microsoft.com/office/word/2010/wordprocessingCanvas" xmlns:cx="http://schemas.microsoft.com/office/drawing/2014/chartex" xmlns:cx1="http://schemas.microsoft.com/office/drawing/2015/9/8/chartex" xmlns:cx2="http://schemas.microsoft.com/office/drawing/2015/10/21/chartex" xmlns:cx3="http://schemas.microsoft.com/office/drawing/2016/5/9/chartex" xmlns:cx4="http://schemas.microsoft.com/office/drawing/2016/5/10/chartex" xmlns:cx5="http://schemas.microsoft.com/office/drawing/2016/5/11/chartex" xmlns:cx6="http://schemas.microsoft.com/office/drawing/2016/5/12/chartex" xmlns:cx7="http://schemas.microsoft.com/office/drawing/2016/5/13/chartex" xmlns:cx8="http://schemas.microsoft.com/office/drawing/2016/5/14/chartex" xmlns:mc="http://schemas.openxmlformats.org/markup-compatibility/2006" xmlns:aink="http://schemas.microsoft.com/office/drawing/2016/ink" xmlns:am3d="http://schemas.microsoft.com/office/drawing/2017/model3d" xmlns:o="urn:schemas-microsoft-com:office:office" xmlns:oel="http://schemas.microsoft.com/office/2019/extlst" xmlns:r="http://schemas.openxmlformats.org/officeDocument/2006/relationships" xmlns:m="http://schemas.openxmlformats.org/officeDocument/2006/math" xmlns:v="urn:schemas-microsoft-com:vml" xmlns:wp14="http://schemas.microsoft.com/office/word/2010/wordprocessingDrawing" xmlns:wp="http://schemas.openxmlformats.org/drawingml/2006/wordprocessingDrawing" xmlns:w10="urn:schemas-microsoft-com:office:word" xmlns:w="http://schemas.openxmlformats.org/wordprocessingml/2006/main" xmlns:w14="http://schemas.microsoft.com/office/word/2010/wordml" xmlns:w15="http://schemas.microsoft.com/office/word/2012/wordml" xmlns:w16cex="http://schemas.microsoft.com/office/word/2018/wordml/cex" xmlns:w16cid="http://schemas.microsoft.com/office/word/2016/wordml/cid" xmlns:w16="http://schemas.microsoft.com/office/word/2018/wordml" xmlns:w16du="http://schemas.microsoft.com/office/word/2023/wordml/word16du" xmlns:w16sdtdh="http://schemas.microsoft.com/office/word/2020/wordml/sdtdatahash" xmlns:w16se="http://schemas.microsoft.com/office/word/2015/wordml/symex" xmlns:wpg="http://schemas.microsoft.com/office/word/2010/wordprocessingGroup" xmlns:wpi="http://schemas.microsoft.com/office/word/2010/wordprocessingInk" xmlns:wne="http://schemas.microsoft.com/office/word/2006/wordml" xmlns:wps="http://schemas.microsoft.com/office/word/2010/wordprocessingShape" mc:Ignorable="w14 w15 w16se w16cid w16 w16cex w16sdtdh w16du wp14">
   <w:abstractNum w:abstractNumId="0" w15:restartNumberingAfterBreak="0">
     <w:nsid w:val="17BD535A"/>
     <w:multiLevelType w:val="hybridMultilevel"/>
@@ -3025,7 +3014,7 @@
 </file>
 
 <file path=word/styles.xml><?xml version="1.0" encoding="utf-8"?>
-<w:styles xmlns:mc="http://schemas.openxmlformats.org/markup-compatibility/2006" xmlns:r="http://schemas.openxmlformats.org/officeDocument/2006/relationships" xmlns:w="http://schemas.openxmlformats.org/wordprocessingml/2006/main" xmlns:w14="http://schemas.microsoft.com/office/word/2010/wordml" xmlns:w15="http://schemas.microsoft.com/office/word/2012/wordml" xmlns:w16cex="http://schemas.microsoft.com/office/word/2018/wordml/cex" xmlns:w16cid="http://schemas.microsoft.com/office/word/2016/wordml/cid" xmlns:w16="http://schemas.microsoft.com/office/word/2018/wordml" xmlns:w16sdtdh="http://schemas.microsoft.com/office/word/2020/wordml/sdtdatahash" xmlns:w16se="http://schemas.microsoft.com/office/word/2015/wordml/symex" mc:Ignorable="w14 w15 w16se w16cid w16 w16cex w16sdtdh">
+<w:styles xmlns:mc="http://schemas.openxmlformats.org/markup-compatibility/2006" xmlns:r="http://schemas.openxmlformats.org/officeDocument/2006/relationships" xmlns:w="http://schemas.openxmlformats.org/wordprocessingml/2006/main" xmlns:w14="http://schemas.microsoft.com/office/word/2010/wordml" xmlns:w15="http://schemas.microsoft.com/office/word/2012/wordml" xmlns:w16cex="http://schemas.microsoft.com/office/word/2018/wordml/cex" xmlns:w16cid="http://schemas.microsoft.com/office/word/2016/wordml/cid" xmlns:w16="http://schemas.microsoft.com/office/word/2018/wordml" xmlns:w16du="http://schemas.microsoft.com/office/word/2023/wordml/word16du" xmlns:w16sdtdh="http://schemas.microsoft.com/office/word/2020/wordml/sdtdatahash" xmlns:w16se="http://schemas.microsoft.com/office/word/2015/wordml/symex" mc:Ignorable="w14 w15 w16se w16cid w16 w16cex w16sdtdh w16du">
   <w:docDefaults>
     <w:rPrDefault>
       <w:rPr>
@@ -3435,11 +3424,11 @@
       <w:szCs w:val="24"/>
     </w:rPr>
   </w:style>
-  <w:style w:type="paragraph" w:styleId="Heading1">
+  <w:style w:type="paragraph" w:styleId="Ttulo1">
     <w:name w:val="heading 1"/>
     <w:basedOn w:val="Normal"/>
     <w:next w:val="Normal"/>
-    <w:link w:val="Heading1Char"/>
+    <w:link w:val="Ttulo1Char"/>
     <w:uiPriority w:val="9"/>
     <w:qFormat/>
     <w:rsid w:val="00BD4496"/>
@@ -3451,11 +3440,11 @@
       <w:szCs w:val="28"/>
     </w:rPr>
   </w:style>
-  <w:style w:type="paragraph" w:styleId="Heading2">
+  <w:style w:type="paragraph" w:styleId="Ttulo2">
     <w:name w:val="heading 2"/>
-    <w:basedOn w:val="Heading1"/>
+    <w:basedOn w:val="Ttulo1"/>
     <w:next w:val="Normal"/>
-    <w:link w:val="Heading2Char"/>
+    <w:link w:val="Ttulo2Char"/>
     <w:uiPriority w:val="9"/>
     <w:unhideWhenUsed/>
     <w:qFormat/>
@@ -3464,11 +3453,11 @@
       <w:outlineLvl w:val="1"/>
     </w:pPr>
   </w:style>
-  <w:style w:type="paragraph" w:styleId="Heading3">
+  <w:style w:type="paragraph" w:styleId="Ttulo3">
     <w:name w:val="heading 3"/>
-    <w:basedOn w:val="Heading2"/>
+    <w:basedOn w:val="Ttulo2"/>
     <w:next w:val="Normal"/>
-    <w:link w:val="Heading3Char"/>
+    <w:link w:val="Ttulo3Char"/>
     <w:uiPriority w:val="9"/>
     <w:unhideWhenUsed/>
     <w:qFormat/>
@@ -3477,12 +3466,13 @@
       <w:outlineLvl w:val="2"/>
     </w:pPr>
   </w:style>
-  <w:style w:type="character" w:default="1" w:styleId="DefaultParagraphFont">
+  <w:style w:type="character" w:default="1" w:styleId="Fontepargpadro">
     <w:name w:val="Default Paragraph Font"/>
     <w:uiPriority w:val="1"/>
+    <w:semiHidden/>
     <w:unhideWhenUsed/>
   </w:style>
-  <w:style w:type="table" w:default="1" w:styleId="TableNormal">
+  <w:style w:type="table" w:default="1" w:styleId="Tabelanormal">
     <w:name w:val="Normal Table"/>
     <w:uiPriority w:val="99"/>
     <w:semiHidden/>
@@ -3497,16 +3487,16 @@
       </w:tblCellMar>
     </w:tblPr>
   </w:style>
-  <w:style w:type="numbering" w:default="1" w:styleId="NoList">
+  <w:style w:type="numbering" w:default="1" w:styleId="Semlista">
     <w:name w:val="No List"/>
     <w:uiPriority w:val="99"/>
     <w:semiHidden/>
     <w:unhideWhenUsed/>
   </w:style>
-  <w:style w:type="character" w:customStyle="1" w:styleId="Heading1Char">
-    <w:name w:val="Heading 1 Char"/>
-    <w:basedOn w:val="DefaultParagraphFont"/>
-    <w:link w:val="Heading1"/>
+  <w:style w:type="character" w:customStyle="1" w:styleId="Ttulo1Char">
+    <w:name w:val="Título 1 Char"/>
+    <w:basedOn w:val="Fontepargpadro"/>
+    <w:link w:val="Ttulo1"/>
     <w:uiPriority w:val="9"/>
     <w:rsid w:val="00BD4496"/>
     <w:rPr>
@@ -3515,10 +3505,10 @@
       <w:szCs w:val="28"/>
     </w:rPr>
   </w:style>
-  <w:style w:type="character" w:customStyle="1" w:styleId="Heading2Char">
-    <w:name w:val="Heading 2 Char"/>
-    <w:basedOn w:val="DefaultParagraphFont"/>
-    <w:link w:val="Heading2"/>
+  <w:style w:type="character" w:customStyle="1" w:styleId="Ttulo2Char">
+    <w:name w:val="Título 2 Char"/>
+    <w:basedOn w:val="Fontepargpadro"/>
+    <w:link w:val="Ttulo2"/>
     <w:uiPriority w:val="9"/>
     <w:rsid w:val="00BD4496"/>
     <w:rPr>
@@ -3527,10 +3517,10 @@
       <w:szCs w:val="28"/>
     </w:rPr>
   </w:style>
-  <w:style w:type="character" w:customStyle="1" w:styleId="Heading3Char">
-    <w:name w:val="Heading 3 Char"/>
-    <w:basedOn w:val="DefaultParagraphFont"/>
-    <w:link w:val="Heading3"/>
+  <w:style w:type="character" w:customStyle="1" w:styleId="Ttulo3Char">
+    <w:name w:val="Título 3 Char"/>
+    <w:basedOn w:val="Fontepargpadro"/>
+    <w:link w:val="Ttulo3"/>
     <w:uiPriority w:val="9"/>
     <w:rsid w:val="00BD4496"/>
     <w:rPr>
@@ -3556,7 +3546,7 @@
       <w14:ligatures w14:val="none"/>
     </w:rPr>
   </w:style>
-  <w:style w:type="paragraph" w:styleId="ListParagraph">
+  <w:style w:type="paragraph" w:styleId="PargrafodaLista">
     <w:name w:val="List Paragraph"/>
     <w:basedOn w:val="Normal"/>
     <w:uiPriority w:val="34"/>
@@ -3569,7 +3559,7 @@
   </w:style>
   <w:style w:type="character" w:styleId="Hyperlink">
     <w:name w:val="Hyperlink"/>
-    <w:basedOn w:val="DefaultParagraphFont"/>
+    <w:basedOn w:val="Fontepargpadro"/>
     <w:uiPriority w:val="99"/>
     <w:unhideWhenUsed/>
     <w:rsid w:val="00B669D3"/>
@@ -3578,9 +3568,9 @@
       <w:u w:val="single"/>
     </w:rPr>
   </w:style>
-  <w:style w:type="character" w:styleId="UnresolvedMention">
+  <w:style w:type="character" w:styleId="MenoPendente">
     <w:name w:val="Unresolved Mention"/>
-    <w:basedOn w:val="DefaultParagraphFont"/>
+    <w:basedOn w:val="Fontepargpadro"/>
     <w:uiPriority w:val="99"/>
     <w:semiHidden/>
     <w:unhideWhenUsed/>
@@ -3590,10 +3580,10 @@
       <w:shd w:val="clear" w:color="auto" w:fill="E1DFDD"/>
     </w:rPr>
   </w:style>
-  <w:style w:type="paragraph" w:styleId="Header">
+  <w:style w:type="paragraph" w:styleId="Cabealho">
     <w:name w:val="header"/>
     <w:basedOn w:val="Normal"/>
-    <w:link w:val="HeaderChar"/>
+    <w:link w:val="CabealhoChar"/>
     <w:uiPriority w:val="99"/>
     <w:unhideWhenUsed/>
     <w:rsid w:val="007832B1"/>
@@ -3605,10 +3595,10 @@
       <w:spacing w:after="0" w:line="240" w:lineRule="auto"/>
     </w:pPr>
   </w:style>
-  <w:style w:type="character" w:customStyle="1" w:styleId="HeaderChar">
-    <w:name w:val="Header Char"/>
-    <w:basedOn w:val="DefaultParagraphFont"/>
-    <w:link w:val="Header"/>
+  <w:style w:type="character" w:customStyle="1" w:styleId="CabealhoChar">
+    <w:name w:val="Cabeçalho Char"/>
+    <w:basedOn w:val="Fontepargpadro"/>
+    <w:link w:val="Cabealho"/>
     <w:uiPriority w:val="99"/>
     <w:rsid w:val="007832B1"/>
     <w:rPr>
@@ -3617,10 +3607,10 @@
       <w:szCs w:val="24"/>
     </w:rPr>
   </w:style>
-  <w:style w:type="paragraph" w:styleId="Footer">
+  <w:style w:type="paragraph" w:styleId="Rodap">
     <w:name w:val="footer"/>
     <w:basedOn w:val="Normal"/>
-    <w:link w:val="FooterChar"/>
+    <w:link w:val="RodapChar"/>
     <w:uiPriority w:val="99"/>
     <w:unhideWhenUsed/>
     <w:rsid w:val="007832B1"/>
@@ -3632,10 +3622,10 @@
       <w:spacing w:after="0" w:line="240" w:lineRule="auto"/>
     </w:pPr>
   </w:style>
-  <w:style w:type="character" w:customStyle="1" w:styleId="FooterChar">
-    <w:name w:val="Footer Char"/>
-    <w:basedOn w:val="DefaultParagraphFont"/>
-    <w:link w:val="Footer"/>
+  <w:style w:type="character" w:customStyle="1" w:styleId="RodapChar">
+    <w:name w:val="Rodapé Char"/>
+    <w:basedOn w:val="Fontepargpadro"/>
+    <w:link w:val="Rodap"/>
     <w:uiPriority w:val="99"/>
     <w:rsid w:val="007832B1"/>
     <w:rPr>
@@ -3644,9 +3634,9 @@
       <w:szCs w:val="24"/>
     </w:rPr>
   </w:style>
-  <w:style w:type="paragraph" w:styleId="TOCHeading">
+  <w:style w:type="paragraph" w:styleId="CabealhodoSumrio">
     <w:name w:val="TOC Heading"/>
-    <w:basedOn w:val="Heading1"/>
+    <w:basedOn w:val="Ttulo1"/>
     <w:next w:val="Normal"/>
     <w:uiPriority w:val="39"/>
     <w:unhideWhenUsed/>
@@ -3669,7 +3659,7 @@
       <w14:ligatures w14:val="none"/>
     </w:rPr>
   </w:style>
-  <w:style w:type="paragraph" w:styleId="TOC1">
+  <w:style w:type="paragraph" w:styleId="Sumrio1">
     <w:name w:val="toc 1"/>
     <w:basedOn w:val="Normal"/>
     <w:next w:val="Normal"/>
@@ -3681,7 +3671,7 @@
       <w:spacing w:after="100"/>
     </w:pPr>
   </w:style>
-  <w:style w:type="paragraph" w:styleId="TOC2">
+  <w:style w:type="paragraph" w:styleId="Sumrio2">
     <w:name w:val="toc 2"/>
     <w:basedOn w:val="Normal"/>
     <w:next w:val="Normal"/>
@@ -3694,7 +3684,7 @@
       <w:ind w:left="240"/>
     </w:pPr>
   </w:style>
-  <w:style w:type="paragraph" w:styleId="TOC3">
+  <w:style w:type="paragraph" w:styleId="Sumrio3">
     <w:name w:val="toc 3"/>
     <w:basedOn w:val="Normal"/>
     <w:next w:val="Normal"/>
@@ -3707,9 +3697,9 @@
       <w:ind w:left="480"/>
     </w:pPr>
   </w:style>
-  <w:style w:type="character" w:styleId="FollowedHyperlink">
+  <w:style w:type="character" w:styleId="HiperlinkVisitado">
     <w:name w:val="FollowedHyperlink"/>
-    <w:basedOn w:val="DefaultParagraphFont"/>
+    <w:basedOn w:val="Fontepargpadro"/>
     <w:uiPriority w:val="99"/>
     <w:semiHidden/>
     <w:unhideWhenUsed/>

</xml_diff>

<commit_message>
docs: Feitas pequenas modificações no documento para encaminhar o que fazer
</commit_message>
<xml_diff>
--- a/SoulPass-Java-Documentacao.docx
+++ b/SoulPass-Java-Documentacao.docx
@@ -1,17 +1,19 @@
 
 <file path=word/document.xml><?xml version="1.0" encoding="utf-8"?>
-<w:document xmlns:wpc="http://schemas.microsoft.com/office/word/2010/wordprocessingCanvas" xmlns:cx="http://schemas.microsoft.com/office/drawing/2014/chartex" xmlns:cx1="http://schemas.microsoft.com/office/drawing/2015/9/8/chartex" xmlns:cx2="http://schemas.microsoft.com/office/drawing/2015/10/21/chartex" xmlns:cx3="http://schemas.microsoft.com/office/drawing/2016/5/9/chartex" xmlns:cx4="http://schemas.microsoft.com/office/drawing/2016/5/10/chartex" xmlns:cx5="http://schemas.microsoft.com/office/drawing/2016/5/11/chartex" xmlns:cx6="http://schemas.microsoft.com/office/drawing/2016/5/12/chartex" xmlns:cx7="http://schemas.microsoft.com/office/drawing/2016/5/13/chartex" xmlns:cx8="http://schemas.microsoft.com/office/drawing/2016/5/14/chartex" xmlns:mc="http://schemas.openxmlformats.org/markup-compatibility/2006" xmlns:aink="http://schemas.microsoft.com/office/drawing/2016/ink" xmlns:am3d="http://schemas.microsoft.com/office/drawing/2017/model3d" xmlns:o="urn:schemas-microsoft-com:office:office" xmlns:oel="http://schemas.microsoft.com/office/2019/extlst" xmlns:r="http://schemas.openxmlformats.org/officeDocument/2006/relationships" xmlns:m="http://schemas.openxmlformats.org/officeDocument/2006/math" xmlns:v="urn:schemas-microsoft-com:vml" xmlns:wp14="http://schemas.microsoft.com/office/word/2010/wordprocessingDrawing" xmlns:wp="http://schemas.openxmlformats.org/drawingml/2006/wordprocessingDrawing" xmlns:w10="urn:schemas-microsoft-com:office:word" xmlns:w="http://schemas.openxmlformats.org/wordprocessingml/2006/main" xmlns:w14="http://schemas.microsoft.com/office/word/2010/wordml" xmlns:w15="http://schemas.microsoft.com/office/word/2012/wordml" xmlns:w16cex="http://schemas.microsoft.com/office/word/2018/wordml/cex" xmlns:w16cid="http://schemas.microsoft.com/office/word/2016/wordml/cid" xmlns:w16="http://schemas.microsoft.com/office/word/2018/wordml" xmlns:w16du="http://schemas.microsoft.com/office/word/2023/wordml/word16du" xmlns:w16sdtdh="http://schemas.microsoft.com/office/word/2020/wordml/sdtdatahash" xmlns:w16se="http://schemas.microsoft.com/office/word/2015/wordml/symex" xmlns:wpg="http://schemas.microsoft.com/office/word/2010/wordprocessingGroup" xmlns:wpi="http://schemas.microsoft.com/office/word/2010/wordprocessingInk" xmlns:wne="http://schemas.microsoft.com/office/word/2006/wordml" xmlns:wps="http://schemas.microsoft.com/office/word/2010/wordprocessingShape" mc:Ignorable="w14 w15 w16se w16cid w16 w16cex w16sdtdh w16du wp14">
+<w:document xmlns:wpc="http://schemas.microsoft.com/office/word/2010/wordprocessingCanvas" xmlns:cx="http://schemas.microsoft.com/office/drawing/2014/chartex" xmlns:cx1="http://schemas.microsoft.com/office/drawing/2015/9/8/chartex" xmlns:cx2="http://schemas.microsoft.com/office/drawing/2015/10/21/chartex" xmlns:cx3="http://schemas.microsoft.com/office/drawing/2016/5/9/chartex" xmlns:cx4="http://schemas.microsoft.com/office/drawing/2016/5/10/chartex" xmlns:cx5="http://schemas.microsoft.com/office/drawing/2016/5/11/chartex" xmlns:cx6="http://schemas.microsoft.com/office/drawing/2016/5/12/chartex" xmlns:cx7="http://schemas.microsoft.com/office/drawing/2016/5/13/chartex" xmlns:cx8="http://schemas.microsoft.com/office/drawing/2016/5/14/chartex" xmlns:mc="http://schemas.openxmlformats.org/markup-compatibility/2006" xmlns:aink="http://schemas.microsoft.com/office/drawing/2016/ink" xmlns:am3d="http://schemas.microsoft.com/office/drawing/2017/model3d" xmlns:o="urn:schemas-microsoft-com:office:office" xmlns:oel="http://schemas.microsoft.com/office/2019/extlst" xmlns:r="http://schemas.openxmlformats.org/officeDocument/2006/relationships" xmlns:m="http://schemas.openxmlformats.org/officeDocument/2006/math" xmlns:v="urn:schemas-microsoft-com:vml" xmlns:wp14="http://schemas.microsoft.com/office/word/2010/wordprocessingDrawing" xmlns:wp="http://schemas.openxmlformats.org/drawingml/2006/wordprocessingDrawing" xmlns:w10="urn:schemas-microsoft-com:office:word" xmlns:w="http://schemas.openxmlformats.org/wordprocessingml/2006/main" xmlns:w14="http://schemas.microsoft.com/office/word/2010/wordml" xmlns:w15="http://schemas.microsoft.com/office/word/2012/wordml" xmlns:w16cex="http://schemas.microsoft.com/office/word/2018/wordml/cex" xmlns:w16cid="http://schemas.microsoft.com/office/word/2016/wordml/cid" xmlns:w16="http://schemas.microsoft.com/office/word/2018/wordml" xmlns:w16sdtdh="http://schemas.microsoft.com/office/word/2020/wordml/sdtdatahash" xmlns:w16se="http://schemas.microsoft.com/office/word/2015/wordml/symex" xmlns:wpg="http://schemas.microsoft.com/office/word/2010/wordprocessingGroup" xmlns:wpi="http://schemas.microsoft.com/office/word/2010/wordprocessingInk" xmlns:wne="http://schemas.microsoft.com/office/word/2006/wordml" xmlns:wps="http://schemas.microsoft.com/office/word/2010/wordprocessingShape" mc:Ignorable="w14 w15 w16se w16cid w16 w16cex w16sdtdh wp14">
   <w:body>
     <w:p>
       <w:pPr>
-        <w:pStyle w:val="Ttulo1"/>
+        <w:pStyle w:val="Heading1"/>
         <w:jc w:val="center"/>
       </w:pPr>
       <w:bookmarkStart w:id="0" w:name="_Toc240009152"/>
+      <w:proofErr w:type="spellStart"/>
       <w:r>
         <w:t>SoulPass</w:t>
       </w:r>
       <w:bookmarkEnd w:id="0"/>
+      <w:proofErr w:type="spellEnd"/>
     </w:p>
     <w:p>
       <w:pPr>
@@ -139,7 +141,15 @@
         <w:t xml:space="preserve">Renato Ruiz Ferreira </w:t>
       </w:r>
       <w:r>
-        <w:t xml:space="preserve">Fonseca Scolamieri </w:t>
+        <w:t xml:space="preserve">Fonseca </w:t>
+      </w:r>
+      <w:proofErr w:type="spellStart"/>
+      <w:r>
+        <w:t>Scolamieri</w:t>
+      </w:r>
+      <w:proofErr w:type="spellEnd"/>
+      <w:r>
+        <w:t xml:space="preserve"> </w:t>
       </w:r>
       <w:r>
         <w:t>–</w:t>
@@ -195,6 +205,7 @@
       <w:r>
         <w:t xml:space="preserve">Sistema </w:t>
       </w:r>
+      <w:proofErr w:type="spellStart"/>
       <w:r>
         <w:rPr>
           <w:i/>
@@ -202,6 +213,7 @@
         </w:rPr>
         <w:t>SoulPass</w:t>
       </w:r>
+      <w:proofErr w:type="spellEnd"/>
       <w:r>
         <w:t xml:space="preserve"> de </w:t>
       </w:r>
@@ -218,7 +230,7 @@
     <w:p/>
     <w:p>
       <w:pPr>
-        <w:pStyle w:val="Ttulo1"/>
+        <w:pStyle w:val="Heading1"/>
       </w:pPr>
       <w:bookmarkStart w:id="1" w:name="_Toc240009153"/>
       <w:r>
@@ -254,7 +266,7 @@
       <w:sdtContent>
         <w:p>
           <w:pPr>
-            <w:pStyle w:val="CabealhodoSumrio"/>
+            <w:pStyle w:val="TOCHeading"/>
             <w:spacing w:line="360" w:lineRule="auto"/>
             <w:rPr>
               <w:rFonts w:ascii="Arial" w:hAnsi="Arial" w:cs="Arial"/>
@@ -275,7 +287,7 @@
         </w:p>
         <w:p>
           <w:pPr>
-            <w:pStyle w:val="Sumrio1"/>
+            <w:pStyle w:val="TOC1"/>
             <w:tabs>
               <w:tab w:val="right" w:leader="dot" w:pos="8494"/>
             </w:tabs>
@@ -352,7 +364,7 @@
         </w:p>
         <w:p>
           <w:pPr>
-            <w:pStyle w:val="Sumrio1"/>
+            <w:pStyle w:val="TOC1"/>
             <w:tabs>
               <w:tab w:val="right" w:leader="dot" w:pos="8494"/>
             </w:tabs>
@@ -420,7 +432,7 @@
         </w:p>
         <w:p>
           <w:pPr>
-            <w:pStyle w:val="Sumrio1"/>
+            <w:pStyle w:val="TOC1"/>
             <w:tabs>
               <w:tab w:val="right" w:leader="dot" w:pos="8494"/>
             </w:tabs>
@@ -488,7 +500,7 @@
         </w:p>
         <w:p>
           <w:pPr>
-            <w:pStyle w:val="Sumrio2"/>
+            <w:pStyle w:val="TOC2"/>
             <w:tabs>
               <w:tab w:val="right" w:leader="dot" w:pos="8494"/>
             </w:tabs>
@@ -556,7 +568,7 @@
         </w:p>
         <w:p>
           <w:pPr>
-            <w:pStyle w:val="Sumrio2"/>
+            <w:pStyle w:val="TOC2"/>
             <w:tabs>
               <w:tab w:val="right" w:leader="dot" w:pos="8494"/>
             </w:tabs>
@@ -624,7 +636,7 @@
         </w:p>
         <w:p>
           <w:pPr>
-            <w:pStyle w:val="Sumrio3"/>
+            <w:pStyle w:val="TOC3"/>
             <w:tabs>
               <w:tab w:val="right" w:leader="dot" w:pos="8494"/>
             </w:tabs>
@@ -692,7 +704,7 @@
         </w:p>
         <w:p>
           <w:pPr>
-            <w:pStyle w:val="Sumrio3"/>
+            <w:pStyle w:val="TOC3"/>
             <w:tabs>
               <w:tab w:val="right" w:leader="dot" w:pos="8494"/>
             </w:tabs>
@@ -760,7 +772,7 @@
         </w:p>
         <w:p>
           <w:pPr>
-            <w:pStyle w:val="Sumrio1"/>
+            <w:pStyle w:val="TOC1"/>
             <w:tabs>
               <w:tab w:val="right" w:leader="dot" w:pos="8494"/>
             </w:tabs>
@@ -829,7 +841,7 @@
         </w:p>
         <w:p>
           <w:pPr>
-            <w:pStyle w:val="Sumrio1"/>
+            <w:pStyle w:val="TOC1"/>
             <w:tabs>
               <w:tab w:val="right" w:leader="dot" w:pos="8494"/>
             </w:tabs>
@@ -897,7 +909,7 @@
         </w:p>
         <w:p>
           <w:pPr>
-            <w:pStyle w:val="Sumrio1"/>
+            <w:pStyle w:val="TOC1"/>
             <w:tabs>
               <w:tab w:val="right" w:leader="dot" w:pos="8494"/>
             </w:tabs>
@@ -965,7 +977,7 @@
         </w:p>
         <w:p>
           <w:pPr>
-            <w:pStyle w:val="Sumrio1"/>
+            <w:pStyle w:val="TOC1"/>
             <w:tabs>
               <w:tab w:val="right" w:leader="dot" w:pos="8494"/>
             </w:tabs>
@@ -1044,59 +1056,21 @@
       </w:sdtContent>
     </w:sdt>
     <w:p>
-      <w:pPr>
-        <w:pStyle w:val="Ttulo1"/>
-      </w:pPr>
       <w:bookmarkStart w:id="2" w:name="_Toc240009154"/>
     </w:p>
-    <w:p>
-      <w:pPr>
-        <w:pStyle w:val="Ttulo1"/>
-      </w:pPr>
-    </w:p>
-    <w:p>
-      <w:pPr>
-        <w:pStyle w:val="Ttulo1"/>
-      </w:pPr>
-    </w:p>
-    <w:p>
-      <w:pPr>
-        <w:pStyle w:val="Ttulo1"/>
-      </w:pPr>
-    </w:p>
-    <w:p>
-      <w:pPr>
-        <w:pStyle w:val="Ttulo1"/>
-      </w:pPr>
-    </w:p>
-    <w:p>
-      <w:pPr>
-        <w:pStyle w:val="Ttulo1"/>
-      </w:pPr>
-    </w:p>
-    <w:p>
-      <w:pPr>
-        <w:pStyle w:val="Ttulo1"/>
-      </w:pPr>
-    </w:p>
-    <w:p>
-      <w:pPr>
-        <w:pStyle w:val="Ttulo1"/>
-      </w:pPr>
-    </w:p>
-    <w:p>
-      <w:pPr>
-        <w:pStyle w:val="Ttulo1"/>
-      </w:pPr>
-    </w:p>
-    <w:p>
-      <w:pPr>
-        <w:pStyle w:val="Ttulo1"/>
-      </w:pPr>
-    </w:p>
-    <w:p>
-      <w:pPr>
-        <w:pStyle w:val="Ttulo1"/>
+    <w:p/>
+    <w:p/>
+    <w:p/>
+    <w:p/>
+    <w:p/>
+    <w:p/>
+    <w:p/>
+    <w:p/>
+    <w:p/>
+    <w:p/>
+    <w:p>
+      <w:pPr>
+        <w:pStyle w:val="Heading1"/>
       </w:pPr>
       <w:r>
         <w:lastRenderedPageBreak/>
@@ -1109,7 +1083,7 @@
     </w:p>
     <w:p>
       <w:pPr>
-        <w:pStyle w:val="Ttulo2"/>
+        <w:pStyle w:val="Heading2"/>
       </w:pPr>
       <w:bookmarkStart w:id="3" w:name="_Toc240009155"/>
       <w:r>
@@ -1122,7 +1096,15 @@
         <w:t xml:space="preserve">. </w:t>
       </w:r>
       <w:r>
-        <w:t>O objetivo da SoulPass e da Aplicação</w:t>
+        <w:t xml:space="preserve">O objetivo da </w:t>
+      </w:r>
+      <w:proofErr w:type="spellStart"/>
+      <w:r>
+        <w:t>SoulPass</w:t>
+      </w:r>
+      <w:proofErr w:type="spellEnd"/>
+      <w:r>
+        <w:t xml:space="preserve"> e da Aplicação</w:t>
       </w:r>
       <w:bookmarkEnd w:id="3"/>
     </w:p>
@@ -1142,6 +1124,7 @@
         </w:rPr>
         <w:t xml:space="preserve">O </w:t>
       </w:r>
+      <w:proofErr w:type="spellStart"/>
       <w:r>
         <w:rPr>
           <w:b/>
@@ -1151,6 +1134,7 @@
         </w:rPr>
         <w:t>SoulPass</w:t>
       </w:r>
+      <w:proofErr w:type="spellEnd"/>
       <w:r>
         <w:rPr>
           <w:b/>
@@ -1158,6 +1142,7 @@
         </w:rPr>
         <w:t xml:space="preserve"> é uma solução inovadora desenvolvida em parceria com a </w:t>
       </w:r>
+      <w:proofErr w:type="spellStart"/>
       <w:r>
         <w:rPr>
           <w:b/>
@@ -1167,6 +1152,7 @@
         </w:rPr>
         <w:t>SoulUp</w:t>
       </w:r>
+      <w:proofErr w:type="spellEnd"/>
       <w:r>
         <w:rPr>
           <w:b/>
@@ -1174,6 +1160,7 @@
         </w:rPr>
         <w:t xml:space="preserve"> como parte do </w:t>
       </w:r>
+      <w:proofErr w:type="spellStart"/>
       <w:r>
         <w:rPr>
           <w:b/>
@@ -1183,6 +1170,7 @@
         </w:rPr>
         <w:t>Challenge</w:t>
       </w:r>
+      <w:proofErr w:type="spellEnd"/>
       <w:r>
         <w:rPr>
           <w:b/>
@@ -1224,6 +1212,7 @@
         </w:rPr>
         <w:t xml:space="preserve">Converta pontos acumulados na plataforma </w:t>
       </w:r>
+      <w:proofErr w:type="spellStart"/>
       <w:r>
         <w:rPr>
           <w:b/>
@@ -1233,6 +1222,7 @@
         </w:rPr>
         <w:t>SoulUp</w:t>
       </w:r>
+      <w:proofErr w:type="spellEnd"/>
       <w:r>
         <w:rPr>
           <w:b/>
@@ -1299,8 +1289,13 @@
         <w:t xml:space="preserve"> acumulam pontos </w:t>
       </w:r>
       <w:r>
-        <w:t>no aplicativo SoulUp</w:t>
-      </w:r>
+        <w:t xml:space="preserve">no aplicativo </w:t>
+      </w:r>
+      <w:proofErr w:type="spellStart"/>
+      <w:r>
+        <w:t>SoulUp</w:t>
+      </w:r>
+      <w:proofErr w:type="spellEnd"/>
       <w:r>
         <w:t xml:space="preserve"> </w:t>
       </w:r>
@@ -1492,7 +1487,49 @@
           <w:b/>
           <w:bCs/>
         </w:rPr>
-        <w:t xml:space="preserve">Além de estimular a saúde e mais uma ação sustentável como reduzir o </w:t>
+        <w:t>Além de estimular a saúde</w:t>
+      </w:r>
+      <w:r>
+        <w:rPr>
+          <w:b/>
+          <w:bCs/>
+        </w:rPr>
+        <w:t>,</w:t>
+      </w:r>
+      <w:r>
+        <w:rPr>
+          <w:b/>
+          <w:bCs/>
+        </w:rPr>
+        <w:t xml:space="preserve"> </w:t>
+      </w:r>
+      <w:r>
+        <w:rPr>
+          <w:b/>
+          <w:bCs/>
+        </w:rPr>
+        <w:t>é</w:t>
+      </w:r>
+      <w:r>
+        <w:rPr>
+          <w:b/>
+          <w:bCs/>
+        </w:rPr>
+        <w:t xml:space="preserve"> mais uma ação sustentável</w:t>
+      </w:r>
+      <w:r>
+        <w:rPr>
+          <w:b/>
+          <w:bCs/>
+        </w:rPr>
+        <w:t>,</w:t>
+      </w:r>
+      <w:r>
+        <w:rPr>
+          <w:b/>
+          <w:bCs/>
+        </w:rPr>
+        <w:t xml:space="preserve"> como reduzir o </w:t>
       </w:r>
       <w:r>
         <w:rPr>
@@ -1557,8 +1594,21 @@
         <w:t>Através</w:t>
       </w:r>
       <w:r>
-        <w:t xml:space="preserve"> de classes modelo, </w:t>
-      </w:r>
+        <w:t xml:space="preserve"> de classes</w:t>
+      </w:r>
+      <w:r>
+        <w:t xml:space="preserve"> em camadas</w:t>
+      </w:r>
+      <w:r>
+        <w:t xml:space="preserve"> </w:t>
+      </w:r>
+      <w:r>
+        <w:t>(</w:t>
+      </w:r>
+      <w:r>
+        <w:t xml:space="preserve">modelo, </w:t>
+      </w:r>
+      <w:proofErr w:type="spellStart"/>
       <w:r>
         <w:rPr>
           <w:i/>
@@ -1566,6 +1616,7 @@
         </w:rPr>
         <w:t>enums</w:t>
       </w:r>
+      <w:proofErr w:type="spellEnd"/>
       <w:r>
         <w:t xml:space="preserve">, </w:t>
       </w:r>
@@ -1582,6 +1633,7 @@
       <w:r>
         <w:t xml:space="preserve"> </w:t>
       </w:r>
+      <w:proofErr w:type="spellStart"/>
       <w:r>
         <w:rPr>
           <w:i/>
@@ -1589,6 +1641,42 @@
         </w:rPr>
         <w:t>daos</w:t>
       </w:r>
+      <w:proofErr w:type="spellEnd"/>
+      <w:r>
+        <w:rPr>
+          <w:i/>
+          <w:iCs/>
+        </w:rPr>
+        <w:t xml:space="preserve">, </w:t>
+      </w:r>
+      <w:proofErr w:type="spellStart"/>
+      <w:r>
+        <w:rPr>
+          <w:i/>
+          <w:iCs/>
+        </w:rPr>
+        <w:t>controllers</w:t>
+      </w:r>
+      <w:proofErr w:type="spellEnd"/>
+      <w:r>
+        <w:rPr>
+          <w:i/>
+          <w:iCs/>
+        </w:rPr>
+        <w:t xml:space="preserve"> e </w:t>
+      </w:r>
+      <w:proofErr w:type="spellStart"/>
+      <w:r>
+        <w:rPr>
+          <w:i/>
+          <w:iCs/>
+        </w:rPr>
+        <w:t>services</w:t>
+      </w:r>
+      <w:proofErr w:type="spellEnd"/>
+      <w:r>
+        <w:t>)</w:t>
+      </w:r>
       <w:r>
         <w:t xml:space="preserve"> </w:t>
       </w:r>
@@ -1603,51 +1691,82 @@
     <w:p>
       <w:pPr>
         <w:ind w:firstLine="708"/>
-        <w:rPr>
-          <w:b/>
-          <w:bCs/>
-        </w:rPr>
-      </w:pPr>
-      <w:r>
-        <w:t xml:space="preserve">A equipe está em </w:t>
-      </w:r>
-      <w:r>
-        <w:rPr>
-          <w:b/>
-          <w:bCs/>
-        </w:rPr>
-        <w:t>constante aprendizado e espera aprender muito com esse projeto.</w:t>
-      </w:r>
-      <w:r>
-        <w:t xml:space="preserve"> Conforme o aprendizado da equipe, </w:t>
-      </w:r>
-      <w:r>
-        <w:rPr>
-          <w:b/>
-          <w:bCs/>
-        </w:rPr>
-        <w:t>o escopo vai aumentando cada vez mais, e mais coisas são implementadas.</w:t>
-      </w:r>
-    </w:p>
-    <w:p>
-      <w:pPr>
-        <w:pStyle w:val="Ttulo2"/>
-      </w:pPr>
+      </w:pPr>
+      <w:r>
+        <w:t xml:space="preserve">A equipe </w:t>
+      </w:r>
+      <w:r>
+        <w:rPr>
+          <w:b/>
+          <w:bCs/>
+        </w:rPr>
+        <w:t>esteve em constante aprendizado.</w:t>
+      </w:r>
+      <w:r>
+        <w:t xml:space="preserve"> Foram muitos </w:t>
+      </w:r>
+      <w:r>
+        <w:rPr>
+          <w:b/>
+          <w:bCs/>
+        </w:rPr>
+        <w:t>problemas, obstáculos,</w:t>
+      </w:r>
+      <w:r>
+        <w:t xml:space="preserve"> que foram </w:t>
+      </w:r>
+      <w:r>
+        <w:rPr>
+          <w:b/>
+          <w:bCs/>
+        </w:rPr>
+        <w:t>superados</w:t>
+      </w:r>
+      <w:r>
+        <w:t xml:space="preserve"> e finalmente </w:t>
+      </w:r>
+      <w:r>
+        <w:rPr>
+          <w:b/>
+          <w:bCs/>
+        </w:rPr>
+        <w:t>a aplicação se torna real</w:t>
+      </w:r>
+      <w:r>
+        <w:rPr>
+          <w:b/>
+          <w:bCs/>
+        </w:rPr>
+        <w:t xml:space="preserve">, </w:t>
+      </w:r>
+      <w:r>
+        <w:t xml:space="preserve">palpável ao nosso cliente que é a </w:t>
+      </w:r>
+      <w:proofErr w:type="spellStart"/>
+      <w:r>
+        <w:rPr>
+          <w:i/>
+          <w:iCs/>
+        </w:rPr>
+        <w:t>SoulUp</w:t>
+      </w:r>
+      <w:proofErr w:type="spellEnd"/>
+      <w:r>
+        <w:rPr>
+          <w:i/>
+          <w:iCs/>
+        </w:rPr>
+        <w:t>.</w:t>
+      </w:r>
+    </w:p>
+    <w:p>
       <w:bookmarkStart w:id="4" w:name="_Toc240009156"/>
     </w:p>
-    <w:p>
-      <w:pPr>
-        <w:pStyle w:val="Ttulo2"/>
-      </w:pPr>
-    </w:p>
-    <w:p>
-      <w:pPr>
-        <w:pStyle w:val="Ttulo2"/>
-      </w:pPr>
-    </w:p>
-    <w:p>
-      <w:pPr>
-        <w:pStyle w:val="Ttulo2"/>
+    <w:p/>
+    <w:p/>
+    <w:p>
+      <w:pPr>
+        <w:pStyle w:val="Heading2"/>
       </w:pPr>
       <w:r>
         <w:lastRenderedPageBreak/>
@@ -1657,7 +1776,7 @@
     </w:p>
     <w:p>
       <w:pPr>
-        <w:pStyle w:val="Ttulo3"/>
+        <w:pStyle w:val="Heading3"/>
       </w:pPr>
       <w:bookmarkStart w:id="5" w:name="_Toc240009157"/>
       <w:r>
@@ -1667,7 +1786,7 @@
     </w:p>
     <w:p>
       <w:pPr>
-        <w:pStyle w:val="PargrafodaLista"/>
+        <w:pStyle w:val="ListParagraph"/>
         <w:numPr>
           <w:ilvl w:val="0"/>
           <w:numId w:val="5"/>
@@ -1682,7 +1801,7 @@
     </w:p>
     <w:p>
       <w:pPr>
-        <w:pStyle w:val="PargrafodaLista"/>
+        <w:pStyle w:val="ListParagraph"/>
         <w:numPr>
           <w:ilvl w:val="0"/>
           <w:numId w:val="5"/>
@@ -1704,7 +1823,7 @@
     </w:p>
     <w:p>
       <w:pPr>
-        <w:pStyle w:val="PargrafodaLista"/>
+        <w:pStyle w:val="ListParagraph"/>
         <w:numPr>
           <w:ilvl w:val="0"/>
           <w:numId w:val="5"/>
@@ -1722,7 +1841,7 @@
     </w:p>
     <w:p>
       <w:pPr>
-        <w:pStyle w:val="PargrafodaLista"/>
+        <w:pStyle w:val="ListParagraph"/>
         <w:numPr>
           <w:ilvl w:val="0"/>
           <w:numId w:val="5"/>
@@ -1740,7 +1859,7 @@
     </w:p>
     <w:p>
       <w:pPr>
-        <w:pStyle w:val="PargrafodaLista"/>
+        <w:pStyle w:val="ListParagraph"/>
         <w:numPr>
           <w:ilvl w:val="0"/>
           <w:numId w:val="5"/>
@@ -1755,7 +1874,7 @@
     </w:p>
     <w:p>
       <w:pPr>
-        <w:pStyle w:val="PargrafodaLista"/>
+        <w:pStyle w:val="ListParagraph"/>
         <w:numPr>
           <w:ilvl w:val="0"/>
           <w:numId w:val="5"/>
@@ -1770,7 +1889,7 @@
     </w:p>
     <w:p>
       <w:pPr>
-        <w:pStyle w:val="PargrafodaLista"/>
+        <w:pStyle w:val="ListParagraph"/>
         <w:numPr>
           <w:ilvl w:val="0"/>
           <w:numId w:val="5"/>
@@ -1782,7 +1901,7 @@
     </w:p>
     <w:p>
       <w:pPr>
-        <w:pStyle w:val="PargrafodaLista"/>
+        <w:pStyle w:val="ListParagraph"/>
         <w:numPr>
           <w:ilvl w:val="0"/>
           <w:numId w:val="5"/>
@@ -1794,7 +1913,7 @@
     </w:p>
     <w:p>
       <w:pPr>
-        <w:pStyle w:val="PargrafodaLista"/>
+        <w:pStyle w:val="ListParagraph"/>
         <w:numPr>
           <w:ilvl w:val="0"/>
           <w:numId w:val="5"/>
@@ -1806,7 +1925,7 @@
     </w:p>
     <w:p>
       <w:pPr>
-        <w:pStyle w:val="PargrafodaLista"/>
+        <w:pStyle w:val="ListParagraph"/>
         <w:numPr>
           <w:ilvl w:val="0"/>
           <w:numId w:val="5"/>
@@ -1830,7 +1949,7 @@
     </w:p>
     <w:p>
       <w:pPr>
-        <w:pStyle w:val="PargrafodaLista"/>
+        <w:pStyle w:val="ListParagraph"/>
         <w:numPr>
           <w:ilvl w:val="0"/>
           <w:numId w:val="5"/>
@@ -1854,7 +1973,7 @@
     </w:p>
     <w:p>
       <w:pPr>
-        <w:pStyle w:val="PargrafodaLista"/>
+        <w:pStyle w:val="ListParagraph"/>
         <w:numPr>
           <w:ilvl w:val="0"/>
           <w:numId w:val="5"/>
@@ -1873,7 +1992,7 @@
     </w:p>
     <w:p>
       <w:pPr>
-        <w:pStyle w:val="PargrafodaLista"/>
+        <w:pStyle w:val="ListParagraph"/>
         <w:numPr>
           <w:ilvl w:val="0"/>
           <w:numId w:val="5"/>
@@ -1885,7 +2004,7 @@
     </w:p>
     <w:p>
       <w:pPr>
-        <w:pStyle w:val="PargrafodaLista"/>
+        <w:pStyle w:val="ListParagraph"/>
         <w:numPr>
           <w:ilvl w:val="0"/>
           <w:numId w:val="5"/>
@@ -1904,7 +2023,7 @@
     </w:p>
     <w:p>
       <w:pPr>
-        <w:pStyle w:val="PargrafodaLista"/>
+        <w:pStyle w:val="ListParagraph"/>
         <w:numPr>
           <w:ilvl w:val="0"/>
           <w:numId w:val="5"/>
@@ -1916,7 +2035,7 @@
     </w:p>
     <w:p>
       <w:pPr>
-        <w:pStyle w:val="PargrafodaLista"/>
+        <w:pStyle w:val="ListParagraph"/>
         <w:numPr>
           <w:ilvl w:val="0"/>
           <w:numId w:val="5"/>
@@ -1931,7 +2050,7 @@
     </w:p>
     <w:p>
       <w:pPr>
-        <w:pStyle w:val="PargrafodaLista"/>
+        <w:pStyle w:val="ListParagraph"/>
         <w:numPr>
           <w:ilvl w:val="0"/>
           <w:numId w:val="5"/>
@@ -1943,7 +2062,7 @@
     </w:p>
     <w:p>
       <w:pPr>
-        <w:pStyle w:val="PargrafodaLista"/>
+        <w:pStyle w:val="ListParagraph"/>
         <w:numPr>
           <w:ilvl w:val="0"/>
           <w:numId w:val="5"/>
@@ -1958,7 +2077,7 @@
     </w:p>
     <w:p>
       <w:pPr>
-        <w:pStyle w:val="PargrafodaLista"/>
+        <w:pStyle w:val="ListParagraph"/>
         <w:numPr>
           <w:ilvl w:val="0"/>
           <w:numId w:val="5"/>
@@ -1970,7 +2089,19 @@
     </w:p>
     <w:p>
       <w:pPr>
-        <w:pStyle w:val="Ttulo3"/>
+        <w:pStyle w:val="ListParagraph"/>
+        <w:numPr>
+          <w:ilvl w:val="0"/>
+          <w:numId w:val="5"/>
+        </w:numPr>
+      </w:pPr>
+      <w:r>
+        <w:t>Se conectar à Interfaces de Programação de Aplicação (Sigla API, em inglês) de terceiros;</w:t>
+      </w:r>
+    </w:p>
+    <w:p>
+      <w:pPr>
+        <w:pStyle w:val="Heading3"/>
       </w:pPr>
       <w:bookmarkStart w:id="6" w:name="_Toc240009158"/>
       <w:r>
@@ -1980,88 +2111,98 @@
     </w:p>
     <w:p>
       <w:pPr>
-        <w:pStyle w:val="PargrafodaLista"/>
+        <w:pStyle w:val="ListParagraph"/>
         <w:numPr>
           <w:ilvl w:val="0"/>
           <w:numId w:val="6"/>
         </w:numPr>
       </w:pPr>
       <w:r>
-        <w:t>Se conectar à Interfaces de Programação de Aplicação (Sigla API, em inglês) de terceiros;</w:t>
-      </w:r>
-    </w:p>
-    <w:p>
-      <w:pPr>
-        <w:pStyle w:val="PargrafodaLista"/>
+        <w:t>Distinguir, através de Inteligência Artificial (IA),</w:t>
+      </w:r>
+      <w:r>
+        <w:t xml:space="preserve"> o tipo de atividade e o quanto ela vale em pontos </w:t>
+      </w:r>
+      <w:proofErr w:type="spellStart"/>
+      <w:r>
+        <w:rPr>
+          <w:i/>
+          <w:iCs/>
+        </w:rPr>
+        <w:t>in-app</w:t>
+      </w:r>
+      <w:proofErr w:type="spellEnd"/>
+      <w:r>
+        <w:rPr>
+          <w:i/>
+          <w:iCs/>
+        </w:rPr>
+        <w:t>;</w:t>
+      </w:r>
+    </w:p>
+    <w:p>
+      <w:pPr>
+        <w:pStyle w:val="ListParagraph"/>
         <w:numPr>
           <w:ilvl w:val="0"/>
           <w:numId w:val="6"/>
         </w:numPr>
       </w:pPr>
       <w:r>
-        <w:t>Distinguir, através de Inteligência Artificial (IA),</w:t>
-      </w:r>
-      <w:r>
-        <w:t xml:space="preserve"> o tipo de atividade e o quanto ela vale em pontos </w:t>
-      </w:r>
-      <w:r>
-        <w:rPr>
-          <w:i/>
-          <w:iCs/>
-        </w:rPr>
-        <w:t>in-app;</w:t>
-      </w:r>
-    </w:p>
-    <w:p>
-      <w:pPr>
-        <w:pStyle w:val="PargrafodaLista"/>
-        <w:numPr>
-          <w:ilvl w:val="0"/>
-          <w:numId w:val="6"/>
-        </w:numPr>
-      </w:pPr>
-      <w:r>
-        <w:t>Se conectar a rede de postagens para se ter comentários ou likes;</w:t>
-      </w:r>
-    </w:p>
-    <w:p>
-      <w:pPr>
-        <w:pStyle w:val="Ttulo1"/>
-        <w:rPr>
-          <w:lang w:val="en-US"/>
-        </w:rPr>
-      </w:pPr>
+        <w:t xml:space="preserve">Se </w:t>
+      </w:r>
+      <w:proofErr w:type="gramStart"/>
+      <w:r>
+        <w:t>conectar  rede</w:t>
+      </w:r>
+      <w:proofErr w:type="gramEnd"/>
+      <w:r>
+        <w:t xml:space="preserve"> de postagens para se ter comentários ou likes;</w:t>
+      </w:r>
+    </w:p>
+    <w:p>
       <w:bookmarkStart w:id="7" w:name="_Toc240009159"/>
     </w:p>
-    <w:p>
-      <w:pPr>
-        <w:pStyle w:val="Ttulo1"/>
-        <w:rPr>
-          <w:lang w:val="en-US"/>
-        </w:rPr>
-      </w:pPr>
-    </w:p>
-    <w:p>
-      <w:pPr>
-        <w:pStyle w:val="Ttulo1"/>
-        <w:rPr>
-          <w:lang w:val="en-US"/>
-        </w:rPr>
-      </w:pPr>
-      <w:r>
-        <w:rPr>
-          <w:lang w:val="en-US"/>
-        </w:rPr>
+    <w:p/>
+    <w:p>
+      <w:pPr>
+        <w:pStyle w:val="Heading1"/>
+      </w:pPr>
+      <w:r>
         <w:lastRenderedPageBreak/>
-        <w:t>2</w:t>
-      </w:r>
-      <w:r>
-        <w:rPr>
-          <w:lang w:val="en-US"/>
-        </w:rPr>
+        <w:t xml:space="preserve">2. Tabela de </w:t>
+      </w:r>
+      <w:proofErr w:type="spellStart"/>
+      <w:r>
+        <w:t>Endpoints</w:t>
+      </w:r>
+      <w:proofErr w:type="spellEnd"/>
+      <w:r>
+        <w:t xml:space="preserve"> (API </w:t>
+      </w:r>
+      <w:proofErr w:type="spellStart"/>
+      <w:r>
+        <w:t>RESTful</w:t>
+      </w:r>
+      <w:proofErr w:type="spellEnd"/>
+      <w:r>
+        <w:t>)</w:t>
+      </w:r>
+    </w:p>
+    <w:p>
+      <w:pPr>
+        <w:pStyle w:val="Heading1"/>
+      </w:pPr>
+      <w:r>
+        <w:t>3</w:t>
+      </w:r>
+      <w:r>
         <w:t>. Protótipo</w:t>
       </w:r>
       <w:bookmarkEnd w:id="7"/>
+      <w:r>
+        <w:t xml:space="preserve"> – Telas da aplicação</w:t>
+      </w:r>
     </w:p>
     <w:p>
       <w:pPr>
@@ -2090,10 +2231,13 @@
     </w:p>
     <w:p>
       <w:pPr>
-        <w:pStyle w:val="Ttulo1"/>
-      </w:pPr>
-      <w:r>
-        <w:t>3. MER (Modelo de Entidade e Relacionamento)</w:t>
+        <w:pStyle w:val="Heading1"/>
+      </w:pPr>
+      <w:r>
+        <w:t>4</w:t>
+      </w:r>
+      <w:r>
+        <w:t>. MER (Modelo de Entidade e Relacionamento)</w:t>
       </w:r>
       <w:bookmarkEnd w:id="8"/>
     </w:p>
@@ -2160,12 +2304,26 @@
       </w:r>
     </w:p>
     <w:p>
-      <w:pPr>
-        <w:pStyle w:val="Ttulo1"/>
-      </w:pPr>
       <w:bookmarkStart w:id="9" w:name="_Toc240009161"/>
-      <w:r>
-        <w:t>4. Diagrama de Classes</w:t>
+    </w:p>
+    <w:p/>
+    <w:p/>
+    <w:p/>
+    <w:p/>
+    <w:p/>
+    <w:p/>
+    <w:p/>
+    <w:p/>
+    <w:p>
+      <w:pPr>
+        <w:pStyle w:val="Heading1"/>
+      </w:pPr>
+      <w:r>
+        <w:lastRenderedPageBreak/>
+        <w:t>5</w:t>
+      </w:r>
+      <w:r>
+        <w:t>. Diagrama de Classes</w:t>
       </w:r>
       <w:bookmarkEnd w:id="9"/>
     </w:p>
@@ -2229,12 +2387,14 @@
     </w:p>
     <w:p>
       <w:pPr>
-        <w:pStyle w:val="Ttulo1"/>
+        <w:pStyle w:val="Heading1"/>
       </w:pPr>
       <w:bookmarkStart w:id="10" w:name="_Toc240009162"/>
       <w:r>
-        <w:lastRenderedPageBreak/>
-        <w:t>5. Como rodar a aplicação?</w:t>
+        <w:t>6</w:t>
+      </w:r>
+      <w:r>
+        <w:t>. Como rodar a aplicação?</w:t>
       </w:r>
       <w:bookmarkEnd w:id="10"/>
     </w:p>
@@ -2253,13 +2413,31 @@
       <w:r>
         <w:t xml:space="preserve"> a seguir foi feito no </w:t>
       </w:r>
-      <w:r>
-        <w:rPr>
-          <w:b/>
-          <w:bCs/>
-        </w:rPr>
-        <w:t>JetBrains IntelliJ</w:t>
-      </w:r>
+      <w:proofErr w:type="spellStart"/>
+      <w:r>
+        <w:rPr>
+          <w:b/>
+          <w:bCs/>
+        </w:rPr>
+        <w:t>JetBrains</w:t>
+      </w:r>
+      <w:proofErr w:type="spellEnd"/>
+      <w:r>
+        <w:rPr>
+          <w:b/>
+          <w:bCs/>
+        </w:rPr>
+        <w:t xml:space="preserve"> </w:t>
+      </w:r>
+      <w:proofErr w:type="spellStart"/>
+      <w:r>
+        <w:rPr>
+          <w:b/>
+          <w:bCs/>
+        </w:rPr>
+        <w:t>IntelliJ</w:t>
+      </w:r>
+      <w:proofErr w:type="spellEnd"/>
       <w:r>
         <w:t xml:space="preserve">, na </w:t>
       </w:r>
@@ -2277,7 +2455,15 @@
         <w:t xml:space="preserve">Caso ainda esteja vendo esse arquivo pelo .zip, por favor, extraia o conteúdo da pasta comprimida para uma nova pasta. </w:t>
       </w:r>
       <w:r>
-        <w:t xml:space="preserve">Abra a pasta do projeto pelo IntelliJ e use a classe </w:t>
+        <w:t xml:space="preserve">Abra a pasta do projeto pelo </w:t>
+      </w:r>
+      <w:proofErr w:type="spellStart"/>
+      <w:r>
+        <w:t>IntelliJ</w:t>
+      </w:r>
+      <w:proofErr w:type="spellEnd"/>
+      <w:r>
+        <w:t xml:space="preserve"> e use a classe </w:t>
       </w:r>
       <w:r>
         <w:rPr>
@@ -2306,7 +2492,7 @@
 </file>
 
 <file path=word/endnotes.xml><?xml version="1.0" encoding="utf-8"?>
-<w:endnotes xmlns:wpc="http://schemas.microsoft.com/office/word/2010/wordprocessingCanvas" xmlns:cx="http://schemas.microsoft.com/office/drawing/2014/chartex" xmlns:cx1="http://schemas.microsoft.com/office/drawing/2015/9/8/chartex" xmlns:cx2="http://schemas.microsoft.com/office/drawing/2015/10/21/chartex" xmlns:cx3="http://schemas.microsoft.com/office/drawing/2016/5/9/chartex" xmlns:cx4="http://schemas.microsoft.com/office/drawing/2016/5/10/chartex" xmlns:cx5="http://schemas.microsoft.com/office/drawing/2016/5/11/chartex" xmlns:cx6="http://schemas.microsoft.com/office/drawing/2016/5/12/chartex" xmlns:cx7="http://schemas.microsoft.com/office/drawing/2016/5/13/chartex" xmlns:cx8="http://schemas.microsoft.com/office/drawing/2016/5/14/chartex" xmlns:mc="http://schemas.openxmlformats.org/markup-compatibility/2006" xmlns:aink="http://schemas.microsoft.com/office/drawing/2016/ink" xmlns:am3d="http://schemas.microsoft.com/office/drawing/2017/model3d" xmlns:o="urn:schemas-microsoft-com:office:office" xmlns:oel="http://schemas.microsoft.com/office/2019/extlst" xmlns:r="http://schemas.openxmlformats.org/officeDocument/2006/relationships" xmlns:m="http://schemas.openxmlformats.org/officeDocument/2006/math" xmlns:v="urn:schemas-microsoft-com:vml" xmlns:wp14="http://schemas.microsoft.com/office/word/2010/wordprocessingDrawing" xmlns:wp="http://schemas.openxmlformats.org/drawingml/2006/wordprocessingDrawing" xmlns:w10="urn:schemas-microsoft-com:office:word" xmlns:w="http://schemas.openxmlformats.org/wordprocessingml/2006/main" xmlns:w14="http://schemas.microsoft.com/office/word/2010/wordml" xmlns:w15="http://schemas.microsoft.com/office/word/2012/wordml" xmlns:w16cex="http://schemas.microsoft.com/office/word/2018/wordml/cex" xmlns:w16cid="http://schemas.microsoft.com/office/word/2016/wordml/cid" xmlns:w16="http://schemas.microsoft.com/office/word/2018/wordml" xmlns:w16du="http://schemas.microsoft.com/office/word/2023/wordml/word16du" xmlns:w16sdtdh="http://schemas.microsoft.com/office/word/2020/wordml/sdtdatahash" xmlns:w16se="http://schemas.microsoft.com/office/word/2015/wordml/symex" xmlns:wpg="http://schemas.microsoft.com/office/word/2010/wordprocessingGroup" xmlns:wpi="http://schemas.microsoft.com/office/word/2010/wordprocessingInk" xmlns:wne="http://schemas.microsoft.com/office/word/2006/wordml" xmlns:wps="http://schemas.microsoft.com/office/word/2010/wordprocessingShape" mc:Ignorable="w14 w15 w16se w16cid w16 w16cex w16sdtdh w16du wp14">
+<w:endnotes xmlns:wpc="http://schemas.microsoft.com/office/word/2010/wordprocessingCanvas" xmlns:cx="http://schemas.microsoft.com/office/drawing/2014/chartex" xmlns:cx1="http://schemas.microsoft.com/office/drawing/2015/9/8/chartex" xmlns:cx2="http://schemas.microsoft.com/office/drawing/2015/10/21/chartex" xmlns:cx3="http://schemas.microsoft.com/office/drawing/2016/5/9/chartex" xmlns:cx4="http://schemas.microsoft.com/office/drawing/2016/5/10/chartex" xmlns:cx5="http://schemas.microsoft.com/office/drawing/2016/5/11/chartex" xmlns:cx6="http://schemas.microsoft.com/office/drawing/2016/5/12/chartex" xmlns:cx7="http://schemas.microsoft.com/office/drawing/2016/5/13/chartex" xmlns:cx8="http://schemas.microsoft.com/office/drawing/2016/5/14/chartex" xmlns:mc="http://schemas.openxmlformats.org/markup-compatibility/2006" xmlns:aink="http://schemas.microsoft.com/office/drawing/2016/ink" xmlns:am3d="http://schemas.microsoft.com/office/drawing/2017/model3d" xmlns:o="urn:schemas-microsoft-com:office:office" xmlns:oel="http://schemas.microsoft.com/office/2019/extlst" xmlns:r="http://schemas.openxmlformats.org/officeDocument/2006/relationships" xmlns:m="http://schemas.openxmlformats.org/officeDocument/2006/math" xmlns:v="urn:schemas-microsoft-com:vml" xmlns:wp14="http://schemas.microsoft.com/office/word/2010/wordprocessingDrawing" xmlns:wp="http://schemas.openxmlformats.org/drawingml/2006/wordprocessingDrawing" xmlns:w10="urn:schemas-microsoft-com:office:word" xmlns:w="http://schemas.openxmlformats.org/wordprocessingml/2006/main" xmlns:w14="http://schemas.microsoft.com/office/word/2010/wordml" xmlns:w15="http://schemas.microsoft.com/office/word/2012/wordml" xmlns:w16cex="http://schemas.microsoft.com/office/word/2018/wordml/cex" xmlns:w16cid="http://schemas.microsoft.com/office/word/2016/wordml/cid" xmlns:w16="http://schemas.microsoft.com/office/word/2018/wordml" xmlns:w16sdtdh="http://schemas.microsoft.com/office/word/2020/wordml/sdtdatahash" xmlns:w16se="http://schemas.microsoft.com/office/word/2015/wordml/symex" xmlns:wpg="http://schemas.microsoft.com/office/word/2010/wordprocessingGroup" xmlns:wpi="http://schemas.microsoft.com/office/word/2010/wordprocessingInk" xmlns:wne="http://schemas.microsoft.com/office/word/2006/wordml" xmlns:wps="http://schemas.microsoft.com/office/word/2010/wordprocessingShape" mc:Ignorable="w14 w15 w16se w16cid w16 w16cex w16sdtdh wp14">
   <w:endnote w:type="separator" w:id="-1">
     <w:p>
       <w:pPr>
@@ -2331,7 +2517,7 @@
 </file>
 
 <file path=word/footnotes.xml><?xml version="1.0" encoding="utf-8"?>
-<w:footnotes xmlns:wpc="http://schemas.microsoft.com/office/word/2010/wordprocessingCanvas" xmlns:cx="http://schemas.microsoft.com/office/drawing/2014/chartex" xmlns:cx1="http://schemas.microsoft.com/office/drawing/2015/9/8/chartex" xmlns:cx2="http://schemas.microsoft.com/office/drawing/2015/10/21/chartex" xmlns:cx3="http://schemas.microsoft.com/office/drawing/2016/5/9/chartex" xmlns:cx4="http://schemas.microsoft.com/office/drawing/2016/5/10/chartex" xmlns:cx5="http://schemas.microsoft.com/office/drawing/2016/5/11/chartex" xmlns:cx6="http://schemas.microsoft.com/office/drawing/2016/5/12/chartex" xmlns:cx7="http://schemas.microsoft.com/office/drawing/2016/5/13/chartex" xmlns:cx8="http://schemas.microsoft.com/office/drawing/2016/5/14/chartex" xmlns:mc="http://schemas.openxmlformats.org/markup-compatibility/2006" xmlns:aink="http://schemas.microsoft.com/office/drawing/2016/ink" xmlns:am3d="http://schemas.microsoft.com/office/drawing/2017/model3d" xmlns:o="urn:schemas-microsoft-com:office:office" xmlns:oel="http://schemas.microsoft.com/office/2019/extlst" xmlns:r="http://schemas.openxmlformats.org/officeDocument/2006/relationships" xmlns:m="http://schemas.openxmlformats.org/officeDocument/2006/math" xmlns:v="urn:schemas-microsoft-com:vml" xmlns:wp14="http://schemas.microsoft.com/office/word/2010/wordprocessingDrawing" xmlns:wp="http://schemas.openxmlformats.org/drawingml/2006/wordprocessingDrawing" xmlns:w10="urn:schemas-microsoft-com:office:word" xmlns:w="http://schemas.openxmlformats.org/wordprocessingml/2006/main" xmlns:w14="http://schemas.microsoft.com/office/word/2010/wordml" xmlns:w15="http://schemas.microsoft.com/office/word/2012/wordml" xmlns:w16cex="http://schemas.microsoft.com/office/word/2018/wordml/cex" xmlns:w16cid="http://schemas.microsoft.com/office/word/2016/wordml/cid" xmlns:w16="http://schemas.microsoft.com/office/word/2018/wordml" xmlns:w16du="http://schemas.microsoft.com/office/word/2023/wordml/word16du" xmlns:w16sdtdh="http://schemas.microsoft.com/office/word/2020/wordml/sdtdatahash" xmlns:w16se="http://schemas.microsoft.com/office/word/2015/wordml/symex" xmlns:wpg="http://schemas.microsoft.com/office/word/2010/wordprocessingGroup" xmlns:wpi="http://schemas.microsoft.com/office/word/2010/wordprocessingInk" xmlns:wne="http://schemas.microsoft.com/office/word/2006/wordml" xmlns:wps="http://schemas.microsoft.com/office/word/2010/wordprocessingShape" mc:Ignorable="w14 w15 w16se w16cid w16 w16cex w16sdtdh w16du wp14">
+<w:footnotes xmlns:wpc="http://schemas.microsoft.com/office/word/2010/wordprocessingCanvas" xmlns:cx="http://schemas.microsoft.com/office/drawing/2014/chartex" xmlns:cx1="http://schemas.microsoft.com/office/drawing/2015/9/8/chartex" xmlns:cx2="http://schemas.microsoft.com/office/drawing/2015/10/21/chartex" xmlns:cx3="http://schemas.microsoft.com/office/drawing/2016/5/9/chartex" xmlns:cx4="http://schemas.microsoft.com/office/drawing/2016/5/10/chartex" xmlns:cx5="http://schemas.microsoft.com/office/drawing/2016/5/11/chartex" xmlns:cx6="http://schemas.microsoft.com/office/drawing/2016/5/12/chartex" xmlns:cx7="http://schemas.microsoft.com/office/drawing/2016/5/13/chartex" xmlns:cx8="http://schemas.microsoft.com/office/drawing/2016/5/14/chartex" xmlns:mc="http://schemas.openxmlformats.org/markup-compatibility/2006" xmlns:aink="http://schemas.microsoft.com/office/drawing/2016/ink" xmlns:am3d="http://schemas.microsoft.com/office/drawing/2017/model3d" xmlns:o="urn:schemas-microsoft-com:office:office" xmlns:oel="http://schemas.microsoft.com/office/2019/extlst" xmlns:r="http://schemas.openxmlformats.org/officeDocument/2006/relationships" xmlns:m="http://schemas.openxmlformats.org/officeDocument/2006/math" xmlns:v="urn:schemas-microsoft-com:vml" xmlns:wp14="http://schemas.microsoft.com/office/word/2010/wordprocessingDrawing" xmlns:wp="http://schemas.openxmlformats.org/drawingml/2006/wordprocessingDrawing" xmlns:w10="urn:schemas-microsoft-com:office:word" xmlns:w="http://schemas.openxmlformats.org/wordprocessingml/2006/main" xmlns:w14="http://schemas.microsoft.com/office/word/2010/wordml" xmlns:w15="http://schemas.microsoft.com/office/word/2012/wordml" xmlns:w16cex="http://schemas.microsoft.com/office/word/2018/wordml/cex" xmlns:w16cid="http://schemas.microsoft.com/office/word/2016/wordml/cid" xmlns:w16="http://schemas.microsoft.com/office/word/2018/wordml" xmlns:w16sdtdh="http://schemas.microsoft.com/office/word/2020/wordml/sdtdatahash" xmlns:w16se="http://schemas.microsoft.com/office/word/2015/wordml/symex" xmlns:wpg="http://schemas.microsoft.com/office/word/2010/wordprocessingGroup" xmlns:wpi="http://schemas.microsoft.com/office/word/2010/wordprocessingInk" xmlns:wne="http://schemas.microsoft.com/office/word/2006/wordml" xmlns:wps="http://schemas.microsoft.com/office/word/2010/wordprocessingShape" mc:Ignorable="w14 w15 w16se w16cid w16 w16cex w16sdtdh wp14">
   <w:footnote w:type="separator" w:id="-1">
     <w:p>
       <w:pPr>
@@ -2356,7 +2542,7 @@
 </file>
 
 <file path=word/header1.xml><?xml version="1.0" encoding="utf-8"?>
-<w:hdr xmlns:wpc="http://schemas.microsoft.com/office/word/2010/wordprocessingCanvas" xmlns:cx="http://schemas.microsoft.com/office/drawing/2014/chartex" xmlns:cx1="http://schemas.microsoft.com/office/drawing/2015/9/8/chartex" xmlns:cx2="http://schemas.microsoft.com/office/drawing/2015/10/21/chartex" xmlns:cx3="http://schemas.microsoft.com/office/drawing/2016/5/9/chartex" xmlns:cx4="http://schemas.microsoft.com/office/drawing/2016/5/10/chartex" xmlns:cx5="http://schemas.microsoft.com/office/drawing/2016/5/11/chartex" xmlns:cx6="http://schemas.microsoft.com/office/drawing/2016/5/12/chartex" xmlns:cx7="http://schemas.microsoft.com/office/drawing/2016/5/13/chartex" xmlns:cx8="http://schemas.microsoft.com/office/drawing/2016/5/14/chartex" xmlns:mc="http://schemas.openxmlformats.org/markup-compatibility/2006" xmlns:aink="http://schemas.microsoft.com/office/drawing/2016/ink" xmlns:am3d="http://schemas.microsoft.com/office/drawing/2017/model3d" xmlns:o="urn:schemas-microsoft-com:office:office" xmlns:oel="http://schemas.microsoft.com/office/2019/extlst" xmlns:r="http://schemas.openxmlformats.org/officeDocument/2006/relationships" xmlns:m="http://schemas.openxmlformats.org/officeDocument/2006/math" xmlns:v="urn:schemas-microsoft-com:vml" xmlns:wp14="http://schemas.microsoft.com/office/word/2010/wordprocessingDrawing" xmlns:wp="http://schemas.openxmlformats.org/drawingml/2006/wordprocessingDrawing" xmlns:w10="urn:schemas-microsoft-com:office:word" xmlns:w="http://schemas.openxmlformats.org/wordprocessingml/2006/main" xmlns:w14="http://schemas.microsoft.com/office/word/2010/wordml" xmlns:w15="http://schemas.microsoft.com/office/word/2012/wordml" xmlns:w16cex="http://schemas.microsoft.com/office/word/2018/wordml/cex" xmlns:w16cid="http://schemas.microsoft.com/office/word/2016/wordml/cid" xmlns:w16="http://schemas.microsoft.com/office/word/2018/wordml" xmlns:w16du="http://schemas.microsoft.com/office/word/2023/wordml/word16du" xmlns:w16sdtdh="http://schemas.microsoft.com/office/word/2020/wordml/sdtdatahash" xmlns:w16se="http://schemas.microsoft.com/office/word/2015/wordml/symex" xmlns:wpg="http://schemas.microsoft.com/office/word/2010/wordprocessingGroup" xmlns:wpi="http://schemas.microsoft.com/office/word/2010/wordprocessingInk" xmlns:wne="http://schemas.microsoft.com/office/word/2006/wordml" xmlns:wps="http://schemas.microsoft.com/office/word/2010/wordprocessingShape" mc:Ignorable="w14 w15 w16se w16cid w16 w16cex w16sdtdh w16du wp14">
+<w:hdr xmlns:wpc="http://schemas.microsoft.com/office/word/2010/wordprocessingCanvas" xmlns:cx="http://schemas.microsoft.com/office/drawing/2014/chartex" xmlns:cx1="http://schemas.microsoft.com/office/drawing/2015/9/8/chartex" xmlns:cx2="http://schemas.microsoft.com/office/drawing/2015/10/21/chartex" xmlns:cx3="http://schemas.microsoft.com/office/drawing/2016/5/9/chartex" xmlns:cx4="http://schemas.microsoft.com/office/drawing/2016/5/10/chartex" xmlns:cx5="http://schemas.microsoft.com/office/drawing/2016/5/11/chartex" xmlns:cx6="http://schemas.microsoft.com/office/drawing/2016/5/12/chartex" xmlns:cx7="http://schemas.microsoft.com/office/drawing/2016/5/13/chartex" xmlns:cx8="http://schemas.microsoft.com/office/drawing/2016/5/14/chartex" xmlns:mc="http://schemas.openxmlformats.org/markup-compatibility/2006" xmlns:aink="http://schemas.microsoft.com/office/drawing/2016/ink" xmlns:am3d="http://schemas.microsoft.com/office/drawing/2017/model3d" xmlns:o="urn:schemas-microsoft-com:office:office" xmlns:oel="http://schemas.microsoft.com/office/2019/extlst" xmlns:r="http://schemas.openxmlformats.org/officeDocument/2006/relationships" xmlns:m="http://schemas.openxmlformats.org/officeDocument/2006/math" xmlns:v="urn:schemas-microsoft-com:vml" xmlns:wp14="http://schemas.microsoft.com/office/word/2010/wordprocessingDrawing" xmlns:wp="http://schemas.openxmlformats.org/drawingml/2006/wordprocessingDrawing" xmlns:w10="urn:schemas-microsoft-com:office:word" xmlns:w="http://schemas.openxmlformats.org/wordprocessingml/2006/main" xmlns:w14="http://schemas.microsoft.com/office/word/2010/wordml" xmlns:w15="http://schemas.microsoft.com/office/word/2012/wordml" xmlns:w16cex="http://schemas.microsoft.com/office/word/2018/wordml/cex" xmlns:w16cid="http://schemas.microsoft.com/office/word/2016/wordml/cid" xmlns:w16="http://schemas.microsoft.com/office/word/2018/wordml" xmlns:w16sdtdh="http://schemas.microsoft.com/office/word/2020/wordml/sdtdatahash" xmlns:w16se="http://schemas.microsoft.com/office/word/2015/wordml/symex" xmlns:wpg="http://schemas.microsoft.com/office/word/2010/wordprocessingGroup" xmlns:wpi="http://schemas.microsoft.com/office/word/2010/wordprocessingInk" xmlns:wne="http://schemas.microsoft.com/office/word/2006/wordml" xmlns:wps="http://schemas.microsoft.com/office/word/2010/wordprocessingShape" mc:Ignorable="w14 w15 w16se w16cid w16 w16cex w16sdtdh wp14">
   <w:sdt>
     <w:sdtPr>
       <w:id w:val="-1213418629"/>
@@ -2373,7 +2559,7 @@
     <w:sdtContent>
       <w:p>
         <w:pPr>
-          <w:pStyle w:val="Cabealho"/>
+          <w:pStyle w:val="Header"/>
           <w:jc w:val="right"/>
         </w:pPr>
         <w:r>
@@ -2402,14 +2588,14 @@
   </w:sdt>
   <w:p>
     <w:pPr>
-      <w:pStyle w:val="Cabealho"/>
+      <w:pStyle w:val="Header"/>
     </w:pPr>
   </w:p>
 </w:hdr>
 </file>
 
 <file path=word/numbering.xml><?xml version="1.0" encoding="utf-8"?>
-<w:numbering xmlns:wpc="http://schemas.microsoft.com/office/word/2010/wordprocessingCanvas" xmlns:cx="http://schemas.microsoft.com/office/drawing/2014/chartex" xmlns:cx1="http://schemas.microsoft.com/office/drawing/2015/9/8/chartex" xmlns:cx2="http://schemas.microsoft.com/office/drawing/2015/10/21/chartex" xmlns:cx3="http://schemas.microsoft.com/office/drawing/2016/5/9/chartex" xmlns:cx4="http://schemas.microsoft.com/office/drawing/2016/5/10/chartex" xmlns:cx5="http://schemas.microsoft.com/office/drawing/2016/5/11/chartex" xmlns:cx6="http://schemas.microsoft.com/office/drawing/2016/5/12/chartex" xmlns:cx7="http://schemas.microsoft.com/office/drawing/2016/5/13/chartex" xmlns:cx8="http://schemas.microsoft.com/office/drawing/2016/5/14/chartex" xmlns:mc="http://schemas.openxmlformats.org/markup-compatibility/2006" xmlns:aink="http://schemas.microsoft.com/office/drawing/2016/ink" xmlns:am3d="http://schemas.microsoft.com/office/drawing/2017/model3d" xmlns:o="urn:schemas-microsoft-com:office:office" xmlns:oel="http://schemas.microsoft.com/office/2019/extlst" xmlns:r="http://schemas.openxmlformats.org/officeDocument/2006/relationships" xmlns:m="http://schemas.openxmlformats.org/officeDocument/2006/math" xmlns:v="urn:schemas-microsoft-com:vml" xmlns:wp14="http://schemas.microsoft.com/office/word/2010/wordprocessingDrawing" xmlns:wp="http://schemas.openxmlformats.org/drawingml/2006/wordprocessingDrawing" xmlns:w10="urn:schemas-microsoft-com:office:word" xmlns:w="http://schemas.openxmlformats.org/wordprocessingml/2006/main" xmlns:w14="http://schemas.microsoft.com/office/word/2010/wordml" xmlns:w15="http://schemas.microsoft.com/office/word/2012/wordml" xmlns:w16cex="http://schemas.microsoft.com/office/word/2018/wordml/cex" xmlns:w16cid="http://schemas.microsoft.com/office/word/2016/wordml/cid" xmlns:w16="http://schemas.microsoft.com/office/word/2018/wordml" xmlns:w16du="http://schemas.microsoft.com/office/word/2023/wordml/word16du" xmlns:w16sdtdh="http://schemas.microsoft.com/office/word/2020/wordml/sdtdatahash" xmlns:w16se="http://schemas.microsoft.com/office/word/2015/wordml/symex" xmlns:wpg="http://schemas.microsoft.com/office/word/2010/wordprocessingGroup" xmlns:wpi="http://schemas.microsoft.com/office/word/2010/wordprocessingInk" xmlns:wne="http://schemas.microsoft.com/office/word/2006/wordml" xmlns:wps="http://schemas.microsoft.com/office/word/2010/wordprocessingShape" mc:Ignorable="w14 w15 w16se w16cid w16 w16cex w16sdtdh w16du wp14">
+<w:numbering xmlns:wpc="http://schemas.microsoft.com/office/word/2010/wordprocessingCanvas" xmlns:cx="http://schemas.microsoft.com/office/drawing/2014/chartex" xmlns:cx1="http://schemas.microsoft.com/office/drawing/2015/9/8/chartex" xmlns:cx2="http://schemas.microsoft.com/office/drawing/2015/10/21/chartex" xmlns:cx3="http://schemas.microsoft.com/office/drawing/2016/5/9/chartex" xmlns:cx4="http://schemas.microsoft.com/office/drawing/2016/5/10/chartex" xmlns:cx5="http://schemas.microsoft.com/office/drawing/2016/5/11/chartex" xmlns:cx6="http://schemas.microsoft.com/office/drawing/2016/5/12/chartex" xmlns:cx7="http://schemas.microsoft.com/office/drawing/2016/5/13/chartex" xmlns:cx8="http://schemas.microsoft.com/office/drawing/2016/5/14/chartex" xmlns:mc="http://schemas.openxmlformats.org/markup-compatibility/2006" xmlns:aink="http://schemas.microsoft.com/office/drawing/2016/ink" xmlns:am3d="http://schemas.microsoft.com/office/drawing/2017/model3d" xmlns:o="urn:schemas-microsoft-com:office:office" xmlns:oel="http://schemas.microsoft.com/office/2019/extlst" xmlns:r="http://schemas.openxmlformats.org/officeDocument/2006/relationships" xmlns:m="http://schemas.openxmlformats.org/officeDocument/2006/math" xmlns:v="urn:schemas-microsoft-com:vml" xmlns:wp14="http://schemas.microsoft.com/office/word/2010/wordprocessingDrawing" xmlns:wp="http://schemas.openxmlformats.org/drawingml/2006/wordprocessingDrawing" xmlns:w10="urn:schemas-microsoft-com:office:word" xmlns:w="http://schemas.openxmlformats.org/wordprocessingml/2006/main" xmlns:w14="http://schemas.microsoft.com/office/word/2010/wordml" xmlns:w15="http://schemas.microsoft.com/office/word/2012/wordml" xmlns:w16cex="http://schemas.microsoft.com/office/word/2018/wordml/cex" xmlns:w16cid="http://schemas.microsoft.com/office/word/2016/wordml/cid" xmlns:w16="http://schemas.microsoft.com/office/word/2018/wordml" xmlns:w16sdtdh="http://schemas.microsoft.com/office/word/2020/wordml/sdtdatahash" xmlns:w16se="http://schemas.microsoft.com/office/word/2015/wordml/symex" xmlns:wpg="http://schemas.microsoft.com/office/word/2010/wordprocessingGroup" xmlns:wpi="http://schemas.microsoft.com/office/word/2010/wordprocessingInk" xmlns:wne="http://schemas.microsoft.com/office/word/2006/wordml" xmlns:wps="http://schemas.microsoft.com/office/word/2010/wordprocessingShape" mc:Ignorable="w14 w15 w16se w16cid w16 w16cex w16sdtdh wp14">
   <w:abstractNum w:abstractNumId="0" w15:restartNumberingAfterBreak="0">
     <w:nsid w:val="17BD535A"/>
     <w:multiLevelType w:val="hybridMultilevel"/>
@@ -3014,7 +3200,7 @@
 </file>
 
 <file path=word/styles.xml><?xml version="1.0" encoding="utf-8"?>
-<w:styles xmlns:mc="http://schemas.openxmlformats.org/markup-compatibility/2006" xmlns:r="http://schemas.openxmlformats.org/officeDocument/2006/relationships" xmlns:w="http://schemas.openxmlformats.org/wordprocessingml/2006/main" xmlns:w14="http://schemas.microsoft.com/office/word/2010/wordml" xmlns:w15="http://schemas.microsoft.com/office/word/2012/wordml" xmlns:w16cex="http://schemas.microsoft.com/office/word/2018/wordml/cex" xmlns:w16cid="http://schemas.microsoft.com/office/word/2016/wordml/cid" xmlns:w16="http://schemas.microsoft.com/office/word/2018/wordml" xmlns:w16du="http://schemas.microsoft.com/office/word/2023/wordml/word16du" xmlns:w16sdtdh="http://schemas.microsoft.com/office/word/2020/wordml/sdtdatahash" xmlns:w16se="http://schemas.microsoft.com/office/word/2015/wordml/symex" mc:Ignorable="w14 w15 w16se w16cid w16 w16cex w16sdtdh w16du">
+<w:styles xmlns:mc="http://schemas.openxmlformats.org/markup-compatibility/2006" xmlns:r="http://schemas.openxmlformats.org/officeDocument/2006/relationships" xmlns:w="http://schemas.openxmlformats.org/wordprocessingml/2006/main" xmlns:w14="http://schemas.microsoft.com/office/word/2010/wordml" xmlns:w15="http://schemas.microsoft.com/office/word/2012/wordml" xmlns:w16cex="http://schemas.microsoft.com/office/word/2018/wordml/cex" xmlns:w16cid="http://schemas.microsoft.com/office/word/2016/wordml/cid" xmlns:w16="http://schemas.microsoft.com/office/word/2018/wordml" xmlns:w16sdtdh="http://schemas.microsoft.com/office/word/2020/wordml/sdtdatahash" xmlns:w16se="http://schemas.microsoft.com/office/word/2015/wordml/symex" mc:Ignorable="w14 w15 w16se w16cid w16 w16cex w16sdtdh">
   <w:docDefaults>
     <w:rPrDefault>
       <w:rPr>
@@ -3424,11 +3610,11 @@
       <w:szCs w:val="24"/>
     </w:rPr>
   </w:style>
-  <w:style w:type="paragraph" w:styleId="Ttulo1">
+  <w:style w:type="paragraph" w:styleId="Heading1">
     <w:name w:val="heading 1"/>
     <w:basedOn w:val="Normal"/>
     <w:next w:val="Normal"/>
-    <w:link w:val="Ttulo1Char"/>
+    <w:link w:val="Heading1Char"/>
     <w:uiPriority w:val="9"/>
     <w:qFormat/>
     <w:rsid w:val="00BD4496"/>
@@ -3440,11 +3626,11 @@
       <w:szCs w:val="28"/>
     </w:rPr>
   </w:style>
-  <w:style w:type="paragraph" w:styleId="Ttulo2">
+  <w:style w:type="paragraph" w:styleId="Heading2">
     <w:name w:val="heading 2"/>
-    <w:basedOn w:val="Ttulo1"/>
+    <w:basedOn w:val="Heading1"/>
     <w:next w:val="Normal"/>
-    <w:link w:val="Ttulo2Char"/>
+    <w:link w:val="Heading2Char"/>
     <w:uiPriority w:val="9"/>
     <w:unhideWhenUsed/>
     <w:qFormat/>
@@ -3453,11 +3639,11 @@
       <w:outlineLvl w:val="1"/>
     </w:pPr>
   </w:style>
-  <w:style w:type="paragraph" w:styleId="Ttulo3">
+  <w:style w:type="paragraph" w:styleId="Heading3">
     <w:name w:val="heading 3"/>
-    <w:basedOn w:val="Ttulo2"/>
+    <w:basedOn w:val="Heading2"/>
     <w:next w:val="Normal"/>
-    <w:link w:val="Ttulo3Char"/>
+    <w:link w:val="Heading3Char"/>
     <w:uiPriority w:val="9"/>
     <w:unhideWhenUsed/>
     <w:qFormat/>
@@ -3466,13 +3652,13 @@
       <w:outlineLvl w:val="2"/>
     </w:pPr>
   </w:style>
-  <w:style w:type="character" w:default="1" w:styleId="Fontepargpadro">
+  <w:style w:type="character" w:default="1" w:styleId="DefaultParagraphFont">
     <w:name w:val="Default Paragraph Font"/>
     <w:uiPriority w:val="1"/>
     <w:semiHidden/>
     <w:unhideWhenUsed/>
   </w:style>
-  <w:style w:type="table" w:default="1" w:styleId="Tabelanormal">
+  <w:style w:type="table" w:default="1" w:styleId="TableNormal">
     <w:name w:val="Normal Table"/>
     <w:uiPriority w:val="99"/>
     <w:semiHidden/>
@@ -3487,16 +3673,16 @@
       </w:tblCellMar>
     </w:tblPr>
   </w:style>
-  <w:style w:type="numbering" w:default="1" w:styleId="Semlista">
+  <w:style w:type="numbering" w:default="1" w:styleId="NoList">
     <w:name w:val="No List"/>
     <w:uiPriority w:val="99"/>
     <w:semiHidden/>
     <w:unhideWhenUsed/>
   </w:style>
-  <w:style w:type="character" w:customStyle="1" w:styleId="Ttulo1Char">
-    <w:name w:val="Título 1 Char"/>
-    <w:basedOn w:val="Fontepargpadro"/>
-    <w:link w:val="Ttulo1"/>
+  <w:style w:type="character" w:customStyle="1" w:styleId="Heading1Char">
+    <w:name w:val="Heading 1 Char"/>
+    <w:basedOn w:val="DefaultParagraphFont"/>
+    <w:link w:val="Heading1"/>
     <w:uiPriority w:val="9"/>
     <w:rsid w:val="00BD4496"/>
     <w:rPr>
@@ -3505,10 +3691,10 @@
       <w:szCs w:val="28"/>
     </w:rPr>
   </w:style>
-  <w:style w:type="character" w:customStyle="1" w:styleId="Ttulo2Char">
-    <w:name w:val="Título 2 Char"/>
-    <w:basedOn w:val="Fontepargpadro"/>
-    <w:link w:val="Ttulo2"/>
+  <w:style w:type="character" w:customStyle="1" w:styleId="Heading2Char">
+    <w:name w:val="Heading 2 Char"/>
+    <w:basedOn w:val="DefaultParagraphFont"/>
+    <w:link w:val="Heading2"/>
     <w:uiPriority w:val="9"/>
     <w:rsid w:val="00BD4496"/>
     <w:rPr>
@@ -3517,10 +3703,10 @@
       <w:szCs w:val="28"/>
     </w:rPr>
   </w:style>
-  <w:style w:type="character" w:customStyle="1" w:styleId="Ttulo3Char">
-    <w:name w:val="Título 3 Char"/>
-    <w:basedOn w:val="Fontepargpadro"/>
-    <w:link w:val="Ttulo3"/>
+  <w:style w:type="character" w:customStyle="1" w:styleId="Heading3Char">
+    <w:name w:val="Heading 3 Char"/>
+    <w:basedOn w:val="DefaultParagraphFont"/>
+    <w:link w:val="Heading3"/>
     <w:uiPriority w:val="9"/>
     <w:rsid w:val="00BD4496"/>
     <w:rPr>
@@ -3546,7 +3732,7 @@
       <w14:ligatures w14:val="none"/>
     </w:rPr>
   </w:style>
-  <w:style w:type="paragraph" w:styleId="PargrafodaLista">
+  <w:style w:type="paragraph" w:styleId="ListParagraph">
     <w:name w:val="List Paragraph"/>
     <w:basedOn w:val="Normal"/>
     <w:uiPriority w:val="34"/>
@@ -3559,7 +3745,7 @@
   </w:style>
   <w:style w:type="character" w:styleId="Hyperlink">
     <w:name w:val="Hyperlink"/>
-    <w:basedOn w:val="Fontepargpadro"/>
+    <w:basedOn w:val="DefaultParagraphFont"/>
     <w:uiPriority w:val="99"/>
     <w:unhideWhenUsed/>
     <w:rsid w:val="00B669D3"/>
@@ -3568,9 +3754,9 @@
       <w:u w:val="single"/>
     </w:rPr>
   </w:style>
-  <w:style w:type="character" w:styleId="MenoPendente">
+  <w:style w:type="character" w:styleId="UnresolvedMention">
     <w:name w:val="Unresolved Mention"/>
-    <w:basedOn w:val="Fontepargpadro"/>
+    <w:basedOn w:val="DefaultParagraphFont"/>
     <w:uiPriority w:val="99"/>
     <w:semiHidden/>
     <w:unhideWhenUsed/>
@@ -3580,10 +3766,10 @@
       <w:shd w:val="clear" w:color="auto" w:fill="E1DFDD"/>
     </w:rPr>
   </w:style>
-  <w:style w:type="paragraph" w:styleId="Cabealho">
+  <w:style w:type="paragraph" w:styleId="Header">
     <w:name w:val="header"/>
     <w:basedOn w:val="Normal"/>
-    <w:link w:val="CabealhoChar"/>
+    <w:link w:val="HeaderChar"/>
     <w:uiPriority w:val="99"/>
     <w:unhideWhenUsed/>
     <w:rsid w:val="007832B1"/>
@@ -3595,10 +3781,10 @@
       <w:spacing w:after="0" w:line="240" w:lineRule="auto"/>
     </w:pPr>
   </w:style>
-  <w:style w:type="character" w:customStyle="1" w:styleId="CabealhoChar">
-    <w:name w:val="Cabeçalho Char"/>
-    <w:basedOn w:val="Fontepargpadro"/>
-    <w:link w:val="Cabealho"/>
+  <w:style w:type="character" w:customStyle="1" w:styleId="HeaderChar">
+    <w:name w:val="Header Char"/>
+    <w:basedOn w:val="DefaultParagraphFont"/>
+    <w:link w:val="Header"/>
     <w:uiPriority w:val="99"/>
     <w:rsid w:val="007832B1"/>
     <w:rPr>
@@ -3607,10 +3793,10 @@
       <w:szCs w:val="24"/>
     </w:rPr>
   </w:style>
-  <w:style w:type="paragraph" w:styleId="Rodap">
+  <w:style w:type="paragraph" w:styleId="Footer">
     <w:name w:val="footer"/>
     <w:basedOn w:val="Normal"/>
-    <w:link w:val="RodapChar"/>
+    <w:link w:val="FooterChar"/>
     <w:uiPriority w:val="99"/>
     <w:unhideWhenUsed/>
     <w:rsid w:val="007832B1"/>
@@ -3622,10 +3808,10 @@
       <w:spacing w:after="0" w:line="240" w:lineRule="auto"/>
     </w:pPr>
   </w:style>
-  <w:style w:type="character" w:customStyle="1" w:styleId="RodapChar">
-    <w:name w:val="Rodapé Char"/>
-    <w:basedOn w:val="Fontepargpadro"/>
-    <w:link w:val="Rodap"/>
+  <w:style w:type="character" w:customStyle="1" w:styleId="FooterChar">
+    <w:name w:val="Footer Char"/>
+    <w:basedOn w:val="DefaultParagraphFont"/>
+    <w:link w:val="Footer"/>
     <w:uiPriority w:val="99"/>
     <w:rsid w:val="007832B1"/>
     <w:rPr>
@@ -3634,9 +3820,9 @@
       <w:szCs w:val="24"/>
     </w:rPr>
   </w:style>
-  <w:style w:type="paragraph" w:styleId="CabealhodoSumrio">
+  <w:style w:type="paragraph" w:styleId="TOCHeading">
     <w:name w:val="TOC Heading"/>
-    <w:basedOn w:val="Ttulo1"/>
+    <w:basedOn w:val="Heading1"/>
     <w:next w:val="Normal"/>
     <w:uiPriority w:val="39"/>
     <w:unhideWhenUsed/>
@@ -3659,7 +3845,7 @@
       <w14:ligatures w14:val="none"/>
     </w:rPr>
   </w:style>
-  <w:style w:type="paragraph" w:styleId="Sumrio1">
+  <w:style w:type="paragraph" w:styleId="TOC1">
     <w:name w:val="toc 1"/>
     <w:basedOn w:val="Normal"/>
     <w:next w:val="Normal"/>
@@ -3671,7 +3857,7 @@
       <w:spacing w:after="100"/>
     </w:pPr>
   </w:style>
-  <w:style w:type="paragraph" w:styleId="Sumrio2">
+  <w:style w:type="paragraph" w:styleId="TOC2">
     <w:name w:val="toc 2"/>
     <w:basedOn w:val="Normal"/>
     <w:next w:val="Normal"/>
@@ -3684,7 +3870,7 @@
       <w:ind w:left="240"/>
     </w:pPr>
   </w:style>
-  <w:style w:type="paragraph" w:styleId="Sumrio3">
+  <w:style w:type="paragraph" w:styleId="TOC3">
     <w:name w:val="toc 3"/>
     <w:basedOn w:val="Normal"/>
     <w:next w:val="Normal"/>
@@ -3697,9 +3883,9 @@
       <w:ind w:left="480"/>
     </w:pPr>
   </w:style>
-  <w:style w:type="character" w:styleId="HiperlinkVisitado">
+  <w:style w:type="character" w:styleId="FollowedHyperlink">
     <w:name w:val="FollowedHyperlink"/>
-    <w:basedOn w:val="Fontepargpadro"/>
+    <w:basedOn w:val="DefaultParagraphFont"/>
     <w:uiPriority w:val="99"/>
     <w:semiHidden/>
     <w:unhideWhenUsed/>

</xml_diff>

<commit_message>
feat: Feita as mudanças, adição de DTO, BO, RESOURCES e MAPPER, para poder definir os EndPoints
</commit_message>
<xml_diff>
--- a/SoulPass-Java-Documentacao.docx
+++ b/SoulPass-Java-Documentacao.docx
@@ -1,10 +1,10 @@
 
 <file path=word/document.xml><?xml version="1.0" encoding="utf-8"?>
-<w:document xmlns:wpc="http://schemas.microsoft.com/office/word/2010/wordprocessingCanvas" xmlns:cx="http://schemas.microsoft.com/office/drawing/2014/chartex" xmlns:cx1="http://schemas.microsoft.com/office/drawing/2015/9/8/chartex" xmlns:cx2="http://schemas.microsoft.com/office/drawing/2015/10/21/chartex" xmlns:cx3="http://schemas.microsoft.com/office/drawing/2016/5/9/chartex" xmlns:cx4="http://schemas.microsoft.com/office/drawing/2016/5/10/chartex" xmlns:cx5="http://schemas.microsoft.com/office/drawing/2016/5/11/chartex" xmlns:cx6="http://schemas.microsoft.com/office/drawing/2016/5/12/chartex" xmlns:cx7="http://schemas.microsoft.com/office/drawing/2016/5/13/chartex" xmlns:cx8="http://schemas.microsoft.com/office/drawing/2016/5/14/chartex" xmlns:mc="http://schemas.openxmlformats.org/markup-compatibility/2006" xmlns:aink="http://schemas.microsoft.com/office/drawing/2016/ink" xmlns:am3d="http://schemas.microsoft.com/office/drawing/2017/model3d" xmlns:o="urn:schemas-microsoft-com:office:office" xmlns:oel="http://schemas.microsoft.com/office/2019/extlst" xmlns:r="http://schemas.openxmlformats.org/officeDocument/2006/relationships" xmlns:m="http://schemas.openxmlformats.org/officeDocument/2006/math" xmlns:v="urn:schemas-microsoft-com:vml" xmlns:wp14="http://schemas.microsoft.com/office/word/2010/wordprocessingDrawing" xmlns:wp="http://schemas.openxmlformats.org/drawingml/2006/wordprocessingDrawing" xmlns:w10="urn:schemas-microsoft-com:office:word" xmlns:w="http://schemas.openxmlformats.org/wordprocessingml/2006/main" xmlns:w14="http://schemas.microsoft.com/office/word/2010/wordml" xmlns:w15="http://schemas.microsoft.com/office/word/2012/wordml" xmlns:w16cex="http://schemas.microsoft.com/office/word/2018/wordml/cex" xmlns:w16cid="http://schemas.microsoft.com/office/word/2016/wordml/cid" xmlns:w16="http://schemas.microsoft.com/office/word/2018/wordml" xmlns:w16sdtdh="http://schemas.microsoft.com/office/word/2020/wordml/sdtdatahash" xmlns:w16se="http://schemas.microsoft.com/office/word/2015/wordml/symex" xmlns:wpg="http://schemas.microsoft.com/office/word/2010/wordprocessingGroup" xmlns:wpi="http://schemas.microsoft.com/office/word/2010/wordprocessingInk" xmlns:wne="http://schemas.microsoft.com/office/word/2006/wordml" xmlns:wps="http://schemas.microsoft.com/office/word/2010/wordprocessingShape" mc:Ignorable="w14 w15 w16se w16cid w16 w16cex w16sdtdh wp14">
+<w:document xmlns:wpc="http://schemas.microsoft.com/office/word/2010/wordprocessingCanvas" xmlns:cx="http://schemas.microsoft.com/office/drawing/2014/chartex" xmlns:cx1="http://schemas.microsoft.com/office/drawing/2015/9/8/chartex" xmlns:cx2="http://schemas.microsoft.com/office/drawing/2015/10/21/chartex" xmlns:cx3="http://schemas.microsoft.com/office/drawing/2016/5/9/chartex" xmlns:cx4="http://schemas.microsoft.com/office/drawing/2016/5/10/chartex" xmlns:cx5="http://schemas.microsoft.com/office/drawing/2016/5/11/chartex" xmlns:cx6="http://schemas.microsoft.com/office/drawing/2016/5/12/chartex" xmlns:cx7="http://schemas.microsoft.com/office/drawing/2016/5/13/chartex" xmlns:cx8="http://schemas.microsoft.com/office/drawing/2016/5/14/chartex" xmlns:mc="http://schemas.openxmlformats.org/markup-compatibility/2006" xmlns:aink="http://schemas.microsoft.com/office/drawing/2016/ink" xmlns:am3d="http://schemas.microsoft.com/office/drawing/2017/model3d" xmlns:o="urn:schemas-microsoft-com:office:office" xmlns:oel="http://schemas.microsoft.com/office/2019/extlst" xmlns:r="http://schemas.openxmlformats.org/officeDocument/2006/relationships" xmlns:m="http://schemas.openxmlformats.org/officeDocument/2006/math" xmlns:v="urn:schemas-microsoft-com:vml" xmlns:wp14="http://schemas.microsoft.com/office/word/2010/wordprocessingDrawing" xmlns:wp="http://schemas.openxmlformats.org/drawingml/2006/wordprocessingDrawing" xmlns:w10="urn:schemas-microsoft-com:office:word" xmlns:w="http://schemas.openxmlformats.org/wordprocessingml/2006/main" xmlns:w14="http://schemas.microsoft.com/office/word/2010/wordml" xmlns:w15="http://schemas.microsoft.com/office/word/2012/wordml" xmlns:w16cex="http://schemas.microsoft.com/office/word/2018/wordml/cex" xmlns:w16cid="http://schemas.microsoft.com/office/word/2016/wordml/cid" xmlns:w16="http://schemas.microsoft.com/office/word/2018/wordml" xmlns:w16du="http://schemas.microsoft.com/office/word/2023/wordml/word16du" xmlns:w16sdtdh="http://schemas.microsoft.com/office/word/2020/wordml/sdtdatahash" xmlns:w16se="http://schemas.microsoft.com/office/word/2015/wordml/symex" xmlns:wpg="http://schemas.microsoft.com/office/word/2010/wordprocessingGroup" xmlns:wpi="http://schemas.microsoft.com/office/word/2010/wordprocessingInk" xmlns:wne="http://schemas.microsoft.com/office/word/2006/wordml" xmlns:wps="http://schemas.microsoft.com/office/word/2010/wordprocessingShape" mc:Ignorable="w14 w15 w16se w16cid w16 w16cex w16sdtdh w16du wp14">
   <w:body>
     <w:p>
       <w:pPr>
-        <w:pStyle w:val="Heading1"/>
+        <w:pStyle w:val="Ttulo1"/>
         <w:jc w:val="center"/>
       </w:pPr>
       <w:bookmarkStart w:id="0" w:name="_Toc240009152"/>
@@ -24,7 +24,7 @@
           <w:noProof/>
         </w:rPr>
         <w:drawing>
-          <wp:inline distT="0" distB="0" distL="0" distR="0" wp14:anchorId="57ECA46B" wp14:editId="6ABE7FE1">
+          <wp:inline distT="0" distB="0" distL="0" distR="0" wp14:anchorId="34C2CCBB" wp14:editId="3034F554">
             <wp:extent cx="3105150" cy="3105150"/>
             <wp:effectExtent l="0" t="0" r="0" b="0"/>
             <wp:docPr id="1874544545" name="Imagem 1" descr="Ícone do aplicativo SoulPass. Contém o simbolo de um ónibus e uma escrita &quot;Pass&quot; no meio"/>
@@ -194,6 +194,11 @@
       <w:pPr>
         <w:jc w:val="center"/>
       </w:pPr>
+    </w:p>
+    <w:p>
+      <w:pPr>
+        <w:jc w:val="center"/>
+      </w:pPr>
       <w:r>
         <w:t>Solução:</w:t>
       </w:r>
@@ -230,11 +235,10 @@
     <w:p/>
     <w:p>
       <w:pPr>
-        <w:pStyle w:val="Heading1"/>
+        <w:pStyle w:val="Ttulo1"/>
       </w:pPr>
       <w:bookmarkStart w:id="1" w:name="_Toc240009153"/>
       <w:r>
-        <w:lastRenderedPageBreak/>
         <w:t>Sumário</w:t>
       </w:r>
       <w:bookmarkEnd w:id="1"/>
@@ -266,7 +270,7 @@
       <w:sdtContent>
         <w:p>
           <w:pPr>
-            <w:pStyle w:val="TOCHeading"/>
+            <w:pStyle w:val="CabealhodoSumrio"/>
             <w:spacing w:line="360" w:lineRule="auto"/>
             <w:rPr>
               <w:rFonts w:ascii="Arial" w:hAnsi="Arial" w:cs="Arial"/>
@@ -287,7 +291,7 @@
         </w:p>
         <w:p>
           <w:pPr>
-            <w:pStyle w:val="TOC1"/>
+            <w:pStyle w:val="Sumrio1"/>
             <w:tabs>
               <w:tab w:val="right" w:leader="dot" w:pos="8494"/>
             </w:tabs>
@@ -364,7 +368,7 @@
         </w:p>
         <w:p>
           <w:pPr>
-            <w:pStyle w:val="TOC1"/>
+            <w:pStyle w:val="Sumrio1"/>
             <w:tabs>
               <w:tab w:val="right" w:leader="dot" w:pos="8494"/>
             </w:tabs>
@@ -432,7 +436,7 @@
         </w:p>
         <w:p>
           <w:pPr>
-            <w:pStyle w:val="TOC1"/>
+            <w:pStyle w:val="Sumrio1"/>
             <w:tabs>
               <w:tab w:val="right" w:leader="dot" w:pos="8494"/>
             </w:tabs>
@@ -500,7 +504,7 @@
         </w:p>
         <w:p>
           <w:pPr>
-            <w:pStyle w:val="TOC2"/>
+            <w:pStyle w:val="Sumrio2"/>
             <w:tabs>
               <w:tab w:val="right" w:leader="dot" w:pos="8494"/>
             </w:tabs>
@@ -568,7 +572,7 @@
         </w:p>
         <w:p>
           <w:pPr>
-            <w:pStyle w:val="TOC2"/>
+            <w:pStyle w:val="Sumrio2"/>
             <w:tabs>
               <w:tab w:val="right" w:leader="dot" w:pos="8494"/>
             </w:tabs>
@@ -636,7 +640,7 @@
         </w:p>
         <w:p>
           <w:pPr>
-            <w:pStyle w:val="TOC3"/>
+            <w:pStyle w:val="Sumrio3"/>
             <w:tabs>
               <w:tab w:val="right" w:leader="dot" w:pos="8494"/>
             </w:tabs>
@@ -704,7 +708,7 @@
         </w:p>
         <w:p>
           <w:pPr>
-            <w:pStyle w:val="TOC3"/>
+            <w:pStyle w:val="Sumrio3"/>
             <w:tabs>
               <w:tab w:val="right" w:leader="dot" w:pos="8494"/>
             </w:tabs>
@@ -772,7 +776,7 @@
         </w:p>
         <w:p>
           <w:pPr>
-            <w:pStyle w:val="TOC1"/>
+            <w:pStyle w:val="Sumrio1"/>
             <w:tabs>
               <w:tab w:val="right" w:leader="dot" w:pos="8494"/>
             </w:tabs>
@@ -841,7 +845,7 @@
         </w:p>
         <w:p>
           <w:pPr>
-            <w:pStyle w:val="TOC1"/>
+            <w:pStyle w:val="Sumrio1"/>
             <w:tabs>
               <w:tab w:val="right" w:leader="dot" w:pos="8494"/>
             </w:tabs>
@@ -909,7 +913,7 @@
         </w:p>
         <w:p>
           <w:pPr>
-            <w:pStyle w:val="TOC1"/>
+            <w:pStyle w:val="Sumrio1"/>
             <w:tabs>
               <w:tab w:val="right" w:leader="dot" w:pos="8494"/>
             </w:tabs>
@@ -977,7 +981,7 @@
         </w:p>
         <w:p>
           <w:pPr>
-            <w:pStyle w:val="TOC1"/>
+            <w:pStyle w:val="Sumrio1"/>
             <w:tabs>
               <w:tab w:val="right" w:leader="dot" w:pos="8494"/>
             </w:tabs>
@@ -1070,10 +1074,9 @@
     <w:p/>
     <w:p>
       <w:pPr>
-        <w:pStyle w:val="Heading1"/>
-      </w:pPr>
-      <w:r>
-        <w:lastRenderedPageBreak/>
+        <w:pStyle w:val="Ttulo1"/>
+      </w:pPr>
+      <w:r>
         <w:t xml:space="preserve">1. </w:t>
       </w:r>
       <w:r>
@@ -1083,7 +1086,7 @@
     </w:p>
     <w:p>
       <w:pPr>
-        <w:pStyle w:val="Heading2"/>
+        <w:pStyle w:val="Ttulo2"/>
       </w:pPr>
       <w:bookmarkStart w:id="3" w:name="_Toc240009155"/>
       <w:r>
@@ -1766,17 +1769,16 @@
     <w:p/>
     <w:p>
       <w:pPr>
-        <w:pStyle w:val="Heading2"/>
-      </w:pPr>
-      <w:r>
-        <w:lastRenderedPageBreak/>
+        <w:pStyle w:val="Ttulo2"/>
+      </w:pPr>
+      <w:r>
         <w:t>1.2. O Escopo desse projeto</w:t>
       </w:r>
       <w:bookmarkEnd w:id="4"/>
     </w:p>
     <w:p>
       <w:pPr>
-        <w:pStyle w:val="Heading3"/>
+        <w:pStyle w:val="Ttulo3"/>
       </w:pPr>
       <w:bookmarkStart w:id="5" w:name="_Toc240009157"/>
       <w:r>
@@ -1786,7 +1788,7 @@
     </w:p>
     <w:p>
       <w:pPr>
-        <w:pStyle w:val="ListParagraph"/>
+        <w:pStyle w:val="PargrafodaLista"/>
         <w:numPr>
           <w:ilvl w:val="0"/>
           <w:numId w:val="5"/>
@@ -1801,7 +1803,7 @@
     </w:p>
     <w:p>
       <w:pPr>
-        <w:pStyle w:val="ListParagraph"/>
+        <w:pStyle w:val="PargrafodaLista"/>
         <w:numPr>
           <w:ilvl w:val="0"/>
           <w:numId w:val="5"/>
@@ -1823,7 +1825,7 @@
     </w:p>
     <w:p>
       <w:pPr>
-        <w:pStyle w:val="ListParagraph"/>
+        <w:pStyle w:val="PargrafodaLista"/>
         <w:numPr>
           <w:ilvl w:val="0"/>
           <w:numId w:val="5"/>
@@ -1841,7 +1843,7 @@
     </w:p>
     <w:p>
       <w:pPr>
-        <w:pStyle w:val="ListParagraph"/>
+        <w:pStyle w:val="PargrafodaLista"/>
         <w:numPr>
           <w:ilvl w:val="0"/>
           <w:numId w:val="5"/>
@@ -1859,7 +1861,7 @@
     </w:p>
     <w:p>
       <w:pPr>
-        <w:pStyle w:val="ListParagraph"/>
+        <w:pStyle w:val="PargrafodaLista"/>
         <w:numPr>
           <w:ilvl w:val="0"/>
           <w:numId w:val="5"/>
@@ -1874,7 +1876,7 @@
     </w:p>
     <w:p>
       <w:pPr>
-        <w:pStyle w:val="ListParagraph"/>
+        <w:pStyle w:val="PargrafodaLista"/>
         <w:numPr>
           <w:ilvl w:val="0"/>
           <w:numId w:val="5"/>
@@ -1889,7 +1891,7 @@
     </w:p>
     <w:p>
       <w:pPr>
-        <w:pStyle w:val="ListParagraph"/>
+        <w:pStyle w:val="PargrafodaLista"/>
         <w:numPr>
           <w:ilvl w:val="0"/>
           <w:numId w:val="5"/>
@@ -1901,7 +1903,7 @@
     </w:p>
     <w:p>
       <w:pPr>
-        <w:pStyle w:val="ListParagraph"/>
+        <w:pStyle w:val="PargrafodaLista"/>
         <w:numPr>
           <w:ilvl w:val="0"/>
           <w:numId w:val="5"/>
@@ -1913,7 +1915,7 @@
     </w:p>
     <w:p>
       <w:pPr>
-        <w:pStyle w:val="ListParagraph"/>
+        <w:pStyle w:val="PargrafodaLista"/>
         <w:numPr>
           <w:ilvl w:val="0"/>
           <w:numId w:val="5"/>
@@ -1925,7 +1927,7 @@
     </w:p>
     <w:p>
       <w:pPr>
-        <w:pStyle w:val="ListParagraph"/>
+        <w:pStyle w:val="PargrafodaLista"/>
         <w:numPr>
           <w:ilvl w:val="0"/>
           <w:numId w:val="5"/>
@@ -1949,7 +1951,7 @@
     </w:p>
     <w:p>
       <w:pPr>
-        <w:pStyle w:val="ListParagraph"/>
+        <w:pStyle w:val="PargrafodaLista"/>
         <w:numPr>
           <w:ilvl w:val="0"/>
           <w:numId w:val="5"/>
@@ -1973,7 +1975,7 @@
     </w:p>
     <w:p>
       <w:pPr>
-        <w:pStyle w:val="ListParagraph"/>
+        <w:pStyle w:val="PargrafodaLista"/>
         <w:numPr>
           <w:ilvl w:val="0"/>
           <w:numId w:val="5"/>
@@ -1992,7 +1994,7 @@
     </w:p>
     <w:p>
       <w:pPr>
-        <w:pStyle w:val="ListParagraph"/>
+        <w:pStyle w:val="PargrafodaLista"/>
         <w:numPr>
           <w:ilvl w:val="0"/>
           <w:numId w:val="5"/>
@@ -2004,7 +2006,7 @@
     </w:p>
     <w:p>
       <w:pPr>
-        <w:pStyle w:val="ListParagraph"/>
+        <w:pStyle w:val="PargrafodaLista"/>
         <w:numPr>
           <w:ilvl w:val="0"/>
           <w:numId w:val="5"/>
@@ -2023,7 +2025,7 @@
     </w:p>
     <w:p>
       <w:pPr>
-        <w:pStyle w:val="ListParagraph"/>
+        <w:pStyle w:val="PargrafodaLista"/>
         <w:numPr>
           <w:ilvl w:val="0"/>
           <w:numId w:val="5"/>
@@ -2035,7 +2037,7 @@
     </w:p>
     <w:p>
       <w:pPr>
-        <w:pStyle w:val="ListParagraph"/>
+        <w:pStyle w:val="PargrafodaLista"/>
         <w:numPr>
           <w:ilvl w:val="0"/>
           <w:numId w:val="5"/>
@@ -2050,7 +2052,7 @@
     </w:p>
     <w:p>
       <w:pPr>
-        <w:pStyle w:val="ListParagraph"/>
+        <w:pStyle w:val="PargrafodaLista"/>
         <w:numPr>
           <w:ilvl w:val="0"/>
           <w:numId w:val="5"/>
@@ -2062,7 +2064,7 @@
     </w:p>
     <w:p>
       <w:pPr>
-        <w:pStyle w:val="ListParagraph"/>
+        <w:pStyle w:val="PargrafodaLista"/>
         <w:numPr>
           <w:ilvl w:val="0"/>
           <w:numId w:val="5"/>
@@ -2077,7 +2079,7 @@
     </w:p>
     <w:p>
       <w:pPr>
-        <w:pStyle w:val="ListParagraph"/>
+        <w:pStyle w:val="PargrafodaLista"/>
         <w:numPr>
           <w:ilvl w:val="0"/>
           <w:numId w:val="5"/>
@@ -2089,7 +2091,7 @@
     </w:p>
     <w:p>
       <w:pPr>
-        <w:pStyle w:val="ListParagraph"/>
+        <w:pStyle w:val="PargrafodaLista"/>
         <w:numPr>
           <w:ilvl w:val="0"/>
           <w:numId w:val="5"/>
@@ -2101,7 +2103,7 @@
     </w:p>
     <w:p>
       <w:pPr>
-        <w:pStyle w:val="Heading3"/>
+        <w:pStyle w:val="Ttulo3"/>
       </w:pPr>
       <w:bookmarkStart w:id="6" w:name="_Toc240009158"/>
       <w:r>
@@ -2111,7 +2113,7 @@
     </w:p>
     <w:p>
       <w:pPr>
-        <w:pStyle w:val="ListParagraph"/>
+        <w:pStyle w:val="PargrafodaLista"/>
         <w:numPr>
           <w:ilvl w:val="0"/>
           <w:numId w:val="6"/>
@@ -2142,7 +2144,7 @@
     </w:p>
     <w:p>
       <w:pPr>
-        <w:pStyle w:val="ListParagraph"/>
+        <w:pStyle w:val="PargrafodaLista"/>
         <w:numPr>
           <w:ilvl w:val="0"/>
           <w:numId w:val="6"/>
@@ -2161,37 +2163,3125 @@
       </w:r>
     </w:p>
     <w:p>
+      <w:pPr>
+        <w:pStyle w:val="Ttulo2"/>
+        <w:keepNext/>
+      </w:pPr>
+      <w:r>
+        <w:lastRenderedPageBreak/>
+        <w:t>1.3. Principais funcionalidades da solução</w:t>
+      </w:r>
+    </w:p>
+    <w:p>
+      <w:pPr>
+        <w:pStyle w:val="PargrafodaLista"/>
+        <w:numPr>
+          <w:ilvl w:val="0"/>
+          <w:numId w:val="5"/>
+        </w:numPr>
+      </w:pPr>
+      <w:r>
+        <w:rPr>
+          <w:b/>
+          <w:bCs/>
+        </w:rPr>
+        <w:t xml:space="preserve">Cadastro, login e recuperação de senha: </w:t>
+      </w:r>
+      <w:r>
+        <w:t>o cadastro do usuário já cria, automaticamente, a conta de pontos vinculada a ele. A senha nunca é devolvida nas respostas da API.</w:t>
+      </w:r>
+    </w:p>
+    <w:p>
+      <w:pPr>
+        <w:pStyle w:val="PargrafodaLista"/>
+        <w:numPr>
+          <w:ilvl w:val="0"/>
+          <w:numId w:val="5"/>
+        </w:numPr>
+      </w:pPr>
+      <w:r>
+        <w:rPr>
+          <w:b/>
+          <w:bCs/>
+        </w:rPr>
+        <w:t xml:space="preserve">Visão geral da conta: </w:t>
+      </w:r>
+      <w:r>
+        <w:t>saldo de pontos, equivalência em reais, crédito disponível no bilhete, distância percorrida nos últimos 7 dias, meta diária de 6 km e últimas atividades.</w:t>
+      </w:r>
+    </w:p>
+    <w:p>
+      <w:pPr>
+        <w:pStyle w:val="PargrafodaLista"/>
+        <w:numPr>
+          <w:ilvl w:val="0"/>
+          <w:numId w:val="5"/>
+        </w:numPr>
+      </w:pPr>
+      <w:r>
+        <w:rPr>
+          <w:b/>
+          <w:bCs/>
+        </w:rPr>
+        <w:t xml:space="preserve">Caminhadas: </w:t>
+      </w:r>
+      <w:r>
+        <w:t>cada deslocamento registrado rende 40 pontos a cada 2 km (até 6 km por caminhada), respeitando o limite de 120 pontos por dia, com listagem do histórico de caminhadas.</w:t>
+      </w:r>
+    </w:p>
+    <w:p>
+      <w:pPr>
+        <w:pStyle w:val="PargrafodaLista"/>
+        <w:numPr>
+          <w:ilvl w:val="0"/>
+          <w:numId w:val="5"/>
+        </w:numPr>
+      </w:pPr>
+      <w:r>
+        <w:rPr>
+          <w:b/>
+          <w:bCs/>
+        </w:rPr>
+        <w:t xml:space="preserve">Conversão de pontos em crédito: </w:t>
+      </w:r>
+      <w:r>
+        <w:t>110 pontos equivalem a R$ 1,00. O usuário pode simular a conversão antes de confirmá-la, e o crédito é somado ao saldo do bilhete único.</w:t>
+      </w:r>
+    </w:p>
+    <w:p>
+      <w:pPr>
+        <w:pStyle w:val="PargrafodaLista"/>
+        <w:numPr>
+          <w:ilvl w:val="0"/>
+          <w:numId w:val="5"/>
+        </w:numPr>
+      </w:pPr>
+      <w:r>
+        <w:rPr>
+          <w:b/>
+          <w:bCs/>
+        </w:rPr>
+        <w:t xml:space="preserve">Bilhete único: </w:t>
+      </w:r>
+      <w:r>
+        <w:t>cadastro de bilhete com número de 9 dígitos vinculado ao usuário, consulta de crédito e manutenção dos dados.</w:t>
+      </w:r>
+    </w:p>
+    <w:p>
+      <w:pPr>
+        <w:pStyle w:val="PargrafodaLista"/>
+        <w:numPr>
+          <w:ilvl w:val="0"/>
+          <w:numId w:val="5"/>
+        </w:numPr>
+      </w:pPr>
+      <w:r>
+        <w:rPr>
+          <w:b/>
+          <w:bCs/>
+        </w:rPr>
+        <w:t xml:space="preserve">Histórico de pontos: </w:t>
+      </w:r>
+      <w:r>
+        <w:t>registro de todos os pontos ganhos por caminhada, com totais e filtro por origem.</w:t>
+      </w:r>
+    </w:p>
+    <w:p>
+      <w:pPr>
+        <w:pStyle w:val="PargrafodaLista"/>
+        <w:numPr>
+          <w:ilvl w:val="0"/>
+          <w:numId w:val="5"/>
+        </w:numPr>
+      </w:pPr>
+      <w:r>
+        <w:rPr>
+          <w:b/>
+          <w:bCs/>
+        </w:rPr>
+        <w:t xml:space="preserve">Respostas padronizadas: </w:t>
+      </w:r>
+      <w:r>
+        <w:t>a API devolve códigos HTTP adequados (400, 401, 404, 409 e 500) acompanhados de uma mensagem explicando o erro.</w:t>
+      </w:r>
+    </w:p>
+    <w:p>
       <w:bookmarkStart w:id="7" w:name="_Toc240009159"/>
     </w:p>
     <w:p/>
     <w:p>
       <w:pPr>
-        <w:pStyle w:val="Heading1"/>
-      </w:pPr>
-      <w:r>
+        <w:pStyle w:val="Ttulo1"/>
+      </w:pPr>
+      <w:r>
+        <w:t xml:space="preserve">2. Tabela de </w:t>
+      </w:r>
+      <w:proofErr w:type="spellStart"/>
+      <w:r>
+        <w:t>Endpoints</w:t>
+      </w:r>
+      <w:proofErr w:type="spellEnd"/>
+      <w:r>
+        <w:t xml:space="preserve"> (API </w:t>
+      </w:r>
+      <w:proofErr w:type="spellStart"/>
+      <w:r>
+        <w:t>RESTful</w:t>
+      </w:r>
+      <w:proofErr w:type="spellEnd"/>
+      <w:r>
+        <w:t>)</w:t>
+      </w:r>
+    </w:p>
+    <w:p/>
+    <w:tbl>
+      <w:tblPr>
+        <w:tblW w:w="8504" w:type="dxa"/>
+        <w:tblBorders>
+          <w:top w:val="single" w:sz="4" w:space="0" w:color="808080"/>
+          <w:left w:val="single" w:sz="4" w:space="0" w:color="808080"/>
+          <w:bottom w:val="single" w:sz="4" w:space="0" w:color="808080"/>
+          <w:right w:val="single" w:sz="4" w:space="0" w:color="808080"/>
+          <w:insideH w:val="single" w:sz="4" w:space="0" w:color="808080"/>
+          <w:insideV w:val="single" w:sz="4" w:space="0" w:color="808080"/>
+        </w:tblBorders>
+        <w:tblLayout w:type="fixed"/>
+        <w:tblCellMar>
+          <w:left w:w="80" w:type="dxa"/>
+          <w:right w:w="80" w:type="dxa"/>
+        </w:tblCellMar>
+        <w:tblLook w:val="04A0" w:firstRow="1" w:lastRow="0" w:firstColumn="1" w:lastColumn="0" w:noHBand="0" w:noVBand="1"/>
+      </w:tblPr>
+      <w:tblGrid>
+        <w:gridCol w:w="1000"/>
+        <w:gridCol w:w="2750"/>
+        <w:gridCol w:w="3000"/>
+        <w:gridCol w:w="1754"/>
+      </w:tblGrid>
+      <w:tr>
+        <w:trPr>
+          <w:cantSplit/>
+          <w:tblHeader/>
+        </w:trPr>
+        <w:tc>
+          <w:tcPr>
+            <w:tcW w:w="1000" w:type="dxa"/>
+            <w:shd w:val="clear" w:color="auto" w:fill="D9D9D9"/>
+            <w:vAlign w:val="center"/>
+          </w:tcPr>
+          <w:p>
+            <w:pPr>
+              <w:keepNext/>
+              <w:spacing w:before="40" w:after="40" w:line="240" w:lineRule="auto"/>
+              <w:jc w:val="left"/>
+            </w:pPr>
+            <w:r>
+              <w:rPr>
+                <w:b/>
+                <w:bCs/>
+                <w:sz w:val="18"/>
+                <w:szCs w:val="18"/>
+              </w:rPr>
+              <w:t>Verbo</w:t>
+            </w:r>
+          </w:p>
+        </w:tc>
+        <w:tc>
+          <w:tcPr>
+            <w:tcW w:w="2750" w:type="dxa"/>
+            <w:shd w:val="clear" w:color="auto" w:fill="D9D9D9"/>
+            <w:vAlign w:val="center"/>
+          </w:tcPr>
+          <w:p>
+            <w:pPr>
+              <w:keepNext/>
+              <w:spacing w:before="40" w:after="40" w:line="240" w:lineRule="auto"/>
+              <w:jc w:val="left"/>
+            </w:pPr>
+            <w:r>
+              <w:rPr>
+                <w:b/>
+                <w:bCs/>
+                <w:sz w:val="18"/>
+                <w:szCs w:val="18"/>
+              </w:rPr>
+              <w:t>URI</w:t>
+            </w:r>
+          </w:p>
+        </w:tc>
+        <w:tc>
+          <w:tcPr>
+            <w:tcW w:w="3000" w:type="dxa"/>
+            <w:shd w:val="clear" w:color="auto" w:fill="D9D9D9"/>
+            <w:vAlign w:val="center"/>
+          </w:tcPr>
+          <w:p>
+            <w:pPr>
+              <w:keepNext/>
+              <w:spacing w:before="40" w:after="40" w:line="240" w:lineRule="auto"/>
+              <w:jc w:val="left"/>
+            </w:pPr>
+            <w:r>
+              <w:rPr>
+                <w:b/>
+                <w:bCs/>
+                <w:sz w:val="18"/>
+                <w:szCs w:val="18"/>
+              </w:rPr>
+              <w:t>Descrição</w:t>
+            </w:r>
+          </w:p>
+        </w:tc>
+        <w:tc>
+          <w:tcPr>
+            <w:tcW w:w="1754" w:type="dxa"/>
+            <w:shd w:val="clear" w:color="auto" w:fill="D9D9D9"/>
+            <w:vAlign w:val="center"/>
+          </w:tcPr>
+          <w:p>
+            <w:pPr>
+              <w:keepNext/>
+              <w:spacing w:before="40" w:after="40" w:line="240" w:lineRule="auto"/>
+              <w:jc w:val="left"/>
+            </w:pPr>
+            <w:r>
+              <w:rPr>
+                <w:b/>
+                <w:bCs/>
+                <w:sz w:val="18"/>
+                <w:szCs w:val="18"/>
+              </w:rPr>
+              <w:t>Status esperados</w:t>
+            </w:r>
+          </w:p>
+        </w:tc>
+      </w:tr>
+      <w:tr>
+        <w:trPr>
+          <w:cantSplit/>
+        </w:trPr>
+        <w:tc>
+          <w:tcPr>
+            <w:tcW w:w="8504" w:type="dxa"/>
+            <w:gridSpan w:val="4"/>
+            <w:shd w:val="clear" w:color="auto" w:fill="F2F2F2"/>
+            <w:vAlign w:val="center"/>
+          </w:tcPr>
+          <w:p>
+            <w:pPr>
+              <w:keepNext/>
+              <w:spacing w:before="40" w:after="40" w:line="240" w:lineRule="auto"/>
+              <w:jc w:val="left"/>
+            </w:pPr>
+            <w:r>
+              <w:rPr>
+                <w:b/>
+                <w:bCs/>
+                <w:sz w:val="18"/>
+                <w:szCs w:val="18"/>
+              </w:rPr>
+              <w:t>Usuários – /usuarios (telas de cadastro, login e Meu perfil)</w:t>
+            </w:r>
+          </w:p>
+        </w:tc>
+      </w:tr>
+      <w:tr>
+        <w:trPr>
+          <w:cantSplit/>
+        </w:trPr>
+        <w:tc>
+          <w:tcPr>
+            <w:tcW w:w="1000" w:type="dxa"/>
+            <w:vAlign w:val="center"/>
+          </w:tcPr>
+          <w:p>
+            <w:pPr>
+              <w:spacing w:before="40" w:after="40" w:line="240" w:lineRule="auto"/>
+              <w:jc w:val="left"/>
+            </w:pPr>
+            <w:r>
+              <w:rPr>
+                <w:b/>
+                <w:bCs/>
+                <w:sz w:val="18"/>
+                <w:szCs w:val="18"/>
+              </w:rPr>
+              <w:t>POST</w:t>
+            </w:r>
+          </w:p>
+        </w:tc>
+        <w:tc>
+          <w:tcPr>
+            <w:tcW w:w="2750" w:type="dxa"/>
+            <w:vAlign w:val="center"/>
+          </w:tcPr>
+          <w:p>
+            <w:pPr>
+              <w:spacing w:before="40" w:after="40" w:line="240" w:lineRule="auto"/>
+              <w:jc w:val="left"/>
+            </w:pPr>
+            <w:r>
+              <w:rPr>
+                <w:sz w:val="18"/>
+                <w:szCs w:val="18"/>
+              </w:rPr>
+              <w:t>/usuarios</w:t>
+            </w:r>
+          </w:p>
+        </w:tc>
+        <w:tc>
+          <w:tcPr>
+            <w:tcW w:w="3000" w:type="dxa"/>
+            <w:vAlign w:val="center"/>
+          </w:tcPr>
+          <w:p>
+            <w:pPr>
+              <w:spacing w:before="40" w:after="40" w:line="240" w:lineRule="auto"/>
+              <w:jc w:val="left"/>
+            </w:pPr>
+            <w:r>
+              <w:rPr>
+                <w:sz w:val="18"/>
+                <w:szCs w:val="18"/>
+              </w:rPr>
+              <w:t>Cadastra o usuário e cria sua conta. Corpo: nome, idade, cpf, email, senha.</w:t>
+            </w:r>
+          </w:p>
+        </w:tc>
+        <w:tc>
+          <w:tcPr>
+            <w:tcW w:w="1754" w:type="dxa"/>
+            <w:vAlign w:val="center"/>
+          </w:tcPr>
+          <w:p>
+            <w:pPr>
+              <w:spacing w:before="40" w:after="40" w:line="240" w:lineRule="auto"/>
+              <w:jc w:val="left"/>
+            </w:pPr>
+            <w:r>
+              <w:rPr>
+                <w:sz w:val="18"/>
+                <w:szCs w:val="18"/>
+              </w:rPr>
+              <w:t>201, 400, 409, 500</w:t>
+            </w:r>
+          </w:p>
+        </w:tc>
+      </w:tr>
+      <w:tr>
+        <w:trPr>
+          <w:cantSplit/>
+        </w:trPr>
+        <w:tc>
+          <w:tcPr>
+            <w:tcW w:w="1000" w:type="dxa"/>
+            <w:vAlign w:val="center"/>
+          </w:tcPr>
+          <w:p>
+            <w:pPr>
+              <w:spacing w:before="40" w:after="40" w:line="240" w:lineRule="auto"/>
+              <w:jc w:val="left"/>
+            </w:pPr>
+            <w:r>
+              <w:rPr>
+                <w:b/>
+                <w:bCs/>
+                <w:sz w:val="18"/>
+                <w:szCs w:val="18"/>
+              </w:rPr>
+              <w:t>POST</w:t>
+            </w:r>
+          </w:p>
+        </w:tc>
+        <w:tc>
+          <w:tcPr>
+            <w:tcW w:w="2750" w:type="dxa"/>
+            <w:vAlign w:val="center"/>
+          </w:tcPr>
+          <w:p>
+            <w:pPr>
+              <w:spacing w:before="40" w:after="40" w:line="240" w:lineRule="auto"/>
+              <w:jc w:val="left"/>
+            </w:pPr>
+            <w:r>
+              <w:rPr>
+                <w:sz w:val="18"/>
+                <w:szCs w:val="18"/>
+              </w:rPr>
+              <w:t>/usuarios/login</w:t>
+            </w:r>
+          </w:p>
+        </w:tc>
+        <w:tc>
+          <w:tcPr>
+            <w:tcW w:w="3000" w:type="dxa"/>
+            <w:vAlign w:val="center"/>
+          </w:tcPr>
+          <w:p>
+            <w:pPr>
+              <w:spacing w:before="40" w:after="40" w:line="240" w:lineRule="auto"/>
+              <w:jc w:val="left"/>
+            </w:pPr>
+            <w:r>
+              <w:rPr>
+                <w:sz w:val="18"/>
+                <w:szCs w:val="18"/>
+              </w:rPr>
+              <w:t>Realiza o login. Corpo: email, senha. Retorna usuário e conta.</w:t>
+            </w:r>
+          </w:p>
+        </w:tc>
+        <w:tc>
+          <w:tcPr>
+            <w:tcW w:w="1754" w:type="dxa"/>
+            <w:vAlign w:val="center"/>
+          </w:tcPr>
+          <w:p>
+            <w:pPr>
+              <w:spacing w:before="40" w:after="40" w:line="240" w:lineRule="auto"/>
+              <w:jc w:val="left"/>
+            </w:pPr>
+            <w:r>
+              <w:rPr>
+                <w:sz w:val="18"/>
+                <w:szCs w:val="18"/>
+              </w:rPr>
+              <w:t>200, 400, 401, 404, 500</w:t>
+            </w:r>
+          </w:p>
+        </w:tc>
+      </w:tr>
+      <w:tr>
+        <w:trPr>
+          <w:cantSplit/>
+        </w:trPr>
+        <w:tc>
+          <w:tcPr>
+            <w:tcW w:w="1000" w:type="dxa"/>
+            <w:vAlign w:val="center"/>
+          </w:tcPr>
+          <w:p>
+            <w:pPr>
+              <w:spacing w:before="40" w:after="40" w:line="240" w:lineRule="auto"/>
+              <w:jc w:val="left"/>
+            </w:pPr>
+            <w:r>
+              <w:rPr>
+                <w:b/>
+                <w:bCs/>
+                <w:sz w:val="18"/>
+                <w:szCs w:val="18"/>
+              </w:rPr>
+              <w:t>PUT</w:t>
+            </w:r>
+          </w:p>
+        </w:tc>
+        <w:tc>
+          <w:tcPr>
+            <w:tcW w:w="2750" w:type="dxa"/>
+            <w:vAlign w:val="center"/>
+          </w:tcPr>
+          <w:p>
+            <w:pPr>
+              <w:spacing w:before="40" w:after="40" w:line="240" w:lineRule="auto"/>
+              <w:jc w:val="left"/>
+            </w:pPr>
+            <w:r>
+              <w:rPr>
+                <w:sz w:val="18"/>
+                <w:szCs w:val="18"/>
+              </w:rPr>
+              <w:t>/usuarios/senha</w:t>
+            </w:r>
+          </w:p>
+        </w:tc>
+        <w:tc>
+          <w:tcPr>
+            <w:tcW w:w="3000" w:type="dxa"/>
+            <w:vAlign w:val="center"/>
+          </w:tcPr>
+          <w:p>
+            <w:pPr>
+              <w:spacing w:before="40" w:after="40" w:line="240" w:lineRule="auto"/>
+              <w:jc w:val="left"/>
+            </w:pPr>
+            <w:r>
+              <w:rPr>
+                <w:sz w:val="18"/>
+                <w:szCs w:val="18"/>
+              </w:rPr>
+              <w:t>Redefine a senha. Corpo: email, novaSenha.</w:t>
+            </w:r>
+          </w:p>
+        </w:tc>
+        <w:tc>
+          <w:tcPr>
+            <w:tcW w:w="1754" w:type="dxa"/>
+            <w:vAlign w:val="center"/>
+          </w:tcPr>
+          <w:p>
+            <w:pPr>
+              <w:spacing w:before="40" w:after="40" w:line="240" w:lineRule="auto"/>
+              <w:jc w:val="left"/>
+            </w:pPr>
+            <w:r>
+              <w:rPr>
+                <w:sz w:val="18"/>
+                <w:szCs w:val="18"/>
+              </w:rPr>
+              <w:t>204, 400, 404, 500</w:t>
+            </w:r>
+          </w:p>
+        </w:tc>
+      </w:tr>
+      <w:tr>
+        <w:trPr>
+          <w:cantSplit/>
+        </w:trPr>
+        <w:tc>
+          <w:tcPr>
+            <w:tcW w:w="1000" w:type="dxa"/>
+            <w:vAlign w:val="center"/>
+          </w:tcPr>
+          <w:p>
+            <w:pPr>
+              <w:spacing w:before="40" w:after="40" w:line="240" w:lineRule="auto"/>
+              <w:jc w:val="left"/>
+            </w:pPr>
+            <w:r>
+              <w:rPr>
+                <w:b/>
+                <w:bCs/>
+                <w:sz w:val="18"/>
+                <w:szCs w:val="18"/>
+              </w:rPr>
+              <w:t>GET</w:t>
+            </w:r>
+          </w:p>
+        </w:tc>
+        <w:tc>
+          <w:tcPr>
+            <w:tcW w:w="2750" w:type="dxa"/>
+            <w:vAlign w:val="center"/>
+          </w:tcPr>
+          <w:p>
+            <w:pPr>
+              <w:spacing w:before="40" w:after="40" w:line="240" w:lineRule="auto"/>
+              <w:jc w:val="left"/>
+            </w:pPr>
+            <w:r>
+              <w:rPr>
+                <w:sz w:val="18"/>
+                <w:szCs w:val="18"/>
+              </w:rPr>
+              <w:t>/usuarios</w:t>
+            </w:r>
+          </w:p>
+        </w:tc>
+        <w:tc>
+          <w:tcPr>
+            <w:tcW w:w="3000" w:type="dxa"/>
+            <w:vAlign w:val="center"/>
+          </w:tcPr>
+          <w:p>
+            <w:pPr>
+              <w:spacing w:before="40" w:after="40" w:line="240" w:lineRule="auto"/>
+              <w:jc w:val="left"/>
+            </w:pPr>
+            <w:r>
+              <w:rPr>
+                <w:sz w:val="18"/>
+                <w:szCs w:val="18"/>
+              </w:rPr>
+              <w:t>Lista todos os usuários.</w:t>
+            </w:r>
+          </w:p>
+        </w:tc>
+        <w:tc>
+          <w:tcPr>
+            <w:tcW w:w="1754" w:type="dxa"/>
+            <w:vAlign w:val="center"/>
+          </w:tcPr>
+          <w:p>
+            <w:pPr>
+              <w:spacing w:before="40" w:after="40" w:line="240" w:lineRule="auto"/>
+              <w:jc w:val="left"/>
+            </w:pPr>
+            <w:r>
+              <w:rPr>
+                <w:sz w:val="18"/>
+                <w:szCs w:val="18"/>
+              </w:rPr>
+              <w:t>200, 500</w:t>
+            </w:r>
+          </w:p>
+        </w:tc>
+      </w:tr>
+      <w:tr>
+        <w:trPr>
+          <w:cantSplit/>
+        </w:trPr>
+        <w:tc>
+          <w:tcPr>
+            <w:tcW w:w="1000" w:type="dxa"/>
+            <w:vAlign w:val="center"/>
+          </w:tcPr>
+          <w:p>
+            <w:pPr>
+              <w:spacing w:before="40" w:after="40" w:line="240" w:lineRule="auto"/>
+              <w:jc w:val="left"/>
+            </w:pPr>
+            <w:r>
+              <w:rPr>
+                <w:b/>
+                <w:bCs/>
+                <w:sz w:val="18"/>
+                <w:szCs w:val="18"/>
+              </w:rPr>
+              <w:lastRenderedPageBreak/>
+              <w:t>GET</w:t>
+            </w:r>
+          </w:p>
+        </w:tc>
+        <w:tc>
+          <w:tcPr>
+            <w:tcW w:w="2750" w:type="dxa"/>
+            <w:vAlign w:val="center"/>
+          </w:tcPr>
+          <w:p>
+            <w:pPr>
+              <w:spacing w:before="40" w:after="40" w:line="240" w:lineRule="auto"/>
+              <w:jc w:val="left"/>
+            </w:pPr>
+            <w:r>
+              <w:rPr>
+                <w:sz w:val="18"/>
+                <w:szCs w:val="18"/>
+              </w:rPr>
+              <w:t>/usuarios/{id}</w:t>
+            </w:r>
+          </w:p>
+        </w:tc>
+        <w:tc>
+          <w:tcPr>
+            <w:tcW w:w="3000" w:type="dxa"/>
+            <w:vAlign w:val="center"/>
+          </w:tcPr>
+          <w:p>
+            <w:pPr>
+              <w:spacing w:before="40" w:after="40" w:line="240" w:lineRule="auto"/>
+              <w:jc w:val="left"/>
+            </w:pPr>
+            <w:r>
+              <w:rPr>
+                <w:sz w:val="18"/>
+                <w:szCs w:val="18"/>
+              </w:rPr>
+              <w:t>Busca um usuário pelo id.</w:t>
+            </w:r>
+          </w:p>
+        </w:tc>
+        <w:tc>
+          <w:tcPr>
+            <w:tcW w:w="1754" w:type="dxa"/>
+            <w:vAlign w:val="center"/>
+          </w:tcPr>
+          <w:p>
+            <w:pPr>
+              <w:spacing w:before="40" w:after="40" w:line="240" w:lineRule="auto"/>
+              <w:jc w:val="left"/>
+            </w:pPr>
+            <w:r>
+              <w:rPr>
+                <w:sz w:val="18"/>
+                <w:szCs w:val="18"/>
+              </w:rPr>
+              <w:t>200, 404, 500</w:t>
+            </w:r>
+          </w:p>
+        </w:tc>
+      </w:tr>
+      <w:tr>
+        <w:trPr>
+          <w:cantSplit/>
+        </w:trPr>
+        <w:tc>
+          <w:tcPr>
+            <w:tcW w:w="1000" w:type="dxa"/>
+            <w:vAlign w:val="center"/>
+          </w:tcPr>
+          <w:p>
+            <w:pPr>
+              <w:spacing w:before="40" w:after="40" w:line="240" w:lineRule="auto"/>
+              <w:jc w:val="left"/>
+            </w:pPr>
+            <w:r>
+              <w:rPr>
+                <w:b/>
+                <w:bCs/>
+                <w:sz w:val="18"/>
+                <w:szCs w:val="18"/>
+              </w:rPr>
+              <w:t>PUT</w:t>
+            </w:r>
+          </w:p>
+        </w:tc>
+        <w:tc>
+          <w:tcPr>
+            <w:tcW w:w="2750" w:type="dxa"/>
+            <w:vAlign w:val="center"/>
+          </w:tcPr>
+          <w:p>
+            <w:pPr>
+              <w:spacing w:before="40" w:after="40" w:line="240" w:lineRule="auto"/>
+              <w:jc w:val="left"/>
+            </w:pPr>
+            <w:r>
+              <w:rPr>
+                <w:sz w:val="18"/>
+                <w:szCs w:val="18"/>
+              </w:rPr>
+              <w:t>/usuarios/{id}</w:t>
+            </w:r>
+          </w:p>
+        </w:tc>
+        <w:tc>
+          <w:tcPr>
+            <w:tcW w:w="3000" w:type="dxa"/>
+            <w:vAlign w:val="center"/>
+          </w:tcPr>
+          <w:p>
+            <w:pPr>
+              <w:spacing w:before="40" w:after="40" w:line="240" w:lineRule="auto"/>
+              <w:jc w:val="left"/>
+            </w:pPr>
+            <w:r>
+              <w:rPr>
+                <w:sz w:val="18"/>
+                <w:szCs w:val="18"/>
+              </w:rPr>
+              <w:t>Atualiza nome, idade e CPF do usuário.</w:t>
+            </w:r>
+          </w:p>
+        </w:tc>
+        <w:tc>
+          <w:tcPr>
+            <w:tcW w:w="1754" w:type="dxa"/>
+            <w:vAlign w:val="center"/>
+          </w:tcPr>
+          <w:p>
+            <w:pPr>
+              <w:spacing w:before="40" w:after="40" w:line="240" w:lineRule="auto"/>
+              <w:jc w:val="left"/>
+            </w:pPr>
+            <w:r>
+              <w:rPr>
+                <w:sz w:val="18"/>
+                <w:szCs w:val="18"/>
+              </w:rPr>
+              <w:t>200, 400, 404, 500</w:t>
+            </w:r>
+          </w:p>
+        </w:tc>
+      </w:tr>
+      <w:tr>
+        <w:trPr>
+          <w:cantSplit/>
+        </w:trPr>
+        <w:tc>
+          <w:tcPr>
+            <w:tcW w:w="1000" w:type="dxa"/>
+            <w:vAlign w:val="center"/>
+          </w:tcPr>
+          <w:p>
+            <w:pPr>
+              <w:spacing w:before="40" w:after="40" w:line="240" w:lineRule="auto"/>
+              <w:jc w:val="left"/>
+            </w:pPr>
+            <w:r>
+              <w:rPr>
+                <w:b/>
+                <w:bCs/>
+                <w:sz w:val="18"/>
+                <w:szCs w:val="18"/>
+              </w:rPr>
+              <w:t>DELETE</w:t>
+            </w:r>
+          </w:p>
+        </w:tc>
+        <w:tc>
+          <w:tcPr>
+            <w:tcW w:w="2750" w:type="dxa"/>
+            <w:vAlign w:val="center"/>
+          </w:tcPr>
+          <w:p>
+            <w:pPr>
+              <w:spacing w:before="40" w:after="40" w:line="240" w:lineRule="auto"/>
+              <w:jc w:val="left"/>
+            </w:pPr>
+            <w:r>
+              <w:rPr>
+                <w:sz w:val="18"/>
+                <w:szCs w:val="18"/>
+              </w:rPr>
+              <w:t>/usuarios/{id}</w:t>
+            </w:r>
+          </w:p>
+        </w:tc>
+        <w:tc>
+          <w:tcPr>
+            <w:tcW w:w="3000" w:type="dxa"/>
+            <w:vAlign w:val="center"/>
+          </w:tcPr>
+          <w:p>
+            <w:pPr>
+              <w:spacing w:before="40" w:after="40" w:line="240" w:lineRule="auto"/>
+              <w:jc w:val="left"/>
+            </w:pPr>
+            <w:r>
+              <w:rPr>
+                <w:sz w:val="18"/>
+                <w:szCs w:val="18"/>
+              </w:rPr>
+              <w:t>Exclui o usuário.</w:t>
+            </w:r>
+          </w:p>
+        </w:tc>
+        <w:tc>
+          <w:tcPr>
+            <w:tcW w:w="1754" w:type="dxa"/>
+            <w:vAlign w:val="center"/>
+          </w:tcPr>
+          <w:p>
+            <w:pPr>
+              <w:spacing w:before="40" w:after="40" w:line="240" w:lineRule="auto"/>
+              <w:jc w:val="left"/>
+            </w:pPr>
+            <w:r>
+              <w:rPr>
+                <w:sz w:val="18"/>
+                <w:szCs w:val="18"/>
+              </w:rPr>
+              <w:t>204, 404, 500</w:t>
+            </w:r>
+          </w:p>
+        </w:tc>
+      </w:tr>
+      <w:tr>
+        <w:trPr>
+          <w:cantSplit/>
+        </w:trPr>
+        <w:tc>
+          <w:tcPr>
+            <w:tcW w:w="8504" w:type="dxa"/>
+            <w:gridSpan w:val="4"/>
+            <w:shd w:val="clear" w:color="auto" w:fill="F2F2F2"/>
+            <w:vAlign w:val="center"/>
+          </w:tcPr>
+          <w:p>
+            <w:pPr>
+              <w:keepNext/>
+              <w:spacing w:before="40" w:after="40" w:line="240" w:lineRule="auto"/>
+              <w:jc w:val="left"/>
+            </w:pPr>
+            <w:r>
+              <w:rPr>
+                <w:b/>
+                <w:bCs/>
+                <w:sz w:val="18"/>
+                <w:szCs w:val="18"/>
+              </w:rPr>
+              <w:t>Contas – /contas (telas Visão geral e Pontos e créditos)</w:t>
+            </w:r>
+          </w:p>
+        </w:tc>
+      </w:tr>
+      <w:tr>
+        <w:trPr>
+          <w:cantSplit/>
+        </w:trPr>
+        <w:tc>
+          <w:tcPr>
+            <w:tcW w:w="1000" w:type="dxa"/>
+            <w:vAlign w:val="center"/>
+          </w:tcPr>
+          <w:p>
+            <w:pPr>
+              <w:spacing w:before="40" w:after="40" w:line="240" w:lineRule="auto"/>
+              <w:jc w:val="left"/>
+            </w:pPr>
+            <w:r>
+              <w:rPr>
+                <w:b/>
+                <w:bCs/>
+                <w:sz w:val="18"/>
+                <w:szCs w:val="18"/>
+              </w:rPr>
+              <w:t>GET</w:t>
+            </w:r>
+          </w:p>
+        </w:tc>
+        <w:tc>
+          <w:tcPr>
+            <w:tcW w:w="2750" w:type="dxa"/>
+            <w:vAlign w:val="center"/>
+          </w:tcPr>
+          <w:p>
+            <w:pPr>
+              <w:spacing w:before="40" w:after="40" w:line="240" w:lineRule="auto"/>
+              <w:jc w:val="left"/>
+            </w:pPr>
+            <w:r>
+              <w:rPr>
+                <w:sz w:val="18"/>
+                <w:szCs w:val="18"/>
+              </w:rPr>
+              <w:t>/contas</w:t>
+            </w:r>
+          </w:p>
+        </w:tc>
+        <w:tc>
+          <w:tcPr>
+            <w:tcW w:w="3000" w:type="dxa"/>
+            <w:vAlign w:val="center"/>
+          </w:tcPr>
+          <w:p>
+            <w:pPr>
+              <w:spacing w:before="40" w:after="40" w:line="240" w:lineRule="auto"/>
+              <w:jc w:val="left"/>
+            </w:pPr>
+            <w:r>
+              <w:rPr>
+                <w:sz w:val="18"/>
+                <w:szCs w:val="18"/>
+              </w:rPr>
+              <w:t>Lista todas as contas.</w:t>
+            </w:r>
+          </w:p>
+        </w:tc>
+        <w:tc>
+          <w:tcPr>
+            <w:tcW w:w="1754" w:type="dxa"/>
+            <w:vAlign w:val="center"/>
+          </w:tcPr>
+          <w:p>
+            <w:pPr>
+              <w:spacing w:before="40" w:after="40" w:line="240" w:lineRule="auto"/>
+              <w:jc w:val="left"/>
+            </w:pPr>
+            <w:r>
+              <w:rPr>
+                <w:sz w:val="18"/>
+                <w:szCs w:val="18"/>
+              </w:rPr>
+              <w:t>200, 500</w:t>
+            </w:r>
+          </w:p>
+        </w:tc>
+      </w:tr>
+      <w:tr>
+        <w:trPr>
+          <w:cantSplit/>
+        </w:trPr>
+        <w:tc>
+          <w:tcPr>
+            <w:tcW w:w="1000" w:type="dxa"/>
+            <w:vAlign w:val="center"/>
+          </w:tcPr>
+          <w:p>
+            <w:pPr>
+              <w:spacing w:before="40" w:after="40" w:line="240" w:lineRule="auto"/>
+              <w:jc w:val="left"/>
+            </w:pPr>
+            <w:r>
+              <w:rPr>
+                <w:b/>
+                <w:bCs/>
+                <w:sz w:val="18"/>
+                <w:szCs w:val="18"/>
+              </w:rPr>
+              <w:t>GET</w:t>
+            </w:r>
+          </w:p>
+        </w:tc>
+        <w:tc>
+          <w:tcPr>
+            <w:tcW w:w="2750" w:type="dxa"/>
+            <w:vAlign w:val="center"/>
+          </w:tcPr>
+          <w:p>
+            <w:pPr>
+              <w:spacing w:before="40" w:after="40" w:line="240" w:lineRule="auto"/>
+              <w:jc w:val="left"/>
+            </w:pPr>
+            <w:r>
+              <w:rPr>
+                <w:sz w:val="18"/>
+                <w:szCs w:val="18"/>
+              </w:rPr>
+              <w:t>/contas/{id}</w:t>
+            </w:r>
+          </w:p>
+        </w:tc>
+        <w:tc>
+          <w:tcPr>
+            <w:tcW w:w="3000" w:type="dxa"/>
+            <w:vAlign w:val="center"/>
+          </w:tcPr>
+          <w:p>
+            <w:pPr>
+              <w:spacing w:before="40" w:after="40" w:line="240" w:lineRule="auto"/>
+              <w:jc w:val="left"/>
+            </w:pPr>
+            <w:r>
+              <w:rPr>
+                <w:sz w:val="18"/>
+                <w:szCs w:val="18"/>
+              </w:rPr>
+              <w:t>Busca a conta: saldo de pontos, equivalência em reais, pontos que faltam para a passagem e bilhete.</w:t>
+            </w:r>
+          </w:p>
+        </w:tc>
+        <w:tc>
+          <w:tcPr>
+            <w:tcW w:w="1754" w:type="dxa"/>
+            <w:vAlign w:val="center"/>
+          </w:tcPr>
+          <w:p>
+            <w:pPr>
+              <w:spacing w:before="40" w:after="40" w:line="240" w:lineRule="auto"/>
+              <w:jc w:val="left"/>
+            </w:pPr>
+            <w:r>
+              <w:rPr>
+                <w:sz w:val="18"/>
+                <w:szCs w:val="18"/>
+              </w:rPr>
+              <w:t>200, 404, 500</w:t>
+            </w:r>
+          </w:p>
+        </w:tc>
+      </w:tr>
+      <w:tr>
+        <w:trPr>
+          <w:cantSplit/>
+        </w:trPr>
+        <w:tc>
+          <w:tcPr>
+            <w:tcW w:w="1000" w:type="dxa"/>
+            <w:vAlign w:val="center"/>
+          </w:tcPr>
+          <w:p>
+            <w:pPr>
+              <w:spacing w:before="40" w:after="40" w:line="240" w:lineRule="auto"/>
+              <w:jc w:val="left"/>
+            </w:pPr>
+            <w:r>
+              <w:rPr>
+                <w:b/>
+                <w:bCs/>
+                <w:sz w:val="18"/>
+                <w:szCs w:val="18"/>
+              </w:rPr>
+              <w:t>GET</w:t>
+            </w:r>
+          </w:p>
+        </w:tc>
+        <w:tc>
+          <w:tcPr>
+            <w:tcW w:w="2750" w:type="dxa"/>
+            <w:vAlign w:val="center"/>
+          </w:tcPr>
+          <w:p>
+            <w:pPr>
+              <w:spacing w:before="40" w:after="40" w:line="240" w:lineRule="auto"/>
+              <w:jc w:val="left"/>
+            </w:pPr>
+            <w:r>
+              <w:rPr>
+                <w:sz w:val="18"/>
+                <w:szCs w:val="18"/>
+              </w:rPr>
+              <w:t>/contas/usuario/{idUser}</w:t>
+            </w:r>
+          </w:p>
+        </w:tc>
+        <w:tc>
+          <w:tcPr>
+            <w:tcW w:w="3000" w:type="dxa"/>
+            <w:vAlign w:val="center"/>
+          </w:tcPr>
+          <w:p>
+            <w:pPr>
+              <w:spacing w:before="40" w:after="40" w:line="240" w:lineRule="auto"/>
+              <w:jc w:val="left"/>
+            </w:pPr>
+            <w:r>
+              <w:rPr>
+                <w:sz w:val="18"/>
+                <w:szCs w:val="18"/>
+              </w:rPr>
+              <w:t>Busca a conta de um usuário.</w:t>
+            </w:r>
+          </w:p>
+        </w:tc>
+        <w:tc>
+          <w:tcPr>
+            <w:tcW w:w="1754" w:type="dxa"/>
+            <w:vAlign w:val="center"/>
+          </w:tcPr>
+          <w:p>
+            <w:pPr>
+              <w:spacing w:before="40" w:after="40" w:line="240" w:lineRule="auto"/>
+              <w:jc w:val="left"/>
+            </w:pPr>
+            <w:r>
+              <w:rPr>
+                <w:sz w:val="18"/>
+                <w:szCs w:val="18"/>
+              </w:rPr>
+              <w:t>200, 404, 500</w:t>
+            </w:r>
+          </w:p>
+        </w:tc>
+      </w:tr>
+      <w:tr>
+        <w:trPr>
+          <w:cantSplit/>
+        </w:trPr>
+        <w:tc>
+          <w:tcPr>
+            <w:tcW w:w="1000" w:type="dxa"/>
+            <w:vAlign w:val="center"/>
+          </w:tcPr>
+          <w:p>
+            <w:pPr>
+              <w:spacing w:before="40" w:after="40" w:line="240" w:lineRule="auto"/>
+              <w:jc w:val="left"/>
+            </w:pPr>
+            <w:r>
+              <w:rPr>
+                <w:b/>
+                <w:bCs/>
+                <w:sz w:val="18"/>
+                <w:szCs w:val="18"/>
+              </w:rPr>
+              <w:t>GET</w:t>
+            </w:r>
+          </w:p>
+        </w:tc>
+        <w:tc>
+          <w:tcPr>
+            <w:tcW w:w="2750" w:type="dxa"/>
+            <w:vAlign w:val="center"/>
+          </w:tcPr>
+          <w:p>
+            <w:pPr>
+              <w:spacing w:before="40" w:after="40" w:line="240" w:lineRule="auto"/>
+              <w:jc w:val="left"/>
+            </w:pPr>
+            <w:r>
+              <w:rPr>
+                <w:sz w:val="18"/>
+                <w:szCs w:val="18"/>
+              </w:rPr>
+              <w:t>/contas/{id}/resumo</w:t>
+            </w:r>
+          </w:p>
+        </w:tc>
+        <w:tc>
+          <w:tcPr>
+            <w:tcW w:w="3000" w:type="dxa"/>
+            <w:vAlign w:val="center"/>
+          </w:tcPr>
+          <w:p>
+            <w:pPr>
+              <w:spacing w:before="40" w:after="40" w:line="240" w:lineRule="auto"/>
+              <w:jc w:val="left"/>
+            </w:pPr>
+            <w:r>
+              <w:rPr>
+                <w:sz w:val="18"/>
+                <w:szCs w:val="18"/>
+              </w:rPr>
+              <w:t>Resumo da Visão geral: distância dos últimos 7 dias, meta diária e últimas atividades.</w:t>
+            </w:r>
+          </w:p>
+        </w:tc>
+        <w:tc>
+          <w:tcPr>
+            <w:tcW w:w="1754" w:type="dxa"/>
+            <w:vAlign w:val="center"/>
+          </w:tcPr>
+          <w:p>
+            <w:pPr>
+              <w:spacing w:before="40" w:after="40" w:line="240" w:lineRule="auto"/>
+              <w:jc w:val="left"/>
+            </w:pPr>
+            <w:r>
+              <w:rPr>
+                <w:sz w:val="18"/>
+                <w:szCs w:val="18"/>
+              </w:rPr>
+              <w:t>200, 404, 500</w:t>
+            </w:r>
+          </w:p>
+        </w:tc>
+      </w:tr>
+      <w:tr>
+        <w:trPr>
+          <w:cantSplit/>
+        </w:trPr>
+        <w:tc>
+          <w:tcPr>
+            <w:tcW w:w="1000" w:type="dxa"/>
+            <w:vAlign w:val="center"/>
+          </w:tcPr>
+          <w:p>
+            <w:pPr>
+              <w:spacing w:before="40" w:after="40" w:line="240" w:lineRule="auto"/>
+              <w:jc w:val="left"/>
+            </w:pPr>
+            <w:r>
+              <w:rPr>
+                <w:b/>
+                <w:bCs/>
+                <w:sz w:val="18"/>
+                <w:szCs w:val="18"/>
+              </w:rPr>
+              <w:t>GET</w:t>
+            </w:r>
+          </w:p>
+        </w:tc>
+        <w:tc>
+          <w:tcPr>
+            <w:tcW w:w="2750" w:type="dxa"/>
+            <w:vAlign w:val="center"/>
+          </w:tcPr>
+          <w:p>
+            <w:pPr>
+              <w:spacing w:before="40" w:after="40" w:line="240" w:lineRule="auto"/>
+              <w:jc w:val="left"/>
+            </w:pPr>
+            <w:r>
+              <w:rPr>
+                <w:sz w:val="18"/>
+                <w:szCs w:val="18"/>
+              </w:rPr>
+              <w:t>/contas/{id}/conversao?pontos={pontos}</w:t>
+            </w:r>
+          </w:p>
+        </w:tc>
+        <w:tc>
+          <w:tcPr>
+            <w:tcW w:w="3000" w:type="dxa"/>
+            <w:vAlign w:val="center"/>
+          </w:tcPr>
+          <w:p>
+            <w:pPr>
+              <w:spacing w:before="40" w:after="40" w:line="240" w:lineRule="auto"/>
+              <w:jc w:val="left"/>
+            </w:pPr>
+            <w:r>
+              <w:rPr>
+                <w:sz w:val="18"/>
+                <w:szCs w:val="18"/>
+              </w:rPr>
+              <w:t>Simula a conversão de pontos em crédito, sem alterar a conta.</w:t>
+            </w:r>
+          </w:p>
+        </w:tc>
+        <w:tc>
+          <w:tcPr>
+            <w:tcW w:w="1754" w:type="dxa"/>
+            <w:vAlign w:val="center"/>
+          </w:tcPr>
+          <w:p>
+            <w:pPr>
+              <w:spacing w:before="40" w:after="40" w:line="240" w:lineRule="auto"/>
+              <w:jc w:val="left"/>
+            </w:pPr>
+            <w:r>
+              <w:rPr>
+                <w:sz w:val="18"/>
+                <w:szCs w:val="18"/>
+              </w:rPr>
+              <w:t>200, 400, 404, 500</w:t>
+            </w:r>
+          </w:p>
+        </w:tc>
+      </w:tr>
+      <w:tr>
+        <w:trPr>
+          <w:cantSplit/>
+        </w:trPr>
+        <w:tc>
+          <w:tcPr>
+            <w:tcW w:w="1000" w:type="dxa"/>
+            <w:vAlign w:val="center"/>
+          </w:tcPr>
+          <w:p>
+            <w:pPr>
+              <w:spacing w:before="40" w:after="40" w:line="240" w:lineRule="auto"/>
+              <w:jc w:val="left"/>
+            </w:pPr>
+            <w:r>
+              <w:rPr>
+                <w:b/>
+                <w:bCs/>
+                <w:sz w:val="18"/>
+                <w:szCs w:val="18"/>
+              </w:rPr>
+              <w:t>POST</w:t>
+            </w:r>
+          </w:p>
+        </w:tc>
+        <w:tc>
+          <w:tcPr>
+            <w:tcW w:w="2750" w:type="dxa"/>
+            <w:vAlign w:val="center"/>
+          </w:tcPr>
+          <w:p>
+            <w:pPr>
+              <w:spacing w:before="40" w:after="40" w:line="240" w:lineRule="auto"/>
+              <w:jc w:val="left"/>
+            </w:pPr>
+            <w:r>
+              <w:rPr>
+                <w:sz w:val="18"/>
+                <w:szCs w:val="18"/>
+              </w:rPr>
+              <w:t>/contas/{id}/conversao</w:t>
+            </w:r>
+          </w:p>
+        </w:tc>
+        <w:tc>
+          <w:tcPr>
+            <w:tcW w:w="3000" w:type="dxa"/>
+            <w:vAlign w:val="center"/>
+          </w:tcPr>
+          <w:p>
+            <w:pPr>
+              <w:spacing w:before="40" w:after="40" w:line="240" w:lineRule="auto"/>
+              <w:jc w:val="left"/>
+            </w:pPr>
+            <w:r>
+              <w:rPr>
+                <w:sz w:val="18"/>
+                <w:szCs w:val="18"/>
+              </w:rPr>
+              <w:t>Converte pontos em crédito no bilhete. Corpo: pontos.</w:t>
+            </w:r>
+          </w:p>
+        </w:tc>
+        <w:tc>
+          <w:tcPr>
+            <w:tcW w:w="1754" w:type="dxa"/>
+            <w:vAlign w:val="center"/>
+          </w:tcPr>
+          <w:p>
+            <w:pPr>
+              <w:spacing w:before="40" w:after="40" w:line="240" w:lineRule="auto"/>
+              <w:jc w:val="left"/>
+            </w:pPr>
+            <w:r>
+              <w:rPr>
+                <w:sz w:val="18"/>
+                <w:szCs w:val="18"/>
+              </w:rPr>
+              <w:t>200, 400, 404, 409, 500</w:t>
+            </w:r>
+          </w:p>
+        </w:tc>
+      </w:tr>
+      <w:tr>
+        <w:trPr>
+          <w:cantSplit/>
+        </w:trPr>
+        <w:tc>
+          <w:tcPr>
+            <w:tcW w:w="1000" w:type="dxa"/>
+            <w:vAlign w:val="center"/>
+          </w:tcPr>
+          <w:p>
+            <w:pPr>
+              <w:spacing w:before="40" w:after="40" w:line="240" w:lineRule="auto"/>
+              <w:jc w:val="left"/>
+            </w:pPr>
+            <w:r>
+              <w:rPr>
+                <w:b/>
+                <w:bCs/>
+                <w:sz w:val="18"/>
+                <w:szCs w:val="18"/>
+              </w:rPr>
+              <w:t>PUT</w:t>
+            </w:r>
+          </w:p>
+        </w:tc>
+        <w:tc>
+          <w:tcPr>
+            <w:tcW w:w="2750" w:type="dxa"/>
+            <w:vAlign w:val="center"/>
+          </w:tcPr>
+          <w:p>
+            <w:pPr>
+              <w:spacing w:before="40" w:after="40" w:line="240" w:lineRule="auto"/>
+              <w:jc w:val="left"/>
+            </w:pPr>
+            <w:r>
+              <w:rPr>
+                <w:sz w:val="18"/>
+                <w:szCs w:val="18"/>
+              </w:rPr>
+              <w:t>/contas/{id}</w:t>
+            </w:r>
+          </w:p>
+        </w:tc>
+        <w:tc>
+          <w:tcPr>
+            <w:tcW w:w="3000" w:type="dxa"/>
+            <w:vAlign w:val="center"/>
+          </w:tcPr>
+          <w:p>
+            <w:pPr>
+              <w:spacing w:before="40" w:after="40" w:line="240" w:lineRule="auto"/>
+              <w:jc w:val="left"/>
+            </w:pPr>
+            <w:r>
+              <w:rPr>
+                <w:sz w:val="18"/>
+                <w:szCs w:val="18"/>
+              </w:rPr>
+              <w:t>Atualiza status, pontos e limite da conta.</w:t>
+            </w:r>
+          </w:p>
+        </w:tc>
+        <w:tc>
+          <w:tcPr>
+            <w:tcW w:w="1754" w:type="dxa"/>
+            <w:vAlign w:val="center"/>
+          </w:tcPr>
+          <w:p>
+            <w:pPr>
+              <w:spacing w:before="40" w:after="40" w:line="240" w:lineRule="auto"/>
+              <w:jc w:val="left"/>
+            </w:pPr>
+            <w:r>
+              <w:rPr>
+                <w:sz w:val="18"/>
+                <w:szCs w:val="18"/>
+              </w:rPr>
+              <w:t>200, 400, 404, 500</w:t>
+            </w:r>
+          </w:p>
+        </w:tc>
+      </w:tr>
+      <w:tr>
+        <w:trPr>
+          <w:cantSplit/>
+        </w:trPr>
+        <w:tc>
+          <w:tcPr>
+            <w:tcW w:w="1000" w:type="dxa"/>
+            <w:vAlign w:val="center"/>
+          </w:tcPr>
+          <w:p>
+            <w:pPr>
+              <w:spacing w:before="40" w:after="40" w:line="240" w:lineRule="auto"/>
+              <w:jc w:val="left"/>
+            </w:pPr>
+            <w:r>
+              <w:rPr>
+                <w:b/>
+                <w:bCs/>
+                <w:sz w:val="18"/>
+                <w:szCs w:val="18"/>
+              </w:rPr>
+              <w:t>PATCH</w:t>
+            </w:r>
+          </w:p>
+        </w:tc>
+        <w:tc>
+          <w:tcPr>
+            <w:tcW w:w="2750" w:type="dxa"/>
+            <w:vAlign w:val="center"/>
+          </w:tcPr>
+          <w:p>
+            <w:pPr>
+              <w:spacing w:before="40" w:after="40" w:line="240" w:lineRule="auto"/>
+              <w:jc w:val="left"/>
+            </w:pPr>
+            <w:r>
+              <w:rPr>
+                <w:sz w:val="18"/>
+                <w:szCs w:val="18"/>
+              </w:rPr>
+              <w:t>/contas/{id}/desativar</w:t>
+            </w:r>
+          </w:p>
+        </w:tc>
+        <w:tc>
+          <w:tcPr>
+            <w:tcW w:w="3000" w:type="dxa"/>
+            <w:vAlign w:val="center"/>
+          </w:tcPr>
+          <w:p>
+            <w:pPr>
+              <w:spacing w:before="40" w:after="40" w:line="240" w:lineRule="auto"/>
+              <w:jc w:val="left"/>
+            </w:pPr>
+            <w:r>
+              <w:rPr>
+                <w:sz w:val="18"/>
+                <w:szCs w:val="18"/>
+              </w:rPr>
+              <w:t>Desativa a conta.</w:t>
+            </w:r>
+          </w:p>
+        </w:tc>
+        <w:tc>
+          <w:tcPr>
+            <w:tcW w:w="1754" w:type="dxa"/>
+            <w:vAlign w:val="center"/>
+          </w:tcPr>
+          <w:p>
+            <w:pPr>
+              <w:spacing w:before="40" w:after="40" w:line="240" w:lineRule="auto"/>
+              <w:jc w:val="left"/>
+            </w:pPr>
+            <w:r>
+              <w:rPr>
+                <w:sz w:val="18"/>
+                <w:szCs w:val="18"/>
+              </w:rPr>
+              <w:t>204, 404, 500</w:t>
+            </w:r>
+          </w:p>
+        </w:tc>
+      </w:tr>
+      <w:tr>
+        <w:trPr>
+          <w:cantSplit/>
+        </w:trPr>
+        <w:tc>
+          <w:tcPr>
+            <w:tcW w:w="1000" w:type="dxa"/>
+            <w:vAlign w:val="center"/>
+          </w:tcPr>
+          <w:p>
+            <w:pPr>
+              <w:spacing w:before="40" w:after="40" w:line="240" w:lineRule="auto"/>
+              <w:jc w:val="left"/>
+            </w:pPr>
+            <w:r>
+              <w:rPr>
+                <w:b/>
+                <w:bCs/>
+                <w:sz w:val="18"/>
+                <w:szCs w:val="18"/>
+              </w:rPr>
+              <w:t>DELETE</w:t>
+            </w:r>
+          </w:p>
+        </w:tc>
+        <w:tc>
+          <w:tcPr>
+            <w:tcW w:w="2750" w:type="dxa"/>
+            <w:vAlign w:val="center"/>
+          </w:tcPr>
+          <w:p>
+            <w:pPr>
+              <w:spacing w:before="40" w:after="40" w:line="240" w:lineRule="auto"/>
+              <w:jc w:val="left"/>
+            </w:pPr>
+            <w:r>
+              <w:rPr>
+                <w:sz w:val="18"/>
+                <w:szCs w:val="18"/>
+              </w:rPr>
+              <w:t>/contas/{id}</w:t>
+            </w:r>
+          </w:p>
+        </w:tc>
+        <w:tc>
+          <w:tcPr>
+            <w:tcW w:w="3000" w:type="dxa"/>
+            <w:vAlign w:val="center"/>
+          </w:tcPr>
+          <w:p>
+            <w:pPr>
+              <w:spacing w:before="40" w:after="40" w:line="240" w:lineRule="auto"/>
+              <w:jc w:val="left"/>
+            </w:pPr>
+            <w:r>
+              <w:rPr>
+                <w:sz w:val="18"/>
+                <w:szCs w:val="18"/>
+              </w:rPr>
+              <w:t>Exclui a conta.</w:t>
+            </w:r>
+          </w:p>
+        </w:tc>
+        <w:tc>
+          <w:tcPr>
+            <w:tcW w:w="1754" w:type="dxa"/>
+            <w:vAlign w:val="center"/>
+          </w:tcPr>
+          <w:p>
+            <w:pPr>
+              <w:spacing w:before="40" w:after="40" w:line="240" w:lineRule="auto"/>
+              <w:jc w:val="left"/>
+            </w:pPr>
+            <w:r>
+              <w:rPr>
+                <w:sz w:val="18"/>
+                <w:szCs w:val="18"/>
+              </w:rPr>
+              <w:t>204, 404, 500</w:t>
+            </w:r>
+          </w:p>
+        </w:tc>
+      </w:tr>
+      <w:tr>
+        <w:trPr>
+          <w:cantSplit/>
+        </w:trPr>
+        <w:tc>
+          <w:tcPr>
+            <w:tcW w:w="8504" w:type="dxa"/>
+            <w:gridSpan w:val="4"/>
+            <w:shd w:val="clear" w:color="auto" w:fill="F2F2F2"/>
+            <w:vAlign w:val="center"/>
+          </w:tcPr>
+          <w:p>
+            <w:pPr>
+              <w:keepNext/>
+              <w:spacing w:before="40" w:after="40" w:line="240" w:lineRule="auto"/>
+              <w:jc w:val="left"/>
+            </w:pPr>
+            <w:r>
+              <w:rPr>
+                <w:b/>
+                <w:bCs/>
+                <w:sz w:val="18"/>
+                <w:szCs w:val="18"/>
+              </w:rPr>
+              <w:t>Bilhetes – /bilhetes (Gerenciar bilhete)</w:t>
+            </w:r>
+          </w:p>
+        </w:tc>
+      </w:tr>
+      <w:tr>
+        <w:trPr>
+          <w:cantSplit/>
+        </w:trPr>
+        <w:tc>
+          <w:tcPr>
+            <w:tcW w:w="1000" w:type="dxa"/>
+            <w:vAlign w:val="center"/>
+          </w:tcPr>
+          <w:p>
+            <w:pPr>
+              <w:spacing w:before="40" w:after="40" w:line="240" w:lineRule="auto"/>
+              <w:jc w:val="left"/>
+            </w:pPr>
+            <w:r>
+              <w:rPr>
+                <w:b/>
+                <w:bCs/>
+                <w:sz w:val="18"/>
+                <w:szCs w:val="18"/>
+              </w:rPr>
+              <w:t>GET</w:t>
+            </w:r>
+          </w:p>
+        </w:tc>
+        <w:tc>
+          <w:tcPr>
+            <w:tcW w:w="2750" w:type="dxa"/>
+            <w:vAlign w:val="center"/>
+          </w:tcPr>
+          <w:p>
+            <w:pPr>
+              <w:spacing w:before="40" w:after="40" w:line="240" w:lineRule="auto"/>
+              <w:jc w:val="left"/>
+            </w:pPr>
+            <w:r>
+              <w:rPr>
+                <w:sz w:val="18"/>
+                <w:szCs w:val="18"/>
+              </w:rPr>
+              <w:t>/bilhetes</w:t>
+            </w:r>
+          </w:p>
+        </w:tc>
+        <w:tc>
+          <w:tcPr>
+            <w:tcW w:w="3000" w:type="dxa"/>
+            <w:vAlign w:val="center"/>
+          </w:tcPr>
+          <w:p>
+            <w:pPr>
+              <w:spacing w:before="40" w:after="40" w:line="240" w:lineRule="auto"/>
+              <w:jc w:val="left"/>
+            </w:pPr>
+            <w:r>
+              <w:rPr>
+                <w:sz w:val="18"/>
+                <w:szCs w:val="18"/>
+              </w:rPr>
+              <w:t>Lista todos os bilhetes.</w:t>
+            </w:r>
+          </w:p>
+        </w:tc>
+        <w:tc>
+          <w:tcPr>
+            <w:tcW w:w="1754" w:type="dxa"/>
+            <w:vAlign w:val="center"/>
+          </w:tcPr>
+          <w:p>
+            <w:pPr>
+              <w:spacing w:before="40" w:after="40" w:line="240" w:lineRule="auto"/>
+              <w:jc w:val="left"/>
+            </w:pPr>
+            <w:r>
+              <w:rPr>
+                <w:sz w:val="18"/>
+                <w:szCs w:val="18"/>
+              </w:rPr>
+              <w:t>200, 500</w:t>
+            </w:r>
+          </w:p>
+        </w:tc>
+      </w:tr>
+      <w:tr>
+        <w:trPr>
+          <w:cantSplit/>
+        </w:trPr>
+        <w:tc>
+          <w:tcPr>
+            <w:tcW w:w="1000" w:type="dxa"/>
+            <w:vAlign w:val="center"/>
+          </w:tcPr>
+          <w:p>
+            <w:pPr>
+              <w:spacing w:before="40" w:after="40" w:line="240" w:lineRule="auto"/>
+              <w:jc w:val="left"/>
+            </w:pPr>
+            <w:r>
+              <w:rPr>
+                <w:b/>
+                <w:bCs/>
+                <w:sz w:val="18"/>
+                <w:szCs w:val="18"/>
+              </w:rPr>
+              <w:t>GET</w:t>
+            </w:r>
+          </w:p>
+        </w:tc>
+        <w:tc>
+          <w:tcPr>
+            <w:tcW w:w="2750" w:type="dxa"/>
+            <w:vAlign w:val="center"/>
+          </w:tcPr>
+          <w:p>
+            <w:pPr>
+              <w:spacing w:before="40" w:after="40" w:line="240" w:lineRule="auto"/>
+              <w:jc w:val="left"/>
+            </w:pPr>
+            <w:r>
+              <w:rPr>
+                <w:sz w:val="18"/>
+                <w:szCs w:val="18"/>
+              </w:rPr>
+              <w:t>/bilhetes/{id}</w:t>
+            </w:r>
+          </w:p>
+        </w:tc>
+        <w:tc>
+          <w:tcPr>
+            <w:tcW w:w="3000" w:type="dxa"/>
+            <w:vAlign w:val="center"/>
+          </w:tcPr>
+          <w:p>
+            <w:pPr>
+              <w:spacing w:before="40" w:after="40" w:line="240" w:lineRule="auto"/>
+              <w:jc w:val="left"/>
+            </w:pPr>
+            <w:r>
+              <w:rPr>
+                <w:sz w:val="18"/>
+                <w:szCs w:val="18"/>
+              </w:rPr>
+              <w:t>Busca um bilhete pelo id.</w:t>
+            </w:r>
+          </w:p>
+        </w:tc>
+        <w:tc>
+          <w:tcPr>
+            <w:tcW w:w="1754" w:type="dxa"/>
+            <w:vAlign w:val="center"/>
+          </w:tcPr>
+          <w:p>
+            <w:pPr>
+              <w:spacing w:before="40" w:after="40" w:line="240" w:lineRule="auto"/>
+              <w:jc w:val="left"/>
+            </w:pPr>
+            <w:r>
+              <w:rPr>
+                <w:sz w:val="18"/>
+                <w:szCs w:val="18"/>
+              </w:rPr>
+              <w:t>200, 404, 500</w:t>
+            </w:r>
+          </w:p>
+        </w:tc>
+      </w:tr>
+      <w:tr>
+        <w:trPr>
+          <w:cantSplit/>
+        </w:trPr>
+        <w:tc>
+          <w:tcPr>
+            <w:tcW w:w="1000" w:type="dxa"/>
+            <w:vAlign w:val="center"/>
+          </w:tcPr>
+          <w:p>
+            <w:pPr>
+              <w:spacing w:before="40" w:after="40" w:line="240" w:lineRule="auto"/>
+              <w:jc w:val="left"/>
+            </w:pPr>
+            <w:r>
+              <w:rPr>
+                <w:b/>
+                <w:bCs/>
+                <w:sz w:val="18"/>
+                <w:szCs w:val="18"/>
+              </w:rPr>
+              <w:t>GET</w:t>
+            </w:r>
+          </w:p>
+        </w:tc>
+        <w:tc>
+          <w:tcPr>
+            <w:tcW w:w="2750" w:type="dxa"/>
+            <w:vAlign w:val="center"/>
+          </w:tcPr>
+          <w:p>
+            <w:pPr>
+              <w:spacing w:before="40" w:after="40" w:line="240" w:lineRule="auto"/>
+              <w:jc w:val="left"/>
+            </w:pPr>
+            <w:r>
+              <w:rPr>
+                <w:sz w:val="18"/>
+                <w:szCs w:val="18"/>
+              </w:rPr>
+              <w:t>/bilhetes/usuario/{idUser}</w:t>
+            </w:r>
+          </w:p>
+        </w:tc>
+        <w:tc>
+          <w:tcPr>
+            <w:tcW w:w="3000" w:type="dxa"/>
+            <w:vAlign w:val="center"/>
+          </w:tcPr>
+          <w:p>
+            <w:pPr>
+              <w:spacing w:before="40" w:after="40" w:line="240" w:lineRule="auto"/>
+              <w:jc w:val="left"/>
+            </w:pPr>
+            <w:r>
+              <w:rPr>
+                <w:sz w:val="18"/>
+                <w:szCs w:val="18"/>
+              </w:rPr>
+              <w:t>Busca o bilhete vinculado ao usuário.</w:t>
+            </w:r>
+          </w:p>
+        </w:tc>
+        <w:tc>
+          <w:tcPr>
+            <w:tcW w:w="1754" w:type="dxa"/>
+            <w:vAlign w:val="center"/>
+          </w:tcPr>
+          <w:p>
+            <w:pPr>
+              <w:spacing w:before="40" w:after="40" w:line="240" w:lineRule="auto"/>
+              <w:jc w:val="left"/>
+            </w:pPr>
+            <w:r>
+              <w:rPr>
+                <w:sz w:val="18"/>
+                <w:szCs w:val="18"/>
+              </w:rPr>
+              <w:t>200, 404, 500</w:t>
+            </w:r>
+          </w:p>
+        </w:tc>
+      </w:tr>
+      <w:tr>
+        <w:trPr>
+          <w:cantSplit/>
+        </w:trPr>
+        <w:tc>
+          <w:tcPr>
+            <w:tcW w:w="1000" w:type="dxa"/>
+            <w:vAlign w:val="center"/>
+          </w:tcPr>
+          <w:p>
+            <w:pPr>
+              <w:spacing w:before="40" w:after="40" w:line="240" w:lineRule="auto"/>
+              <w:jc w:val="left"/>
+            </w:pPr>
+            <w:r>
+              <w:rPr>
+                <w:b/>
+                <w:bCs/>
+                <w:sz w:val="18"/>
+                <w:szCs w:val="18"/>
+              </w:rPr>
+              <w:t>POST</w:t>
+            </w:r>
+          </w:p>
+        </w:tc>
+        <w:tc>
+          <w:tcPr>
+            <w:tcW w:w="2750" w:type="dxa"/>
+            <w:vAlign w:val="center"/>
+          </w:tcPr>
+          <w:p>
+            <w:pPr>
+              <w:spacing w:before="40" w:after="40" w:line="240" w:lineRule="auto"/>
+              <w:jc w:val="left"/>
+            </w:pPr>
+            <w:r>
+              <w:rPr>
+                <w:sz w:val="18"/>
+                <w:szCs w:val="18"/>
+              </w:rPr>
+              <w:t>/bilhetes/usuario/{idUser}</w:t>
+            </w:r>
+          </w:p>
+        </w:tc>
+        <w:tc>
+          <w:tcPr>
+            <w:tcW w:w="3000" w:type="dxa"/>
+            <w:vAlign w:val="center"/>
+          </w:tcPr>
+          <w:p>
+            <w:pPr>
+              <w:spacing w:before="40" w:after="40" w:line="240" w:lineRule="auto"/>
+              <w:jc w:val="left"/>
+            </w:pPr>
+            <w:r>
+              <w:rPr>
+                <w:sz w:val="18"/>
+                <w:szCs w:val="18"/>
+              </w:rPr>
+              <w:t>Cadastra o bilhete e o vincula ao usuário. Corpo: numBilhete (9 dígitos).</w:t>
+            </w:r>
+          </w:p>
+        </w:tc>
+        <w:tc>
+          <w:tcPr>
+            <w:tcW w:w="1754" w:type="dxa"/>
+            <w:vAlign w:val="center"/>
+          </w:tcPr>
+          <w:p>
+            <w:pPr>
+              <w:spacing w:before="40" w:after="40" w:line="240" w:lineRule="auto"/>
+              <w:jc w:val="left"/>
+            </w:pPr>
+            <w:r>
+              <w:rPr>
+                <w:sz w:val="18"/>
+                <w:szCs w:val="18"/>
+              </w:rPr>
+              <w:t>201, 400, 404, 409, 500</w:t>
+            </w:r>
+          </w:p>
+        </w:tc>
+      </w:tr>
+      <w:tr>
+        <w:trPr>
+          <w:cantSplit/>
+        </w:trPr>
+        <w:tc>
+          <w:tcPr>
+            <w:tcW w:w="1000" w:type="dxa"/>
+            <w:vAlign w:val="center"/>
+          </w:tcPr>
+          <w:p>
+            <w:pPr>
+              <w:spacing w:before="40" w:after="40" w:line="240" w:lineRule="auto"/>
+              <w:jc w:val="left"/>
+            </w:pPr>
+            <w:r>
+              <w:rPr>
+                <w:b/>
+                <w:bCs/>
+                <w:sz w:val="18"/>
+                <w:szCs w:val="18"/>
+              </w:rPr>
+              <w:t>PUT</w:t>
+            </w:r>
+          </w:p>
+        </w:tc>
+        <w:tc>
+          <w:tcPr>
+            <w:tcW w:w="2750" w:type="dxa"/>
+            <w:vAlign w:val="center"/>
+          </w:tcPr>
+          <w:p>
+            <w:pPr>
+              <w:spacing w:before="40" w:after="40" w:line="240" w:lineRule="auto"/>
+              <w:jc w:val="left"/>
+            </w:pPr>
+            <w:r>
+              <w:rPr>
+                <w:sz w:val="18"/>
+                <w:szCs w:val="18"/>
+              </w:rPr>
+              <w:t>/bilhetes/{id}</w:t>
+            </w:r>
+          </w:p>
+        </w:tc>
+        <w:tc>
+          <w:tcPr>
+            <w:tcW w:w="3000" w:type="dxa"/>
+            <w:vAlign w:val="center"/>
+          </w:tcPr>
+          <w:p>
+            <w:pPr>
+              <w:spacing w:before="40" w:after="40" w:line="240" w:lineRule="auto"/>
+              <w:jc w:val="left"/>
+            </w:pPr>
+            <w:r>
+              <w:rPr>
+                <w:sz w:val="18"/>
+                <w:szCs w:val="18"/>
+              </w:rPr>
+              <w:t>Atualiza crédito e status do bilhete.</w:t>
+            </w:r>
+          </w:p>
+        </w:tc>
+        <w:tc>
+          <w:tcPr>
+            <w:tcW w:w="1754" w:type="dxa"/>
+            <w:vAlign w:val="center"/>
+          </w:tcPr>
+          <w:p>
+            <w:pPr>
+              <w:spacing w:before="40" w:after="40" w:line="240" w:lineRule="auto"/>
+              <w:jc w:val="left"/>
+            </w:pPr>
+            <w:r>
+              <w:rPr>
+                <w:sz w:val="18"/>
+                <w:szCs w:val="18"/>
+              </w:rPr>
+              <w:t>200, 400, 404, 500</w:t>
+            </w:r>
+          </w:p>
+        </w:tc>
+      </w:tr>
+      <w:tr>
+        <w:trPr>
+          <w:cantSplit/>
+        </w:trPr>
+        <w:tc>
+          <w:tcPr>
+            <w:tcW w:w="1000" w:type="dxa"/>
+            <w:vAlign w:val="center"/>
+          </w:tcPr>
+          <w:p>
+            <w:pPr>
+              <w:spacing w:before="40" w:after="40" w:line="240" w:lineRule="auto"/>
+              <w:jc w:val="left"/>
+            </w:pPr>
+            <w:r>
+              <w:rPr>
+                <w:b/>
+                <w:bCs/>
+                <w:sz w:val="18"/>
+                <w:szCs w:val="18"/>
+              </w:rPr>
+              <w:t>DELETE</w:t>
+            </w:r>
+          </w:p>
+        </w:tc>
+        <w:tc>
+          <w:tcPr>
+            <w:tcW w:w="2750" w:type="dxa"/>
+            <w:vAlign w:val="center"/>
+          </w:tcPr>
+          <w:p>
+            <w:pPr>
+              <w:spacing w:before="40" w:after="40" w:line="240" w:lineRule="auto"/>
+              <w:jc w:val="left"/>
+            </w:pPr>
+            <w:r>
+              <w:rPr>
+                <w:sz w:val="18"/>
+                <w:szCs w:val="18"/>
+              </w:rPr>
+              <w:t>/bilhetes/{id}</w:t>
+            </w:r>
+          </w:p>
+        </w:tc>
+        <w:tc>
+          <w:tcPr>
+            <w:tcW w:w="3000" w:type="dxa"/>
+            <w:vAlign w:val="center"/>
+          </w:tcPr>
+          <w:p>
+            <w:pPr>
+              <w:spacing w:before="40" w:after="40" w:line="240" w:lineRule="auto"/>
+              <w:jc w:val="left"/>
+            </w:pPr>
+            <w:r>
+              <w:rPr>
+                <w:sz w:val="18"/>
+                <w:szCs w:val="18"/>
+              </w:rPr>
+              <w:t>Exclui o bilhete.</w:t>
+            </w:r>
+          </w:p>
+        </w:tc>
+        <w:tc>
+          <w:tcPr>
+            <w:tcW w:w="1754" w:type="dxa"/>
+            <w:vAlign w:val="center"/>
+          </w:tcPr>
+          <w:p>
+            <w:pPr>
+              <w:spacing w:before="40" w:after="40" w:line="240" w:lineRule="auto"/>
+              <w:jc w:val="left"/>
+            </w:pPr>
+            <w:r>
+              <w:rPr>
+                <w:sz w:val="18"/>
+                <w:szCs w:val="18"/>
+              </w:rPr>
+              <w:t>204, 404, 500</w:t>
+            </w:r>
+          </w:p>
+        </w:tc>
+      </w:tr>
+      <w:tr>
+        <w:trPr>
+          <w:cantSplit/>
+        </w:trPr>
+        <w:tc>
+          <w:tcPr>
+            <w:tcW w:w="8504" w:type="dxa"/>
+            <w:gridSpan w:val="4"/>
+            <w:shd w:val="clear" w:color="auto" w:fill="F2F2F2"/>
+            <w:vAlign w:val="center"/>
+          </w:tcPr>
+          <w:p>
+            <w:pPr>
+              <w:keepNext/>
+              <w:spacing w:before="40" w:after="40" w:line="240" w:lineRule="auto"/>
+              <w:jc w:val="left"/>
+            </w:pPr>
+            <w:r>
+              <w:rPr>
+                <w:b/>
+                <w:bCs/>
+                <w:sz w:val="18"/>
+                <w:szCs w:val="18"/>
+              </w:rPr>
+              <w:t>Caminhadas – /caminhadas (Minhas caminhadas)</w:t>
+            </w:r>
+          </w:p>
+        </w:tc>
+      </w:tr>
+      <w:tr>
+        <w:trPr>
+          <w:cantSplit/>
+        </w:trPr>
+        <w:tc>
+          <w:tcPr>
+            <w:tcW w:w="1000" w:type="dxa"/>
+            <w:vAlign w:val="center"/>
+          </w:tcPr>
+          <w:p>
+            <w:pPr>
+              <w:spacing w:before="40" w:after="40" w:line="240" w:lineRule="auto"/>
+              <w:jc w:val="left"/>
+            </w:pPr>
+            <w:r>
+              <w:rPr>
+                <w:b/>
+                <w:bCs/>
+                <w:sz w:val="18"/>
+                <w:szCs w:val="18"/>
+              </w:rPr>
+              <w:t>POST</w:t>
+            </w:r>
+          </w:p>
+        </w:tc>
+        <w:tc>
+          <w:tcPr>
+            <w:tcW w:w="2750" w:type="dxa"/>
+            <w:vAlign w:val="center"/>
+          </w:tcPr>
+          <w:p>
+            <w:pPr>
+              <w:spacing w:before="40" w:after="40" w:line="240" w:lineRule="auto"/>
+              <w:jc w:val="left"/>
+            </w:pPr>
+            <w:r>
+              <w:rPr>
+                <w:sz w:val="18"/>
+                <w:szCs w:val="18"/>
+              </w:rPr>
+              <w:t>/caminhadas</w:t>
+            </w:r>
+          </w:p>
+        </w:tc>
+        <w:tc>
+          <w:tcPr>
+            <w:tcW w:w="3000" w:type="dxa"/>
+            <w:vAlign w:val="center"/>
+          </w:tcPr>
+          <w:p>
+            <w:pPr>
+              <w:spacing w:before="40" w:after="40" w:line="240" w:lineRule="auto"/>
+              <w:jc w:val="left"/>
+            </w:pPr>
+            <w:r>
+              <w:rPr>
+                <w:sz w:val="18"/>
+                <w:szCs w:val="18"/>
+              </w:rPr>
+              <w:t>Registra uma caminhada e credita os pontos. Corpo: idConta, kmAndados.</w:t>
+            </w:r>
+          </w:p>
+        </w:tc>
+        <w:tc>
+          <w:tcPr>
+            <w:tcW w:w="1754" w:type="dxa"/>
+            <w:vAlign w:val="center"/>
+          </w:tcPr>
+          <w:p>
+            <w:pPr>
+              <w:spacing w:before="40" w:after="40" w:line="240" w:lineRule="auto"/>
+              <w:jc w:val="left"/>
+            </w:pPr>
+            <w:r>
+              <w:rPr>
+                <w:sz w:val="18"/>
+                <w:szCs w:val="18"/>
+              </w:rPr>
+              <w:t>201, 400, 404, 409, 500</w:t>
+            </w:r>
+          </w:p>
+        </w:tc>
+      </w:tr>
+      <w:tr>
+        <w:trPr>
+          <w:cantSplit/>
+        </w:trPr>
+        <w:tc>
+          <w:tcPr>
+            <w:tcW w:w="1000" w:type="dxa"/>
+            <w:vAlign w:val="center"/>
+          </w:tcPr>
+          <w:p>
+            <w:pPr>
+              <w:spacing w:before="40" w:after="40" w:line="240" w:lineRule="auto"/>
+              <w:jc w:val="left"/>
+            </w:pPr>
+            <w:r>
+              <w:rPr>
+                <w:b/>
+                <w:bCs/>
+                <w:sz w:val="18"/>
+                <w:szCs w:val="18"/>
+              </w:rPr>
+              <w:t>GET</w:t>
+            </w:r>
+          </w:p>
+        </w:tc>
+        <w:tc>
+          <w:tcPr>
+            <w:tcW w:w="2750" w:type="dxa"/>
+            <w:vAlign w:val="center"/>
+          </w:tcPr>
+          <w:p>
+            <w:pPr>
+              <w:spacing w:before="40" w:after="40" w:line="240" w:lineRule="auto"/>
+              <w:jc w:val="left"/>
+            </w:pPr>
+            <w:r>
+              <w:rPr>
+                <w:sz w:val="18"/>
+                <w:szCs w:val="18"/>
+              </w:rPr>
+              <w:t>/caminhadas/conta/{idConta}</w:t>
+            </w:r>
+          </w:p>
+        </w:tc>
+        <w:tc>
+          <w:tcPr>
+            <w:tcW w:w="3000" w:type="dxa"/>
+            <w:vAlign w:val="center"/>
+          </w:tcPr>
+          <w:p>
+            <w:pPr>
+              <w:spacing w:before="40" w:after="40" w:line="240" w:lineRule="auto"/>
+              <w:jc w:val="left"/>
+            </w:pPr>
+            <w:r>
+              <w:rPr>
+                <w:sz w:val="18"/>
+                <w:szCs w:val="18"/>
+              </w:rPr>
+              <w:t>Lista as caminhadas da conta, da mais recente para a mais antiga.</w:t>
+            </w:r>
+          </w:p>
+        </w:tc>
+        <w:tc>
+          <w:tcPr>
+            <w:tcW w:w="1754" w:type="dxa"/>
+            <w:vAlign w:val="center"/>
+          </w:tcPr>
+          <w:p>
+            <w:pPr>
+              <w:spacing w:before="40" w:after="40" w:line="240" w:lineRule="auto"/>
+              <w:jc w:val="left"/>
+            </w:pPr>
+            <w:r>
+              <w:rPr>
+                <w:sz w:val="18"/>
+                <w:szCs w:val="18"/>
+              </w:rPr>
+              <w:t>200, 404, 500</w:t>
+            </w:r>
+          </w:p>
+        </w:tc>
+      </w:tr>
+      <w:tr>
+        <w:trPr>
+          <w:cantSplit/>
+        </w:trPr>
+        <w:tc>
+          <w:tcPr>
+            <w:tcW w:w="1000" w:type="dxa"/>
+            <w:vAlign w:val="center"/>
+          </w:tcPr>
+          <w:p>
+            <w:pPr>
+              <w:spacing w:before="40" w:after="40" w:line="240" w:lineRule="auto"/>
+              <w:jc w:val="left"/>
+            </w:pPr>
+            <w:r>
+              <w:rPr>
+                <w:b/>
+                <w:bCs/>
+                <w:sz w:val="18"/>
+                <w:szCs w:val="18"/>
+              </w:rPr>
+              <w:t>GET</w:t>
+            </w:r>
+          </w:p>
+        </w:tc>
+        <w:tc>
+          <w:tcPr>
+            <w:tcW w:w="2750" w:type="dxa"/>
+            <w:vAlign w:val="center"/>
+          </w:tcPr>
+          <w:p>
+            <w:pPr>
+              <w:spacing w:before="40" w:after="40" w:line="240" w:lineRule="auto"/>
+              <w:jc w:val="left"/>
+            </w:pPr>
+            <w:r>
+              <w:rPr>
+                <w:sz w:val="18"/>
+                <w:szCs w:val="18"/>
+              </w:rPr>
+              <w:t>/caminhadas/{id}</w:t>
+            </w:r>
+          </w:p>
+        </w:tc>
+        <w:tc>
+          <w:tcPr>
+            <w:tcW w:w="3000" w:type="dxa"/>
+            <w:vAlign w:val="center"/>
+          </w:tcPr>
+          <w:p>
+            <w:pPr>
+              <w:spacing w:before="40" w:after="40" w:line="240" w:lineRule="auto"/>
+              <w:jc w:val="left"/>
+            </w:pPr>
+            <w:r>
+              <w:rPr>
+                <w:sz w:val="18"/>
+                <w:szCs w:val="18"/>
+              </w:rPr>
+              <w:t>Busca uma caminhada pelo id.</w:t>
+            </w:r>
+          </w:p>
+        </w:tc>
+        <w:tc>
+          <w:tcPr>
+            <w:tcW w:w="1754" w:type="dxa"/>
+            <w:vAlign w:val="center"/>
+          </w:tcPr>
+          <w:p>
+            <w:pPr>
+              <w:spacing w:before="40" w:after="40" w:line="240" w:lineRule="auto"/>
+              <w:jc w:val="left"/>
+            </w:pPr>
+            <w:r>
+              <w:rPr>
+                <w:sz w:val="18"/>
+                <w:szCs w:val="18"/>
+              </w:rPr>
+              <w:t>200, 404, 500</w:t>
+            </w:r>
+          </w:p>
+        </w:tc>
+      </w:tr>
+      <w:tr>
+        <w:trPr>
+          <w:cantSplit/>
+        </w:trPr>
+        <w:tc>
+          <w:tcPr>
+            <w:tcW w:w="1000" w:type="dxa"/>
+            <w:vAlign w:val="center"/>
+          </w:tcPr>
+          <w:p>
+            <w:pPr>
+              <w:spacing w:before="40" w:after="40" w:line="240" w:lineRule="auto"/>
+              <w:jc w:val="left"/>
+            </w:pPr>
+            <w:r>
+              <w:rPr>
+                <w:b/>
+                <w:bCs/>
+                <w:sz w:val="18"/>
+                <w:szCs w:val="18"/>
+              </w:rPr>
+              <w:t>DELETE</w:t>
+            </w:r>
+          </w:p>
+        </w:tc>
+        <w:tc>
+          <w:tcPr>
+            <w:tcW w:w="2750" w:type="dxa"/>
+            <w:vAlign w:val="center"/>
+          </w:tcPr>
+          <w:p>
+            <w:pPr>
+              <w:spacing w:before="40" w:after="40" w:line="240" w:lineRule="auto"/>
+              <w:jc w:val="left"/>
+            </w:pPr>
+            <w:r>
+              <w:rPr>
+                <w:sz w:val="18"/>
+                <w:szCs w:val="18"/>
+              </w:rPr>
+              <w:t>/caminhadas/{id}</w:t>
+            </w:r>
+          </w:p>
+        </w:tc>
+        <w:tc>
+          <w:tcPr>
+            <w:tcW w:w="3000" w:type="dxa"/>
+            <w:vAlign w:val="center"/>
+          </w:tcPr>
+          <w:p>
+            <w:pPr>
+              <w:spacing w:before="40" w:after="40" w:line="240" w:lineRule="auto"/>
+              <w:jc w:val="left"/>
+            </w:pPr>
+            <w:r>
+              <w:rPr>
+                <w:sz w:val="18"/>
+                <w:szCs w:val="18"/>
+              </w:rPr>
+              <w:t>Exclui a caminhada.</w:t>
+            </w:r>
+          </w:p>
+        </w:tc>
+        <w:tc>
+          <w:tcPr>
+            <w:tcW w:w="1754" w:type="dxa"/>
+            <w:vAlign w:val="center"/>
+          </w:tcPr>
+          <w:p>
+            <w:pPr>
+              <w:spacing w:before="40" w:after="40" w:line="240" w:lineRule="auto"/>
+              <w:jc w:val="left"/>
+            </w:pPr>
+            <w:r>
+              <w:rPr>
+                <w:sz w:val="18"/>
+                <w:szCs w:val="18"/>
+              </w:rPr>
+              <w:t>204, 404, 500</w:t>
+            </w:r>
+          </w:p>
+        </w:tc>
+      </w:tr>
+      <w:tr>
+        <w:trPr>
+          <w:cantSplit/>
+        </w:trPr>
+        <w:tc>
+          <w:tcPr>
+            <w:tcW w:w="8504" w:type="dxa"/>
+            <w:gridSpan w:val="4"/>
+            <w:shd w:val="clear" w:color="auto" w:fill="F2F2F2"/>
+            <w:vAlign w:val="center"/>
+          </w:tcPr>
+          <w:p>
+            <w:pPr>
+              <w:keepNext/>
+              <w:spacing w:before="40" w:after="40" w:line="240" w:lineRule="auto"/>
+              <w:jc w:val="left"/>
+            </w:pPr>
+            <w:r>
+              <w:rPr>
+                <w:b/>
+                <w:bCs/>
+                <w:sz w:val="18"/>
+                <w:szCs w:val="18"/>
+              </w:rPr>
+              <w:t>Históricos – /historicos (Meu histórico)</w:t>
+            </w:r>
+          </w:p>
+        </w:tc>
+      </w:tr>
+      <w:tr>
+        <w:trPr>
+          <w:cantSplit/>
+        </w:trPr>
+        <w:tc>
+          <w:tcPr>
+            <w:tcW w:w="1000" w:type="dxa"/>
+            <w:vAlign w:val="center"/>
+          </w:tcPr>
+          <w:p>
+            <w:pPr>
+              <w:spacing w:before="40" w:after="40" w:line="240" w:lineRule="auto"/>
+              <w:jc w:val="left"/>
+            </w:pPr>
+            <w:r>
+              <w:rPr>
+                <w:b/>
+                <w:bCs/>
+                <w:sz w:val="18"/>
+                <w:szCs w:val="18"/>
+              </w:rPr>
+              <w:t>GET</w:t>
+            </w:r>
+          </w:p>
+        </w:tc>
+        <w:tc>
+          <w:tcPr>
+            <w:tcW w:w="2750" w:type="dxa"/>
+            <w:vAlign w:val="center"/>
+          </w:tcPr>
+          <w:p>
+            <w:pPr>
+              <w:spacing w:before="40" w:after="40" w:line="240" w:lineRule="auto"/>
+              <w:jc w:val="left"/>
+            </w:pPr>
+            <w:r>
+              <w:rPr>
+                <w:sz w:val="18"/>
+                <w:szCs w:val="18"/>
+              </w:rPr>
+              <w:t>/historicos/conta/{idConta}?origem={origem}</w:t>
+            </w:r>
+          </w:p>
+        </w:tc>
+        <w:tc>
+          <w:tcPr>
+            <w:tcW w:w="3000" w:type="dxa"/>
+            <w:vAlign w:val="center"/>
+          </w:tcPr>
+          <w:p>
+            <w:pPr>
+              <w:spacing w:before="40" w:after="40" w:line="240" w:lineRule="auto"/>
+              <w:jc w:val="left"/>
+            </w:pPr>
+            <w:r>
+              <w:rPr>
+                <w:sz w:val="18"/>
+                <w:szCs w:val="18"/>
+              </w:rPr>
+              <w:t>Histórico de pontos da conta, com totais. O filtro origem (ex.: CAMINHADA) é opcional.</w:t>
+            </w:r>
+          </w:p>
+        </w:tc>
+        <w:tc>
+          <w:tcPr>
+            <w:tcW w:w="1754" w:type="dxa"/>
+            <w:vAlign w:val="center"/>
+          </w:tcPr>
+          <w:p>
+            <w:pPr>
+              <w:spacing w:before="40" w:after="40" w:line="240" w:lineRule="auto"/>
+              <w:jc w:val="left"/>
+            </w:pPr>
+            <w:r>
+              <w:rPr>
+                <w:sz w:val="18"/>
+                <w:szCs w:val="18"/>
+              </w:rPr>
+              <w:t>200, 400, 404, 500</w:t>
+            </w:r>
+          </w:p>
+        </w:tc>
+      </w:tr>
+      <w:tr>
+        <w:trPr>
+          <w:cantSplit/>
+        </w:trPr>
+        <w:tc>
+          <w:tcPr>
+            <w:tcW w:w="1000" w:type="dxa"/>
+            <w:vAlign w:val="center"/>
+          </w:tcPr>
+          <w:p>
+            <w:pPr>
+              <w:spacing w:before="40" w:after="40" w:line="240" w:lineRule="auto"/>
+              <w:jc w:val="left"/>
+            </w:pPr>
+            <w:r>
+              <w:rPr>
+                <w:b/>
+                <w:bCs/>
+                <w:sz w:val="18"/>
+                <w:szCs w:val="18"/>
+              </w:rPr>
+              <w:t>GET</w:t>
+            </w:r>
+          </w:p>
+        </w:tc>
+        <w:tc>
+          <w:tcPr>
+            <w:tcW w:w="2750" w:type="dxa"/>
+            <w:vAlign w:val="center"/>
+          </w:tcPr>
+          <w:p>
+            <w:pPr>
+              <w:spacing w:before="40" w:after="40" w:line="240" w:lineRule="auto"/>
+              <w:jc w:val="left"/>
+            </w:pPr>
+            <w:r>
+              <w:rPr>
+                <w:sz w:val="18"/>
+                <w:szCs w:val="18"/>
+              </w:rPr>
+              <w:t>/historicos/{id}</w:t>
+            </w:r>
+          </w:p>
+        </w:tc>
+        <w:tc>
+          <w:tcPr>
+            <w:tcW w:w="3000" w:type="dxa"/>
+            <w:vAlign w:val="center"/>
+          </w:tcPr>
+          <w:p>
+            <w:pPr>
+              <w:spacing w:before="40" w:after="40" w:line="240" w:lineRule="auto"/>
+              <w:jc w:val="left"/>
+            </w:pPr>
+            <w:r>
+              <w:rPr>
+                <w:sz w:val="18"/>
+                <w:szCs w:val="18"/>
+              </w:rPr>
+              <w:t>Busca um registro de histórico pelo id.</w:t>
+            </w:r>
+          </w:p>
+        </w:tc>
+        <w:tc>
+          <w:tcPr>
+            <w:tcW w:w="1754" w:type="dxa"/>
+            <w:vAlign w:val="center"/>
+          </w:tcPr>
+          <w:p>
+            <w:pPr>
+              <w:spacing w:before="40" w:after="40" w:line="240" w:lineRule="auto"/>
+              <w:jc w:val="left"/>
+            </w:pPr>
+            <w:r>
+              <w:rPr>
+                <w:sz w:val="18"/>
+                <w:szCs w:val="18"/>
+              </w:rPr>
+              <w:t>200, 404, 500</w:t>
+            </w:r>
+          </w:p>
+        </w:tc>
+      </w:tr>
+      <w:tr>
+        <w:trPr>
+          <w:cantSplit/>
+        </w:trPr>
+        <w:tc>
+          <w:tcPr>
+            <w:tcW w:w="1000" w:type="dxa"/>
+            <w:vAlign w:val="center"/>
+          </w:tcPr>
+          <w:p>
+            <w:pPr>
+              <w:spacing w:before="40" w:after="40" w:line="240" w:lineRule="auto"/>
+              <w:jc w:val="left"/>
+            </w:pPr>
+            <w:r>
+              <w:rPr>
+                <w:b/>
+                <w:bCs/>
+                <w:sz w:val="18"/>
+                <w:szCs w:val="18"/>
+              </w:rPr>
+              <w:t>DELETE</w:t>
+            </w:r>
+          </w:p>
+        </w:tc>
+        <w:tc>
+          <w:tcPr>
+            <w:tcW w:w="2750" w:type="dxa"/>
+            <w:vAlign w:val="center"/>
+          </w:tcPr>
+          <w:p>
+            <w:pPr>
+              <w:spacing w:before="40" w:after="40" w:line="240" w:lineRule="auto"/>
+              <w:jc w:val="left"/>
+            </w:pPr>
+            <w:r>
+              <w:rPr>
+                <w:sz w:val="18"/>
+                <w:szCs w:val="18"/>
+              </w:rPr>
+              <w:t>/historicos/{id}</w:t>
+            </w:r>
+          </w:p>
+        </w:tc>
+        <w:tc>
+          <w:tcPr>
+            <w:tcW w:w="3000" w:type="dxa"/>
+            <w:vAlign w:val="center"/>
+          </w:tcPr>
+          <w:p>
+            <w:pPr>
+              <w:spacing w:before="40" w:after="40" w:line="240" w:lineRule="auto"/>
+              <w:jc w:val="left"/>
+            </w:pPr>
+            <w:r>
+              <w:rPr>
+                <w:sz w:val="18"/>
+                <w:szCs w:val="18"/>
+              </w:rPr>
+              <w:t>Exclui um registro de histórico.</w:t>
+            </w:r>
+          </w:p>
+        </w:tc>
+        <w:tc>
+          <w:tcPr>
+            <w:tcW w:w="1754" w:type="dxa"/>
+            <w:vAlign w:val="center"/>
+          </w:tcPr>
+          <w:p>
+            <w:pPr>
+              <w:spacing w:before="40" w:after="40" w:line="240" w:lineRule="auto"/>
+              <w:jc w:val="left"/>
+            </w:pPr>
+            <w:r>
+              <w:rPr>
+                <w:sz w:val="18"/>
+                <w:szCs w:val="18"/>
+              </w:rPr>
+              <w:t>204, 404, 500</w:t>
+            </w:r>
+          </w:p>
+        </w:tc>
+      </w:tr>
+    </w:tbl>
+    <w:p>
+      <w:pPr>
+        <w:spacing w:before="200" w:after="80"/>
+      </w:pPr>
+      <w:r>
+        <w:rPr>
+          <w:b/>
+          <w:bCs/>
+        </w:rPr>
+        <w:t>Significado dos códigos de status</w:t>
+      </w:r>
+    </w:p>
+    <w:p>
+      <w:r>
+        <w:rPr>
+          <w:b/>
+          <w:bCs/>
+        </w:rPr>
+        <w:t xml:space="preserve">200 OK: </w:t>
+      </w:r>
+      <w:r>
+        <w:t xml:space="preserve">requisição concluída com sucesso e dados retornados. </w:t>
+      </w:r>
+    </w:p>
+    <w:p>
+      <w:r>
+        <w:rPr>
+          <w:b/>
+          <w:bCs/>
+        </w:rPr>
+        <w:t xml:space="preserve">201 </w:t>
+      </w:r>
+      <w:proofErr w:type="spellStart"/>
+      <w:r>
+        <w:rPr>
+          <w:b/>
+          <w:bCs/>
+        </w:rPr>
+        <w:t>Created</w:t>
+      </w:r>
+      <w:proofErr w:type="spellEnd"/>
+      <w:r>
+        <w:rPr>
+          <w:b/>
+          <w:bCs/>
+        </w:rPr>
+        <w:t xml:space="preserve">: </w:t>
+      </w:r>
+      <w:r>
+        <w:t xml:space="preserve">recurso criado. </w:t>
+      </w:r>
+    </w:p>
+    <w:p>
+      <w:r>
+        <w:rPr>
+          <w:b/>
+          <w:bCs/>
+        </w:rPr>
         <w:lastRenderedPageBreak/>
-        <w:t xml:space="preserve">2. Tabela de </w:t>
+        <w:t xml:space="preserve">204 No </w:t>
       </w:r>
       <w:proofErr w:type="spellStart"/>
       <w:r>
-        <w:t>Endpoints</w:t>
+        <w:rPr>
+          <w:b/>
+          <w:bCs/>
+        </w:rPr>
+        <w:t>Content</w:t>
       </w:r>
       <w:proofErr w:type="spellEnd"/>
       <w:r>
-        <w:t xml:space="preserve"> (API </w:t>
+        <w:rPr>
+          <w:b/>
+          <w:bCs/>
+        </w:rPr>
+        <w:t xml:space="preserve">: </w:t>
+      </w:r>
+      <w:r>
+        <w:t xml:space="preserve">operação concluída, sem corpo de resposta. </w:t>
+      </w:r>
+    </w:p>
+    <w:p>
+      <w:r>
+        <w:rPr>
+          <w:b/>
+          <w:bCs/>
+        </w:rPr>
+        <w:t xml:space="preserve">400 </w:t>
       </w:r>
       <w:proofErr w:type="spellStart"/>
       <w:r>
-        <w:t>RESTful</w:t>
+        <w:rPr>
+          <w:b/>
+          <w:bCs/>
+        </w:rPr>
+        <w:t>Bad</w:t>
       </w:r>
       <w:proofErr w:type="spellEnd"/>
       <w:r>
-        <w:t>)</w:t>
-      </w:r>
-    </w:p>
-    <w:p>
-      <w:pPr>
-        <w:pStyle w:val="Heading1"/>
+        <w:rPr>
+          <w:b/>
+          <w:bCs/>
+        </w:rPr>
+        <w:t xml:space="preserve"> </w:t>
+      </w:r>
+      <w:proofErr w:type="spellStart"/>
+      <w:r>
+        <w:rPr>
+          <w:b/>
+          <w:bCs/>
+        </w:rPr>
+        <w:t>Request</w:t>
+      </w:r>
+      <w:proofErr w:type="spellEnd"/>
+      <w:r>
+        <w:rPr>
+          <w:b/>
+          <w:bCs/>
+        </w:rPr>
+        <w:t xml:space="preserve">: </w:t>
+      </w:r>
+      <w:r>
+        <w:t xml:space="preserve">dados inválidos ou regra de negócio violada. </w:t>
+      </w:r>
+    </w:p>
+    <w:p>
+      <w:r>
+        <w:rPr>
+          <w:b/>
+          <w:bCs/>
+        </w:rPr>
+        <w:t xml:space="preserve">401 </w:t>
+      </w:r>
+      <w:proofErr w:type="spellStart"/>
+      <w:r>
+        <w:rPr>
+          <w:b/>
+          <w:bCs/>
+        </w:rPr>
+        <w:t>Unauthorized</w:t>
+      </w:r>
+      <w:proofErr w:type="spellEnd"/>
+      <w:r>
+        <w:rPr>
+          <w:b/>
+          <w:bCs/>
+        </w:rPr>
+        <w:t xml:space="preserve">: </w:t>
+      </w:r>
+      <w:r>
+        <w:t xml:space="preserve">e-mail ou senha inválidos. </w:t>
+      </w:r>
+    </w:p>
+    <w:p>
+      <w:r>
+        <w:rPr>
+          <w:b/>
+          <w:bCs/>
+        </w:rPr>
+        <w:t xml:space="preserve">404 </w:t>
+      </w:r>
+      <w:proofErr w:type="spellStart"/>
+      <w:r>
+        <w:rPr>
+          <w:b/>
+          <w:bCs/>
+        </w:rPr>
+        <w:t>Not</w:t>
+      </w:r>
+      <w:proofErr w:type="spellEnd"/>
+      <w:r>
+        <w:rPr>
+          <w:b/>
+          <w:bCs/>
+        </w:rPr>
+        <w:t xml:space="preserve"> </w:t>
+      </w:r>
+      <w:proofErr w:type="spellStart"/>
+      <w:r>
+        <w:rPr>
+          <w:b/>
+          <w:bCs/>
+        </w:rPr>
+        <w:t>Found</w:t>
+      </w:r>
+      <w:proofErr w:type="spellEnd"/>
+      <w:r>
+        <w:rPr>
+          <w:b/>
+          <w:bCs/>
+        </w:rPr>
+        <w:t xml:space="preserve">: </w:t>
+      </w:r>
+      <w:r>
+        <w:t xml:space="preserve">recurso não encontrado. </w:t>
+      </w:r>
+    </w:p>
+    <w:p>
+      <w:r>
+        <w:rPr>
+          <w:b/>
+          <w:bCs/>
+        </w:rPr>
+        <w:t xml:space="preserve">409 </w:t>
+      </w:r>
+      <w:proofErr w:type="spellStart"/>
+      <w:r>
+        <w:rPr>
+          <w:b/>
+          <w:bCs/>
+        </w:rPr>
+        <w:t>Conflict</w:t>
+      </w:r>
+      <w:proofErr w:type="spellEnd"/>
+      <w:r>
+        <w:rPr>
+          <w:b/>
+          <w:bCs/>
+        </w:rPr>
+        <w:t xml:space="preserve">: </w:t>
+      </w:r>
+      <w:r>
+        <w:t xml:space="preserve">conflito com o estado atual, como e-mail já cadastrado ou conta inativa. </w:t>
+      </w:r>
+    </w:p>
+    <w:p>
+      <w:r>
+        <w:rPr>
+          <w:b/>
+          <w:bCs/>
+        </w:rPr>
+        <w:t xml:space="preserve">500 </w:t>
+      </w:r>
+      <w:proofErr w:type="spellStart"/>
+      <w:r>
+        <w:rPr>
+          <w:b/>
+          <w:bCs/>
+        </w:rPr>
+        <w:t>Internal</w:t>
+      </w:r>
+      <w:proofErr w:type="spellEnd"/>
+      <w:r>
+        <w:rPr>
+          <w:b/>
+          <w:bCs/>
+        </w:rPr>
+        <w:t xml:space="preserve"> Server </w:t>
+      </w:r>
+      <w:proofErr w:type="spellStart"/>
+      <w:r>
+        <w:rPr>
+          <w:b/>
+          <w:bCs/>
+        </w:rPr>
+        <w:t>Error</w:t>
+      </w:r>
+      <w:proofErr w:type="spellEnd"/>
+      <w:r>
+        <w:rPr>
+          <w:b/>
+          <w:bCs/>
+        </w:rPr>
+        <w:t xml:space="preserve">: </w:t>
+      </w:r>
+      <w:r>
+        <w:t>falha inesperada, como indisponibilidade do banco de dados; pode ocorrer em qualquer endpoint.</w:t>
+      </w:r>
+    </w:p>
+    <w:p>
+      <w:pPr>
+        <w:pStyle w:val="Ttulo1"/>
       </w:pPr>
       <w:r>
         <w:t>3</w:t>
@@ -2231,7 +5321,7 @@
     </w:p>
     <w:p>
       <w:pPr>
-        <w:pStyle w:val="Heading1"/>
+        <w:pStyle w:val="Ttulo1"/>
       </w:pPr>
       <w:r>
         <w:t>4</w:t>
@@ -2254,7 +5344,7 @@
           <w:lang w:val="en-US"/>
         </w:rPr>
         <w:drawing>
-          <wp:inline distT="0" distB="0" distL="0" distR="0" wp14:anchorId="7CDA4E5B" wp14:editId="3531DE18">
+          <wp:inline distT="0" distB="0" distL="0" distR="0" wp14:anchorId="7AB477B8" wp14:editId="7861D6BC">
             <wp:extent cx="4333152" cy="3455719"/>
             <wp:effectExtent l="0" t="0" r="0" b="0"/>
             <wp:docPr id="5" name="Picture 5"/>
@@ -2307,16 +5397,16 @@
       <w:bookmarkStart w:id="9" w:name="_Toc240009161"/>
     </w:p>
     <w:p/>
-    <w:p/>
-    <w:p/>
-    <w:p/>
-    <w:p/>
-    <w:p/>
-    <w:p/>
-    <w:p/>
-    <w:p>
-      <w:pPr>
-        <w:pStyle w:val="Heading1"/>
+    <w:p>
+      <w:pPr>
+        <w:rPr>
+          <w:u w:val="single"/>
+        </w:rPr>
+      </w:pPr>
+    </w:p>
+    <w:p>
+      <w:pPr>
+        <w:pStyle w:val="Ttulo1"/>
       </w:pPr>
       <w:r>
         <w:lastRenderedPageBreak/>
@@ -2336,7 +5426,7 @@
           <w:noProof/>
         </w:rPr>
         <w:drawing>
-          <wp:inline distT="0" distB="0" distL="0" distR="0" wp14:anchorId="21D948BA" wp14:editId="3401E349">
+          <wp:inline distT="0" distB="0" distL="0" distR="0" wp14:anchorId="5C77E51A" wp14:editId="7E9D0B8E">
             <wp:extent cx="4144903" cy="3220995"/>
             <wp:effectExtent l="0" t="0" r="8255" b="0"/>
             <wp:docPr id="1047754742" name="Imagem 2"/>
@@ -2387,7 +5477,7 @@
     </w:p>
     <w:p>
       <w:pPr>
-        <w:pStyle w:val="Heading1"/>
+        <w:pStyle w:val="Ttulo1"/>
       </w:pPr>
       <w:bookmarkStart w:id="10" w:name="_Toc240009162"/>
       <w:r>
@@ -2492,7 +5582,7 @@
 </file>
 
 <file path=word/endnotes.xml><?xml version="1.0" encoding="utf-8"?>
-<w:endnotes xmlns:wpc="http://schemas.microsoft.com/office/word/2010/wordprocessingCanvas" xmlns:cx="http://schemas.microsoft.com/office/drawing/2014/chartex" xmlns:cx1="http://schemas.microsoft.com/office/drawing/2015/9/8/chartex" xmlns:cx2="http://schemas.microsoft.com/office/drawing/2015/10/21/chartex" xmlns:cx3="http://schemas.microsoft.com/office/drawing/2016/5/9/chartex" xmlns:cx4="http://schemas.microsoft.com/office/drawing/2016/5/10/chartex" xmlns:cx5="http://schemas.microsoft.com/office/drawing/2016/5/11/chartex" xmlns:cx6="http://schemas.microsoft.com/office/drawing/2016/5/12/chartex" xmlns:cx7="http://schemas.microsoft.com/office/drawing/2016/5/13/chartex" xmlns:cx8="http://schemas.microsoft.com/office/drawing/2016/5/14/chartex" xmlns:mc="http://schemas.openxmlformats.org/markup-compatibility/2006" xmlns:aink="http://schemas.microsoft.com/office/drawing/2016/ink" xmlns:am3d="http://schemas.microsoft.com/office/drawing/2017/model3d" xmlns:o="urn:schemas-microsoft-com:office:office" xmlns:oel="http://schemas.microsoft.com/office/2019/extlst" xmlns:r="http://schemas.openxmlformats.org/officeDocument/2006/relationships" xmlns:m="http://schemas.openxmlformats.org/officeDocument/2006/math" xmlns:v="urn:schemas-microsoft-com:vml" xmlns:wp14="http://schemas.microsoft.com/office/word/2010/wordprocessingDrawing" xmlns:wp="http://schemas.openxmlformats.org/drawingml/2006/wordprocessingDrawing" xmlns:w10="urn:schemas-microsoft-com:office:word" xmlns:w="http://schemas.openxmlformats.org/wordprocessingml/2006/main" xmlns:w14="http://schemas.microsoft.com/office/word/2010/wordml" xmlns:w15="http://schemas.microsoft.com/office/word/2012/wordml" xmlns:w16cex="http://schemas.microsoft.com/office/word/2018/wordml/cex" xmlns:w16cid="http://schemas.microsoft.com/office/word/2016/wordml/cid" xmlns:w16="http://schemas.microsoft.com/office/word/2018/wordml" xmlns:w16sdtdh="http://schemas.microsoft.com/office/word/2020/wordml/sdtdatahash" xmlns:w16se="http://schemas.microsoft.com/office/word/2015/wordml/symex" xmlns:wpg="http://schemas.microsoft.com/office/word/2010/wordprocessingGroup" xmlns:wpi="http://schemas.microsoft.com/office/word/2010/wordprocessingInk" xmlns:wne="http://schemas.microsoft.com/office/word/2006/wordml" xmlns:wps="http://schemas.microsoft.com/office/word/2010/wordprocessingShape" mc:Ignorable="w14 w15 w16se w16cid w16 w16cex w16sdtdh wp14">
+<w:endnotes xmlns:wpc="http://schemas.microsoft.com/office/word/2010/wordprocessingCanvas" xmlns:cx="http://schemas.microsoft.com/office/drawing/2014/chartex" xmlns:cx1="http://schemas.microsoft.com/office/drawing/2015/9/8/chartex" xmlns:cx2="http://schemas.microsoft.com/office/drawing/2015/10/21/chartex" xmlns:cx3="http://schemas.microsoft.com/office/drawing/2016/5/9/chartex" xmlns:cx4="http://schemas.microsoft.com/office/drawing/2016/5/10/chartex" xmlns:cx5="http://schemas.microsoft.com/office/drawing/2016/5/11/chartex" xmlns:cx6="http://schemas.microsoft.com/office/drawing/2016/5/12/chartex" xmlns:cx7="http://schemas.microsoft.com/office/drawing/2016/5/13/chartex" xmlns:cx8="http://schemas.microsoft.com/office/drawing/2016/5/14/chartex" xmlns:mc="http://schemas.openxmlformats.org/markup-compatibility/2006" xmlns:aink="http://schemas.microsoft.com/office/drawing/2016/ink" xmlns:am3d="http://schemas.microsoft.com/office/drawing/2017/model3d" xmlns:o="urn:schemas-microsoft-com:office:office" xmlns:oel="http://schemas.microsoft.com/office/2019/extlst" xmlns:r="http://schemas.openxmlformats.org/officeDocument/2006/relationships" xmlns:m="http://schemas.openxmlformats.org/officeDocument/2006/math" xmlns:v="urn:schemas-microsoft-com:vml" xmlns:wp14="http://schemas.microsoft.com/office/word/2010/wordprocessingDrawing" xmlns:wp="http://schemas.openxmlformats.org/drawingml/2006/wordprocessingDrawing" xmlns:w10="urn:schemas-microsoft-com:office:word" xmlns:w="http://schemas.openxmlformats.org/wordprocessingml/2006/main" xmlns:w14="http://schemas.microsoft.com/office/word/2010/wordml" xmlns:w15="http://schemas.microsoft.com/office/word/2012/wordml" xmlns:w16cex="http://schemas.microsoft.com/office/word/2018/wordml/cex" xmlns:w16cid="http://schemas.microsoft.com/office/word/2016/wordml/cid" xmlns:w16="http://schemas.microsoft.com/office/word/2018/wordml" xmlns:w16du="http://schemas.microsoft.com/office/word/2023/wordml/word16du" xmlns:w16sdtdh="http://schemas.microsoft.com/office/word/2020/wordml/sdtdatahash" xmlns:w16se="http://schemas.microsoft.com/office/word/2015/wordml/symex" xmlns:wpg="http://schemas.microsoft.com/office/word/2010/wordprocessingGroup" xmlns:wpi="http://schemas.microsoft.com/office/word/2010/wordprocessingInk" xmlns:wne="http://schemas.microsoft.com/office/word/2006/wordml" xmlns:wps="http://schemas.microsoft.com/office/word/2010/wordprocessingShape" mc:Ignorable="w14 w15 w16se w16cid w16 w16cex w16sdtdh w16du wp14">
   <w:endnote w:type="separator" w:id="-1">
     <w:p>
       <w:pPr>
@@ -2517,7 +5607,7 @@
 </file>
 
 <file path=word/footnotes.xml><?xml version="1.0" encoding="utf-8"?>
-<w:footnotes xmlns:wpc="http://schemas.microsoft.com/office/word/2010/wordprocessingCanvas" xmlns:cx="http://schemas.microsoft.com/office/drawing/2014/chartex" xmlns:cx1="http://schemas.microsoft.com/office/drawing/2015/9/8/chartex" xmlns:cx2="http://schemas.microsoft.com/office/drawing/2015/10/21/chartex" xmlns:cx3="http://schemas.microsoft.com/office/drawing/2016/5/9/chartex" xmlns:cx4="http://schemas.microsoft.com/office/drawing/2016/5/10/chartex" xmlns:cx5="http://schemas.microsoft.com/office/drawing/2016/5/11/chartex" xmlns:cx6="http://schemas.microsoft.com/office/drawing/2016/5/12/chartex" xmlns:cx7="http://schemas.microsoft.com/office/drawing/2016/5/13/chartex" xmlns:cx8="http://schemas.microsoft.com/office/drawing/2016/5/14/chartex" xmlns:mc="http://schemas.openxmlformats.org/markup-compatibility/2006" xmlns:aink="http://schemas.microsoft.com/office/drawing/2016/ink" xmlns:am3d="http://schemas.microsoft.com/office/drawing/2017/model3d" xmlns:o="urn:schemas-microsoft-com:office:office" xmlns:oel="http://schemas.microsoft.com/office/2019/extlst" xmlns:r="http://schemas.openxmlformats.org/officeDocument/2006/relationships" xmlns:m="http://schemas.openxmlformats.org/officeDocument/2006/math" xmlns:v="urn:schemas-microsoft-com:vml" xmlns:wp14="http://schemas.microsoft.com/office/word/2010/wordprocessingDrawing" xmlns:wp="http://schemas.openxmlformats.org/drawingml/2006/wordprocessingDrawing" xmlns:w10="urn:schemas-microsoft-com:office:word" xmlns:w="http://schemas.openxmlformats.org/wordprocessingml/2006/main" xmlns:w14="http://schemas.microsoft.com/office/word/2010/wordml" xmlns:w15="http://schemas.microsoft.com/office/word/2012/wordml" xmlns:w16cex="http://schemas.microsoft.com/office/word/2018/wordml/cex" xmlns:w16cid="http://schemas.microsoft.com/office/word/2016/wordml/cid" xmlns:w16="http://schemas.microsoft.com/office/word/2018/wordml" xmlns:w16sdtdh="http://schemas.microsoft.com/office/word/2020/wordml/sdtdatahash" xmlns:w16se="http://schemas.microsoft.com/office/word/2015/wordml/symex" xmlns:wpg="http://schemas.microsoft.com/office/word/2010/wordprocessingGroup" xmlns:wpi="http://schemas.microsoft.com/office/word/2010/wordprocessingInk" xmlns:wne="http://schemas.microsoft.com/office/word/2006/wordml" xmlns:wps="http://schemas.microsoft.com/office/word/2010/wordprocessingShape" mc:Ignorable="w14 w15 w16se w16cid w16 w16cex w16sdtdh wp14">
+<w:footnotes xmlns:wpc="http://schemas.microsoft.com/office/word/2010/wordprocessingCanvas" xmlns:cx="http://schemas.microsoft.com/office/drawing/2014/chartex" xmlns:cx1="http://schemas.microsoft.com/office/drawing/2015/9/8/chartex" xmlns:cx2="http://schemas.microsoft.com/office/drawing/2015/10/21/chartex" xmlns:cx3="http://schemas.microsoft.com/office/drawing/2016/5/9/chartex" xmlns:cx4="http://schemas.microsoft.com/office/drawing/2016/5/10/chartex" xmlns:cx5="http://schemas.microsoft.com/office/drawing/2016/5/11/chartex" xmlns:cx6="http://schemas.microsoft.com/office/drawing/2016/5/12/chartex" xmlns:cx7="http://schemas.microsoft.com/office/drawing/2016/5/13/chartex" xmlns:cx8="http://schemas.microsoft.com/office/drawing/2016/5/14/chartex" xmlns:mc="http://schemas.openxmlformats.org/markup-compatibility/2006" xmlns:aink="http://schemas.microsoft.com/office/drawing/2016/ink" xmlns:am3d="http://schemas.microsoft.com/office/drawing/2017/model3d" xmlns:o="urn:schemas-microsoft-com:office:office" xmlns:oel="http://schemas.microsoft.com/office/2019/extlst" xmlns:r="http://schemas.openxmlformats.org/officeDocument/2006/relationships" xmlns:m="http://schemas.openxmlformats.org/officeDocument/2006/math" xmlns:v="urn:schemas-microsoft-com:vml" xmlns:wp14="http://schemas.microsoft.com/office/word/2010/wordprocessingDrawing" xmlns:wp="http://schemas.openxmlformats.org/drawingml/2006/wordprocessingDrawing" xmlns:w10="urn:schemas-microsoft-com:office:word" xmlns:w="http://schemas.openxmlformats.org/wordprocessingml/2006/main" xmlns:w14="http://schemas.microsoft.com/office/word/2010/wordml" xmlns:w15="http://schemas.microsoft.com/office/word/2012/wordml" xmlns:w16cex="http://schemas.microsoft.com/office/word/2018/wordml/cex" xmlns:w16cid="http://schemas.microsoft.com/office/word/2016/wordml/cid" xmlns:w16="http://schemas.microsoft.com/office/word/2018/wordml" xmlns:w16du="http://schemas.microsoft.com/office/word/2023/wordml/word16du" xmlns:w16sdtdh="http://schemas.microsoft.com/office/word/2020/wordml/sdtdatahash" xmlns:w16se="http://schemas.microsoft.com/office/word/2015/wordml/symex" xmlns:wpg="http://schemas.microsoft.com/office/word/2010/wordprocessingGroup" xmlns:wpi="http://schemas.microsoft.com/office/word/2010/wordprocessingInk" xmlns:wne="http://schemas.microsoft.com/office/word/2006/wordml" xmlns:wps="http://schemas.microsoft.com/office/word/2010/wordprocessingShape" mc:Ignorable="w14 w15 w16se w16cid w16 w16cex w16sdtdh w16du wp14">
   <w:footnote w:type="separator" w:id="-1">
     <w:p>
       <w:pPr>
@@ -2542,7 +5632,7 @@
 </file>
 
 <file path=word/header1.xml><?xml version="1.0" encoding="utf-8"?>
-<w:hdr xmlns:wpc="http://schemas.microsoft.com/office/word/2010/wordprocessingCanvas" xmlns:cx="http://schemas.microsoft.com/office/drawing/2014/chartex" xmlns:cx1="http://schemas.microsoft.com/office/drawing/2015/9/8/chartex" xmlns:cx2="http://schemas.microsoft.com/office/drawing/2015/10/21/chartex" xmlns:cx3="http://schemas.microsoft.com/office/drawing/2016/5/9/chartex" xmlns:cx4="http://schemas.microsoft.com/office/drawing/2016/5/10/chartex" xmlns:cx5="http://schemas.microsoft.com/office/drawing/2016/5/11/chartex" xmlns:cx6="http://schemas.microsoft.com/office/drawing/2016/5/12/chartex" xmlns:cx7="http://schemas.microsoft.com/office/drawing/2016/5/13/chartex" xmlns:cx8="http://schemas.microsoft.com/office/drawing/2016/5/14/chartex" xmlns:mc="http://schemas.openxmlformats.org/markup-compatibility/2006" xmlns:aink="http://schemas.microsoft.com/office/drawing/2016/ink" xmlns:am3d="http://schemas.microsoft.com/office/drawing/2017/model3d" xmlns:o="urn:schemas-microsoft-com:office:office" xmlns:oel="http://schemas.microsoft.com/office/2019/extlst" xmlns:r="http://schemas.openxmlformats.org/officeDocument/2006/relationships" xmlns:m="http://schemas.openxmlformats.org/officeDocument/2006/math" xmlns:v="urn:schemas-microsoft-com:vml" xmlns:wp14="http://schemas.microsoft.com/office/word/2010/wordprocessingDrawing" xmlns:wp="http://schemas.openxmlformats.org/drawingml/2006/wordprocessingDrawing" xmlns:w10="urn:schemas-microsoft-com:office:word" xmlns:w="http://schemas.openxmlformats.org/wordprocessingml/2006/main" xmlns:w14="http://schemas.microsoft.com/office/word/2010/wordml" xmlns:w15="http://schemas.microsoft.com/office/word/2012/wordml" xmlns:w16cex="http://schemas.microsoft.com/office/word/2018/wordml/cex" xmlns:w16cid="http://schemas.microsoft.com/office/word/2016/wordml/cid" xmlns:w16="http://schemas.microsoft.com/office/word/2018/wordml" xmlns:w16sdtdh="http://schemas.microsoft.com/office/word/2020/wordml/sdtdatahash" xmlns:w16se="http://schemas.microsoft.com/office/word/2015/wordml/symex" xmlns:wpg="http://schemas.microsoft.com/office/word/2010/wordprocessingGroup" xmlns:wpi="http://schemas.microsoft.com/office/word/2010/wordprocessingInk" xmlns:wne="http://schemas.microsoft.com/office/word/2006/wordml" xmlns:wps="http://schemas.microsoft.com/office/word/2010/wordprocessingShape" mc:Ignorable="w14 w15 w16se w16cid w16 w16cex w16sdtdh wp14">
+<w:hdr xmlns:wpc="http://schemas.microsoft.com/office/word/2010/wordprocessingCanvas" xmlns:cx="http://schemas.microsoft.com/office/drawing/2014/chartex" xmlns:cx1="http://schemas.microsoft.com/office/drawing/2015/9/8/chartex" xmlns:cx2="http://schemas.microsoft.com/office/drawing/2015/10/21/chartex" xmlns:cx3="http://schemas.microsoft.com/office/drawing/2016/5/9/chartex" xmlns:cx4="http://schemas.microsoft.com/office/drawing/2016/5/10/chartex" xmlns:cx5="http://schemas.microsoft.com/office/drawing/2016/5/11/chartex" xmlns:cx6="http://schemas.microsoft.com/office/drawing/2016/5/12/chartex" xmlns:cx7="http://schemas.microsoft.com/office/drawing/2016/5/13/chartex" xmlns:cx8="http://schemas.microsoft.com/office/drawing/2016/5/14/chartex" xmlns:mc="http://schemas.openxmlformats.org/markup-compatibility/2006" xmlns:aink="http://schemas.microsoft.com/office/drawing/2016/ink" xmlns:am3d="http://schemas.microsoft.com/office/drawing/2017/model3d" xmlns:o="urn:schemas-microsoft-com:office:office" xmlns:oel="http://schemas.microsoft.com/office/2019/extlst" xmlns:r="http://schemas.openxmlformats.org/officeDocument/2006/relationships" xmlns:m="http://schemas.openxmlformats.org/officeDocument/2006/math" xmlns:v="urn:schemas-microsoft-com:vml" xmlns:wp14="http://schemas.microsoft.com/office/word/2010/wordprocessingDrawing" xmlns:wp="http://schemas.openxmlformats.org/drawingml/2006/wordprocessingDrawing" xmlns:w10="urn:schemas-microsoft-com:office:word" xmlns:w="http://schemas.openxmlformats.org/wordprocessingml/2006/main" xmlns:w14="http://schemas.microsoft.com/office/word/2010/wordml" xmlns:w15="http://schemas.microsoft.com/office/word/2012/wordml" xmlns:w16cex="http://schemas.microsoft.com/office/word/2018/wordml/cex" xmlns:w16cid="http://schemas.microsoft.com/office/word/2016/wordml/cid" xmlns:w16="http://schemas.microsoft.com/office/word/2018/wordml" xmlns:w16du="http://schemas.microsoft.com/office/word/2023/wordml/word16du" xmlns:w16sdtdh="http://schemas.microsoft.com/office/word/2020/wordml/sdtdatahash" xmlns:w16se="http://schemas.microsoft.com/office/word/2015/wordml/symex" xmlns:wpg="http://schemas.microsoft.com/office/word/2010/wordprocessingGroup" xmlns:wpi="http://schemas.microsoft.com/office/word/2010/wordprocessingInk" xmlns:wne="http://schemas.microsoft.com/office/word/2006/wordml" xmlns:wps="http://schemas.microsoft.com/office/word/2010/wordprocessingShape" mc:Ignorable="w14 w15 w16se w16cid w16 w16cex w16sdtdh w16du wp14">
   <w:sdt>
     <w:sdtPr>
       <w:id w:val="-1213418629"/>
@@ -2559,7 +5649,7 @@
     <w:sdtContent>
       <w:p>
         <w:pPr>
-          <w:pStyle w:val="Header"/>
+          <w:pStyle w:val="Cabealho"/>
           <w:jc w:val="right"/>
         </w:pPr>
         <w:r>
@@ -2588,14 +5678,14 @@
   </w:sdt>
   <w:p>
     <w:pPr>
-      <w:pStyle w:val="Header"/>
+      <w:pStyle w:val="Cabealho"/>
     </w:pPr>
   </w:p>
 </w:hdr>
 </file>
 
 <file path=word/numbering.xml><?xml version="1.0" encoding="utf-8"?>
-<w:numbering xmlns:wpc="http://schemas.microsoft.com/office/word/2010/wordprocessingCanvas" xmlns:cx="http://schemas.microsoft.com/office/drawing/2014/chartex" xmlns:cx1="http://schemas.microsoft.com/office/drawing/2015/9/8/chartex" xmlns:cx2="http://schemas.microsoft.com/office/drawing/2015/10/21/chartex" xmlns:cx3="http://schemas.microsoft.com/office/drawing/2016/5/9/chartex" xmlns:cx4="http://schemas.microsoft.com/office/drawing/2016/5/10/chartex" xmlns:cx5="http://schemas.microsoft.com/office/drawing/2016/5/11/chartex" xmlns:cx6="http://schemas.microsoft.com/office/drawing/2016/5/12/chartex" xmlns:cx7="http://schemas.microsoft.com/office/drawing/2016/5/13/chartex" xmlns:cx8="http://schemas.microsoft.com/office/drawing/2016/5/14/chartex" xmlns:mc="http://schemas.openxmlformats.org/markup-compatibility/2006" xmlns:aink="http://schemas.microsoft.com/office/drawing/2016/ink" xmlns:am3d="http://schemas.microsoft.com/office/drawing/2017/model3d" xmlns:o="urn:schemas-microsoft-com:office:office" xmlns:oel="http://schemas.microsoft.com/office/2019/extlst" xmlns:r="http://schemas.openxmlformats.org/officeDocument/2006/relationships" xmlns:m="http://schemas.openxmlformats.org/officeDocument/2006/math" xmlns:v="urn:schemas-microsoft-com:vml" xmlns:wp14="http://schemas.microsoft.com/office/word/2010/wordprocessingDrawing" xmlns:wp="http://schemas.openxmlformats.org/drawingml/2006/wordprocessingDrawing" xmlns:w10="urn:schemas-microsoft-com:office:word" xmlns:w="http://schemas.openxmlformats.org/wordprocessingml/2006/main" xmlns:w14="http://schemas.microsoft.com/office/word/2010/wordml" xmlns:w15="http://schemas.microsoft.com/office/word/2012/wordml" xmlns:w16cex="http://schemas.microsoft.com/office/word/2018/wordml/cex" xmlns:w16cid="http://schemas.microsoft.com/office/word/2016/wordml/cid" xmlns:w16="http://schemas.microsoft.com/office/word/2018/wordml" xmlns:w16sdtdh="http://schemas.microsoft.com/office/word/2020/wordml/sdtdatahash" xmlns:w16se="http://schemas.microsoft.com/office/word/2015/wordml/symex" xmlns:wpg="http://schemas.microsoft.com/office/word/2010/wordprocessingGroup" xmlns:wpi="http://schemas.microsoft.com/office/word/2010/wordprocessingInk" xmlns:wne="http://schemas.microsoft.com/office/word/2006/wordml" xmlns:wps="http://schemas.microsoft.com/office/word/2010/wordprocessingShape" mc:Ignorable="w14 w15 w16se w16cid w16 w16cex w16sdtdh wp14">
+<w:numbering xmlns:wpc="http://schemas.microsoft.com/office/word/2010/wordprocessingCanvas" xmlns:cx="http://schemas.microsoft.com/office/drawing/2014/chartex" xmlns:cx1="http://schemas.microsoft.com/office/drawing/2015/9/8/chartex" xmlns:cx2="http://schemas.microsoft.com/office/drawing/2015/10/21/chartex" xmlns:cx3="http://schemas.microsoft.com/office/drawing/2016/5/9/chartex" xmlns:cx4="http://schemas.microsoft.com/office/drawing/2016/5/10/chartex" xmlns:cx5="http://schemas.microsoft.com/office/drawing/2016/5/11/chartex" xmlns:cx6="http://schemas.microsoft.com/office/drawing/2016/5/12/chartex" xmlns:cx7="http://schemas.microsoft.com/office/drawing/2016/5/13/chartex" xmlns:cx8="http://schemas.microsoft.com/office/drawing/2016/5/14/chartex" xmlns:mc="http://schemas.openxmlformats.org/markup-compatibility/2006" xmlns:aink="http://schemas.microsoft.com/office/drawing/2016/ink" xmlns:am3d="http://schemas.microsoft.com/office/drawing/2017/model3d" xmlns:o="urn:schemas-microsoft-com:office:office" xmlns:oel="http://schemas.microsoft.com/office/2019/extlst" xmlns:r="http://schemas.openxmlformats.org/officeDocument/2006/relationships" xmlns:m="http://schemas.openxmlformats.org/officeDocument/2006/math" xmlns:v="urn:schemas-microsoft-com:vml" xmlns:wp14="http://schemas.microsoft.com/office/word/2010/wordprocessingDrawing" xmlns:wp="http://schemas.openxmlformats.org/drawingml/2006/wordprocessingDrawing" xmlns:w10="urn:schemas-microsoft-com:office:word" xmlns:w="http://schemas.openxmlformats.org/wordprocessingml/2006/main" xmlns:w14="http://schemas.microsoft.com/office/word/2010/wordml" xmlns:w15="http://schemas.microsoft.com/office/word/2012/wordml" xmlns:w16cex="http://schemas.microsoft.com/office/word/2018/wordml/cex" xmlns:w16cid="http://schemas.microsoft.com/office/word/2016/wordml/cid" xmlns:w16="http://schemas.microsoft.com/office/word/2018/wordml" xmlns:w16du="http://schemas.microsoft.com/office/word/2023/wordml/word16du" xmlns:w16sdtdh="http://schemas.microsoft.com/office/word/2020/wordml/sdtdatahash" xmlns:w16se="http://schemas.microsoft.com/office/word/2015/wordml/symex" xmlns:wpg="http://schemas.microsoft.com/office/word/2010/wordprocessingGroup" xmlns:wpi="http://schemas.microsoft.com/office/word/2010/wordprocessingInk" xmlns:wne="http://schemas.microsoft.com/office/word/2006/wordml" xmlns:wps="http://schemas.microsoft.com/office/word/2010/wordprocessingShape" mc:Ignorable="w14 w15 w16se w16cid w16 w16cex w16sdtdh w16du wp14">
   <w:abstractNum w:abstractNumId="0" w15:restartNumberingAfterBreak="0">
     <w:nsid w:val="17BD535A"/>
     <w:multiLevelType w:val="hybridMultilevel"/>
@@ -3200,7 +6290,7 @@
 </file>
 
 <file path=word/styles.xml><?xml version="1.0" encoding="utf-8"?>
-<w:styles xmlns:mc="http://schemas.openxmlformats.org/markup-compatibility/2006" xmlns:r="http://schemas.openxmlformats.org/officeDocument/2006/relationships" xmlns:w="http://schemas.openxmlformats.org/wordprocessingml/2006/main" xmlns:w14="http://schemas.microsoft.com/office/word/2010/wordml" xmlns:w15="http://schemas.microsoft.com/office/word/2012/wordml" xmlns:w16cex="http://schemas.microsoft.com/office/word/2018/wordml/cex" xmlns:w16cid="http://schemas.microsoft.com/office/word/2016/wordml/cid" xmlns:w16="http://schemas.microsoft.com/office/word/2018/wordml" xmlns:w16sdtdh="http://schemas.microsoft.com/office/word/2020/wordml/sdtdatahash" xmlns:w16se="http://schemas.microsoft.com/office/word/2015/wordml/symex" mc:Ignorable="w14 w15 w16se w16cid w16 w16cex w16sdtdh">
+<w:styles xmlns:mc="http://schemas.openxmlformats.org/markup-compatibility/2006" xmlns:r="http://schemas.openxmlformats.org/officeDocument/2006/relationships" xmlns:w="http://schemas.openxmlformats.org/wordprocessingml/2006/main" xmlns:w14="http://schemas.microsoft.com/office/word/2010/wordml" xmlns:w15="http://schemas.microsoft.com/office/word/2012/wordml" xmlns:w16cex="http://schemas.microsoft.com/office/word/2018/wordml/cex" xmlns:w16cid="http://schemas.microsoft.com/office/word/2016/wordml/cid" xmlns:w16="http://schemas.microsoft.com/office/word/2018/wordml" xmlns:w16du="http://schemas.microsoft.com/office/word/2023/wordml/word16du" xmlns:w16sdtdh="http://schemas.microsoft.com/office/word/2020/wordml/sdtdatahash" xmlns:w16se="http://schemas.microsoft.com/office/word/2015/wordml/symex" mc:Ignorable="w14 w15 w16se w16cid w16 w16cex w16sdtdh w16du">
   <w:docDefaults>
     <w:rPrDefault>
       <w:rPr>
@@ -3610,11 +6700,11 @@
       <w:szCs w:val="24"/>
     </w:rPr>
   </w:style>
-  <w:style w:type="paragraph" w:styleId="Heading1">
+  <w:style w:type="paragraph" w:styleId="Ttulo1">
     <w:name w:val="heading 1"/>
     <w:basedOn w:val="Normal"/>
     <w:next w:val="Normal"/>
-    <w:link w:val="Heading1Char"/>
+    <w:link w:val="Ttulo1Char"/>
     <w:uiPriority w:val="9"/>
     <w:qFormat/>
     <w:rsid w:val="00BD4496"/>
@@ -3626,11 +6716,11 @@
       <w:szCs w:val="28"/>
     </w:rPr>
   </w:style>
-  <w:style w:type="paragraph" w:styleId="Heading2">
+  <w:style w:type="paragraph" w:styleId="Ttulo2">
     <w:name w:val="heading 2"/>
-    <w:basedOn w:val="Heading1"/>
+    <w:basedOn w:val="Ttulo1"/>
     <w:next w:val="Normal"/>
-    <w:link w:val="Heading2Char"/>
+    <w:link w:val="Ttulo2Char"/>
     <w:uiPriority w:val="9"/>
     <w:unhideWhenUsed/>
     <w:qFormat/>
@@ -3639,11 +6729,11 @@
       <w:outlineLvl w:val="1"/>
     </w:pPr>
   </w:style>
-  <w:style w:type="paragraph" w:styleId="Heading3">
+  <w:style w:type="paragraph" w:styleId="Ttulo3">
     <w:name w:val="heading 3"/>
-    <w:basedOn w:val="Heading2"/>
+    <w:basedOn w:val="Ttulo2"/>
     <w:next w:val="Normal"/>
-    <w:link w:val="Heading3Char"/>
+    <w:link w:val="Ttulo3Char"/>
     <w:uiPriority w:val="9"/>
     <w:unhideWhenUsed/>
     <w:qFormat/>
@@ -3652,13 +6742,13 @@
       <w:outlineLvl w:val="2"/>
     </w:pPr>
   </w:style>
-  <w:style w:type="character" w:default="1" w:styleId="DefaultParagraphFont">
+  <w:style w:type="character" w:default="1" w:styleId="Fontepargpadro">
     <w:name w:val="Default Paragraph Font"/>
     <w:uiPriority w:val="1"/>
     <w:semiHidden/>
     <w:unhideWhenUsed/>
   </w:style>
-  <w:style w:type="table" w:default="1" w:styleId="TableNormal">
+  <w:style w:type="table" w:default="1" w:styleId="Tabelanormal">
     <w:name w:val="Normal Table"/>
     <w:uiPriority w:val="99"/>
     <w:semiHidden/>
@@ -3673,16 +6763,16 @@
       </w:tblCellMar>
     </w:tblPr>
   </w:style>
-  <w:style w:type="numbering" w:default="1" w:styleId="NoList">
+  <w:style w:type="numbering" w:default="1" w:styleId="Semlista">
     <w:name w:val="No List"/>
     <w:uiPriority w:val="99"/>
     <w:semiHidden/>
     <w:unhideWhenUsed/>
   </w:style>
-  <w:style w:type="character" w:customStyle="1" w:styleId="Heading1Char">
-    <w:name w:val="Heading 1 Char"/>
-    <w:basedOn w:val="DefaultParagraphFont"/>
-    <w:link w:val="Heading1"/>
+  <w:style w:type="character" w:customStyle="1" w:styleId="Ttulo1Char">
+    <w:name w:val="Título 1 Char"/>
+    <w:basedOn w:val="Fontepargpadro"/>
+    <w:link w:val="Ttulo1"/>
     <w:uiPriority w:val="9"/>
     <w:rsid w:val="00BD4496"/>
     <w:rPr>
@@ -3691,10 +6781,10 @@
       <w:szCs w:val="28"/>
     </w:rPr>
   </w:style>
-  <w:style w:type="character" w:customStyle="1" w:styleId="Heading2Char">
-    <w:name w:val="Heading 2 Char"/>
-    <w:basedOn w:val="DefaultParagraphFont"/>
-    <w:link w:val="Heading2"/>
+  <w:style w:type="character" w:customStyle="1" w:styleId="Ttulo2Char">
+    <w:name w:val="Título 2 Char"/>
+    <w:basedOn w:val="Fontepargpadro"/>
+    <w:link w:val="Ttulo2"/>
     <w:uiPriority w:val="9"/>
     <w:rsid w:val="00BD4496"/>
     <w:rPr>
@@ -3703,10 +6793,10 @@
       <w:szCs w:val="28"/>
     </w:rPr>
   </w:style>
-  <w:style w:type="character" w:customStyle="1" w:styleId="Heading3Char">
-    <w:name w:val="Heading 3 Char"/>
-    <w:basedOn w:val="DefaultParagraphFont"/>
-    <w:link w:val="Heading3"/>
+  <w:style w:type="character" w:customStyle="1" w:styleId="Ttulo3Char">
+    <w:name w:val="Título 3 Char"/>
+    <w:basedOn w:val="Fontepargpadro"/>
+    <w:link w:val="Ttulo3"/>
     <w:uiPriority w:val="9"/>
     <w:rsid w:val="00BD4496"/>
     <w:rPr>
@@ -3732,7 +6822,7 @@
       <w14:ligatures w14:val="none"/>
     </w:rPr>
   </w:style>
-  <w:style w:type="paragraph" w:styleId="ListParagraph">
+  <w:style w:type="paragraph" w:styleId="PargrafodaLista">
     <w:name w:val="List Paragraph"/>
     <w:basedOn w:val="Normal"/>
     <w:uiPriority w:val="34"/>
@@ -3745,7 +6835,7 @@
   </w:style>
   <w:style w:type="character" w:styleId="Hyperlink">
     <w:name w:val="Hyperlink"/>
-    <w:basedOn w:val="DefaultParagraphFont"/>
+    <w:basedOn w:val="Fontepargpadro"/>
     <w:uiPriority w:val="99"/>
     <w:unhideWhenUsed/>
     <w:rsid w:val="00B669D3"/>
@@ -3754,9 +6844,9 @@
       <w:u w:val="single"/>
     </w:rPr>
   </w:style>
-  <w:style w:type="character" w:styleId="UnresolvedMention">
+  <w:style w:type="character" w:styleId="MenoPendente">
     <w:name w:val="Unresolved Mention"/>
-    <w:basedOn w:val="DefaultParagraphFont"/>
+    <w:basedOn w:val="Fontepargpadro"/>
     <w:uiPriority w:val="99"/>
     <w:semiHidden/>
     <w:unhideWhenUsed/>
@@ -3766,10 +6856,10 @@
       <w:shd w:val="clear" w:color="auto" w:fill="E1DFDD"/>
     </w:rPr>
   </w:style>
-  <w:style w:type="paragraph" w:styleId="Header">
+  <w:style w:type="paragraph" w:styleId="Cabealho">
     <w:name w:val="header"/>
     <w:basedOn w:val="Normal"/>
-    <w:link w:val="HeaderChar"/>
+    <w:link w:val="CabealhoChar"/>
     <w:uiPriority w:val="99"/>
     <w:unhideWhenUsed/>
     <w:rsid w:val="007832B1"/>
@@ -3781,10 +6871,10 @@
       <w:spacing w:after="0" w:line="240" w:lineRule="auto"/>
     </w:pPr>
   </w:style>
-  <w:style w:type="character" w:customStyle="1" w:styleId="HeaderChar">
-    <w:name w:val="Header Char"/>
-    <w:basedOn w:val="DefaultParagraphFont"/>
-    <w:link w:val="Header"/>
+  <w:style w:type="character" w:customStyle="1" w:styleId="CabealhoChar">
+    <w:name w:val="Cabeçalho Char"/>
+    <w:basedOn w:val="Fontepargpadro"/>
+    <w:link w:val="Cabealho"/>
     <w:uiPriority w:val="99"/>
     <w:rsid w:val="007832B1"/>
     <w:rPr>
@@ -3793,10 +6883,10 @@
       <w:szCs w:val="24"/>
     </w:rPr>
   </w:style>
-  <w:style w:type="paragraph" w:styleId="Footer">
+  <w:style w:type="paragraph" w:styleId="Rodap">
     <w:name w:val="footer"/>
     <w:basedOn w:val="Normal"/>
-    <w:link w:val="FooterChar"/>
+    <w:link w:val="RodapChar"/>
     <w:uiPriority w:val="99"/>
     <w:unhideWhenUsed/>
     <w:rsid w:val="007832B1"/>
@@ -3808,10 +6898,10 @@
       <w:spacing w:after="0" w:line="240" w:lineRule="auto"/>
     </w:pPr>
   </w:style>
-  <w:style w:type="character" w:customStyle="1" w:styleId="FooterChar">
-    <w:name w:val="Footer Char"/>
-    <w:basedOn w:val="DefaultParagraphFont"/>
-    <w:link w:val="Footer"/>
+  <w:style w:type="character" w:customStyle="1" w:styleId="RodapChar">
+    <w:name w:val="Rodapé Char"/>
+    <w:basedOn w:val="Fontepargpadro"/>
+    <w:link w:val="Rodap"/>
     <w:uiPriority w:val="99"/>
     <w:rsid w:val="007832B1"/>
     <w:rPr>
@@ -3820,9 +6910,9 @@
       <w:szCs w:val="24"/>
     </w:rPr>
   </w:style>
-  <w:style w:type="paragraph" w:styleId="TOCHeading">
+  <w:style w:type="paragraph" w:styleId="CabealhodoSumrio">
     <w:name w:val="TOC Heading"/>
-    <w:basedOn w:val="Heading1"/>
+    <w:basedOn w:val="Ttulo1"/>
     <w:next w:val="Normal"/>
     <w:uiPriority w:val="39"/>
     <w:unhideWhenUsed/>
@@ -3845,7 +6935,7 @@
       <w14:ligatures w14:val="none"/>
     </w:rPr>
   </w:style>
-  <w:style w:type="paragraph" w:styleId="TOC1">
+  <w:style w:type="paragraph" w:styleId="Sumrio1">
     <w:name w:val="toc 1"/>
     <w:basedOn w:val="Normal"/>
     <w:next w:val="Normal"/>
@@ -3857,7 +6947,7 @@
       <w:spacing w:after="100"/>
     </w:pPr>
   </w:style>
-  <w:style w:type="paragraph" w:styleId="TOC2">
+  <w:style w:type="paragraph" w:styleId="Sumrio2">
     <w:name w:val="toc 2"/>
     <w:basedOn w:val="Normal"/>
     <w:next w:val="Normal"/>
@@ -3870,7 +6960,7 @@
       <w:ind w:left="240"/>
     </w:pPr>
   </w:style>
-  <w:style w:type="paragraph" w:styleId="TOC3">
+  <w:style w:type="paragraph" w:styleId="Sumrio3">
     <w:name w:val="toc 3"/>
     <w:basedOn w:val="Normal"/>
     <w:next w:val="Normal"/>
@@ -3883,9 +6973,9 @@
       <w:ind w:left="480"/>
     </w:pPr>
   </w:style>
-  <w:style w:type="character" w:styleId="FollowedHyperlink">
+  <w:style w:type="character" w:styleId="HiperlinkVisitado">
     <w:name w:val="FollowedHyperlink"/>
-    <w:basedOn w:val="DefaultParagraphFont"/>
+    <w:basedOn w:val="Fontepargpadro"/>
     <w:uiPriority w:val="99"/>
     <w:semiHidden/>
     <w:unhideWhenUsed/>

</xml_diff>